<commit_message>
Paper: state the pre-registered decision rule; disclose the seed-0 test read
</commit_message>
<xml_diff>
--- a/paper/master_copy.docx
+++ b/paper/master_copy.docx
@@ -4084,7 +4084,7 @@
           <w:sz w:val="22"/>
           <w:szCs w:val="22"/>
         </w:rPr>
-        <w:t xml:space="preserve"> Hi-C is autocorrelated over megabases, so random window splits would leak. We split by chromosome: chr3, chr13 and chr17 form the test set, chr10 and chr11 the validation set, and the remaining 17 autosomes the training set (6,284 training samples at a stride of half a sample). All model and recipe decisions are made on the validation chromosomes; the test chromosomes are scored once, for the final table.</w:t>
+        <w:t xml:space="preserve"> Hi-C is autocorrelated over megabases, so random window splits would leak. We split by chromosome: chr3, chr13 and chr17 form the test set, chr10 and chr11 the validation set, and the remaining 17 autosomes the training set (6,284 training samples at a stride of half a sample). All model and recipe decisions are made on the validation chromosomes; the test chromosomes are scored once, for the final table. One exception is disclosed: an evaluation bug, since fixed, read the test split for the full model and B3 at exploratory seed 0, so those two seed-0 test numbers are reported only as exploratory.</w:t>
       </w:r>
     </w:p>
     <w:p>
@@ -4109,6 +4109,30 @@
           <w:szCs w:val="22"/>
         </w:rPr>
         <w:t xml:space="preserve"> Every arm is evaluated with Hi-C removed at inference, so that the only difference between arms is what shaped their weights during pretraining. Results with the graph present are reported separately as an upper bound with privileged input and are never compared with a sequence-only baseline. The headline metric is the Pearson correlation between predicted and measured strength on held-out target edges, stratified by separation into short (&lt;50 kb), medium (50–150 kb) and long (≥150 kb) bands, because a single correlation is dominated by short-range contacts; the long-range band is the primary endpoint. For arms whose pretraining does not train a contact head (B0 and B5), the same contact head is fitted on frozen representations, and all arms are additionally compared under this frozen-representation probe. Differences between arms are assessed with a paired bootstrap over evaluation samples, which is valid because every arm is asked about the identical target edges, and over multiple training seeds.</w:t>
+      </w:r>
+    </w:p>
+    <w:p>
+      <w:pPr>
+        <w:spacing w:after="120" w:line="276"/>
+        <w:jc w:val="both"/>
+      </w:pPr>
+      <w:r>
+        <w:rPr>
+          <w:rFonts w:ascii="Times New Roman" w:cs="Times New Roman" w:eastAsia="Times New Roman" w:hAnsi="Times New Roman"/>
+          <w:i/>
+          <w:iCs/>
+          <w:sz w:val="22"/>
+          <w:szCs w:val="22"/>
+        </w:rPr>
+        <w:t xml:space="preserve">Pre-registered decision rule.</w:t>
+      </w:r>
+      <w:r>
+        <w:rPr>
+          <w:rFonts w:ascii="Times New Roman" w:cs="Times New Roman" w:eastAsia="Times New Roman" w:hAnsi="Times New Roman"/>
+          <w:sz w:val="22"/>
+          <w:szCs w:val="22"/>
+        </w:rPr>
+        <w:t xml:space="preserve"> The claims and the rule that decides them were fixed in writing before any confirmatory run was evaluated. Seed 0 is exploratory and was used only to choose the pretraining recipe; confirmation uses fresh seeds 1–3 for the full model, B3, B0 and B1, at 20,000 steps each, on the validation chromosomes. For a comparison X − Y, 10,000 paired bootstrap resamples of validation samples give a 95% interval for the seed-averaged difference, and X is said to beat Y only if the interval lies above zero and X − Y &gt; 0 in at least two of the three seeds. Claim A, that measured strengths matter, requires the full model to beat B3 on its own contact head. Claim B, that measured topology matters, requires both the full model and B3 to beat both B0 and B1 under the frozen-representation probe; because all four comparisons must pass, no multiple-comparison correction is needed. Every combination of outcomes maps to a pre-specified statement, including a controlled negative result, and B2, B4 and B5 are reported as secondary comparisons whatever the outcome.</w:t>
       </w:r>
     </w:p>
     <w:p>

</xml_diff>

<commit_message>
Paper: rewrite to the selected v1 recipe with the paper-writing skill
The methods described v2 (log O/E regression and structure distillation),
but the pre-registered rule selected v1, which every confirmatory run uses:
soft-target BCE contact loss, structure dropout, no distillation.
Abstract and introduction restructured; distillation moved to the screened
recipe; protocol, read-outs and recipe selection stated in 3.8; results,
discussion and conclusion given a fixed PENDING structure; Figure 1 and
equations regenerated from configs/base.yaml.
</commit_message>
<xml_diff>
--- a/paper/master_copy.docx
+++ b/paper/master_copy.docx
@@ -72,7 +72,7 @@
           <w:sz w:val="18"/>
           <w:szCs w:val="18"/>
         </w:rPr>
-        <w:t xml:space="preserve">Working master copy. Sections 1–3 are drafted; Sections 4–6 (Results, Discussion, Conclusion) are written only once the multi-seed validation results are final and the sealed test split has been scored once.</w:t>
+        <w:t xml:space="preserve">Working master copy. Sections 1–3 are drafted. Sections 4–6 hold the agreed structure only; their content is written once the pre-registered decision has been made on the validation chromosomes and the sealed test split has been scored once.</w:t>
       </w:r>
     </w:p>
     <w:p>
@@ -96,7 +96,7 @@
           <w:sz w:val="18"/>
           <w:szCs w:val="18"/>
         </w:rPr>
-        <w:t xml:space="preserve">The abstract's results sentence and the Introduction's experiments paragraph are marked [PENDING RESULTS] and must be filled from measured numbers only.</w:t>
+        <w:t xml:space="preserve">Every [PENDING RESULTS] slot must be filled from measured numbers only, with the wording fixed by the pre-registered outcome table (docs/preregistration.md, Section 5).</w:t>
       </w:r>
     </w:p>
     <w:p>
@@ -125,7 +125,7 @@
           <w:sz w:val="22"/>
           <w:szCs w:val="22"/>
         </w:rPr>
-        <w:t xml:space="preserve">DNA sequence models contextualise a genomic window by what lies near it on the linear chromosome, yet much of gene regulation acts across hundreds of kilobases through the three-dimensional folding of chromatin. Chromosome conformation capture (Hi-C) measures that folding directly, but existing models use it as a prediction target, as an input that supervised predictors require at inference, or as an external alignment signal; none lets measured contacts decide which distal windows exchange information inside a self-supervised DNA encoder while it learns. We present ChromGraphFM, a DNA encoder pretrained without task labels, in which a sparse graph built from distance-detrended Hi-C contacts biases attention between 5 kb sequence windows across a 640 kb context. Contacts enter the attention logit through a learned edge bias, and the edges the model is asked to predict are withheld from the graph it attends over, so the contact objective cannot be solved by copying its input. Because Hi-C is rarely available where a sequence model is applied, we treat it as training-time-only information: structure dropout removes the distal graph for a fraction of samples, and a structure-distillation objective pulls the representation computed from sequence alone toward the Hi-C-conditioned one. We evaluate every comparison with Hi-C removed at inference, against matched controls that keep the parameter count, data and compute fixed while removing the graph, randomising it, keeping its edges but flattening their strengths, shuffling its strengths among edges, fusing Hi-C after the encoder, or using it only as an alignment target. [PENDING RESULTS: one sentence with the validation-decided, test-confirmed outcome.]</w:t>
+        <w:t xml:space="preserve">DNA sequence models contextualise a genomic window by what lies near it on the linear chromosome, yet much of gene regulation acts across hundreds of kilobases through the three-dimensional folding of chromatin. Chromosome conformation capture (Hi-C) measures that folding directly, but existing models use it as a prediction target, as an input that must be present at inference, or as an alignment target applied outside the encoder; in none of them do measured contacts decide how a self-supervised DNA encoder contextualises its input while it learns. Our insight is that contacts can serve as a training-time routing signal: if they decide which distal windows exchange information during pretraining and are then removed, anything they contribute must reside in weights that operate on sequence alone. We implement this idea in ChromGraphFM, a 7.3 M-parameter DNA encoder in which a sparse graph of distance-detrended Hi-C contacts restricts and biases attention between 5 kb windows across a 640 kb context. Contacts that the model is asked to predict are withheld from the graph it attends over, so the contact objective cannot be met by copying the input, and structure dropout removes the entire distal graph for a fraction of training samples, so the same weights also learn to operate without Hi-C. We test the idea under a pre-registered protocol: every model is evaluated with Hi-C removed, against matched controls that share its architecture, data and compute while removing the graph, randomising it, shuffling or flattening its contact strengths, fusing Hi-C after the encoder, or using Hi-C only as an alignment target, on fresh training seeds and under a decision rule fixed before any confirmatory result was seen. [PENDING RESULTS: one sentence stating the pre-registered outcome, in the wording fixed for it.]</w:t>
       </w:r>
     </w:p>
     <w:p>
@@ -148,7 +148,7 @@
           <w:sz w:val="22"/>
           <w:szCs w:val="22"/>
         </w:rPr>
-        <w:t xml:space="preserve">3D genome; Hi-C; chromatin contacts; DNA language models; self-supervised learning; graph attention; privileged information</w:t>
+        <w:t xml:space="preserve">3D genome; Hi-C; chromatin contacts; DNA language models; self-supervised learning; graph attention; privileged information; pre-registration</w:t>
       </w:r>
     </w:p>
     <w:p>
@@ -178,7 +178,7 @@
           <w:sz w:val="22"/>
           <w:szCs w:val="22"/>
         </w:rPr>
-        <w:t xml:space="preserve">Learning general-purpose representations of DNA sequence has become a central route to predicting the regulatory consequences of the genome, from chromatin accessibility and transcription to the effects of non-coding variants [1–6]. A representation is useful to the extent that it captures what controls a locus, and for a large share of human gene regulation that control is distal: enhancers act on promoters tens to hundreds of kilobases away, brought into contact by the folding of chromatin into loops and topologically associating domains [7,8]. This paper focuses on the setting of learning a sequence representation of a genomic window from DNA alone, where that representation should nevertheless reflect the window's three-dimensional context.</w:t>
+        <w:t xml:space="preserve">Learning general-purpose representations of DNA sequence has become a central route to predicting the regulatory consequences of the genome, from chromatin accessibility and transcription to the effects of non-coding variants [1–6]. A representation is useful to the extent that it captures what controls a locus, and for a large share of human gene regulation that control is distal: enhancers act on promoters tens to hundreds of kilobases away, brought into contact by the folding of chromatin into loops and topologically associating domains [7,8]. This paper focuses on learning a representation of a genomic window from DNA alone that nevertheless reflects the window's three-dimensional context.</w:t>
       </w:r>
     </w:p>
     <w:p>
@@ -192,7 +192,7 @@
           <w:sz w:val="22"/>
           <w:szCs w:val="22"/>
         </w:rPr>
-        <w:t xml:space="preserve">This setting is challenging because three-dimensional proximity is not a property of linear proximity. Sequence models enlarge their receptive field with convolutions and dilations [9], attention [10,11], or long-range state-space and implicit-convolution layers [3–5]; however, all of them weigh context by position along the chromosome, and must infer from sequence alone which of thousands of distal windows are physically close. Folding is partly encoded in sequence through features such as CTCF motifs and their orientation [8,12], but it is cell-type-specific and shaped by factors that a sequence model never observes, so the relevant distal context is diluted among the irrelevant.</w:t>
+        <w:t xml:space="preserve">This setting is challenging because three-dimensional proximity is not a property of linear proximity. Sequence models enlarge their receptive field with convolutions and dilations [9], attention [10,11], or long-range state-space and implicit-convolution layers [3–5]; however, all of them weigh context by position along the chromosome, and must infer from sequence alone which of thousands of distal windows are physically close. Folding is partly encoded in sequence, through features such as CTCF motifs and their orientation [8,12], but it is cell-type-specific and shaped by factors a sequence model never observes, so the relevant distal context is diluted among the irrelevant.</w:t>
       </w:r>
     </w:p>
     <w:p>
@@ -206,7 +206,7 @@
           <w:sz w:val="22"/>
           <w:szCs w:val="22"/>
         </w:rPr>
-        <w:t xml:space="preserve">Chromosome conformation capture measures this folding directly. Hi-C reports, for every pair of genomic bins, how often the two were found in contact [8,13], and a growing body of work learns from it. Sequence-to-structure models predict contact maps from DNA [14–17]; foundation models are now pretrained on contact maps themselves [18,19]; graph and attention models feed contact frequencies into supervised predictors of gene expression [20–23]; and Evo2HiC distils a frozen DNA language model into a compact encoder aligned to Hi-C with a contrastive objective [24]. However, in each of these designs measured contacts never decide how a sequence encoder contextualises its input during self-supervised pretraining: Hi-C is the output, an input that a supervised model needs at prediction time, or an alignment target applied from outside the encoder. The root technical difficulty is twofold. First, injecting contacts into an encoder's attention invites a degenerate solution in which any contact objective is satisfied by reading the contacts back from the input. Second, a representation that depends on Hi-C at inference is unusable for the overwhelming majority of sequences and cell types for which no contact map exists.</w:t>
+        <w:t xml:space="preserve">Chromosome conformation capture measures this folding directly. Hi-C reports, for every pair of genomic bins, how often the two were found in contact [8,13], and a growing body of work learns from it. Sequence-to-structure models predict contact maps from DNA [14–17]; foundation models are pretrained on contact maps themselves [18,19]; graph and attention models feed contact frequencies into supervised predictors of gene expression [20–23]; and Evo2HiC aligns a compact sequence encoder to a Hi-C encoder with a contrastive objective [24]. In each design, however, measured contacts never decide how a sequence encoder contextualises its input during self-supervised pretraining: Hi-C is the output, an input that a supervised model needs at prediction time, or an alignment target applied from outside the encoder. Two technical obstacles explain this gap. First, an encoder whose attention is driven by contacts can satisfy any contact objective by reading the contacts back from its input, so the objective measures nothing. Second, a representation that depends on Hi-C at inference cannot be used for the great majority of sequences and cell types, for which no contact map exists.</w:t>
       </w:r>
     </w:p>
     <w:p>
@@ -220,7 +220,7 @@
           <w:sz w:val="22"/>
           <w:szCs w:val="22"/>
         </w:rPr>
-        <w:t xml:space="preserve">In this paper, we propose ChromGraphFM, a DNA encoder in which measured chromatin contacts shape sequence contextualisation during pretraining and are not required afterwards. The basic idea is illustrated in Figure 1. Our first contribution is contact-biased sparse attention: 5 kb sequence windows become the nodes of a graph whose edges are each window's strongest distance-detrended Hi-C partners, and attention between windows runs over these edges only, with the measured contact strength and the genomic separation entering the attention logit through a learned bias. Because a fraction of the strongest contacts is withheld from the graph and used only as prediction targets, the encoder cannot satisfy its contact objective by copying its input, and must instead learn which sequence windows interact.</w:t>
+        <w:t xml:space="preserve">In this paper, we propose ChromGraphFM, a DNA encoder in which measured chromatin contacts shape sequence contextualisation during pretraining and are not required afterwards. The basic idea is illustrated in Figure 1. Our first contribution is contact-biased sparse attention: 5 kb sequence windows become the nodes of a graph whose edges link each window to its strongest distance-detrended Hi-C partners, attention between windows runs over these edges only, and each edge's measured strength and genomic separation enter its attention logit through a learned bias. A fraction of the strongest contacts is withheld from this graph and used only as prediction targets, so the encoder cannot meet its contact objective by copying its input and must instead learn which sequence windows interact.</w:t>
       </w:r>
     </w:p>
     <w:p>
@@ -234,7 +234,7 @@
           <w:sz w:val="22"/>
           <w:szCs w:val="22"/>
         </w:rPr>
-        <w:t xml:space="preserve">Contact-biased attention alone produces a representation that expects Hi-C at inference. Our second contribution resolves this by treating Hi-C as privileged, training-time-only information [25]. Structure dropout removes the entire distal graph for a random subset of training samples, so that the encoder is never out of distribution without it, and a structure-distillation objective trains the representation computed from sequence alone to match the one computed with contacts, with the latter held fixed as the teacher [26]. The structural knowledge is thereby transferred into the weights that a Hi-C-free model uses.</w:t>
+        <w:t xml:space="preserve">Contact-biased attention by itself yields a model that expects Hi-C at inference. Our second contribution removes this dependence by treating Hi-C as privileged, training-time-only information [25]. Structure dropout removes the entire distal graph from a random 30% of training samples, so that one set of weights is trained both with and without contacts, and the Hi-C-free mode, in which every model is evaluated, is never out of distribution. Because the attention blocks, heads and objectives are shared by the two modes, whatever the contacts teach the encoder is learned in weights that the Hi-C-free mode also uses.</w:t>
       </w:r>
     </w:p>
     <w:p>
@@ -248,7 +248,21 @@
           <w:sz w:val="22"/>
           <w:szCs w:val="22"/>
         </w:rPr>
-        <w:t xml:space="preserve">Whether such a model has learned anything about structure is easy to assert and hard to test, because a richer input, more parameters, or knowledge of genomic distance can each masquerade as structural learning. We therefore evaluate every model with Hi-C removed at inference and compare it against controls that share its architecture, data, parameter count and compute while removing the distal graph, replacing it with random edges, keeping its edges but flattening their strengths, shuffling its strengths among edges, fusing Hi-C after the encoder, or using Hi-C only as a contrastive alignment target. Splits are by chromosome, model decisions are made on validation chromosomes only, and the test chromosomes are scored once. [PENDING RESULTS: the experiments paragraph, stating what the controlled comparison shows, is written from the final measured numbers.]</w:t>
+        <w:t xml:space="preserve">Whether such a model has learned anything about structure is easy to assert and hard to test, because a richer input, more parameters, knowledge of genomic distance, or a favourable choice among many runs can each masquerade as structural learning. Our third contribution is therefore an evaluation protocol designed to rule these out. Every model is evaluated with Hi-C removed at inference and compared against controls that share its architecture, data, parameter count and compute while removing the distal graph, replacing it with random edges, keeping its edges but flattening or shuffling their strengths, fusing Hi-C after the encoder, or using Hi-C only as a contrastive alignment target. Data are split by chromosome, a frozen-representation probe gives every arm the same read-out, and the claims, the statistic and the decision rule were fixed in writing before any confirmatory run was evaluated, with every possible outcome mapped in advance to the claim it supports.</w:t>
+      </w:r>
+    </w:p>
+    <w:p>
+      <w:pPr>
+        <w:spacing w:after="120" w:line="276"/>
+        <w:jc w:val="both"/>
+      </w:pPr>
+      <w:r>
+        <w:rPr>
+          <w:rFonts w:ascii="Times New Roman" w:cs="Times New Roman" w:eastAsia="Times New Roman" w:hAnsi="Times New Roman"/>
+          <w:sz w:val="22"/>
+          <w:szCs w:val="22"/>
+        </w:rPr>
+        <w:t xml:space="preserve">[PENDING RESULTS: the experiments paragraph, stating what the pre-registered comparison shows on the validation chromosomes and on the single test evaluation, in the wording fixed for that outcome.]</w:t>
       </w:r>
     </w:p>
     <w:p>
@@ -281,7 +295,7 @@
           <w:sz w:val="22"/>
           <w:szCs w:val="22"/>
         </w:rPr>
-        <w:t xml:space="preserve">Contact-biased sparse attention, in which distance-detrended Hi-C contacts determine which 5 kb sequence windows attend to one another across a 640 kb context and bias how strongly, with held-out target edges that make the contact objective non-trivial.</w:t>
+        <w:t xml:space="preserve">Contact-biased sparse attention, in which distance-detrended Hi-C contacts determine which 5 kb sequence windows attend to one another across a 640 kb context and bias how strongly, with held-out target edges that keep the contact objective from being solved by copying.</w:t>
       </w:r>
     </w:p>
     <w:p>
@@ -300,7 +314,7 @@
           <w:sz w:val="22"/>
           <w:szCs w:val="22"/>
         </w:rPr>
-        <w:t xml:space="preserve">A training-time-only use of Hi-C, combining structure dropout with structure distillation, that yields DNA representations computed from sequence alone at inference.</w:t>
+        <w:t xml:space="preserve">A training-time-only use of Hi-C through whole-graph structure dropout, which trains one encoder to operate with and without contacts and yields DNA representations computed from sequence alone at inference.</w:t>
       </w:r>
     </w:p>
     <w:p>
@@ -319,7 +333,7 @@
           <w:sz w:val="22"/>
           <w:szCs w:val="22"/>
         </w:rPr>
-        <w:t xml:space="preserve">A controlled evaluation protocol with six matched controls, chromosome-level splits and a Hi-C-free headline setting, which separates the contribution of measured contacts from those of graph regularisation, genomic distance, contact-strength marginals and post-hoc fusion.</w:t>
+        <w:t xml:space="preserve">A pre-registered, controlled evaluation protocol with six matched controls, chromosome-level splits, a Hi-C-free headline setting and a shared frozen-representation probe, which separates the contribution of measured contacts from those of graph regularisation, genomic distance, contact-strength marginals, post-hoc fusion and run selection.</w:t>
       </w:r>
     </w:p>
     <w:p>
@@ -365,7 +379,7 @@
           <w:sz w:val="22"/>
           <w:szCs w:val="22"/>
         </w:rPr>
-        <w:t xml:space="preserve">A first line of work treats three-dimensional structure as the output of a sequence model. Akita predicts Hi-C maps over megabase windows from DNA sequence with a convolutional network [14], Orca extends sequence-to-structure prediction across multiple scales up to whole chromosomes [15], and C.Origami adds CTCF binding and chromatin accessibility to predict cell-type-specific maps [16]; EPCOT predicts chromatin contacts alongside epigenomic and transcriptional tracks in a pre-training and fine-tuning framework [27]. These models establish that folding is substantially predictable from sequence. However, Hi-C is the training target rather than a signal that shapes how the encoder contextualises its input, and the learned features are specialised to the map they reproduce rather than offered as a general sequence representation. ChromGraphFM inverts this relation: measured contacts are an input to the encoder during pretraining, and the product is a sequence representation rather than a contact map.</w:t>
+        <w:t xml:space="preserve">A first line of work treats three-dimensional structure as the output of a sequence model. Akita predicts Hi-C maps over megabase windows from DNA sequence with a convolutional network [14], Orca extends sequence-to-structure prediction across multiple scales up to whole chromosomes [15], and C.Origami adds CTCF binding and chromatin accessibility to predict cell-type-specific maps [16]; EPCOT predicts chromatin contacts alongside epigenomic and transcriptional tracks in a pre-training and fine-tuning framework [26]. These models establish that folding is substantially predictable from sequence. However, Hi-C is the training target rather than a signal that shapes how the encoder contextualises its input, and the learned features are specialised to the map they reproduce rather than offered as a general sequence representation. ChromGraphFM inverts this relation: measured contacts are an input to the encoder during pretraining, and the product is a sequence representation rather than a contact map.</w:t>
       </w:r>
     </w:p>
     <w:p>
@@ -395,7 +409,7 @@
           <w:sz w:val="22"/>
           <w:szCs w:val="22"/>
         </w:rPr>
-        <w:t xml:space="preserve">Self-supervised DNA language models learn general sequence representations from unlabelled genomes. DNABERT and DNABERT-2 adapt masked language modelling to k-mer and byte-pair tokens [1,28], and the Nucleotide Transformer scales this recipe across thousands of genomes [2]. To reach longer contexts, HyenaDNA replaces attention with implicit long convolutions [3], Caduceus builds bidirectional, reverse-complement-equivariant state-space models [4] on structured state-space layers [29–31], and Evo and Evo 2 train very large autoregressive models over hundreds of kilobases to a megabase [5,6]. Supervised sequence-to-function models such as Basenji, Enformer and AlphaGenome reach long contexts through dilated convolutions and attention [9–11]. Across this line, context is weighted by linear position, and distal windows must be identified from sequence alone. Our encoder uses an ordinary bidirectional state-space model within each window and leaves long-range context to a graph defined by measured contacts.</w:t>
+        <w:t xml:space="preserve">Self-supervised DNA language models learn general sequence representations from unlabelled genomes. DNABERT and DNABERT-2 adapt masked language modelling to k-mer and byte-pair tokens [1,27], and the Nucleotide Transformer scales this recipe across thousands of genomes [2]. To reach longer contexts, HyenaDNA replaces attention with implicit long convolutions [3], Caduceus builds bidirectional, reverse-complement-equivariant state-space models [4] on structured state-space layers [28–30], and Evo and Evo 2 train very large autoregressive models over hundreds of kilobases to a megabase [5,6]. Supervised sequence-to-function models such as Basenji, Enformer and AlphaGenome reach long contexts through dilated convolutions and attention [9–11]. Across this line, context is weighted by linear position, and distal windows must be identified from sequence alone. Our encoder uses an ordinary bidirectional state-space model within each window and leaves long-range context to a graph defined by measured contacts.</w:t>
       </w:r>
     </w:p>
     <w:p>
@@ -425,7 +439,7 @@
           <w:sz w:val="22"/>
           <w:szCs w:val="22"/>
         </w:rPr>
-        <w:t xml:space="preserve">A third line learns representations of Hi-C itself. HiCFoundation pretrains a foundation model on a large corpus of contact maps [18], and MIX-HIC jointly pretrains on contact maps and epigenomic tracks [19]; in both, the reusable representation is of contacts rather than of DNA sequence. Chimaera links the latent space of a contact-map autoencoder to a DNA encoder to predict Hi-C from sequence across species [17]. GraphReg uses Hi-C and related 3D assays as the graph of a graph-attention network that predicts gene expression from epigenomic and sequence features [20], and CHROME and Puget likewise combine sequence representations with contact graphs or a Hi-C encoder to predict expression [22,23]. These works show that contact graphs carry information that linear context lacks, but in supervised settings where Hi-C is required at prediction time. Closest to our aim, and concurrent with it, Evo2HiC distils a frozen Evo 2 model into a compact sequence encoder that is aligned to a Hi-C encoder with a contrastive objective, and offers a sequence-only encoder for use without Hi-C [24]. It thus shares our view of Hi-C as a training-time signal, but contacts act there as an alignment target applied from outside the encoder, through a contrastive loss, rather than inside it. ChromGraphFM differs in where Hi-C acts: contacts select and weight the information each window receives at every graph layer during pretraining, and dropout and distillation remove the dependence on Hi-C at inference. Our controls include both a late-fusion and an alignment-only variant (B4 and B5) so that this difference is tested rather than asserted.</w:t>
+        <w:t xml:space="preserve">A third line learns representations of Hi-C itself. HiCFoundation pretrains a foundation model on a large corpus of contact maps [18], and MIX-HIC jointly pretrains on contact maps and epigenomic tracks [19]; in both, the reusable representation is of contacts rather than of DNA sequence. Chimaera links the latent space of a contact-map autoencoder to a DNA encoder to predict Hi-C from sequence across species [17]. GraphReg uses Hi-C and related 3D assays as the graph of a graph-attention network that predicts gene expression from epigenomic and sequence features [20], and CHROME and Puget likewise combine sequence representations with contact graphs or a Hi-C encoder to predict expression [22,23]. These works show that contact graphs carry information that linear context lacks, but in supervised settings where Hi-C is required at prediction time. Closest to our aim, and concurrent with it, Evo2HiC distils a frozen Evo 2 model into a compact sequence encoder that is aligned to a Hi-C encoder with a contrastive objective, and offers a sequence-only encoder for use without Hi-C [24]. It shares our view of Hi-C as a training-time signal, but contacts act there as an alignment target applied from outside the encoder rather than inside it. ChromGraphFM differs in where Hi-C acts: contacts select and weight the information each window receives at every graph layer during pretraining, and structure dropout removes the dependence on Hi-C at inference. Our controls include both a late-fusion and an alignment-only variant (B4 and B5), so that this difference is tested rather than asserted.</w:t>
       </w:r>
     </w:p>
     <w:p>
@@ -455,7 +469,7 @@
           <w:sz w:val="22"/>
           <w:szCs w:val="22"/>
         </w:rPr>
-        <w:t xml:space="preserve">Our attention mechanism belongs to a family that restricts or biases attention with a known structure. Graph attention networks compute attention over graph neighbourhoods [32], and Graphormer adds learned structural biases, such as shortest-path distances, directly to the attention logits of a Transformer [33,34]. In genomics, Chromoformer adds normalised Hi-C interaction frequencies to the self-attention scores of a supervised model that predicts expression from histone modifications around promoters [21], a direct precedent for biasing attention with contact frequency. We follow the additive-bias form, but apply it during self-supervised pretraining of a DNA sequence encoder, with the bias computed from measured contact strength and genomic separation by separate learned functions, a separation that makes a distance-only control constructible. Removing structure during training to obtain robustness has precedents in DropEdge, which drops random edges as a regulariser [35], and in modality dropout, which drops whole input modalities so a model remains usable when one is missing [36]. Our structure dropout removes the whole distal graph per sample for the second reason. Finally, learning using privileged information formalises a teacher signal available at training time only [25], and knowledge distillation transfers a teacher's behaviour into a student [26]; our structure distillation uses the model's own Hi-C-conditioned pass as the teacher of its Hi-C-free pass.</w:t>
+        <w:t xml:space="preserve">Our attention mechanism belongs to a family that restricts or biases attention with a known structure. Graph attention networks compute attention over graph neighbourhoods [31], and Graphormer adds learned structural biases, such as shortest-path distances, directly to the attention logits of a Transformer [32,33]. In genomics, Chromoformer adds normalised Hi-C interaction frequencies to the self-attention scores of a supervised model that predicts expression from histone modifications around promoters [21], a direct precedent for biasing attention with contact frequency. We follow the additive-bias form, but apply it during self-supervised pretraining of a DNA sequence encoder, with the bias computed from measured contact strength and genomic separation by separate learned functions, a separation that makes a distance-only control constructible. Removing structure during training to obtain robustness has precedents in DropEdge, which drops random edges as a regulariser [34], and in modality dropout, which drops whole input modalities so a model remains usable when one is missing [35]; our structure dropout removes the whole distal graph per sample for the second reason. Learning using privileged information formalises a signal available at training time only [25]. A natural extension, distilling the Hi-C-conditioned pass into the Hi-C-free one [36], was screened as an alternative recipe and not selected by our pre-registered rule (Section 3.8).</w:t>
       </w:r>
     </w:p>
     <w:p>
@@ -681,7 +695,7 @@
           <w:sz w:val="22"/>
           <w:szCs w:val="22"/>
         </w:rPr>
-        <w:t xml:space="preserve"> Structure dropout and structure distillation train the model to produce its representation from DNA alone (Section 3.6), so Hi-C is needed only during training. This matters for two reasons: contact maps exist for few cell types and for no user-supplied sequence, and comparing models with Hi-C removed is the only setting in which a gain can be attributed to what training stored in the weights rather than to information supplied at inference. Four objectives train the model end to end (Section 3.7); Section 3.8 defines the controls and the evaluation protocol, and Section 3.9 gives implementation details.</w:t>
+        <w:t xml:space="preserve"> Structure dropout trains the same weights to operate with the distal graph removed (Section 3.6), so Hi-C is needed only during training. This matters for two reasons: contact maps exist for few cell types and for no user-supplied sequence, and comparing models with Hi-C removed is the only setting in which a gain can be attributed to what training stored in the weights rather than to information supplied at inference. Three objectives train the model end to end (Section 3.7); Section 3.8 defines the controls, the recipe selection and the pre-registered evaluation protocol, and Section 3.9 gives implementation details.</w:t>
       </w:r>
     </w:p>
     <w:p>
@@ -695,7 +709,7 @@
           <wp:inline distT="0" distB="0" distL="0" distR="0">
             <wp:extent cx="5734050" cy="3400425"/>
             <wp:effectExtent t="0" r="0" b="0" l="0"/>
-            <wp:docPr id="1" name="overview" descr="Overview of ChromGraphFM. Top: each 5 kb DNA window is encoded independently by a convolutional tower and a bidirectional state-space model into h_i. Bottom: distance-detrended Hi-C contacts define a sparse graph (local and top-k distal edges), from which a fraction of distal edges is withheld as targets. Middle: contact-biased attention propagates information over graph edges only, with the measured strength and separation entering the attention logit through a learned edge bias. A second pass over the same encoder outputs with the distal graph removed gives the Hi-C-free representation z^mathrmfree_i, which is distilled toward z_i. Hi-C is used only during training; at inference the model runs from sequence alone." title="Figure 1"/>
+            <wp:docPr id="1" name="overview" descr="Overview of ChromGraphFM. Top: each 5 kb DNA window is encoded independently by a convolutional tower and a bidirectional state-space model into h_i. Bottom: distance-detrended Hi-C contacts define a sparse graph (local and top-k distal edges), from which a fraction of distal edges is withheld as targets. Middle: contact-biased attention propagates information over graph edges only, with the measured strength and separation entering the attention logit through a learned edge bias. Structure dropout removes the whole distal graph for a fraction of training samples, so the same blocks also run on local edges alone (dashed), which is the Hi-C-free mode used at inference. Hi-C is used only during training." title="Figure 1"/>
             <wp:cNvGraphicFramePr>
               <a:graphicFrameLocks xmlns:a="http://schemas.openxmlformats.org/drawingml/2006/main" noChangeAspect="1"/>
             </wp:cNvGraphicFramePr>
@@ -791,74 +805,7 @@
           <w:sz w:val="18"/>
           <w:szCs w:val="18"/>
         </w:rPr>
-        <w:t xml:space="preserve">. Bottom: distance-detrended Hi-C contacts define a sparse graph (local and top-k distal edges), from which a fraction of distal edges is withheld as targets. Middle: contact-biased attention propagates information over graph edges only, with the measured strength and separation entering the attention logit through a learned edge bias. A second pass over the same encoder outputs with the distal graph removed gives the Hi-C-free representation </w:t>
-      </w:r>
-      <w:r>
-        <w:rPr>
-          <w:rFonts w:ascii="Times New Roman" w:cs="Times New Roman" w:eastAsia="Times New Roman" w:hAnsi="Times New Roman"/>
-          <w:i/>
-          <w:iCs/>
-          <w:sz w:val="18"/>
-          <w:szCs w:val="18"/>
-        </w:rPr>
-        <w:t xml:space="preserve">z</w:t>
-      </w:r>
-      <w:r>
-        <w:rPr>
-          <w:rFonts w:ascii="Times New Roman" w:cs="Times New Roman" w:eastAsia="Times New Roman" w:hAnsi="Times New Roman"/>
-          <w:sz w:val="18"/>
-          <w:szCs w:val="18"/>
-          <w:vertAlign w:val="superscript"/>
-        </w:rPr>
-        <w:t xml:space="preserve">free</w:t>
-      </w:r>
-      <w:r>
-        <w:rPr>
-          <w:rFonts w:ascii="Times New Roman" w:cs="Times New Roman" w:eastAsia="Times New Roman" w:hAnsi="Times New Roman"/>
-          <w:i/>
-          <w:iCs/>
-          <w:sz w:val="18"/>
-          <w:szCs w:val="18"/>
-          <w:vertAlign w:val="subscript"/>
-        </w:rPr>
-        <w:t xml:space="preserve">i</w:t>
-      </w:r>
-      <w:r>
-        <w:rPr>
-          <w:rFonts w:ascii="Times New Roman" w:cs="Times New Roman" w:eastAsia="Times New Roman" w:hAnsi="Times New Roman"/>
-          <w:sz w:val="18"/>
-          <w:szCs w:val="18"/>
-        </w:rPr>
-        <w:t xml:space="preserve">, which is distilled toward </w:t>
-      </w:r>
-      <w:r>
-        <w:rPr>
-          <w:rFonts w:ascii="Times New Roman" w:cs="Times New Roman" w:eastAsia="Times New Roman" w:hAnsi="Times New Roman"/>
-          <w:i/>
-          <w:iCs/>
-          <w:sz w:val="18"/>
-          <w:szCs w:val="18"/>
-        </w:rPr>
-        <w:t xml:space="preserve">z</w:t>
-      </w:r>
-      <w:r>
-        <w:rPr>
-          <w:rFonts w:ascii="Times New Roman" w:cs="Times New Roman" w:eastAsia="Times New Roman" w:hAnsi="Times New Roman"/>
-          <w:i/>
-          <w:iCs/>
-          <w:sz w:val="18"/>
-          <w:szCs w:val="18"/>
-          <w:vertAlign w:val="subscript"/>
-        </w:rPr>
-        <w:t xml:space="preserve">i</w:t>
-      </w:r>
-      <w:r>
-        <w:rPr>
-          <w:rFonts w:ascii="Times New Roman" w:cs="Times New Roman" w:eastAsia="Times New Roman" w:hAnsi="Times New Roman"/>
-          <w:sz w:val="18"/>
-          <w:szCs w:val="18"/>
-        </w:rPr>
-        <w:t xml:space="preserve">. Hi-C is used only during training; at inference the model runs from sequence alone.</w:t>
+        <w:t xml:space="preserve">. Bottom: distance-detrended Hi-C contacts define a sparse graph (local and top-k distal edges), from which a fraction of distal edges is withheld as targets. Middle: contact-biased attention propagates information over graph edges only, with the measured strength and separation entering the attention logit through a learned edge bias. Structure dropout removes the whole distal graph for a fraction of training samples, so the same blocks also run on local edges alone (dashed), which is the Hi-C-free mode used at inference. Hi-C is used only during training.</w:t>
       </w:r>
     </w:p>
     <w:p>
@@ -1774,7 +1721,7 @@
           <w:sz w:val="22"/>
           <w:szCs w:val="22"/>
         </w:rPr>
-        <w:t xml:space="preserve">, so that no information crosses windows before the graph layers. The one-hot sequence first passes through a convolutional tower: a width-15 stem followed by five residual blocks, each consisting of batch normalisation, GELU, a width-5 convolution, batch normalisation, GELU and a pointwise convolution, and each followed by max-pooling by two. The tower detects local sequence motifs and reduces the 5,000 positions to 157, which is where most of the computational saving of the model comes from. Six bidirectional state-space layers then mix information along the window. Each direction is a diagonal state-space model [29,30] evaluated exactly as a long convolution in the frequency domain:</w:t>
+        <w:t xml:space="preserve">, so that no information crosses windows before the graph layers. The one-hot sequence first passes through a convolutional tower: a width-15 stem followed by five residual blocks, each consisting of batch normalisation, GELU, a width-5 convolution, batch normalisation, GELU and a pointwise convolution, and each followed by max-pooling by two. The tower detects local sequence motifs and reduces the 5,000 positions to 157, which is where most of the computational saving of the model comes from. Six bidirectional state-space layers then mix information along the window. Each direction is a diagonal state-space model [28,29] evaluated exactly as a long convolution in the frequency domain:</w:t>
       </w:r>
     </w:p>
     <w:p>
@@ -2662,7 +2609,7 @@
           <w:sz w:val="22"/>
           <w:szCs w:val="22"/>
         </w:rPr>
-        <w:t xml:space="preserve">3.6  Hi-C-free representations: structure dropout and structure distillation</w:t>
+        <w:t xml:space="preserve">3.6  Hi-C-free representations through structure dropout</w:t>
       </w:r>
     </w:p>
     <w:p>
@@ -2676,7 +2623,7 @@
           <w:sz w:val="22"/>
           <w:szCs w:val="22"/>
         </w:rPr>
-        <w:t xml:space="preserve">Hi-C is unavailable for most cell types and for any sequence a downstream user supplies, so a representation that requires it at inference has limited use. We therefore treat Hi-C as privileged information [25] and train the model to produce good representations without it. </w:t>
+        <w:t xml:space="preserve">Hi-C is unavailable for most cell types and for any sequence a downstream user supplies, so a representation that requires it at inference has limited use. We therefore treat Hi-C as privileged information [25] and train the model to produce its representation without it as well. </w:t>
       </w:r>
       <w:r>
         <w:rPr>
@@ -2799,121 +2746,7 @@
           <w:sz w:val="22"/>
           <w:szCs w:val="22"/>
         </w:rPr>
-        <w:t xml:space="preserve">Removing the whole graph rather than individual edges [35] matches the condition at inference exactly, where every distal edge is absent at once [36]. Dropout alone, however, only ensures that the Hi-C-free mode is in distribution; it gives that mode no direct access to what the contacts revealed. </w:t>
-      </w:r>
-      <w:r>
-        <w:rPr>
-          <w:rFonts w:ascii="Times New Roman" w:cs="Times New Roman" w:eastAsia="Times New Roman" w:hAnsi="Times New Roman"/>
-          <w:i/>
-          <w:iCs/>
-          <w:sz w:val="22"/>
-          <w:szCs w:val="22"/>
-        </w:rPr>
-        <w:t xml:space="preserve">Structure distillation</w:t>
-      </w:r>
-      <w:r>
-        <w:rPr>
-          <w:rFonts w:ascii="Times New Roman" w:cs="Times New Roman" w:eastAsia="Times New Roman" w:hAnsi="Times New Roman"/>
-          <w:sz w:val="22"/>
-          <w:szCs w:val="22"/>
-        </w:rPr>
-        <w:t xml:space="preserve"> supplies it. For every sample, the same encoder outputs </w:t>
-      </w:r>
-      <w:r>
-        <w:rPr>
-          <w:rFonts w:ascii="Times New Roman" w:cs="Times New Roman" w:eastAsia="Times New Roman" w:hAnsi="Times New Roman"/>
-          <w:i/>
-          <w:iCs/>
-          <w:sz w:val="22"/>
-          <w:szCs w:val="22"/>
-        </w:rPr>
-        <w:t xml:space="preserve">h</w:t>
-      </w:r>
-      <w:r>
-        <w:rPr>
-          <w:rFonts w:ascii="Times New Roman" w:cs="Times New Roman" w:eastAsia="Times New Roman" w:hAnsi="Times New Roman"/>
-          <w:i/>
-          <w:iCs/>
-          <w:sz w:val="22"/>
-          <w:szCs w:val="22"/>
-          <w:vertAlign w:val="subscript"/>
-        </w:rPr>
-        <w:t xml:space="preserve">i</w:t>
-      </w:r>
-      <w:r>
-        <w:rPr>
-          <w:rFonts w:ascii="Times New Roman" w:cs="Times New Roman" w:eastAsia="Times New Roman" w:hAnsi="Times New Roman"/>
-          <w:sz w:val="22"/>
-          <w:szCs w:val="22"/>
-        </w:rPr>
-        <w:t xml:space="preserve">, including any masking, are passed through the same attention blocks a second time with the distal graph removed, giving </w:t>
-      </w:r>
-      <w:r>
-        <w:rPr>
-          <w:rFonts w:ascii="Times New Roman" w:cs="Times New Roman" w:eastAsia="Times New Roman" w:hAnsi="Times New Roman"/>
-          <w:i/>
-          <w:iCs/>
-          <w:sz w:val="22"/>
-          <w:szCs w:val="22"/>
-        </w:rPr>
-        <w:t xml:space="preserve">z</w:t>
-      </w:r>
-      <w:r>
-        <w:rPr>
-          <w:rFonts w:ascii="Times New Roman" w:cs="Times New Roman" w:eastAsia="Times New Roman" w:hAnsi="Times New Roman"/>
-          <w:sz w:val="22"/>
-          <w:szCs w:val="22"/>
-          <w:vertAlign w:val="superscript"/>
-        </w:rPr>
-        <w:t xml:space="preserve">free</w:t>
-      </w:r>
-      <w:r>
-        <w:rPr>
-          <w:rFonts w:ascii="Times New Roman" w:cs="Times New Roman" w:eastAsia="Times New Roman" w:hAnsi="Times New Roman"/>
-          <w:i/>
-          <w:iCs/>
-          <w:sz w:val="22"/>
-          <w:szCs w:val="22"/>
-          <w:vertAlign w:val="subscript"/>
-        </w:rPr>
-        <w:t xml:space="preserve">i</w:t>
-      </w:r>
-      <w:r>
-        <w:rPr>
-          <w:rFonts w:ascii="Times New Roman" w:cs="Times New Roman" w:eastAsia="Times New Roman" w:hAnsi="Times New Roman"/>
-          <w:sz w:val="22"/>
-          <w:szCs w:val="22"/>
-        </w:rPr>
-        <w:t xml:space="preserve">, and this Hi-C-free representation is trained to match the Hi-C-conditioned </w:t>
-      </w:r>
-      <w:r>
-        <w:rPr>
-          <w:rFonts w:ascii="Times New Roman" w:cs="Times New Roman" w:eastAsia="Times New Roman" w:hAnsi="Times New Roman"/>
-          <w:i/>
-          <w:iCs/>
-          <w:sz w:val="22"/>
-          <w:szCs w:val="22"/>
-        </w:rPr>
-        <w:t xml:space="preserve">z</w:t>
-      </w:r>
-      <w:r>
-        <w:rPr>
-          <w:rFonts w:ascii="Times New Roman" w:cs="Times New Roman" w:eastAsia="Times New Roman" w:hAnsi="Times New Roman"/>
-          <w:i/>
-          <w:iCs/>
-          <w:sz w:val="22"/>
-          <w:szCs w:val="22"/>
-          <w:vertAlign w:val="subscript"/>
-        </w:rPr>
-        <w:t xml:space="preserve">i</w:t>
-      </w:r>
-      <w:r>
-        <w:rPr>
-          <w:rFonts w:ascii="Times New Roman" w:cs="Times New Roman" w:eastAsia="Times New Roman" w:hAnsi="Times New Roman"/>
-          <w:sz w:val="22"/>
-          <w:szCs w:val="22"/>
-        </w:rPr>
-        <w:t xml:space="preserve"> (Eq. (10)). The teacher is held fixed with a stop-gradient, so the conditioned pass cannot degrade toward the impoverished one to make the two agree. Because the local encoder runs once and only the graph blocks run twice, distillation adds little computation. At inference, the model is run in exactly the Hi-C-free mode that distillation trains.</w:t>
+        <w:t xml:space="preserve">Removing the whole graph rather than individual edges [34] reproduces the inference condition exactly, where every distal edge is absent at once [35]; edge-level dropout would only ever show the model a thinned graph and leave the fully Hi-C-free mode out of distribution. Local edges are never dropped, so the sequential backbone, and with it the model's knowledge of linear neighbourhood, is identical in both modes. Because one set of encoder weights, attention blocks and heads serves both modes, nothing is added at inference: the model is simply run in the mode that dropout trains, from DNA sequence alone.</w:t>
       </w:r>
     </w:p>
     <w:p>
@@ -2943,7 +2776,7 @@
           <w:sz w:val="22"/>
           <w:szCs w:val="22"/>
         </w:rPr>
-        <w:t xml:space="preserve">Four objectives train the model. The masked-window and contrastive terms are self-supervised with respect to the sequence; the contact and distillation terms use Hi-C, or the model's own Hi-C-conditioned pass, as training-time-only targets. No task labels are used.</w:t>
+        <w:t xml:space="preserve">Three objectives train the model. The masked-window term is self-supervised with respect to the sequence; the contrastive and contact terms use the held-out Hi-C target edges as training-time-only supervision. No task labels are used.</w:t>
       </w:r>
     </w:p>
     <w:p>
@@ -3403,7 +3236,7 @@
           <w:sz w:val="22"/>
           <w:szCs w:val="22"/>
         </w:rPr>
-        <w:t xml:space="preserve">Contact regression.</w:t>
+        <w:t xml:space="preserve">Contact prediction.</w:t>
       </w:r>
       <w:r>
         <w:rPr>
@@ -3429,7 +3262,7 @@
           <w:sz w:val="22"/>
           <w:szCs w:val="22"/>
         </w:rPr>
-        <w:t xml:space="preserve"> predicts each target edge's log observed-over-expected contact from the two window representations and their separation. Because </w:t>
+        <w:t xml:space="preserve"> predicts each target edge's strength from the two window representations and their separation, and is trained with binary cross-entropy against the measured strength </w:t>
       </w:r>
       <w:r>
         <w:rPr>
@@ -3444,188 +3277,29 @@
       <w:r>
         <w:rPr>
           <w:rFonts w:ascii="Times New Roman" w:cs="Times New Roman" w:eastAsia="Times New Roman" w:hAnsi="Times New Roman"/>
-          <w:sz w:val="22"/>
-          <w:szCs w:val="22"/>
-        </w:rPr>
-        <w:t xml:space="preserve"> = </w:t>
-      </w:r>
-      <w:r>
-        <w:rPr>
-          <w:rFonts w:ascii="Times New Roman" w:cs="Times New Roman" w:eastAsia="Times New Roman" w:hAnsi="Times New Roman"/>
-          <w:sz w:val="22"/>
-          <w:szCs w:val="22"/>
-        </w:rPr>
-        <w:t xml:space="preserve">O/E</w:t>
-      </w:r>
-      <w:r>
-        <w:rPr>
-          <w:rFonts w:ascii="Times New Roman" w:cs="Times New Roman" w:eastAsia="Times New Roman" w:hAnsi="Times New Roman"/>
-          <w:sz w:val="22"/>
-          <w:szCs w:val="22"/>
-        </w:rPr>
-        <w:t xml:space="preserve">/(1+</w:t>
-      </w:r>
-      <w:r>
-        <w:rPr>
-          <w:rFonts w:ascii="Times New Roman" w:cs="Times New Roman" w:eastAsia="Times New Roman" w:hAnsi="Times New Roman"/>
-          <w:sz w:val="22"/>
-          <w:szCs w:val="22"/>
-        </w:rPr>
-        <w:t xml:space="preserve">O/E</w:t>
-      </w:r>
-      <w:r>
-        <w:rPr>
-          <w:rFonts w:ascii="Times New Roman" w:cs="Times New Roman" w:eastAsia="Times New Roman" w:hAnsi="Times New Roman"/>
-          <w:sz w:val="22"/>
-          <w:szCs w:val="22"/>
-        </w:rPr>
-        <w:t xml:space="preserve">)</w:t>
-      </w:r>
-      <w:r>
-        <w:rPr>
-          <w:rFonts w:ascii="Times New Roman" w:cs="Times New Roman" w:eastAsia="Times New Roman" w:hAnsi="Times New Roman"/>
-          <w:sz w:val="22"/>
-          <w:szCs w:val="22"/>
-        </w:rPr>
-        <w:t xml:space="preserve">, the target </w:t>
-      </w:r>
-      <w:r>
-        <w:rPr>
-          <w:rFonts w:ascii="Times New Roman" w:cs="Times New Roman" w:eastAsia="Times New Roman" w:hAnsi="Times New Roman"/>
-          <w:sz w:val="22"/>
-          <w:szCs w:val="22"/>
-        </w:rPr>
-        <w:t xml:space="preserve">log</w:t>
-      </w:r>
-      <w:r>
-        <w:rPr>
-          <w:rFonts w:ascii="Times New Roman" w:cs="Times New Roman" w:eastAsia="Times New Roman" w:hAnsi="Times New Roman"/>
-          <w:sz w:val="22"/>
-          <w:szCs w:val="22"/>
-        </w:rPr>
-        <w:t xml:space="preserve"> </w:t>
-      </w:r>
-      <w:r>
-        <w:rPr>
-          <w:rFonts w:ascii="Times New Roman" w:cs="Times New Roman" w:eastAsia="Times New Roman" w:hAnsi="Times New Roman"/>
-          <w:sz w:val="22"/>
-          <w:szCs w:val="22"/>
-        </w:rPr>
-        <w:t xml:space="preserve">O/E</w:t>
-      </w:r>
-      <w:r>
-        <w:rPr>
-          <w:rFonts w:ascii="Times New Roman" w:cs="Times New Roman" w:eastAsia="Times New Roman" w:hAnsi="Times New Roman"/>
-          <w:sz w:val="22"/>
-          <w:szCs w:val="22"/>
-        </w:rPr>
-        <w:t xml:space="preserve"> equals the logit of </w:t>
-      </w:r>
-      <w:r>
-        <w:rPr>
-          <w:rFonts w:ascii="Times New Roman" w:cs="Times New Roman" w:eastAsia="Times New Roman" w:hAnsi="Times New Roman"/>
-          <w:i/>
-          <w:iCs/>
-          <w:sz w:val="22"/>
-          <w:szCs w:val="22"/>
-        </w:rPr>
-        <w:t xml:space="preserve">c</w:t>
-      </w:r>
-      <w:r>
-        <w:rPr>
-          <w:rFonts w:ascii="Times New Roman" w:cs="Times New Roman" w:eastAsia="Times New Roman" w:hAnsi="Times New Roman"/>
-          <w:sz w:val="22"/>
-          <w:szCs w:val="22"/>
-        </w:rPr>
-        <w:t xml:space="preserve">, so the head's output is a logit and </w:t>
-      </w:r>
-      <w:r>
-        <w:rPr>
-          <w:rFonts w:ascii="Times New Roman" w:cs="Times New Roman" w:eastAsia="Times New Roman" w:hAnsi="Times New Roman"/>
-          <w:i/>
-          <w:iCs/>
-          <w:sz w:val="22"/>
-          <w:szCs w:val="22"/>
-        </w:rPr>
-        <w:t xml:space="preserve">σ</w:t>
-      </w:r>
-      <w:r>
-        <w:rPr>
-          <w:rFonts w:ascii="Times New Roman" w:cs="Times New Roman" w:eastAsia="Times New Roman" w:hAnsi="Times New Roman"/>
-          <w:sz w:val="22"/>
-          <w:szCs w:val="22"/>
-        </w:rPr>
-        <w:t xml:space="preserve">(</w:t>
-      </w:r>
-      <w:r>
-        <w:rPr>
-          <w:rFonts w:ascii="Times New Roman" w:cs="Times New Roman" w:eastAsia="Times New Roman" w:hAnsi="Times New Roman"/>
-          <w:i/>
-          <w:iCs/>
-          <w:sz w:val="22"/>
-          <w:szCs w:val="22"/>
-        </w:rPr>
-        <w:t xml:space="preserve">f</w:t>
-      </w:r>
-      <w:r>
-        <w:rPr>
-          <w:rFonts w:ascii="Times New Roman" w:cs="Times New Roman" w:eastAsia="Times New Roman" w:hAnsi="Times New Roman"/>
-          <w:sz w:val="22"/>
-          <w:szCs w:val="22"/>
-        </w:rPr>
-        <w:t xml:space="preserve">)</w:t>
-      </w:r>
-      <w:r>
-        <w:rPr>
-          <w:rFonts w:ascii="Times New Roman" w:cs="Times New Roman" w:eastAsia="Times New Roman" w:hAnsi="Times New Roman"/>
-          <w:sz w:val="22"/>
-          <w:szCs w:val="22"/>
-        </w:rPr>
-        <w:t xml:space="preserve"> is a predicted strength. Regressing the logit directly, rather than applying binary cross-entropy against the soft strength, keeps the same optimum while avoiding the shrinkage of the cross-entropy gradient by </w:t>
-      </w:r>
-      <w:r>
-        <w:rPr>
-          <w:rFonts w:ascii="Times New Roman" w:cs="Times New Roman" w:eastAsia="Times New Roman" w:hAnsi="Times New Roman"/>
-          <w:i/>
-          <w:iCs/>
-          <w:sz w:val="22"/>
-          <w:szCs w:val="22"/>
-        </w:rPr>
-        <w:t xml:space="preserve">σ</w:t>
-      </w:r>
-      <w:r>
-        <w:rPr>
-          <w:rFonts w:ascii="Times New Roman" w:cs="Times New Roman" w:eastAsia="Times New Roman" w:hAnsi="Times New Roman"/>
-          <w:sz w:val="22"/>
-          <w:szCs w:val="22"/>
-        </w:rPr>
-        <w:t xml:space="preserve">'(</w:t>
-      </w:r>
-      <w:r>
-        <w:rPr>
-          <w:rFonts w:ascii="Times New Roman" w:cs="Times New Roman" w:eastAsia="Times New Roman" w:hAnsi="Times New Roman"/>
-          <w:i/>
-          <w:iCs/>
-          <w:sz w:val="22"/>
-          <w:szCs w:val="22"/>
-        </w:rPr>
-        <w:t xml:space="preserve">f</w:t>
-      </w:r>
-      <w:r>
-        <w:rPr>
-          <w:rFonts w:ascii="Times New Roman" w:cs="Times New Roman" w:eastAsia="Times New Roman" w:hAnsi="Times New Roman"/>
-          <w:sz w:val="22"/>
-          <w:szCs w:val="22"/>
-        </w:rPr>
-        <w:t xml:space="preserve">)</w:t>
-      </w:r>
-      <w:r>
-        <w:rPr>
-          <w:rFonts w:ascii="Times New Roman" w:cs="Times New Roman" w:eastAsia="Times New Roman" w:hAnsi="Times New Roman"/>
-          <w:sz w:val="22"/>
-          <w:szCs w:val="22"/>
-        </w:rPr>
-        <w:t xml:space="preserve">, which is small for the strongly enriched contacts that make up the targets:</w:t>
+          <w:i/>
+          <w:iCs/>
+          <w:sz w:val="22"/>
+          <w:szCs w:val="22"/>
+          <w:vertAlign w:val="subscript"/>
+        </w:rPr>
+        <w:t xml:space="preserve">ij</w:t>
+      </w:r>
+      <w:r>
+        <w:rPr>
+          <w:rFonts w:ascii="Times New Roman" w:cs="Times New Roman" w:eastAsia="Times New Roman" w:hAnsi="Times New Roman"/>
+          <w:sz w:val="22"/>
+          <w:szCs w:val="22"/>
+        </w:rPr>
+        <w:t xml:space="preserve"> ∈ (0, 1)</w:t>
+      </w:r>
+      <w:r>
+        <w:rPr>
+          <w:rFonts w:ascii="Times New Roman" w:cs="Times New Roman" w:eastAsia="Times New Roman" w:hAnsi="Times New Roman"/>
+          <w:sz w:val="22"/>
+          <w:szCs w:val="22"/>
+        </w:rPr>
+        <w:t xml:space="preserve"> as a soft target. Because the targets are soft, the loss is bounded below by their entropy rather than by zero, so its absolute value is not a measure of quality; we therefore evaluate contact prediction by correlation (Section 3.8), not by loss:</w:t>
       </w:r>
     </w:p>
     <w:p>
@@ -3647,7 +3321,7 @@
       <w:r>
         <w:drawing>
           <wp:inline distT="0" distB="0" distL="0" distR="0">
-            <wp:extent cx="5095875" cy="333375"/>
+            <wp:extent cx="5095875" cy="285750"/>
             <wp:effectExtent t="0" r="0" b="0" l="0"/>
             <wp:docPr id="12" name="eq_l_contact" descr="l_contact" title="Equation 9"/>
             <wp:cNvGraphicFramePr>
@@ -3672,7 +3346,7 @@
                   <pic:spPr bwMode="auto">
                     <a:xfrm>
                       <a:off x="0" y="0"/>
-                      <a:ext cx="5095875" cy="333375"/>
+                      <a:ext cx="5095875" cy="285750"/>
                     </a:xfrm>
                     <a:prstGeom prst="rect">
                       <a:avLst/>
@@ -3701,38 +3375,10 @@
       <w:r>
         <w:rPr>
           <w:rFonts w:ascii="Times New Roman" w:cs="Times New Roman" w:eastAsia="Times New Roman" w:hAnsi="Times New Roman"/>
-          <w:i/>
-          <w:iCs/>
-          <w:sz w:val="22"/>
-          <w:szCs w:val="22"/>
-        </w:rPr>
-        <w:t xml:space="preserve">Structure distillation</w:t>
-      </w:r>
-      <w:r>
-        <w:rPr>
-          <w:rFonts w:ascii="Times New Roman" w:cs="Times New Roman" w:eastAsia="Times New Roman" w:hAnsi="Times New Roman"/>
-          <w:sz w:val="22"/>
-          <w:szCs w:val="22"/>
-        </w:rPr>
-        <w:t xml:space="preserve"> is defined over the set </w:t>
-      </w:r>
-      <w:r>
-        <w:rPr>
-          <w:rFonts w:ascii="Times New Roman" w:cs="Times New Roman" w:eastAsia="Times New Roman" w:hAnsi="Times New Roman"/>
-          <w:i/>
-          <w:iCs/>
-          <w:sz w:val="22"/>
-          <w:szCs w:val="22"/>
-        </w:rPr>
-        <w:t xml:space="preserve">V</w:t>
-      </w:r>
-      <w:r>
-        <w:rPr>
-          <w:rFonts w:ascii="Times New Roman" w:cs="Times New Roman" w:eastAsia="Times New Roman" w:hAnsi="Times New Roman"/>
-          <w:sz w:val="22"/>
-          <w:szCs w:val="22"/>
-        </w:rPr>
-        <w:t xml:space="preserve"> of usable windows as</w:t>
+          <w:sz w:val="22"/>
+          <w:szCs w:val="22"/>
+        </w:rPr>
+        <w:t xml:space="preserve">The total objective is</w:t>
       </w:r>
     </w:p>
     <w:p>
@@ -3754,9 +3400,9 @@
       <w:r>
         <w:drawing>
           <wp:inline distT="0" distB="0" distL="0" distR="0">
-            <wp:extent cx="1809750" cy="333375"/>
+            <wp:extent cx="2562225" cy="171450"/>
             <wp:effectExtent t="0" r="0" b="0" l="0"/>
-            <wp:docPr id="13" name="eq_l_distill" descr="l_distill" title="Equation 10"/>
+            <wp:docPr id="13" name="eq_l_total" descr="l_total" title="Equation 10"/>
             <wp:cNvGraphicFramePr>
               <a:graphicFrameLocks xmlns:a="http://schemas.openxmlformats.org/drawingml/2006/main" noChangeAspect="1"/>
             </wp:cNvGraphicFramePr>
@@ -3779,7 +3425,7 @@
                   <pic:spPr bwMode="auto">
                     <a:xfrm>
                       <a:off x="0" y="0"/>
-                      <a:ext cx="1809750" cy="333375"/>
+                      <a:ext cx="2562225" cy="171450"/>
                     </a:xfrm>
                     <a:prstGeom prst="rect">
                       <a:avLst/>
@@ -3811,72 +3457,128 @@
           <w:sz w:val="22"/>
           <w:szCs w:val="22"/>
         </w:rPr>
-        <w:t xml:space="preserve">and the total objective is</w:t>
-      </w:r>
-    </w:p>
-    <w:p>
-      <w:pPr>
-        <w:tabs>
-          <w:tab w:val="center" w:pos="4514"/>
-          <w:tab w:val="right" w:pos="9026"/>
-        </w:tabs>
-        <w:spacing w:after="100" w:before="100"/>
-      </w:pPr>
-      <w:r>
-        <w:rPr>
-          <w:rFonts w:ascii="Times New Roman" w:cs="Times New Roman" w:eastAsia="Times New Roman" w:hAnsi="Times New Roman"/>
-          <w:sz w:val="22"/>
-          <w:szCs w:val="22"/>
-        </w:rPr>
-        <w:t xml:space="preserve">	</w:t>
-      </w:r>
-      <w:r>
-        <w:drawing>
-          <wp:inline distT="0" distB="0" distL="0" distR="0">
-            <wp:extent cx="3400425" cy="171450"/>
-            <wp:effectExtent t="0" r="0" b="0" l="0"/>
-            <wp:docPr id="14" name="eq_l_total" descr="l_total" title="Equation 11"/>
-            <wp:cNvGraphicFramePr>
-              <a:graphicFrameLocks xmlns:a="http://schemas.openxmlformats.org/drawingml/2006/main" noChangeAspect="1"/>
-            </wp:cNvGraphicFramePr>
-            <a:graphic xmlns:a="http://schemas.openxmlformats.org/drawingml/2006/main">
-              <a:graphicData uri="http://schemas.openxmlformats.org/drawingml/2006/picture">
-                <pic:pic xmlns:pic="http://schemas.openxmlformats.org/drawingml/2006/picture">
-                  <pic:nvPicPr>
-                    <pic:cNvPr id="0" name="" descr=""/>
-                    <pic:cNvPicPr>
-                      <a:picLocks noChangeAspect="1" noChangeArrowheads="1"/>
-                    </pic:cNvPicPr>
-                  </pic:nvPicPr>
-                  <pic:blipFill>
-                    <a:blip r:embed="rId21" cstate="none"/>
-                    <a:srcRect/>
-                    <a:stretch>
-                      <a:fillRect/>
-                    </a:stretch>
-                  </pic:blipFill>
-                  <pic:spPr bwMode="auto">
-                    <a:xfrm>
-                      <a:off x="0" y="0"/>
-                      <a:ext cx="3400425" cy="171450"/>
-                    </a:xfrm>
-                    <a:prstGeom prst="rect">
-                      <a:avLst/>
-                    </a:prstGeom>
-                  </pic:spPr>
-                </pic:pic>
-              </a:graphicData>
-            </a:graphic>
-          </wp:inline>
-        </w:drawing>
-      </w:r>
-      <w:r>
-        <w:rPr>
-          <w:rFonts w:ascii="Times New Roman" w:cs="Times New Roman" w:eastAsia="Times New Roman" w:hAnsi="Times New Roman"/>
-          <w:sz w:val="22"/>
-          <w:szCs w:val="22"/>
-        </w:rPr>
-        <w:t xml:space="preserve">	(11)</w:t>
+        <w:t xml:space="preserve">with </w:t>
+      </w:r>
+      <w:r>
+        <w:rPr>
+          <w:rFonts w:ascii="Times New Roman" w:cs="Times New Roman" w:eastAsia="Times New Roman" w:hAnsi="Times New Roman"/>
+          <w:i/>
+          <w:iCs/>
+          <w:sz w:val="22"/>
+          <w:szCs w:val="22"/>
+        </w:rPr>
+        <w:t xml:space="preserve">λ</w:t>
+      </w:r>
+      <w:r>
+        <w:rPr>
+          <w:rFonts w:ascii="Times New Roman" w:cs="Times New Roman" w:eastAsia="Times New Roman" w:hAnsi="Times New Roman"/>
+          <w:sz w:val="22"/>
+          <w:szCs w:val="22"/>
+          <w:vertAlign w:val="subscript"/>
+        </w:rPr>
+        <w:t xml:space="preserve">mask</w:t>
+      </w:r>
+      <w:r>
+        <w:rPr>
+          <w:rFonts w:ascii="Times New Roman" w:cs="Times New Roman" w:eastAsia="Times New Roman" w:hAnsi="Times New Roman"/>
+          <w:sz w:val="22"/>
+          <w:szCs w:val="22"/>
+        </w:rPr>
+        <w:t xml:space="preserve"> = 1</w:t>
+      </w:r>
+      <w:r>
+        <w:rPr>
+          <w:rFonts w:ascii="Times New Roman" w:cs="Times New Roman" w:eastAsia="Times New Roman" w:hAnsi="Times New Roman"/>
+          <w:sz w:val="22"/>
+          <w:szCs w:val="22"/>
+        </w:rPr>
+        <w:t xml:space="preserve">, </w:t>
+      </w:r>
+      <w:r>
+        <w:rPr>
+          <w:rFonts w:ascii="Times New Roman" w:cs="Times New Roman" w:eastAsia="Times New Roman" w:hAnsi="Times New Roman"/>
+          <w:i/>
+          <w:iCs/>
+          <w:sz w:val="22"/>
+          <w:szCs w:val="22"/>
+        </w:rPr>
+        <w:t xml:space="preserve">λ</w:t>
+      </w:r>
+      <w:r>
+        <w:rPr>
+          <w:rFonts w:ascii="Times New Roman" w:cs="Times New Roman" w:eastAsia="Times New Roman" w:hAnsi="Times New Roman"/>
+          <w:sz w:val="22"/>
+          <w:szCs w:val="22"/>
+          <w:vertAlign w:val="subscript"/>
+        </w:rPr>
+        <w:t xml:space="preserve">con</w:t>
+      </w:r>
+      <w:r>
+        <w:rPr>
+          <w:rFonts w:ascii="Times New Roman" w:cs="Times New Roman" w:eastAsia="Times New Roman" w:hAnsi="Times New Roman"/>
+          <w:sz w:val="22"/>
+          <w:szCs w:val="22"/>
+        </w:rPr>
+        <w:t xml:space="preserve"> = 0.5</w:t>
+      </w:r>
+      <w:r>
+        <w:rPr>
+          <w:rFonts w:ascii="Times New Roman" w:cs="Times New Roman" w:eastAsia="Times New Roman" w:hAnsi="Times New Roman"/>
+          <w:sz w:val="22"/>
+          <w:szCs w:val="22"/>
+        </w:rPr>
+        <w:t xml:space="preserve"> and </w:t>
+      </w:r>
+      <w:r>
+        <w:rPr>
+          <w:rFonts w:ascii="Times New Roman" w:cs="Times New Roman" w:eastAsia="Times New Roman" w:hAnsi="Times New Roman"/>
+          <w:i/>
+          <w:iCs/>
+          <w:sz w:val="22"/>
+          <w:szCs w:val="22"/>
+        </w:rPr>
+        <w:t xml:space="preserve">λ</w:t>
+      </w:r>
+      <w:r>
+        <w:rPr>
+          <w:rFonts w:ascii="Times New Roman" w:cs="Times New Roman" w:eastAsia="Times New Roman" w:hAnsi="Times New Roman"/>
+          <w:sz w:val="22"/>
+          <w:szCs w:val="22"/>
+          <w:vertAlign w:val="subscript"/>
+        </w:rPr>
+        <w:t xml:space="preserve">contact</w:t>
+      </w:r>
+      <w:r>
+        <w:rPr>
+          <w:rFonts w:ascii="Times New Roman" w:cs="Times New Roman" w:eastAsia="Times New Roman" w:hAnsi="Times New Roman"/>
+          <w:sz w:val="22"/>
+          <w:szCs w:val="22"/>
+        </w:rPr>
+        <w:t xml:space="preserve"> = 1</w:t>
+      </w:r>
+      <w:r>
+        <w:rPr>
+          <w:rFonts w:ascii="Times New Roman" w:cs="Times New Roman" w:eastAsia="Times New Roman" w:hAnsi="Times New Roman"/>
+          <w:sz w:val="22"/>
+          <w:szCs w:val="22"/>
+        </w:rPr>
+        <w:t xml:space="preserve">. Control arms that have no structural signal train only the terms their signal defines (Table 1).</w:t>
+      </w:r>
+    </w:p>
+    <w:p>
+      <w:pPr>
+        <w:pStyle w:val="Heading2"/>
+        <w:spacing w:after="80" w:before="200"/>
+      </w:pPr>
+      <w:r>
+        <w:rPr>
+          <w:rFonts w:ascii="Times New Roman" w:cs="Times New Roman" w:eastAsia="Times New Roman" w:hAnsi="Times New Roman"/>
+          <w:b/>
+          <w:bCs/>
+          <w:sz w:val="22"/>
+          <w:szCs w:val="22"/>
+        </w:rPr>
+        <w:t xml:space="preserve">3.8  Controlled experimental design and pre-registered protocol</w:t>
       </w:r>
     </w:p>
     <w:p>
@@ -3890,152 +3592,168 @@
           <w:sz w:val="22"/>
           <w:szCs w:val="22"/>
         </w:rPr>
-        <w:t xml:space="preserve">with </w:t>
-      </w:r>
-      <w:r>
-        <w:rPr>
-          <w:rFonts w:ascii="Times New Roman" w:cs="Times New Roman" w:eastAsia="Times New Roman" w:hAnsi="Times New Roman"/>
-          <w:i/>
-          <w:iCs/>
-          <w:sz w:val="22"/>
-          <w:szCs w:val="22"/>
-        </w:rPr>
-        <w:t xml:space="preserve">λ</w:t>
-      </w:r>
-      <w:r>
-        <w:rPr>
-          <w:rFonts w:ascii="Times New Roman" w:cs="Times New Roman" w:eastAsia="Times New Roman" w:hAnsi="Times New Roman"/>
-          <w:sz w:val="22"/>
-          <w:szCs w:val="22"/>
-          <w:vertAlign w:val="subscript"/>
-        </w:rPr>
-        <w:t xml:space="preserve">mask</w:t>
-      </w:r>
-      <w:r>
-        <w:rPr>
-          <w:rFonts w:ascii="Times New Roman" w:cs="Times New Roman" w:eastAsia="Times New Roman" w:hAnsi="Times New Roman"/>
-          <w:sz w:val="22"/>
-          <w:szCs w:val="22"/>
-        </w:rPr>
-        <w:t xml:space="preserve"> = 1</w:t>
-      </w:r>
-      <w:r>
-        <w:rPr>
-          <w:rFonts w:ascii="Times New Roman" w:cs="Times New Roman" w:eastAsia="Times New Roman" w:hAnsi="Times New Roman"/>
-          <w:sz w:val="22"/>
-          <w:szCs w:val="22"/>
-        </w:rPr>
-        <w:t xml:space="preserve">, </w:t>
-      </w:r>
-      <w:r>
-        <w:rPr>
-          <w:rFonts w:ascii="Times New Roman" w:cs="Times New Roman" w:eastAsia="Times New Roman" w:hAnsi="Times New Roman"/>
-          <w:i/>
-          <w:iCs/>
-          <w:sz w:val="22"/>
-          <w:szCs w:val="22"/>
-        </w:rPr>
-        <w:t xml:space="preserve">λ</w:t>
-      </w:r>
-      <w:r>
-        <w:rPr>
-          <w:rFonts w:ascii="Times New Roman" w:cs="Times New Roman" w:eastAsia="Times New Roman" w:hAnsi="Times New Roman"/>
-          <w:sz w:val="22"/>
-          <w:szCs w:val="22"/>
-          <w:vertAlign w:val="subscript"/>
-        </w:rPr>
-        <w:t xml:space="preserve">con</w:t>
-      </w:r>
-      <w:r>
-        <w:rPr>
-          <w:rFonts w:ascii="Times New Roman" w:cs="Times New Roman" w:eastAsia="Times New Roman" w:hAnsi="Times New Roman"/>
-          <w:sz w:val="22"/>
-          <w:szCs w:val="22"/>
-        </w:rPr>
-        <w:t xml:space="preserve"> = 0.5</w:t>
-      </w:r>
-      <w:r>
-        <w:rPr>
-          <w:rFonts w:ascii="Times New Roman" w:cs="Times New Roman" w:eastAsia="Times New Roman" w:hAnsi="Times New Roman"/>
-          <w:sz w:val="22"/>
-          <w:szCs w:val="22"/>
-        </w:rPr>
-        <w:t xml:space="preserve">, </w:t>
-      </w:r>
-      <w:r>
-        <w:rPr>
-          <w:rFonts w:ascii="Times New Roman" w:cs="Times New Roman" w:eastAsia="Times New Roman" w:hAnsi="Times New Roman"/>
-          <w:i/>
-          <w:iCs/>
-          <w:sz w:val="22"/>
-          <w:szCs w:val="22"/>
-        </w:rPr>
-        <w:t xml:space="preserve">λ</w:t>
-      </w:r>
-      <w:r>
-        <w:rPr>
-          <w:rFonts w:ascii="Times New Roman" w:cs="Times New Roman" w:eastAsia="Times New Roman" w:hAnsi="Times New Roman"/>
-          <w:sz w:val="22"/>
-          <w:szCs w:val="22"/>
-          <w:vertAlign w:val="subscript"/>
-        </w:rPr>
-        <w:t xml:space="preserve">contact</w:t>
-      </w:r>
-      <w:r>
-        <w:rPr>
-          <w:rFonts w:ascii="Times New Roman" w:cs="Times New Roman" w:eastAsia="Times New Roman" w:hAnsi="Times New Roman"/>
-          <w:sz w:val="22"/>
-          <w:szCs w:val="22"/>
-        </w:rPr>
-        <w:t xml:space="preserve"> = 1</w:t>
-      </w:r>
-      <w:r>
-        <w:rPr>
-          <w:rFonts w:ascii="Times New Roman" w:cs="Times New Roman" w:eastAsia="Times New Roman" w:hAnsi="Times New Roman"/>
-          <w:sz w:val="22"/>
-          <w:szCs w:val="22"/>
-        </w:rPr>
-        <w:t xml:space="preserve"> and </w:t>
-      </w:r>
-      <w:r>
-        <w:rPr>
-          <w:rFonts w:ascii="Times New Roman" w:cs="Times New Roman" w:eastAsia="Times New Roman" w:hAnsi="Times New Roman"/>
-          <w:i/>
-          <w:iCs/>
-          <w:sz w:val="22"/>
-          <w:szCs w:val="22"/>
-        </w:rPr>
-        <w:t xml:space="preserve">λ</w:t>
-      </w:r>
-      <w:r>
-        <w:rPr>
-          <w:rFonts w:ascii="Times New Roman" w:cs="Times New Roman" w:eastAsia="Times New Roman" w:hAnsi="Times New Roman"/>
-          <w:sz w:val="22"/>
-          <w:szCs w:val="22"/>
-          <w:vertAlign w:val="subscript"/>
-        </w:rPr>
-        <w:t xml:space="preserve">distill</w:t>
-      </w:r>
-      <w:r>
-        <w:rPr>
-          <w:rFonts w:ascii="Times New Roman" w:cs="Times New Roman" w:eastAsia="Times New Roman" w:hAnsi="Times New Roman"/>
-          <w:sz w:val="22"/>
-          <w:szCs w:val="22"/>
-        </w:rPr>
-        <w:t xml:space="preserve"> = 1</w:t>
-      </w:r>
-      <w:r>
-        <w:rPr>
-          <w:rFonts w:ascii="Times New Roman" w:cs="Times New Roman" w:eastAsia="Times New Roman" w:hAnsi="Times New Roman"/>
-          <w:sz w:val="22"/>
-          <w:szCs w:val="22"/>
-        </w:rPr>
-        <w:t xml:space="preserve">.</w:t>
-      </w:r>
-    </w:p>
-    <w:p>
-      <w:pPr>
-        <w:pStyle w:val="Heading2"/>
+        <w:t xml:space="preserve">The claim that measured contacts improve a sequence representation is only meaningful against controls that remove everything else a graph-conditioned model has. We therefore train six control arms (Table 1) through the same code path as the full model, with the same architecture and parameter count, the same training windows, the same number of optimisation steps, the same pretraining recipe and the same held-out targets; only the structural signal differs. Each corruption is drawn from the fixed control seed, so every training seed sees the identical corrupted graph and seed variance cannot be confused with corruption variance. The arms are designed to be read in pairs: B0 against the full model asks whether structure helps at all; B1 asks whether any graph regularisation would do; B2 isolates genomic distance; B3, which keeps the measured topology but permutes strengths among edges, isolates the pairing of strength to edge; B4 asks whether conditioning inside the encoder is better than adding Hi-C features after it; and B5 asks whether Hi-C as a contrastive alignment target alone suffices.</w:t>
+      </w:r>
+    </w:p>
+    <w:p>
+      <w:pPr>
+        <w:spacing w:after="120" w:line="276"/>
+        <w:jc w:val="both"/>
+      </w:pPr>
+      <w:r>
+        <w:rPr>
+          <w:rFonts w:ascii="Times New Roman" w:cs="Times New Roman" w:eastAsia="Times New Roman" w:hAnsi="Times New Roman"/>
+          <w:i/>
+          <w:iCs/>
+          <w:sz w:val="22"/>
+          <w:szCs w:val="22"/>
+        </w:rPr>
+        <w:t xml:space="preserve">Splits.</w:t>
+      </w:r>
+      <w:r>
+        <w:rPr>
+          <w:rFonts w:ascii="Times New Roman" w:cs="Times New Roman" w:eastAsia="Times New Roman" w:hAnsi="Times New Roman"/>
+          <w:sz w:val="22"/>
+          <w:szCs w:val="22"/>
+        </w:rPr>
+        <w:t xml:space="preserve"> Hi-C is autocorrelated over megabases, so random window splits would leak. We split by chromosome: chr3, chr13 and chr17 form the test set, chr10 and chr11 the validation set, and the remaining 17 autosomes the training set (6,284 training samples at a stride of half a sample). All model and recipe decisions are made on the validation chromosomes; the test chromosomes are scored once, for the final table. One exception is disclosed: an evaluation bug, since fixed, read the test split for the full model and B3 at exploratory seed 0, so those two seed-0 test numbers are reported only as exploratory.</w:t>
+      </w:r>
+    </w:p>
+    <w:p>
+      <w:pPr>
+        <w:spacing w:after="120" w:line="276"/>
+        <w:jc w:val="both"/>
+      </w:pPr>
+      <w:r>
+        <w:rPr>
+          <w:rFonts w:ascii="Times New Roman" w:cs="Times New Roman" w:eastAsia="Times New Roman" w:hAnsi="Times New Roman"/>
+          <w:i/>
+          <w:iCs/>
+          <w:sz w:val="22"/>
+          <w:szCs w:val="22"/>
+        </w:rPr>
+        <w:t xml:space="preserve">Headline setting and metric.</w:t>
+      </w:r>
+      <w:r>
+        <w:rPr>
+          <w:rFonts w:ascii="Times New Roman" w:cs="Times New Roman" w:eastAsia="Times New Roman" w:hAnsi="Times New Roman"/>
+          <w:sz w:val="22"/>
+          <w:szCs w:val="22"/>
+        </w:rPr>
+        <w:t xml:space="preserve"> Every arm is evaluated with Hi-C removed at inference, so that the only difference between arms is what shaped their weights during pretraining. Results with the graph present are reported separately as an upper bound with privileged input and are never compared with a sequence-only baseline. The headline metric is the Pearson correlation between predicted and measured strength on held-out target edges, stratified by separation into short (&lt;50 kb), medium (50–150 kb) and long (≥150 kb) bands, because a single correlation is dominated by short-range contacts; the long-range band is the primary endpoint.</w:t>
+      </w:r>
+    </w:p>
+    <w:p>
+      <w:pPr>
+        <w:spacing w:after="120" w:line="276"/>
+        <w:jc w:val="both"/>
+      </w:pPr>
+      <w:r>
+        <w:rPr>
+          <w:rFonts w:ascii="Times New Roman" w:cs="Times New Roman" w:eastAsia="Times New Roman" w:hAnsi="Times New Roman"/>
+          <w:i/>
+          <w:iCs/>
+          <w:sz w:val="22"/>
+          <w:szCs w:val="22"/>
+        </w:rPr>
+        <w:t xml:space="preserve">Two read-outs.</w:t>
+      </w:r>
+      <w:r>
+        <w:rPr>
+          <w:rFonts w:ascii="Times New Roman" w:cs="Times New Roman" w:eastAsia="Times New Roman" w:hAnsi="Times New Roman"/>
+          <w:sz w:val="22"/>
+          <w:szCs w:val="22"/>
+        </w:rPr>
+        <w:t xml:space="preserve"> The </w:t>
+      </w:r>
+      <w:r>
+        <w:rPr>
+          <w:rFonts w:ascii="Times New Roman" w:cs="Times New Roman" w:eastAsia="Times New Roman" w:hAnsi="Times New Roman"/>
+          <w:i/>
+          <w:iCs/>
+          <w:sz w:val="22"/>
+          <w:szCs w:val="22"/>
+        </w:rPr>
+        <w:t xml:space="preserve">head</w:t>
+      </w:r>
+      <w:r>
+        <w:rPr>
+          <w:rFonts w:ascii="Times New Roman" w:cs="Times New Roman" w:eastAsia="Times New Roman" w:hAnsi="Times New Roman"/>
+          <w:sz w:val="22"/>
+          <w:szCs w:val="22"/>
+        </w:rPr>
+        <w:t xml:space="preserve"> read-out uses each model's own contact head, and is valid only for arms that train one. The </w:t>
+      </w:r>
+      <w:r>
+        <w:rPr>
+          <w:rFonts w:ascii="Times New Roman" w:cs="Times New Roman" w:eastAsia="Times New Roman" w:hAnsi="Times New Roman"/>
+          <w:i/>
+          <w:iCs/>
+          <w:sz w:val="22"/>
+          <w:szCs w:val="22"/>
+        </w:rPr>
+        <w:t xml:space="preserve">probe</w:t>
+      </w:r>
+      <w:r>
+        <w:rPr>
+          <w:rFonts w:ascii="Times New Roman" w:cs="Times New Roman" w:eastAsia="Times New Roman" w:hAnsi="Times New Roman"/>
+          <w:sz w:val="22"/>
+          <w:szCs w:val="22"/>
+        </w:rPr>
+        <w:t xml:space="preserve"> read-out fits a fresh contact head of the same architecture on frozen Hi-C-free representations, with the same training pairs, epochs and probe seed for every arm. The probe is the only valid read-out for B0 and B5, whose pretraining trains no contact head, and it compares all arms on representation quality alone, independently of how well each trained its own head.</w:t>
+      </w:r>
+    </w:p>
+    <w:p>
+      <w:pPr>
+        <w:spacing w:after="120" w:line="276"/>
+        <w:jc w:val="both"/>
+      </w:pPr>
+      <w:r>
+        <w:rPr>
+          <w:rFonts w:ascii="Times New Roman" w:cs="Times New Roman" w:eastAsia="Times New Roman" w:hAnsi="Times New Roman"/>
+          <w:i/>
+          <w:iCs/>
+          <w:sz w:val="22"/>
+          <w:szCs w:val="22"/>
+        </w:rPr>
+        <w:t xml:space="preserve">Recipe selection (exploratory).</w:t>
+      </w:r>
+      <w:r>
+        <w:rPr>
+          <w:rFonts w:ascii="Times New Roman" w:cs="Times New Roman" w:eastAsia="Times New Roman" w:hAnsi="Times New Roman"/>
+          <w:sz w:val="22"/>
+          <w:szCs w:val="22"/>
+        </w:rPr>
+        <w:t xml:space="preserve"> Two pretraining recipes were screened on training seed 0 before confirmation: the recipe described above, and a variant that regressed log(O/E) with a squared error instead of the soft-target cross-entropy and added a structure-distillation term pulling the Hi-C-free pass toward the Hi-C-conditioned one [36]. A rule fixed in advance selected the variant only if, on the validation chromosomes, it raised the full model's score and gave a margin over B3 whose 95% interval excluded zero and exceeded the original recipe's margin; otherwise the recipe above was kept. The rule selected the recipe above, which was then frozen for every arm. Seed 0 is therefore exploratory for every arm and is never used as confirmatory evidence.</w:t>
+      </w:r>
+    </w:p>
+    <w:p>
+      <w:pPr>
+        <w:spacing w:after="120" w:line="276"/>
+        <w:jc w:val="both"/>
+      </w:pPr>
+      <w:r>
+        <w:rPr>
+          <w:rFonts w:ascii="Times New Roman" w:cs="Times New Roman" w:eastAsia="Times New Roman" w:hAnsi="Times New Roman"/>
+          <w:i/>
+          <w:iCs/>
+          <w:sz w:val="22"/>
+          <w:szCs w:val="22"/>
+        </w:rPr>
+        <w:t xml:space="preserve">Pre-registered decision rule.</w:t>
+      </w:r>
+      <w:r>
+        <w:rPr>
+          <w:rFonts w:ascii="Times New Roman" w:cs="Times New Roman" w:eastAsia="Times New Roman" w:hAnsi="Times New Roman"/>
+          <w:sz w:val="22"/>
+          <w:szCs w:val="22"/>
+        </w:rPr>
+        <w:t xml:space="preserve"> The claims, the statistic and the decision rule were fixed in writing before any confirmatory run was evaluated. Confirmation uses fresh seeds 1–3 for the full model, B3, B0 and B1, at 20,000 steps each, on the validation chromosomes. For a comparison X − Y, 10,000 paired bootstrap resamples of validation samples give a 95% interval for the seed-averaged difference, and X is said to beat Y only if the interval lies above zero and X − Y &gt; 0 in at least two of the three seeds. Claim A, that measured strengths matter, requires the full model to beat B3 on the head read-out. Claim B, that measured topology matters, requires both the full model and B3 to beat both B0 and B1 on the probe read-out; because all four comparisons must pass, no multiple-comparison correction is needed. Every combination of outcomes maps to a pre-specified statement, including a controlled negative result. B2, B4 and B5 and the distance strata other than long range are reported as secondary comparisons, whatever the outcome.</w:t>
+      </w:r>
+    </w:p>
+    <w:p>
+      <w:pPr>
+        <w:keepNext/>
         <w:spacing w:after="80" w:before="200"/>
       </w:pPr>
       <w:r>
@@ -4043,103 +3761,11 @@
           <w:rFonts w:ascii="Times New Roman" w:cs="Times New Roman" w:eastAsia="Times New Roman" w:hAnsi="Times New Roman"/>
           <w:b/>
           <w:bCs/>
-          <w:sz w:val="22"/>
-          <w:szCs w:val="22"/>
-        </w:rPr>
-        <w:t xml:space="preserve">3.8  Controlled experimental design</w:t>
-      </w:r>
-    </w:p>
-    <w:p>
-      <w:pPr>
-        <w:spacing w:after="120" w:line="276"/>
-        <w:jc w:val="both"/>
-      </w:pPr>
-      <w:r>
-        <w:rPr>
-          <w:rFonts w:ascii="Times New Roman" w:cs="Times New Roman" w:eastAsia="Times New Roman" w:hAnsi="Times New Roman"/>
-          <w:sz w:val="22"/>
-          <w:szCs w:val="22"/>
-        </w:rPr>
-        <w:t xml:space="preserve">The claim that measured contacts improve a sequence representation is only meaningful against controls that remove everything else a graph-conditioned model has. We therefore train six control arms (Table 1) through the same code path as the full model, with the same architecture and parameter count, the same training windows, the same number of optimisation steps, the same pretraining recipe and the same held-out targets; only the structural signal differs. Each corruption is drawn from the fixed control seed, so every training seed sees the identical corrupted graph and seed variance cannot be confused with corruption variance. The arms are designed to be read in pairs: B0 against the full model asks whether structure helps at all; B1 asks whether any graph regularisation would do; B2 isolates genomic distance; B3, which keeps the measured topology but permutes strengths among edges, isolates the pairing of strength to edge; B4 asks whether conditioning inside the encoder is better than adding Hi-C features after it; and B5 asks whether Hi-C as a contrastive alignment target alone suffices.</w:t>
-      </w:r>
-    </w:p>
-    <w:p>
-      <w:pPr>
-        <w:spacing w:after="120" w:line="276"/>
-        <w:jc w:val="both"/>
-      </w:pPr>
-      <w:r>
-        <w:rPr>
-          <w:rFonts w:ascii="Times New Roman" w:cs="Times New Roman" w:eastAsia="Times New Roman" w:hAnsi="Times New Roman"/>
-          <w:i/>
-          <w:iCs/>
-          <w:sz w:val="22"/>
-          <w:szCs w:val="22"/>
-        </w:rPr>
-        <w:t xml:space="preserve">Splits.</w:t>
-      </w:r>
-      <w:r>
-        <w:rPr>
-          <w:rFonts w:ascii="Times New Roman" w:cs="Times New Roman" w:eastAsia="Times New Roman" w:hAnsi="Times New Roman"/>
-          <w:sz w:val="22"/>
-          <w:szCs w:val="22"/>
-        </w:rPr>
-        <w:t xml:space="preserve"> Hi-C is autocorrelated over megabases, so random window splits would leak. We split by chromosome: chr3, chr13 and chr17 form the test set, chr10 and chr11 the validation set, and the remaining 17 autosomes the training set (6,284 training samples at a stride of half a sample). All model and recipe decisions are made on the validation chromosomes; the test chromosomes are scored once, for the final table. One exception is disclosed: an evaluation bug, since fixed, read the test split for the full model and B3 at exploratory seed 0, so those two seed-0 test numbers are reported only as exploratory.</w:t>
-      </w:r>
-    </w:p>
-    <w:p>
-      <w:pPr>
-        <w:spacing w:after="120" w:line="276"/>
-        <w:jc w:val="both"/>
-      </w:pPr>
-      <w:r>
-        <w:rPr>
-          <w:rFonts w:ascii="Times New Roman" w:cs="Times New Roman" w:eastAsia="Times New Roman" w:hAnsi="Times New Roman"/>
-          <w:i/>
-          <w:iCs/>
-          <w:sz w:val="22"/>
-          <w:szCs w:val="22"/>
-        </w:rPr>
-        <w:t xml:space="preserve">Headline setting and metric.</w:t>
-      </w:r>
-      <w:r>
-        <w:rPr>
-          <w:rFonts w:ascii="Times New Roman" w:cs="Times New Roman" w:eastAsia="Times New Roman" w:hAnsi="Times New Roman"/>
-          <w:sz w:val="22"/>
-          <w:szCs w:val="22"/>
-        </w:rPr>
-        <w:t xml:space="preserve"> Every arm is evaluated with Hi-C removed at inference, so that the only difference between arms is what shaped their weights during pretraining. Results with the graph present are reported separately as an upper bound with privileged input and are never compared with a sequence-only baseline. The headline metric is the Pearson correlation between predicted and measured strength on held-out target edges, stratified by separation into short (&lt;50 kb), medium (50–150 kb) and long (≥150 kb) bands, because a single correlation is dominated by short-range contacts; the long-range band is the primary endpoint. For arms whose pretraining does not train a contact head (B0 and B5), the same contact head is fitted on frozen representations, and all arms are additionally compared under this frozen-representation probe. Differences between arms are assessed with a paired bootstrap over evaluation samples, which is valid because every arm is asked about the identical target edges, and over multiple training seeds.</w:t>
-      </w:r>
-    </w:p>
-    <w:p>
-      <w:pPr>
-        <w:spacing w:after="120" w:line="276"/>
-        <w:jc w:val="both"/>
-      </w:pPr>
-      <w:r>
-        <w:rPr>
-          <w:rFonts w:ascii="Times New Roman" w:cs="Times New Roman" w:eastAsia="Times New Roman" w:hAnsi="Times New Roman"/>
-          <w:i/>
-          <w:iCs/>
-          <w:sz w:val="22"/>
-          <w:szCs w:val="22"/>
-        </w:rPr>
-        <w:t xml:space="preserve">Pre-registered decision rule.</w:t>
-      </w:r>
-      <w:r>
-        <w:rPr>
-          <w:rFonts w:ascii="Times New Roman" w:cs="Times New Roman" w:eastAsia="Times New Roman" w:hAnsi="Times New Roman"/>
-          <w:sz w:val="22"/>
-          <w:szCs w:val="22"/>
-        </w:rPr>
-        <w:t xml:space="preserve"> The claims and the rule that decides them were fixed in writing before any confirmatory run was evaluated. Seed 0 is exploratory and was used only to choose the pretraining recipe; confirmation uses fresh seeds 1–3 for the full model, B3, B0 and B1, at 20,000 steps each, on the validation chromosomes. For a comparison X − Y, 10,000 paired bootstrap resamples of validation samples give a 95% interval for the seed-averaged difference, and X is said to beat Y only if the interval lies above zero and X − Y &gt; 0 in at least two of the three seeds. Claim A, that measured strengths matter, requires the full model to beat B3 on its own contact head. Claim B, that measured topology matters, requires both the full model and B3 to beat both B0 and B1 under the frozen-representation probe; because all four comparisons must pass, no multiple-comparison correction is needed. Every combination of outcomes maps to a pre-specified statement, including a controlled negative result, and B2, B4 and B5 are reported as secondary comparisons whatever the outcome.</w:t>
-      </w:r>
-    </w:p>
-    <w:p>
-      <w:pPr>
-        <w:keepNext/>
-        <w:spacing w:after="80" w:before="200"/>
-      </w:pPr>
+          <w:sz w:val="18"/>
+          <w:szCs w:val="18"/>
+        </w:rPr>
+        <w:t xml:space="preserve">Table 1. </w:t>
+      </w:r>
       <w:r>
         <w:rPr>
           <w:rFonts w:ascii="Times New Roman" w:cs="Times New Roman" w:eastAsia="Times New Roman" w:hAnsi="Times New Roman"/>
@@ -4148,16 +3774,6 @@
           <w:sz w:val="18"/>
           <w:szCs w:val="18"/>
         </w:rPr>
-        <w:t xml:space="preserve">Table 1. </w:t>
-      </w:r>
-      <w:r>
-        <w:rPr>
-          <w:rFonts w:ascii="Times New Roman" w:cs="Times New Roman" w:eastAsia="Times New Roman" w:hAnsi="Times New Roman"/>
-          <w:b/>
-          <w:bCs/>
-          <w:sz w:val="18"/>
-          <w:szCs w:val="18"/>
-        </w:rPr>
         <w:t xml:space="preserve">Matched experimental arms.</w:t>
       </w:r>
       <w:r>
@@ -4166,7 +3782,7 @@
           <w:sz w:val="18"/>
           <w:szCs w:val="18"/>
         </w:rPr>
-        <w:t xml:space="preserve"> All arms share architecture, parameter count, training data, steps and held-out targets, and are evaluated with Hi-C removed at inference.</w:t>
+        <w:t xml:space="preserve"> All arms share architecture, parameter count, training data, steps and held-out targets, and are evaluated with Hi-C removed at inference. Full, B3, B0 and B1 are confirmatory; B2, B4 and B5 are secondary.</w:t>
       </w:r>
     </w:p>
     <w:tbl>
@@ -4920,7 +4536,7 @@
           <w:sz w:val="22"/>
           <w:szCs w:val="22"/>
         </w:rPr>
-        <w:t xml:space="preserve">, weight decay 0.01), 1,000 warm-up steps followed by cosine decay, gradient clipping at 1.0 and bfloat16 mixed precision. Each step accumulates gradients over four micro-batches of two samples, so one step sees 8 samples, or 1,024 windows (5.1 Mb of sequence). Training uses one NVIDIA L40S GPU per run, with a peak memory of 14.3 GiB. Data are built reproducibly from a manifest that pins the source accessions and checksums, and every run records its resolved configuration and code commit before its first step. Table 2 lists the hyperparameters.</w:t>
+        <w:t xml:space="preserve">, weight decay 0.01), 1,000 warm-up steps followed by cosine decay, gradient clipping at 1.0 and bfloat16 mixed precision. Each step accumulates gradients over four micro-batches of two samples, so one step sees 8 samples, or 1,024 windows (5.1 Mb of sequence), and a run sees each training sample about 25 times. Training uses one NVIDIA L40S GPU per run, with a peak memory of 14.3 GiB. An update whose gradient norm is not finite is skipped rather than applied, and no checkpoint with non-finite weights is saved; skipped updates are logged and reported per run. Data are built reproducibly from a manifest that pins the source accessions and checksums, and every run records its resolved configuration and code commit before its first step. Table 2 lists the hyperparameters.</w:t>
       </w:r>
     </w:p>
     <w:p>
@@ -4954,7 +4570,7 @@
           <w:sz w:val="18"/>
           <w:szCs w:val="18"/>
         </w:rPr>
-        <w:t xml:space="preserve"> Values are those of the configuration file used for every arm.</w:t>
+        <w:t xml:space="preserve"> Values are those of the configuration file used for every arm (configs/base.yaml).</w:t>
       </w:r>
     </w:p>
     <w:tbl>
@@ -5933,26 +5549,7 @@
                 <w:sz w:val="18"/>
                 <w:szCs w:val="18"/>
               </w:rPr>
-              <w:t xml:space="preserve"> / </w:t>
-            </w:r>
-            <w:r>
-              <w:rPr>
-                <w:rFonts w:ascii="Times New Roman" w:cs="Times New Roman" w:eastAsia="Times New Roman" w:hAnsi="Times New Roman"/>
-                <w:i/>
-                <w:iCs/>
-                <w:sz w:val="18"/>
-                <w:szCs w:val="18"/>
-              </w:rPr>
-              <w:t xml:space="preserve">λ</w:t>
-            </w:r>
-            <w:r>
-              <w:rPr>
-                <w:rFonts w:ascii="Times New Roman" w:cs="Times New Roman" w:eastAsia="Times New Roman" w:hAnsi="Times New Roman"/>
-                <w:sz w:val="18"/>
-                <w:szCs w:val="18"/>
-                <w:vertAlign w:val="subscript"/>
-              </w:rPr>
-              <w:t xml:space="preserve">distill</w:t>
+              <w:t xml:space="preserve"> / contact target</w:t>
             </w:r>
           </w:p>
         </w:tc>
@@ -5979,7 +5576,7 @@
                 <w:sz w:val="18"/>
                 <w:szCs w:val="18"/>
               </w:rPr>
-              <w:t xml:space="preserve">1 / 1</w:t>
+              <w:t xml:space="preserve">1 / soft-target BCE</w:t>
             </w:r>
           </w:p>
         </w:tc>
@@ -6228,6 +5825,22 @@
     </w:p>
     <w:p>
       <w:pPr>
+        <w:pStyle w:val="Heading2"/>
+        <w:spacing w:after="80" w:before="200"/>
+      </w:pPr>
+      <w:r>
+        <w:rPr>
+          <w:rFonts w:ascii="Times New Roman" w:cs="Times New Roman" w:eastAsia="Times New Roman" w:hAnsi="Times New Roman"/>
+          <w:b/>
+          <w:bCs/>
+          <w:sz w:val="22"/>
+          <w:szCs w:val="22"/>
+        </w:rPr>
+        <w:t xml:space="preserve">4.1  Experimental setup</w:t>
+      </w:r>
+    </w:p>
+    <w:p>
+      <w:pPr>
         <w:spacing w:after="120" w:line="276"/>
         <w:jc w:val="both"/>
       </w:pPr>
@@ -6237,7 +5850,127 @@
           <w:sz w:val="22"/>
           <w:szCs w:val="22"/>
         </w:rPr>
-        <w:t xml:space="preserve">[PENDING RESULTS — written from the final multi-seed validation results and the single sealed test evaluation.]</w:t>
+        <w:t xml:space="preserve">[PENDING RESULTS: arms and seeds actually completed, with any skipped updates per run (Section 3.9); compute used; the two read-outs.]</w:t>
+      </w:r>
+    </w:p>
+    <w:p>
+      <w:pPr>
+        <w:pStyle w:val="Heading2"/>
+        <w:spacing w:after="80" w:before="200"/>
+      </w:pPr>
+      <w:r>
+        <w:rPr>
+          <w:rFonts w:ascii="Times New Roman" w:cs="Times New Roman" w:eastAsia="Times New Roman" w:hAnsi="Times New Roman"/>
+          <w:b/>
+          <w:bCs/>
+          <w:sz w:val="22"/>
+          <w:szCs w:val="22"/>
+        </w:rPr>
+        <w:t xml:space="preserve">4.2  Claim A: do measured contact strengths matter?</w:t>
+      </w:r>
+    </w:p>
+    <w:p>
+      <w:pPr>
+        <w:spacing w:after="120" w:line="276"/>
+        <w:jc w:val="both"/>
+      </w:pPr>
+      <w:r>
+        <w:rPr>
+          <w:rFonts w:ascii="Times New Roman" w:cs="Times New Roman" w:eastAsia="Times New Roman" w:hAnsi="Times New Roman"/>
+          <w:sz w:val="22"/>
+          <w:szCs w:val="22"/>
+        </w:rPr>
+        <w:t xml:space="preserve">[PENDING RESULTS: full model vs B3, head read-out, long range, validation. Per-seed values, seed-averaged difference, 95% bootstrap interval, number of seeds favouring the full model, and the pre-registered verdict.]</w:t>
+      </w:r>
+    </w:p>
+    <w:p>
+      <w:pPr>
+        <w:pStyle w:val="Heading2"/>
+        <w:spacing w:after="80" w:before="200"/>
+      </w:pPr>
+      <w:r>
+        <w:rPr>
+          <w:rFonts w:ascii="Times New Roman" w:cs="Times New Roman" w:eastAsia="Times New Roman" w:hAnsi="Times New Roman"/>
+          <w:b/>
+          <w:bCs/>
+          <w:sz w:val="22"/>
+          <w:szCs w:val="22"/>
+        </w:rPr>
+        <w:t xml:space="preserve">4.3  Claim B: does measured contact topology matter?</w:t>
+      </w:r>
+    </w:p>
+    <w:p>
+      <w:pPr>
+        <w:spacing w:after="120" w:line="276"/>
+        <w:jc w:val="both"/>
+      </w:pPr>
+      <w:r>
+        <w:rPr>
+          <w:rFonts w:ascii="Times New Roman" w:cs="Times New Roman" w:eastAsia="Times New Roman" w:hAnsi="Times New Roman"/>
+          <w:sz w:val="22"/>
+          <w:szCs w:val="22"/>
+        </w:rPr>
+        <w:t xml:space="preserve">[PENDING RESULTS: the four comparisons (full vs B0, full vs B1, B3 vs B0, B3 vs B1), probe read-out, long range, validation, each with its interval and seed count, and the pre-registered verdict.]</w:t>
+      </w:r>
+    </w:p>
+    <w:p>
+      <w:pPr>
+        <w:pStyle w:val="Heading2"/>
+        <w:spacing w:after="80" w:before="200"/>
+      </w:pPr>
+      <w:r>
+        <w:rPr>
+          <w:rFonts w:ascii="Times New Roman" w:cs="Times New Roman" w:eastAsia="Times New Roman" w:hAnsi="Times New Roman"/>
+          <w:b/>
+          <w:bCs/>
+          <w:sz w:val="22"/>
+          <w:szCs w:val="22"/>
+        </w:rPr>
+        <w:t xml:space="preserve">4.4  Test-split confirmation</w:t>
+      </w:r>
+    </w:p>
+    <w:p>
+      <w:pPr>
+        <w:spacing w:after="120" w:line="276"/>
+        <w:jc w:val="both"/>
+      </w:pPr>
+      <w:r>
+        <w:rPr>
+          <w:rFonts w:ascii="Times New Roman" w:cs="Times New Roman" w:eastAsia="Times New Roman" w:hAnsi="Times New Roman"/>
+          <w:sz w:val="22"/>
+          <w:szCs w:val="22"/>
+        </w:rPr>
+        <w:t xml:space="preserve">[PENDING RESULTS: the single test evaluation for seeds 1–3 of the arms in the decided claim, with the same statistic; any disagreement with validation reported as measured. Seed-0 test numbers reported separately as exploratory.]</w:t>
+      </w:r>
+    </w:p>
+    <w:p>
+      <w:pPr>
+        <w:pStyle w:val="Heading2"/>
+        <w:spacing w:after="80" w:before="200"/>
+      </w:pPr>
+      <w:r>
+        <w:rPr>
+          <w:rFonts w:ascii="Times New Roman" w:cs="Times New Roman" w:eastAsia="Times New Roman" w:hAnsi="Times New Roman"/>
+          <w:b/>
+          <w:bCs/>
+          <w:sz w:val="22"/>
+          <w:szCs w:val="22"/>
+        </w:rPr>
+        <w:t xml:space="preserve">4.5  Secondary comparisons</w:t>
+      </w:r>
+    </w:p>
+    <w:p>
+      <w:pPr>
+        <w:spacing w:after="120" w:line="276"/>
+        <w:jc w:val="both"/>
+      </w:pPr>
+      <w:r>
+        <w:rPr>
+          <w:rFonts w:ascii="Times New Roman" w:cs="Times New Roman" w:eastAsia="Times New Roman" w:hAnsi="Times New Roman"/>
+          <w:sz w:val="22"/>
+          <w:szCs w:val="22"/>
+        </w:rPr>
+        <w:t xml:space="preserve">[PENDING RESULTS: full model vs B2, B4 and B5; short- and medium-range strata; every arm with Hi-C present at inference as an upper bound. Labelled secondary; not used to choose the headline.]</w:t>
       </w:r>
     </w:p>
     <w:p>
@@ -6267,7 +6000,31 @@
           <w:sz w:val="22"/>
           <w:szCs w:val="22"/>
         </w:rPr>
-        <w:t xml:space="preserve">[PENDING]</w:t>
+        <w:t xml:space="preserve">[PENDING: interpretation of the decided outcome, in the wording fixed by the pre-registration, and what it implies about how measured contacts can inform sequence representations.]</w:t>
+      </w:r>
+    </w:p>
+    <w:p>
+      <w:pPr>
+        <w:spacing w:after="120" w:line="276"/>
+        <w:jc w:val="both"/>
+      </w:pPr>
+      <w:r>
+        <w:rPr>
+          <w:rFonts w:ascii="Times New Roman" w:cs="Times New Roman" w:eastAsia="Times New Roman" w:hAnsi="Times New Roman"/>
+          <w:i/>
+          <w:iCs/>
+          <w:sz w:val="22"/>
+          <w:szCs w:val="22"/>
+        </w:rPr>
+        <w:t xml:space="preserve">Scope and limitations.</w:t>
+      </w:r>
+      <w:r>
+        <w:rPr>
+          <w:rFonts w:ascii="Times New Roman" w:cs="Times New Roman" w:eastAsia="Times New Roman" w:hAnsi="Times New Roman"/>
+          <w:sz w:val="22"/>
+          <w:szCs w:val="22"/>
+        </w:rPr>
+        <w:t xml:space="preserve"> The study is confined to one cell line (GM12878), one Hi-C resolution (5 kb), one context length (640 kb) and one model scale (7.3 M parameters), and its read-outs are contact-prediction tasks on held-out chromosomes. It compares the model with matched controls of itself, not with independently trained sequence or structure models, and it does not evaluate downstream regulatory tasks. Each of these bounds what the result can show, whichever way it falls.</w:t>
       </w:r>
     </w:p>
     <w:p>
@@ -6297,7 +6054,7 @@
           <w:sz w:val="22"/>
           <w:szCs w:val="22"/>
         </w:rPr>
-        <w:t xml:space="preserve">[PENDING]</w:t>
+        <w:t xml:space="preserve">[PENDING: restate the problem and the core idea, the decided result with its strongest evidence, and one concrete next step.]</w:t>
       </w:r>
     </w:p>
     <w:p>
@@ -7439,25 +7196,25 @@
           <w:sz w:val="18"/>
           <w:szCs w:val="18"/>
         </w:rPr>
-        <w:t xml:space="preserve">Hinton G, Vinyals O, Dean J. Distilling the Knowledge in a Neural Network. </w:t>
-      </w:r>
-      <w:r>
-        <w:rPr>
-          <w:rFonts w:ascii="Times New Roman" w:cs="Times New Roman" w:eastAsia="Times New Roman" w:hAnsi="Times New Roman"/>
-          <w:i/>
-          <w:iCs/>
-          <w:sz w:val="18"/>
-          <w:szCs w:val="18"/>
-        </w:rPr>
-        <w:t xml:space="preserve">arXiv preprint (NIPS 2014 Deep Learning Workshop)</w:t>
-      </w:r>
-      <w:r>
-        <w:rPr>
-          <w:rFonts w:ascii="Times New Roman" w:cs="Times New Roman" w:eastAsia="Times New Roman" w:hAnsi="Times New Roman"/>
-          <w:sz w:val="18"/>
-          <w:szCs w:val="18"/>
-        </w:rPr>
-        <w:t xml:space="preserve">. 2015. https://arxiv.org/abs/1503.02531</w:t>
+        <w:t xml:space="preserve">Zhang Z, Feng F, Qiu Y, Liu J. A generalizable framework to comprehensively predict epigenome, chromatin organization, and transcriptome. </w:t>
+      </w:r>
+      <w:r>
+        <w:rPr>
+          <w:rFonts w:ascii="Times New Roman" w:cs="Times New Roman" w:eastAsia="Times New Roman" w:hAnsi="Times New Roman"/>
+          <w:i/>
+          <w:iCs/>
+          <w:sz w:val="18"/>
+          <w:szCs w:val="18"/>
+        </w:rPr>
+        <w:t xml:space="preserve">Nucleic Acids Research</w:t>
+      </w:r>
+      <w:r>
+        <w:rPr>
+          <w:rFonts w:ascii="Times New Roman" w:cs="Times New Roman" w:eastAsia="Times New Roman" w:hAnsi="Times New Roman"/>
+          <w:sz w:val="18"/>
+          <w:szCs w:val="18"/>
+        </w:rPr>
+        <w:t xml:space="preserve">. 2023;51(12):5931-5947. https://doi.org/10.1093/nar/gkad436</w:t>
       </w:r>
     </w:p>
     <w:p>
@@ -7483,25 +7240,25 @@
           <w:sz w:val="18"/>
           <w:szCs w:val="18"/>
         </w:rPr>
-        <w:t xml:space="preserve">Zhang Z, Feng F, Qiu Y, Liu J. A generalizable framework to comprehensively predict epigenome, chromatin organization, and transcriptome. </w:t>
-      </w:r>
-      <w:r>
-        <w:rPr>
-          <w:rFonts w:ascii="Times New Roman" w:cs="Times New Roman" w:eastAsia="Times New Roman" w:hAnsi="Times New Roman"/>
-          <w:i/>
-          <w:iCs/>
-          <w:sz w:val="18"/>
-          <w:szCs w:val="18"/>
-        </w:rPr>
-        <w:t xml:space="preserve">Nucleic Acids Research</w:t>
-      </w:r>
-      <w:r>
-        <w:rPr>
-          <w:rFonts w:ascii="Times New Roman" w:cs="Times New Roman" w:eastAsia="Times New Roman" w:hAnsi="Times New Roman"/>
-          <w:sz w:val="18"/>
-          <w:szCs w:val="18"/>
-        </w:rPr>
-        <w:t xml:space="preserve">. 2023;51(12):5931-5947. https://doi.org/10.1093/nar/gkad436</w:t>
+        <w:t xml:space="preserve">Zhou Z, Ji Y, Li W, Dutta P, Davuluri R, Liu H. DNABERT-2: Efficient Foundation Model and Benchmark For Multi-Species Genome. </w:t>
+      </w:r>
+      <w:r>
+        <w:rPr>
+          <w:rFonts w:ascii="Times New Roman" w:cs="Times New Roman" w:eastAsia="Times New Roman" w:hAnsi="Times New Roman"/>
+          <w:i/>
+          <w:iCs/>
+          <w:sz w:val="18"/>
+          <w:szCs w:val="18"/>
+        </w:rPr>
+        <w:t xml:space="preserve">International Conference on Learning Representations (ICLR)</w:t>
+      </w:r>
+      <w:r>
+        <w:rPr>
+          <w:rFonts w:ascii="Times New Roman" w:cs="Times New Roman" w:eastAsia="Times New Roman" w:hAnsi="Times New Roman"/>
+          <w:sz w:val="18"/>
+          <w:szCs w:val="18"/>
+        </w:rPr>
+        <w:t xml:space="preserve">. 2024. https://arxiv.org/abs/2306.15006</w:t>
       </w:r>
     </w:p>
     <w:p>
@@ -7527,7 +7284,7 @@
           <w:sz w:val="18"/>
           <w:szCs w:val="18"/>
         </w:rPr>
-        <w:t xml:space="preserve">Zhou Z, Ji Y, Li W, Dutta P, Davuluri R, Liu H. DNABERT-2: Efficient Foundation Model and Benchmark For Multi-Species Genome. </w:t>
+        <w:t xml:space="preserve">Gu A, Goel K, Ré C. Efficiently Modeling Long Sequences with Structured State Spaces. </w:t>
       </w:r>
       <w:r>
         <w:rPr>
@@ -7545,7 +7302,7 @@
           <w:sz w:val="18"/>
           <w:szCs w:val="18"/>
         </w:rPr>
-        <w:t xml:space="preserve">. 2024. https://arxiv.org/abs/2306.15006</w:t>
+        <w:t xml:space="preserve">. 2022. https://arxiv.org/abs/2111.00396</w:t>
       </w:r>
     </w:p>
     <w:p>
@@ -7571,25 +7328,25 @@
           <w:sz w:val="18"/>
           <w:szCs w:val="18"/>
         </w:rPr>
-        <w:t xml:space="preserve">Gu A, Goel K, Ré C. Efficiently Modeling Long Sequences with Structured State Spaces. </w:t>
-      </w:r>
-      <w:r>
-        <w:rPr>
-          <w:rFonts w:ascii="Times New Roman" w:cs="Times New Roman" w:eastAsia="Times New Roman" w:hAnsi="Times New Roman"/>
-          <w:i/>
-          <w:iCs/>
-          <w:sz w:val="18"/>
-          <w:szCs w:val="18"/>
-        </w:rPr>
-        <w:t xml:space="preserve">International Conference on Learning Representations (ICLR)</w:t>
-      </w:r>
-      <w:r>
-        <w:rPr>
-          <w:rFonts w:ascii="Times New Roman" w:cs="Times New Roman" w:eastAsia="Times New Roman" w:hAnsi="Times New Roman"/>
-          <w:sz w:val="18"/>
-          <w:szCs w:val="18"/>
-        </w:rPr>
-        <w:t xml:space="preserve">. 2022. https://arxiv.org/abs/2111.00396</w:t>
+        <w:t xml:space="preserve">Gu A, Gupta A, Goel K, Ré C. On the Parameterization and Initialization of Diagonal State Space Models. </w:t>
+      </w:r>
+      <w:r>
+        <w:rPr>
+          <w:rFonts w:ascii="Times New Roman" w:cs="Times New Roman" w:eastAsia="Times New Roman" w:hAnsi="Times New Roman"/>
+          <w:i/>
+          <w:iCs/>
+          <w:sz w:val="18"/>
+          <w:szCs w:val="18"/>
+        </w:rPr>
+        <w:t xml:space="preserve">Advances in Neural Information Processing Systems 35 (NeurIPS 2022)</w:t>
+      </w:r>
+      <w:r>
+        <w:rPr>
+          <w:rFonts w:ascii="Times New Roman" w:cs="Times New Roman" w:eastAsia="Times New Roman" w:hAnsi="Times New Roman"/>
+          <w:sz w:val="18"/>
+          <w:szCs w:val="18"/>
+        </w:rPr>
+        <w:t xml:space="preserve">. 2022. https://proceedings.neurips.cc/paper_files/paper/2022/hash/e9a32fade47b906de908431991440f7c-Abstract-Conference.html</w:t>
       </w:r>
     </w:p>
     <w:p>
@@ -7615,25 +7372,25 @@
           <w:sz w:val="18"/>
           <w:szCs w:val="18"/>
         </w:rPr>
-        <w:t xml:space="preserve">Gu A, Gupta A, Goel K, Ré C. On the Parameterization and Initialization of Diagonal State Space Models. </w:t>
-      </w:r>
-      <w:r>
-        <w:rPr>
-          <w:rFonts w:ascii="Times New Roman" w:cs="Times New Roman" w:eastAsia="Times New Roman" w:hAnsi="Times New Roman"/>
-          <w:i/>
-          <w:iCs/>
-          <w:sz w:val="18"/>
-          <w:szCs w:val="18"/>
-        </w:rPr>
-        <w:t xml:space="preserve">Advances in Neural Information Processing Systems 35 (NeurIPS 2022)</w:t>
-      </w:r>
-      <w:r>
-        <w:rPr>
-          <w:rFonts w:ascii="Times New Roman" w:cs="Times New Roman" w:eastAsia="Times New Roman" w:hAnsi="Times New Roman"/>
-          <w:sz w:val="18"/>
-          <w:szCs w:val="18"/>
-        </w:rPr>
-        <w:t xml:space="preserve">. 2022. https://proceedings.neurips.cc/paper_files/paper/2022/hash/e9a32fade47b906de908431991440f7c-Abstract-Conference.html</w:t>
+        <w:t xml:space="preserve">Gu A, Dao T. Mamba: Linear-Time Sequence Modeling with Selective State Spaces. </w:t>
+      </w:r>
+      <w:r>
+        <w:rPr>
+          <w:rFonts w:ascii="Times New Roman" w:cs="Times New Roman" w:eastAsia="Times New Roman" w:hAnsi="Times New Roman"/>
+          <w:i/>
+          <w:iCs/>
+          <w:sz w:val="18"/>
+          <w:szCs w:val="18"/>
+        </w:rPr>
+        <w:t xml:space="preserve">First Conference on Language Modeling (COLM)</w:t>
+      </w:r>
+      <w:r>
+        <w:rPr>
+          <w:rFonts w:ascii="Times New Roman" w:cs="Times New Roman" w:eastAsia="Times New Roman" w:hAnsi="Times New Roman"/>
+          <w:sz w:val="18"/>
+          <w:szCs w:val="18"/>
+        </w:rPr>
+        <w:t xml:space="preserve">. 2024. https://openreview.net/forum?id=tEYskw1VY2</w:t>
       </w:r>
     </w:p>
     <w:p>
@@ -7659,25 +7416,25 @@
           <w:sz w:val="18"/>
           <w:szCs w:val="18"/>
         </w:rPr>
-        <w:t xml:space="preserve">Gu A, Dao T. Mamba: Linear-Time Sequence Modeling with Selective State Spaces. </w:t>
-      </w:r>
-      <w:r>
-        <w:rPr>
-          <w:rFonts w:ascii="Times New Roman" w:cs="Times New Roman" w:eastAsia="Times New Roman" w:hAnsi="Times New Roman"/>
-          <w:i/>
-          <w:iCs/>
-          <w:sz w:val="18"/>
-          <w:szCs w:val="18"/>
-        </w:rPr>
-        <w:t xml:space="preserve">First Conference on Language Modeling (COLM)</w:t>
-      </w:r>
-      <w:r>
-        <w:rPr>
-          <w:rFonts w:ascii="Times New Roman" w:cs="Times New Roman" w:eastAsia="Times New Roman" w:hAnsi="Times New Roman"/>
-          <w:sz w:val="18"/>
-          <w:szCs w:val="18"/>
-        </w:rPr>
-        <w:t xml:space="preserve">. 2024. https://openreview.net/forum?id=tEYskw1VY2</w:t>
+        <w:t xml:space="preserve">Veličković P, Cucurull G, Casanova A, Romero A, Liò P, Bengio Y. Graph Attention Networks. </w:t>
+      </w:r>
+      <w:r>
+        <w:rPr>
+          <w:rFonts w:ascii="Times New Roman" w:cs="Times New Roman" w:eastAsia="Times New Roman" w:hAnsi="Times New Roman"/>
+          <w:i/>
+          <w:iCs/>
+          <w:sz w:val="18"/>
+          <w:szCs w:val="18"/>
+        </w:rPr>
+        <w:t xml:space="preserve">International Conference on Learning Representations (ICLR)</w:t>
+      </w:r>
+      <w:r>
+        <w:rPr>
+          <w:rFonts w:ascii="Times New Roman" w:cs="Times New Roman" w:eastAsia="Times New Roman" w:hAnsi="Times New Roman"/>
+          <w:sz w:val="18"/>
+          <w:szCs w:val="18"/>
+        </w:rPr>
+        <w:t xml:space="preserve">. 2018. https://arxiv.org/abs/1710.10903</w:t>
       </w:r>
     </w:p>
     <w:p>
@@ -7703,25 +7460,25 @@
           <w:sz w:val="18"/>
           <w:szCs w:val="18"/>
         </w:rPr>
-        <w:t xml:space="preserve">Veličković P, Cucurull G, Casanova A, Romero A, Liò P, Bengio Y. Graph Attention Networks. </w:t>
-      </w:r>
-      <w:r>
-        <w:rPr>
-          <w:rFonts w:ascii="Times New Roman" w:cs="Times New Roman" w:eastAsia="Times New Roman" w:hAnsi="Times New Roman"/>
-          <w:i/>
-          <w:iCs/>
-          <w:sz w:val="18"/>
-          <w:szCs w:val="18"/>
-        </w:rPr>
-        <w:t xml:space="preserve">International Conference on Learning Representations (ICLR)</w:t>
-      </w:r>
-      <w:r>
-        <w:rPr>
-          <w:rFonts w:ascii="Times New Roman" w:cs="Times New Roman" w:eastAsia="Times New Roman" w:hAnsi="Times New Roman"/>
-          <w:sz w:val="18"/>
-          <w:szCs w:val="18"/>
-        </w:rPr>
-        <w:t xml:space="preserve">. 2018. https://arxiv.org/abs/1710.10903</w:t>
+        <w:t xml:space="preserve">Ying C, Cai T, Luo S, Zheng S, Ke G, He D, et al.. Do Transformers Really Perform Bad for Graph Representation?. </w:t>
+      </w:r>
+      <w:r>
+        <w:rPr>
+          <w:rFonts w:ascii="Times New Roman" w:cs="Times New Roman" w:eastAsia="Times New Roman" w:hAnsi="Times New Roman"/>
+          <w:i/>
+          <w:iCs/>
+          <w:sz w:val="18"/>
+          <w:szCs w:val="18"/>
+        </w:rPr>
+        <w:t xml:space="preserve">Advances in Neural Information Processing Systems (NeurIPS)</w:t>
+      </w:r>
+      <w:r>
+        <w:rPr>
+          <w:rFonts w:ascii="Times New Roman" w:cs="Times New Roman" w:eastAsia="Times New Roman" w:hAnsi="Times New Roman"/>
+          <w:sz w:val="18"/>
+          <w:szCs w:val="18"/>
+        </w:rPr>
+        <w:t xml:space="preserve">. 2021. https://arxiv.org/abs/2106.05234</w:t>
       </w:r>
     </w:p>
     <w:p>
@@ -7747,25 +7504,25 @@
           <w:sz w:val="18"/>
           <w:szCs w:val="18"/>
         </w:rPr>
-        <w:t xml:space="preserve">Ying C, Cai T, Luo S, Zheng S, Ke G, He D, et al.. Do Transformers Really Perform Bad for Graph Representation?. </w:t>
-      </w:r>
-      <w:r>
-        <w:rPr>
-          <w:rFonts w:ascii="Times New Roman" w:cs="Times New Roman" w:eastAsia="Times New Roman" w:hAnsi="Times New Roman"/>
-          <w:i/>
-          <w:iCs/>
-          <w:sz w:val="18"/>
-          <w:szCs w:val="18"/>
-        </w:rPr>
-        <w:t xml:space="preserve">Advances in Neural Information Processing Systems (NeurIPS)</w:t>
-      </w:r>
-      <w:r>
-        <w:rPr>
-          <w:rFonts w:ascii="Times New Roman" w:cs="Times New Roman" w:eastAsia="Times New Roman" w:hAnsi="Times New Roman"/>
-          <w:sz w:val="18"/>
-          <w:szCs w:val="18"/>
-        </w:rPr>
-        <w:t xml:space="preserve">. 2021. https://arxiv.org/abs/2106.05234</w:t>
+        <w:t xml:space="preserve">Vaswani A, Shazeer N, Parmar N, Uszkoreit J, Jones L, Gomez AN, et al.. Attention is All you Need. </w:t>
+      </w:r>
+      <w:r>
+        <w:rPr>
+          <w:rFonts w:ascii="Times New Roman" w:cs="Times New Roman" w:eastAsia="Times New Roman" w:hAnsi="Times New Roman"/>
+          <w:i/>
+          <w:iCs/>
+          <w:sz w:val="18"/>
+          <w:szCs w:val="18"/>
+        </w:rPr>
+        <w:t xml:space="preserve">Advances in Neural Information Processing Systems 30 (NeurIPS 2017)</w:t>
+      </w:r>
+      <w:r>
+        <w:rPr>
+          <w:rFonts w:ascii="Times New Roman" w:cs="Times New Roman" w:eastAsia="Times New Roman" w:hAnsi="Times New Roman"/>
+          <w:sz w:val="18"/>
+          <w:szCs w:val="18"/>
+        </w:rPr>
+        <w:t xml:space="preserve">. 2017;5998-6008. https://proceedings.neurips.cc/paper_files/paper/2017/hash/3f5ee243547dee91fbd053c1c4a845aa-Abstract.html</w:t>
       </w:r>
     </w:p>
     <w:p>
@@ -7791,25 +7548,25 @@
           <w:sz w:val="18"/>
           <w:szCs w:val="18"/>
         </w:rPr>
-        <w:t xml:space="preserve">Vaswani A, Shazeer N, Parmar N, Uszkoreit J, Jones L, Gomez AN, et al.. Attention is All you Need. </w:t>
-      </w:r>
-      <w:r>
-        <w:rPr>
-          <w:rFonts w:ascii="Times New Roman" w:cs="Times New Roman" w:eastAsia="Times New Roman" w:hAnsi="Times New Roman"/>
-          <w:i/>
-          <w:iCs/>
-          <w:sz w:val="18"/>
-          <w:szCs w:val="18"/>
-        </w:rPr>
-        <w:t xml:space="preserve">Advances in Neural Information Processing Systems 30 (NeurIPS 2017)</w:t>
-      </w:r>
-      <w:r>
-        <w:rPr>
-          <w:rFonts w:ascii="Times New Roman" w:cs="Times New Roman" w:eastAsia="Times New Roman" w:hAnsi="Times New Roman"/>
-          <w:sz w:val="18"/>
-          <w:szCs w:val="18"/>
-        </w:rPr>
-        <w:t xml:space="preserve">. 2017;5998-6008. https://proceedings.neurips.cc/paper_files/paper/2017/hash/3f5ee243547dee91fbd053c1c4a845aa-Abstract.html</w:t>
+        <w:t xml:space="preserve">Rong Y, Huang W, Xu T, Huang J. DropEdge: Towards Deep Graph Convolutional Networks on Node Classification. </w:t>
+      </w:r>
+      <w:r>
+        <w:rPr>
+          <w:rFonts w:ascii="Times New Roman" w:cs="Times New Roman" w:eastAsia="Times New Roman" w:hAnsi="Times New Roman"/>
+          <w:i/>
+          <w:iCs/>
+          <w:sz w:val="18"/>
+          <w:szCs w:val="18"/>
+        </w:rPr>
+        <w:t xml:space="preserve">International Conference on Learning Representations (ICLR)</w:t>
+      </w:r>
+      <w:r>
+        <w:rPr>
+          <w:rFonts w:ascii="Times New Roman" w:cs="Times New Roman" w:eastAsia="Times New Roman" w:hAnsi="Times New Roman"/>
+          <w:sz w:val="18"/>
+          <w:szCs w:val="18"/>
+        </w:rPr>
+        <w:t xml:space="preserve">. 2020. https://openreview.net/forum?id=Hkx1qkrKPr</w:t>
       </w:r>
     </w:p>
     <w:p>
@@ -7835,25 +7592,25 @@
           <w:sz w:val="18"/>
           <w:szCs w:val="18"/>
         </w:rPr>
-        <w:t xml:space="preserve">Rong Y, Huang W, Xu T, Huang J. DropEdge: Towards Deep Graph Convolutional Networks on Node Classification. </w:t>
-      </w:r>
-      <w:r>
-        <w:rPr>
-          <w:rFonts w:ascii="Times New Roman" w:cs="Times New Roman" w:eastAsia="Times New Roman" w:hAnsi="Times New Roman"/>
-          <w:i/>
-          <w:iCs/>
-          <w:sz w:val="18"/>
-          <w:szCs w:val="18"/>
-        </w:rPr>
-        <w:t xml:space="preserve">International Conference on Learning Representations (ICLR)</w:t>
-      </w:r>
-      <w:r>
-        <w:rPr>
-          <w:rFonts w:ascii="Times New Roman" w:cs="Times New Roman" w:eastAsia="Times New Roman" w:hAnsi="Times New Roman"/>
-          <w:sz w:val="18"/>
-          <w:szCs w:val="18"/>
-        </w:rPr>
-        <w:t xml:space="preserve">. 2020. https://openreview.net/forum?id=Hkx1qkrKPr</w:t>
+        <w:t xml:space="preserve">Neverova N, Wolf C, Taylor G, Nebout F. ModDrop: Adaptive Multi-Modal Gesture Recognition. </w:t>
+      </w:r>
+      <w:r>
+        <w:rPr>
+          <w:rFonts w:ascii="Times New Roman" w:cs="Times New Roman" w:eastAsia="Times New Roman" w:hAnsi="Times New Roman"/>
+          <w:i/>
+          <w:iCs/>
+          <w:sz w:val="18"/>
+          <w:szCs w:val="18"/>
+        </w:rPr>
+        <w:t xml:space="preserve">IEEE Transactions on Pattern Analysis and Machine Intelligence</w:t>
+      </w:r>
+      <w:r>
+        <w:rPr>
+          <w:rFonts w:ascii="Times New Roman" w:cs="Times New Roman" w:eastAsia="Times New Roman" w:hAnsi="Times New Roman"/>
+          <w:sz w:val="18"/>
+          <w:szCs w:val="18"/>
+        </w:rPr>
+        <w:t xml:space="preserve">. 2016;38(8):1692-1706. https://doi.org/10.1109/TPAMI.2015.2461544</w:t>
       </w:r>
     </w:p>
     <w:p>
@@ -7879,25 +7636,25 @@
           <w:sz w:val="18"/>
           <w:szCs w:val="18"/>
         </w:rPr>
-        <w:t xml:space="preserve">Neverova N, Wolf C, Taylor G, Nebout F. ModDrop: Adaptive Multi-Modal Gesture Recognition. </w:t>
-      </w:r>
-      <w:r>
-        <w:rPr>
-          <w:rFonts w:ascii="Times New Roman" w:cs="Times New Roman" w:eastAsia="Times New Roman" w:hAnsi="Times New Roman"/>
-          <w:i/>
-          <w:iCs/>
-          <w:sz w:val="18"/>
-          <w:szCs w:val="18"/>
-        </w:rPr>
-        <w:t xml:space="preserve">IEEE Transactions on Pattern Analysis and Machine Intelligence</w:t>
-      </w:r>
-      <w:r>
-        <w:rPr>
-          <w:rFonts w:ascii="Times New Roman" w:cs="Times New Roman" w:eastAsia="Times New Roman" w:hAnsi="Times New Roman"/>
-          <w:sz w:val="18"/>
-          <w:szCs w:val="18"/>
-        </w:rPr>
-        <w:t xml:space="preserve">. 2016;38(8):1692-1706. https://doi.org/10.1109/TPAMI.2015.2461544</w:t>
+        <w:t xml:space="preserve">Hinton G, Vinyals O, Dean J. Distilling the Knowledge in a Neural Network. </w:t>
+      </w:r>
+      <w:r>
+        <w:rPr>
+          <w:rFonts w:ascii="Times New Roman" w:cs="Times New Roman" w:eastAsia="Times New Roman" w:hAnsi="Times New Roman"/>
+          <w:i/>
+          <w:iCs/>
+          <w:sz w:val="18"/>
+          <w:szCs w:val="18"/>
+        </w:rPr>
+        <w:t xml:space="preserve">arXiv preprint (NIPS 2014 Deep Learning Workshop)</w:t>
+      </w:r>
+      <w:r>
+        <w:rPr>
+          <w:rFonts w:ascii="Times New Roman" w:cs="Times New Roman" w:eastAsia="Times New Roman" w:hAnsi="Times New Roman"/>
+          <w:sz w:val="18"/>
+          <w:szCs w:val="18"/>
+        </w:rPr>
+        <w:t xml:space="preserve">. 2015. https://arxiv.org/abs/1503.02531</w:t>
       </w:r>
     </w:p>
     <w:p>

</xml_diff>

<commit_message>
Paper: rewrite against the code and fill Results, Discussion, Conclusion from the decided claims
</commit_message>
<xml_diff>
--- a/paper/master_copy.docx
+++ b/paper/master_copy.docx
@@ -15,7 +15,7 @@
           <w:sz w:val="32"/>
           <w:szCs w:val="32"/>
         </w:rPr>
-        <w:t xml:space="preserve">ChromGraphFM: Measured 3D Chromatin Contacts as a Training-Time Signal for Hi-C-Free DNA Sequence Representations</w:t>
+        <w:t xml:space="preserve">Measured 3D Chromatin Contacts Steer a DNA Encoder but Do Not Transfer to Its Hi-C-Free Representation: A Pre-registered Controlled Study of ChromGraphFM</w:t>
       </w:r>
     </w:p>
     <w:p>
@@ -72,7 +72,7 @@
           <w:sz w:val="18"/>
           <w:szCs w:val="18"/>
         </w:rPr>
-        <w:t xml:space="preserve">Working master copy. Sections 1–3 are drafted. Sections 4–6 hold the agreed structure only; their content is written once the pre-registered decision has been made on the validation chromosomes and the sealed test split has been scored once.</w:t>
+        <w:t xml:space="preserve">Working master copy, rewritten against the code on 2026-10-16. The pre-registered decision has been made on the validation chromosomes (results/decision_claims_val.json): no positive claim. Sections 4–6 report it in the wording the pre-registration fixes.</w:t>
       </w:r>
     </w:p>
     <w:p>
@@ -96,7 +96,7 @@
           <w:sz w:val="18"/>
           <w:szCs w:val="18"/>
         </w:rPr>
-        <w:t xml:space="preserve">Every [PENDING RESULTS] slot must be filled from measured numbers only, with the wording fixed by the pre-registered outcome table (docs/preregistration.md, Section 5).</w:t>
+        <w:t xml:space="preserve">Still open: (i) the single test-split evaluation (Section 4.4); (ii) the sequence-only re-evaluation with neutral local-edge strengths ([PENDING NEUTRAL], Section 4.5); (iii) the B2 secondary arm. No other slot is open.</w:t>
       </w:r>
     </w:p>
     <w:p>
@@ -125,7 +125,7 @@
           <w:sz w:val="22"/>
           <w:szCs w:val="22"/>
         </w:rPr>
-        <w:t xml:space="preserve">DNA sequence models contextualise a genomic window by what lies near it on the linear chromosome, yet much of gene regulation acts across hundreds of kilobases through the three-dimensional folding of chromatin. Chromosome conformation capture (Hi-C) measures that folding directly, but existing models use it as a prediction target, as an input that must be present at inference, or as an alignment target applied outside the encoder; in none of them do measured contacts decide how a self-supervised DNA encoder contextualises its input while it learns. Our insight is that contacts can serve as a training-time routing signal: if they decide which distal windows exchange information during pretraining and are then removed, anything they contribute must reside in weights that operate on sequence alone. We implement this idea in ChromGraphFM, a 7.3 M-parameter DNA encoder in which a sparse graph of distance-detrended Hi-C contacts restricts and biases attention between 5 kb windows across a 640 kb context. Contacts that the model is asked to predict are withheld from the graph it attends over, so the contact objective cannot be met by copying the input, and structure dropout removes the entire distal graph for a fraction of training samples, so the same weights also learn to operate without Hi-C. We test the idea under a pre-registered protocol: every model is evaluated with Hi-C removed, against matched controls that share its architecture, data and compute while removing the graph, randomising it, shuffling or flattening its contact strengths, fusing Hi-C after the encoder, or using Hi-C only as an alignment target, on fresh training seeds and under a decision rule fixed before any confirmatory result was seen. [PENDING RESULTS: one sentence stating the pre-registered outcome, in the wording fixed for it.]</w:t>
+        <w:t xml:space="preserve">DNA sequence models contextualise a genomic window by what lies near it on the linear chromosome, yet much of gene regulation acts across hundreds of kilobases through the three-dimensional folding of chromatin. Chromosome conformation capture (Hi-C) measures that folding directly, but existing models use it as a prediction target, as an input that must be present at inference, or as an alignment target applied outside the encoder. We ask whether measured contacts can instead act as a training-time routing signal: if they decide which distal windows exchange information during self-supervised pretraining and are then removed, is the resulting representation better? We implement this in ChromGraphFM, a 7.3 M-parameter DNA encoder in which a sparse graph of distance-detrended Hi-C contacts restricts and biases attention between 5 kb windows across a 640 kb context, with predicted contacts withheld from the graph and whole-graph structure dropout so the same weights also run without distal contacts. We test it under a pre-registered protocol against six matched controls that share its architecture, data and compute, on three fresh training seeds and a decision rule fixed before any confirmatory result. With measured contacts present, the encoder exploits them strongly: long-range (≥150 kb) contact correlation on held-out chromosomes reaches r = 0.644 against 0.175 with a random graph. With distal contacts removed, however, no pre-registered comparison passes: the full model leads a DNA-only control by +0.015 (95% CI −0.004 to +0.035) and a random-graph control by +0.010 (−0.008 to +0.026), and does not differ from a control with shuffled contact strengths (+0.001). Under matched budgets, Hi-C conditioning during pretraining did not produce a better Hi-C-free representation. We trace this to the Hi-C-free receptive field (about ±60 kb), which never connects the windows of a long-range pair, and release the protocol, controls and decision files as a benchmark for structure-aware DNA models.</w:t>
       </w:r>
     </w:p>
     <w:p>
@@ -148,7 +148,7 @@
           <w:sz w:val="22"/>
           <w:szCs w:val="22"/>
         </w:rPr>
-        <w:t xml:space="preserve">3D genome; Hi-C; chromatin contacts; DNA language models; self-supervised learning; graph attention; privileged information; pre-registration</w:t>
+        <w:t xml:space="preserve">3D genome; Hi-C; chromatin contacts; DNA language models; self-supervised learning; graph attention; privileged information; pre-registration; negative result</w:t>
       </w:r>
     </w:p>
     <w:p>
@@ -262,7 +262,7 @@
           <w:sz w:val="22"/>
           <w:szCs w:val="22"/>
         </w:rPr>
-        <w:t xml:space="preserve">[PENDING RESULTS: the experiments paragraph, stating what the pre-registered comparison shows on the validation chromosomes and on the single test evaluation, in the wording fixed for that outcome.]</w:t>
+        <w:t xml:space="preserve">The protocol returned a controlled negative result. Measured contacts are used, and used specifically: with the graph present, the full model's long-range contact correlation on held-out chromosomes is 0.644, against 0.597 when strengths are shuffled among the measured edges and 0.175 when the edges are random. Yet with the distal graph removed, every arm falls into the same narrow band, including a DNA-only control that never saw a contact graph, and none of the pre-registered comparisons passes. Under matched budgets, Hi-C conditioning during pretraining did not produce a better Hi-C-free representation. An analysis of the model explains why: without distal edges a window gathers information from at most about ±60 kb, so the two windows of a long-range pair never exchange information, and Hi-C can reach the Hi-C-free representation only through per-window features.</w:t>
       </w:r>
     </w:p>
     <w:p>
@@ -338,6 +338,25 @@
     </w:p>
     <w:p>
       <w:pPr>
+        <w:pStyle w:val="ListParagraph"/>
+        <w:numPr>
+          <w:ilvl w:val="0"/>
+          <w:numId w:val="2"/>
+        </w:numPr>
+        <w:spacing w:after="80" w:line="276"/>
+        <w:jc w:val="both"/>
+      </w:pPr>
+      <w:r>
+        <w:rPr>
+          <w:rFonts w:ascii="Times New Roman" w:cs="Times New Roman" w:eastAsia="Times New Roman" w:hAnsi="Times New Roman"/>
+          <w:sz w:val="22"/>
+          <w:szCs w:val="22"/>
+        </w:rPr>
+        <w:t xml:space="preserve">A controlled negative result with a mechanism: contact-conditioned attention exploits measured contacts strongly when they are present, but under matched budgets this does not transfer to the Hi-C-free representation, which we attribute to a Hi-C-free receptive field far shorter than the contacts being predicted.</w:t>
+      </w:r>
+    </w:p>
+    <w:p>
+      <w:pPr>
         <w:pStyle w:val="Heading1"/>
         <w:spacing w:after="120" w:before="280"/>
       </w:pPr>
@@ -695,7 +714,7 @@
           <w:sz w:val="22"/>
           <w:szCs w:val="22"/>
         </w:rPr>
-        <w:t xml:space="preserve"> Structure dropout trains the same weights to operate with the distal graph removed (Section 3.6), so Hi-C is needed only during training. This matters for two reasons: contact maps exist for few cell types and for no user-supplied sequence, and comparing models with Hi-C removed is the only setting in which a gain can be attributed to what training stored in the weights rather than to information supplied at inference. Three objectives train the model end to end (Section 3.7); Section 3.8 defines the controls, the recipe selection and the pre-registered evaluation protocol, and Section 3.9 gives implementation details.</w:t>
+        <w:t xml:space="preserve"> Structure dropout trains the same weights to operate with the distal graph removed (Section 3.6), so distal contacts are needed only during training. As implemented, the local edges of this Hi-C-free mode still carry the measured strength of the adjacent-window pixels (Section 3.3); Section 4.5 reports a re-evaluation in which these are replaced by the neutral 0.5, so that the model sees DNA alone. This setting matters for two reasons: contact maps exist for few cell types and for no user-supplied sequence, and comparing models with Hi-C removed is the only setting in which a gain can be attributed to what training stored in the weights rather than to information supplied at inference. Three objectives train the model end to end (Section 3.7); Section 3.8 defines the controls, the recipe selection and the pre-registered evaluation protocol, and Section 3.9 gives implementation details.</w:t>
       </w:r>
     </w:p>
     <w:p>
@@ -2746,7 +2765,7 @@
           <w:sz w:val="22"/>
           <w:szCs w:val="22"/>
         </w:rPr>
-        <w:t xml:space="preserve">Removing the whole graph rather than individual edges [34] reproduces the inference condition exactly, where every distal edge is absent at once [35]; edge-level dropout would only ever show the model a thinned graph and leave the fully Hi-C-free mode out of distribution. Local edges are never dropped, so the sequential backbone, and with it the model's knowledge of linear neighbourhood, is identical in both modes. Because one set of encoder weights, attention blocks and heads serves both modes, nothing is added at inference: the model is simply run in the mode that dropout trains, from DNA sequence alone.</w:t>
+        <w:t xml:space="preserve">Removing the whole graph rather than individual edges [34] reproduces the inference condition exactly, where every distal edge is absent at once [35]; edge-level dropout would only ever show the model a thinned graph and leave the fully Hi-C-free mode out of distribution. Local edges are never dropped, so the sequential backbone, and with it the model's knowledge of linear neighbourhood, is identical in both modes. Because one set of encoder weights, attention blocks and heads serves both modes, nothing is added at inference: the model is simply run in the mode that dropout trains. In that mode the local edges keep the measured strength of adjacent windows (up to 15 kb apart), so it is free of distal Hi-C but not of all Hi-C; Section 4.5 removes this remaining input at evaluation time.</w:t>
       </w:r>
     </w:p>
     <w:p>
@@ -3640,7 +3659,7 @@
           <w:sz w:val="22"/>
           <w:szCs w:val="22"/>
         </w:rPr>
-        <w:t xml:space="preserve"> Every arm is evaluated with Hi-C removed at inference, so that the only difference between arms is what shaped their weights during pretraining. Results with the graph present are reported separately as an upper bound with privileged input and are never compared with a sequence-only baseline. The headline metric is the Pearson correlation between predicted and measured strength on held-out target edges, stratified by separation into short (&lt;50 kb), medium (50–150 kb) and long (≥150 kb) bands, because a single correlation is dominated by short-range contacts; the long-range band is the primary endpoint.</w:t>
+        <w:t xml:space="preserve"> Every arm is evaluated with the distal graph removed at inference (the Hi-C-free setting; local edges as in Section 3.3), so that the only difference between arms is what shaped their weights during pretraining. Results with the graph present are reported separately as an upper bound with privileged input and are never compared with a sequence-only baseline. The headline metric is the Pearson correlation between predicted and measured strength on held-out target edges, stratified by separation into short (&lt;50 kb), medium (50–150 kb) and long (≥150 kb) bands, because a single correlation is dominated by short-range contacts; the long-range band is the primary endpoint.</w:t>
       </w:r>
     </w:p>
     <w:p>
@@ -5850,7 +5869,7 @@
           <w:sz w:val="22"/>
           <w:szCs w:val="22"/>
         </w:rPr>
-        <w:t xml:space="preserve">[PENDING RESULTS: arms and seeds actually completed, with any skipped updates per run (Section 3.9); compute used; the two read-outs.]</w:t>
+        <w:t xml:space="preserve">All confirmatory runs completed: the full model, B3, B0 and B1, each at training seeds 1, 2 and 3, for 20,000 steps from the frozen recipe of Section 3.8. Every confirmatory run used the same model, loss and configuration code. No run logged a skipped update. Runs interrupted by server restarts were resumed from their last checkpoint and never replaced by a new seed. The secondary arms B4 and B5 were trained at seed 0. All numbers below are on the validation chromosomes (chr10, chr11; 406 samples), in the Hi-C-free setting unless stated otherwise, and use the long-range band (≥150 kb) as the primary endpoint.</w:t>
       </w:r>
     </w:p>
     <w:p>
@@ -5880,7 +5899,7 @@
           <w:sz w:val="22"/>
           <w:szCs w:val="22"/>
         </w:rPr>
-        <w:t xml:space="preserve">[PENDING RESULTS: full model vs B3, head read-out, long range, validation. Per-seed values, seed-averaged difference, 95% bootstrap interval, number of seeds favouring the full model, and the pre-registered verdict.]</w:t>
+        <w:t xml:space="preserve">On its own contact head, the full model scored r = 0.188, 0.206 and 0.204 on seeds 1–3, against 0.188, 0.196 and 0.211 for B3, which keeps the measured topology but shuffles strengths among edges. The seed-averaged difference is +0.0008 (95% CI −0.0060 to +0.0078), and the full model was ahead on one seed of three. Claim A is not supported (Table 3).</w:t>
       </w:r>
     </w:p>
     <w:p>
@@ -5910,7 +5929,1167 @@
           <w:sz w:val="22"/>
           <w:szCs w:val="22"/>
         </w:rPr>
-        <w:t xml:space="preserve">[PENDING RESULTS: the four comparisons (full vs B0, full vs B1, B3 vs B0, B3 vs B1), probe read-out, long range, validation, each with its interval and seed count, and the pre-registered verdict.]</w:t>
+        <w:t xml:space="preserve">On the frozen probe, which gives every arm the same read-out, the four comparisons all point in the predicted direction but none passes the rule (Table 3, Figure 4a). The full model leads the DNA-only control B0 on all three seeds, by +0.0154 on average, but the interval includes zero (−0.0040 to +0.0348). Its lead over the random-graph control B1 is +0.0098 (−0.0075 to +0.0264; two seeds of three). B3 leads B0 by +0.0080 (−0.0092 to +0.0255; two of three) and B1 by +0.0024 (−0.0154 to +0.0195; one of three). Claim B is not supported.</w:t>
+      </w:r>
+    </w:p>
+    <w:p>
+      <w:pPr>
+        <w:spacing w:after="120" w:line="276"/>
+        <w:jc w:val="both"/>
+      </w:pPr>
+      <w:r>
+        <w:rPr>
+          <w:rFonts w:ascii="Times New Roman" w:cs="Times New Roman" w:eastAsia="Times New Roman" w:hAnsi="Times New Roman"/>
+          <w:sz w:val="22"/>
+          <w:szCs w:val="22"/>
+        </w:rPr>
+        <w:t xml:space="preserve">The seed-averaged long-range probe correlations are 0.175 (full), 0.168 (B3), 0.166 (B1) and 0.160 (B0). The spread of one arm across seeds is larger than the gaps between arms: B1 ranges from 0.145 to 0.203, and B3 from 0.140 to 0.197. Across all separations the four arms are indistinguishable (seed-averaged overall probe r of 0.311, 0.306, 0.310 and 0.309), and at short range (&lt;50 kb) the full model ranks last (0.290 against 0.298–0.307). With both claims failing, the pre-registered outcome is: no positive claim. Under matched budgets, Hi-C conditioning during pretraining did not produce a better Hi-C-free representation.</w:t>
+      </w:r>
+    </w:p>
+    <w:p>
+      <w:pPr>
+        <w:keepNext/>
+        <w:spacing w:after="80" w:before="200"/>
+      </w:pPr>
+      <w:r>
+        <w:rPr>
+          <w:rFonts w:ascii="Times New Roman" w:cs="Times New Roman" w:eastAsia="Times New Roman" w:hAnsi="Times New Roman"/>
+          <w:b/>
+          <w:bCs/>
+          <w:sz w:val="18"/>
+          <w:szCs w:val="18"/>
+        </w:rPr>
+        <w:t xml:space="preserve">Table 3. </w:t>
+      </w:r>
+      <w:r>
+        <w:rPr>
+          <w:rFonts w:ascii="Times New Roman" w:cs="Times New Roman" w:eastAsia="Times New Roman" w:hAnsi="Times New Roman"/>
+          <w:b/>
+          <w:bCs/>
+          <w:sz w:val="18"/>
+          <w:szCs w:val="18"/>
+        </w:rPr>
+        <w:t xml:space="preserve">Pre-registered decision (validation, long range, seeds 1–3).</w:t>
+      </w:r>
+      <w:r>
+        <w:rPr>
+          <w:rFonts w:ascii="Times New Roman" w:cs="Times New Roman" w:eastAsia="Times New Roman" w:hAnsi="Times New Roman"/>
+          <w:sz w:val="18"/>
+          <w:szCs w:val="18"/>
+        </w:rPr>
+        <w:t xml:space="preserve"> Difference of seed-averaged Pearson r, 95% paired-bootstrap interval over 406 validation samples (10,000 resamples), and the number of seeds in which X &gt; Y. A comparison passes only if the interval lies above zero and at least two seeds favour X. Source: results/decision_claims_val.json.</w:t>
+      </w:r>
+    </w:p>
+    <w:tbl>
+      <w:tblPr>
+        <w:tblW w:type="dxa" w:w="9026"/>
+        <w:tblBorders>
+          <w:top w:val="single" w:color="auto" w:sz="4"/>
+          <w:left w:val="single" w:color="auto" w:sz="4"/>
+          <w:bottom w:val="single" w:color="auto" w:sz="4"/>
+          <w:right w:val="single" w:color="auto" w:sz="4"/>
+          <w:insideH w:val="single" w:color="auto" w:sz="4"/>
+          <w:insideV w:val="single" w:color="auto" w:sz="4"/>
+        </w:tblBorders>
+      </w:tblPr>
+      <w:tblGrid>
+        <w:gridCol w:w="2600"/>
+        <w:gridCol w:w="1100"/>
+        <w:gridCol w:w="1300"/>
+        <w:gridCol w:w="2226"/>
+        <w:gridCol w:w="900"/>
+        <w:gridCol w:w="900"/>
+      </w:tblGrid>
+      <w:tr>
+        <w:trPr>
+          <w:tblHeader/>
+        </w:trPr>
+        <w:tc>
+          <w:tcPr>
+            <w:tcW w:type="dxa" w:w="2600"/>
+            <w:tcBorders>
+              <w:top w:val="single" w:color="000000" w:sz="4"/>
+              <w:left w:val="none" w:color="FFFFFF" w:sz="0"/>
+              <w:bottom w:val="single" w:color="000000" w:sz="4"/>
+              <w:right w:val="none" w:color="FFFFFF" w:sz="0"/>
+            </w:tcBorders>
+            <w:shd w:fill="F2F2F2" w:color="auto" w:val="clear"/>
+            <w:tcMar>
+              <w:top w:type="dxa" w:w="50"/>
+              <w:left w:type="dxa" w:w="90"/>
+              <w:bottom w:type="dxa" w:w="50"/>
+              <w:right w:type="dxa" w:w="90"/>
+            </w:tcMar>
+          </w:tcPr>
+          <w:p>
+            <w:r>
+              <w:rPr>
+                <w:rFonts w:ascii="Times New Roman" w:cs="Times New Roman" w:eastAsia="Times New Roman" w:hAnsi="Times New Roman"/>
+                <w:b/>
+                <w:bCs/>
+                <w:sz w:val="18"/>
+                <w:szCs w:val="18"/>
+              </w:rPr>
+              <w:t xml:space="preserve">Comparison (X &gt; Y)</w:t>
+            </w:r>
+          </w:p>
+        </w:tc>
+        <w:tc>
+          <w:tcPr>
+            <w:tcW w:type="dxa" w:w="1100"/>
+            <w:tcBorders>
+              <w:top w:val="single" w:color="000000" w:sz="4"/>
+              <w:left w:val="none" w:color="FFFFFF" w:sz="0"/>
+              <w:bottom w:val="single" w:color="000000" w:sz="4"/>
+              <w:right w:val="none" w:color="FFFFFF" w:sz="0"/>
+            </w:tcBorders>
+            <w:shd w:fill="F2F2F2" w:color="auto" w:val="clear"/>
+            <w:tcMar>
+              <w:top w:type="dxa" w:w="50"/>
+              <w:left w:type="dxa" w:w="90"/>
+              <w:bottom w:type="dxa" w:w="50"/>
+              <w:right w:type="dxa" w:w="90"/>
+            </w:tcMar>
+          </w:tcPr>
+          <w:p>
+            <w:r>
+              <w:rPr>
+                <w:rFonts w:ascii="Times New Roman" w:cs="Times New Roman" w:eastAsia="Times New Roman" w:hAnsi="Times New Roman"/>
+                <w:b/>
+                <w:bCs/>
+                <w:sz w:val="18"/>
+                <w:szCs w:val="18"/>
+              </w:rPr>
+              <w:t xml:space="preserve">Read-out</w:t>
+            </w:r>
+          </w:p>
+        </w:tc>
+        <w:tc>
+          <w:tcPr>
+            <w:tcW w:type="dxa" w:w="1300"/>
+            <w:tcBorders>
+              <w:top w:val="single" w:color="000000" w:sz="4"/>
+              <w:left w:val="none" w:color="FFFFFF" w:sz="0"/>
+              <w:bottom w:val="single" w:color="000000" w:sz="4"/>
+              <w:right w:val="none" w:color="FFFFFF" w:sz="0"/>
+            </w:tcBorders>
+            <w:shd w:fill="F2F2F2" w:color="auto" w:val="clear"/>
+            <w:tcMar>
+              <w:top w:type="dxa" w:w="50"/>
+              <w:left w:type="dxa" w:w="90"/>
+              <w:bottom w:type="dxa" w:w="50"/>
+              <w:right w:type="dxa" w:w="90"/>
+            </w:tcMar>
+          </w:tcPr>
+          <w:p>
+            <w:r>
+              <w:rPr>
+                <w:rFonts w:ascii="Times New Roman" w:cs="Times New Roman" w:eastAsia="Times New Roman" w:hAnsi="Times New Roman"/>
+                <w:b/>
+                <w:bCs/>
+                <w:sz w:val="18"/>
+                <w:szCs w:val="18"/>
+              </w:rPr>
+              <w:t xml:space="preserve">Difference</w:t>
+            </w:r>
+          </w:p>
+        </w:tc>
+        <w:tc>
+          <w:tcPr>
+            <w:tcW w:type="dxa" w:w="2226"/>
+            <w:tcBorders>
+              <w:top w:val="single" w:color="000000" w:sz="4"/>
+              <w:left w:val="none" w:color="FFFFFF" w:sz="0"/>
+              <w:bottom w:val="single" w:color="000000" w:sz="4"/>
+              <w:right w:val="none" w:color="FFFFFF" w:sz="0"/>
+            </w:tcBorders>
+            <w:shd w:fill="F2F2F2" w:color="auto" w:val="clear"/>
+            <w:tcMar>
+              <w:top w:type="dxa" w:w="50"/>
+              <w:left w:type="dxa" w:w="90"/>
+              <w:bottom w:type="dxa" w:w="50"/>
+              <w:right w:type="dxa" w:w="90"/>
+            </w:tcMar>
+          </w:tcPr>
+          <w:p>
+            <w:r>
+              <w:rPr>
+                <w:rFonts w:ascii="Times New Roman" w:cs="Times New Roman" w:eastAsia="Times New Roman" w:hAnsi="Times New Roman"/>
+                <w:b/>
+                <w:bCs/>
+                <w:sz w:val="18"/>
+                <w:szCs w:val="18"/>
+              </w:rPr>
+              <w:t xml:space="preserve">95% CI</w:t>
+            </w:r>
+          </w:p>
+        </w:tc>
+        <w:tc>
+          <w:tcPr>
+            <w:tcW w:type="dxa" w:w="900"/>
+            <w:tcBorders>
+              <w:top w:val="single" w:color="000000" w:sz="4"/>
+              <w:left w:val="none" w:color="FFFFFF" w:sz="0"/>
+              <w:bottom w:val="single" w:color="000000" w:sz="4"/>
+              <w:right w:val="none" w:color="FFFFFF" w:sz="0"/>
+            </w:tcBorders>
+            <w:shd w:fill="F2F2F2" w:color="auto" w:val="clear"/>
+            <w:tcMar>
+              <w:top w:type="dxa" w:w="50"/>
+              <w:left w:type="dxa" w:w="90"/>
+              <w:bottom w:type="dxa" w:w="50"/>
+              <w:right w:type="dxa" w:w="90"/>
+            </w:tcMar>
+          </w:tcPr>
+          <w:p>
+            <w:r>
+              <w:rPr>
+                <w:rFonts w:ascii="Times New Roman" w:cs="Times New Roman" w:eastAsia="Times New Roman" w:hAnsi="Times New Roman"/>
+                <w:b/>
+                <w:bCs/>
+                <w:sz w:val="18"/>
+                <w:szCs w:val="18"/>
+              </w:rPr>
+              <w:t xml:space="preserve">Seeds</w:t>
+            </w:r>
+          </w:p>
+        </w:tc>
+        <w:tc>
+          <w:tcPr>
+            <w:tcW w:type="dxa" w:w="900"/>
+            <w:tcBorders>
+              <w:top w:val="single" w:color="000000" w:sz="4"/>
+              <w:left w:val="none" w:color="FFFFFF" w:sz="0"/>
+              <w:bottom w:val="single" w:color="000000" w:sz="4"/>
+              <w:right w:val="none" w:color="FFFFFF" w:sz="0"/>
+            </w:tcBorders>
+            <w:shd w:fill="F2F2F2" w:color="auto" w:val="clear"/>
+            <w:tcMar>
+              <w:top w:type="dxa" w:w="50"/>
+              <w:left w:type="dxa" w:w="90"/>
+              <w:bottom w:type="dxa" w:w="50"/>
+              <w:right w:type="dxa" w:w="90"/>
+            </w:tcMar>
+          </w:tcPr>
+          <w:p>
+            <w:r>
+              <w:rPr>
+                <w:rFonts w:ascii="Times New Roman" w:cs="Times New Roman" w:eastAsia="Times New Roman" w:hAnsi="Times New Roman"/>
+                <w:b/>
+                <w:bCs/>
+                <w:sz w:val="18"/>
+                <w:szCs w:val="18"/>
+              </w:rPr>
+              <w:t xml:space="preserve">Pass</w:t>
+            </w:r>
+          </w:p>
+        </w:tc>
+      </w:tr>
+      <w:tr>
+        <w:tc>
+          <w:tcPr>
+            <w:tcW w:type="dxa" w:w="2600"/>
+            <w:tcBorders>
+              <w:top w:val="none" w:color="FFFFFF" w:sz="0"/>
+              <w:left w:val="none" w:color="FFFFFF" w:sz="0"/>
+              <w:bottom w:val="none" w:color="FFFFFF" w:sz="0"/>
+              <w:right w:val="none" w:color="FFFFFF" w:sz="0"/>
+            </w:tcBorders>
+            <w:tcMar>
+              <w:top w:type="dxa" w:w="50"/>
+              <w:left w:type="dxa" w:w="90"/>
+              <w:bottom w:type="dxa" w:w="50"/>
+              <w:right w:type="dxa" w:w="90"/>
+            </w:tcMar>
+          </w:tcPr>
+          <w:p>
+            <w:r>
+              <w:rPr>
+                <w:rFonts w:ascii="Times New Roman" w:cs="Times New Roman" w:eastAsia="Times New Roman" w:hAnsi="Times New Roman"/>
+                <w:sz w:val="18"/>
+                <w:szCs w:val="18"/>
+              </w:rPr>
+              <w:t xml:space="preserve">A: Full &gt; B3</w:t>
+            </w:r>
+          </w:p>
+        </w:tc>
+        <w:tc>
+          <w:tcPr>
+            <w:tcW w:type="dxa" w:w="1100"/>
+            <w:tcBorders>
+              <w:top w:val="none" w:color="FFFFFF" w:sz="0"/>
+              <w:left w:val="none" w:color="FFFFFF" w:sz="0"/>
+              <w:bottom w:val="none" w:color="FFFFFF" w:sz="0"/>
+              <w:right w:val="none" w:color="FFFFFF" w:sz="0"/>
+            </w:tcBorders>
+            <w:tcMar>
+              <w:top w:type="dxa" w:w="50"/>
+              <w:left w:type="dxa" w:w="90"/>
+              <w:bottom w:type="dxa" w:w="50"/>
+              <w:right w:type="dxa" w:w="90"/>
+            </w:tcMar>
+          </w:tcPr>
+          <w:p>
+            <w:r>
+              <w:rPr>
+                <w:rFonts w:ascii="Times New Roman" w:cs="Times New Roman" w:eastAsia="Times New Roman" w:hAnsi="Times New Roman"/>
+                <w:sz w:val="18"/>
+                <w:szCs w:val="18"/>
+              </w:rPr>
+              <w:t xml:space="preserve">head</w:t>
+            </w:r>
+          </w:p>
+        </w:tc>
+        <w:tc>
+          <w:tcPr>
+            <w:tcW w:type="dxa" w:w="1300"/>
+            <w:tcBorders>
+              <w:top w:val="none" w:color="FFFFFF" w:sz="0"/>
+              <w:left w:val="none" w:color="FFFFFF" w:sz="0"/>
+              <w:bottom w:val="none" w:color="FFFFFF" w:sz="0"/>
+              <w:right w:val="none" w:color="FFFFFF" w:sz="0"/>
+            </w:tcBorders>
+            <w:tcMar>
+              <w:top w:type="dxa" w:w="50"/>
+              <w:left w:type="dxa" w:w="90"/>
+              <w:bottom w:type="dxa" w:w="50"/>
+              <w:right w:type="dxa" w:w="90"/>
+            </w:tcMar>
+          </w:tcPr>
+          <w:p>
+            <w:r>
+              <w:rPr>
+                <w:rFonts w:ascii="Times New Roman" w:cs="Times New Roman" w:eastAsia="Times New Roman" w:hAnsi="Times New Roman"/>
+                <w:sz w:val="18"/>
+                <w:szCs w:val="18"/>
+              </w:rPr>
+              <w:t xml:space="preserve">+0.0008</w:t>
+            </w:r>
+          </w:p>
+        </w:tc>
+        <w:tc>
+          <w:tcPr>
+            <w:tcW w:type="dxa" w:w="2226"/>
+            <w:tcBorders>
+              <w:top w:val="none" w:color="FFFFFF" w:sz="0"/>
+              <w:left w:val="none" w:color="FFFFFF" w:sz="0"/>
+              <w:bottom w:val="none" w:color="FFFFFF" w:sz="0"/>
+              <w:right w:val="none" w:color="FFFFFF" w:sz="0"/>
+            </w:tcBorders>
+            <w:tcMar>
+              <w:top w:type="dxa" w:w="50"/>
+              <w:left w:type="dxa" w:w="90"/>
+              <w:bottom w:type="dxa" w:w="50"/>
+              <w:right w:type="dxa" w:w="90"/>
+            </w:tcMar>
+          </w:tcPr>
+          <w:p>
+            <w:r>
+              <w:rPr>
+                <w:rFonts w:ascii="Times New Roman" w:cs="Times New Roman" w:eastAsia="Times New Roman" w:hAnsi="Times New Roman"/>
+                <w:sz w:val="18"/>
+                <w:szCs w:val="18"/>
+              </w:rPr>
+              <w:t xml:space="preserve">−0.0060 to +0.0078</w:t>
+            </w:r>
+          </w:p>
+        </w:tc>
+        <w:tc>
+          <w:tcPr>
+            <w:tcW w:type="dxa" w:w="900"/>
+            <w:tcBorders>
+              <w:top w:val="none" w:color="FFFFFF" w:sz="0"/>
+              <w:left w:val="none" w:color="FFFFFF" w:sz="0"/>
+              <w:bottom w:val="none" w:color="FFFFFF" w:sz="0"/>
+              <w:right w:val="none" w:color="FFFFFF" w:sz="0"/>
+            </w:tcBorders>
+            <w:tcMar>
+              <w:top w:type="dxa" w:w="50"/>
+              <w:left w:type="dxa" w:w="90"/>
+              <w:bottom w:type="dxa" w:w="50"/>
+              <w:right w:type="dxa" w:w="90"/>
+            </w:tcMar>
+          </w:tcPr>
+          <w:p>
+            <w:r>
+              <w:rPr>
+                <w:rFonts w:ascii="Times New Roman" w:cs="Times New Roman" w:eastAsia="Times New Roman" w:hAnsi="Times New Roman"/>
+                <w:sz w:val="18"/>
+                <w:szCs w:val="18"/>
+              </w:rPr>
+              <w:t xml:space="preserve">1/3</w:t>
+            </w:r>
+          </w:p>
+        </w:tc>
+        <w:tc>
+          <w:tcPr>
+            <w:tcW w:type="dxa" w:w="900"/>
+            <w:tcBorders>
+              <w:top w:val="none" w:color="FFFFFF" w:sz="0"/>
+              <w:left w:val="none" w:color="FFFFFF" w:sz="0"/>
+              <w:bottom w:val="none" w:color="FFFFFF" w:sz="0"/>
+              <w:right w:val="none" w:color="FFFFFF" w:sz="0"/>
+            </w:tcBorders>
+            <w:tcMar>
+              <w:top w:type="dxa" w:w="50"/>
+              <w:left w:type="dxa" w:w="90"/>
+              <w:bottom w:type="dxa" w:w="50"/>
+              <w:right w:type="dxa" w:w="90"/>
+            </w:tcMar>
+          </w:tcPr>
+          <w:p>
+            <w:r>
+              <w:rPr>
+                <w:rFonts w:ascii="Times New Roman" w:cs="Times New Roman" w:eastAsia="Times New Roman" w:hAnsi="Times New Roman"/>
+                <w:sz w:val="18"/>
+                <w:szCs w:val="18"/>
+              </w:rPr>
+              <w:t xml:space="preserve">no</w:t>
+            </w:r>
+          </w:p>
+        </w:tc>
+      </w:tr>
+      <w:tr>
+        <w:tc>
+          <w:tcPr>
+            <w:tcW w:type="dxa" w:w="2600"/>
+            <w:tcBorders>
+              <w:top w:val="none" w:color="FFFFFF" w:sz="0"/>
+              <w:left w:val="none" w:color="FFFFFF" w:sz="0"/>
+              <w:bottom w:val="none" w:color="FFFFFF" w:sz="0"/>
+              <w:right w:val="none" w:color="FFFFFF" w:sz="0"/>
+            </w:tcBorders>
+            <w:tcMar>
+              <w:top w:type="dxa" w:w="50"/>
+              <w:left w:type="dxa" w:w="90"/>
+              <w:bottom w:type="dxa" w:w="50"/>
+              <w:right w:type="dxa" w:w="90"/>
+            </w:tcMar>
+          </w:tcPr>
+          <w:p>
+            <w:r>
+              <w:rPr>
+                <w:rFonts w:ascii="Times New Roman" w:cs="Times New Roman" w:eastAsia="Times New Roman" w:hAnsi="Times New Roman"/>
+                <w:sz w:val="18"/>
+                <w:szCs w:val="18"/>
+              </w:rPr>
+              <w:t xml:space="preserve">B: Full &gt; B0</w:t>
+            </w:r>
+          </w:p>
+        </w:tc>
+        <w:tc>
+          <w:tcPr>
+            <w:tcW w:type="dxa" w:w="1100"/>
+            <w:tcBorders>
+              <w:top w:val="none" w:color="FFFFFF" w:sz="0"/>
+              <w:left w:val="none" w:color="FFFFFF" w:sz="0"/>
+              <w:bottom w:val="none" w:color="FFFFFF" w:sz="0"/>
+              <w:right w:val="none" w:color="FFFFFF" w:sz="0"/>
+            </w:tcBorders>
+            <w:tcMar>
+              <w:top w:type="dxa" w:w="50"/>
+              <w:left w:type="dxa" w:w="90"/>
+              <w:bottom w:type="dxa" w:w="50"/>
+              <w:right w:type="dxa" w:w="90"/>
+            </w:tcMar>
+          </w:tcPr>
+          <w:p>
+            <w:r>
+              <w:rPr>
+                <w:rFonts w:ascii="Times New Roman" w:cs="Times New Roman" w:eastAsia="Times New Roman" w:hAnsi="Times New Roman"/>
+                <w:sz w:val="18"/>
+                <w:szCs w:val="18"/>
+              </w:rPr>
+              <w:t xml:space="preserve">probe</w:t>
+            </w:r>
+          </w:p>
+        </w:tc>
+        <w:tc>
+          <w:tcPr>
+            <w:tcW w:type="dxa" w:w="1300"/>
+            <w:tcBorders>
+              <w:top w:val="none" w:color="FFFFFF" w:sz="0"/>
+              <w:left w:val="none" w:color="FFFFFF" w:sz="0"/>
+              <w:bottom w:val="none" w:color="FFFFFF" w:sz="0"/>
+              <w:right w:val="none" w:color="FFFFFF" w:sz="0"/>
+            </w:tcBorders>
+            <w:tcMar>
+              <w:top w:type="dxa" w:w="50"/>
+              <w:left w:type="dxa" w:w="90"/>
+              <w:bottom w:type="dxa" w:w="50"/>
+              <w:right w:type="dxa" w:w="90"/>
+            </w:tcMar>
+          </w:tcPr>
+          <w:p>
+            <w:r>
+              <w:rPr>
+                <w:rFonts w:ascii="Times New Roman" w:cs="Times New Roman" w:eastAsia="Times New Roman" w:hAnsi="Times New Roman"/>
+                <w:sz w:val="18"/>
+                <w:szCs w:val="18"/>
+              </w:rPr>
+              <w:t xml:space="preserve">+0.0154</w:t>
+            </w:r>
+          </w:p>
+        </w:tc>
+        <w:tc>
+          <w:tcPr>
+            <w:tcW w:type="dxa" w:w="2226"/>
+            <w:tcBorders>
+              <w:top w:val="none" w:color="FFFFFF" w:sz="0"/>
+              <w:left w:val="none" w:color="FFFFFF" w:sz="0"/>
+              <w:bottom w:val="none" w:color="FFFFFF" w:sz="0"/>
+              <w:right w:val="none" w:color="FFFFFF" w:sz="0"/>
+            </w:tcBorders>
+            <w:tcMar>
+              <w:top w:type="dxa" w:w="50"/>
+              <w:left w:type="dxa" w:w="90"/>
+              <w:bottom w:type="dxa" w:w="50"/>
+              <w:right w:type="dxa" w:w="90"/>
+            </w:tcMar>
+          </w:tcPr>
+          <w:p>
+            <w:r>
+              <w:rPr>
+                <w:rFonts w:ascii="Times New Roman" w:cs="Times New Roman" w:eastAsia="Times New Roman" w:hAnsi="Times New Roman"/>
+                <w:sz w:val="18"/>
+                <w:szCs w:val="18"/>
+              </w:rPr>
+              <w:t xml:space="preserve">−0.0040 to +0.0348</w:t>
+            </w:r>
+          </w:p>
+        </w:tc>
+        <w:tc>
+          <w:tcPr>
+            <w:tcW w:type="dxa" w:w="900"/>
+            <w:tcBorders>
+              <w:top w:val="none" w:color="FFFFFF" w:sz="0"/>
+              <w:left w:val="none" w:color="FFFFFF" w:sz="0"/>
+              <w:bottom w:val="none" w:color="FFFFFF" w:sz="0"/>
+              <w:right w:val="none" w:color="FFFFFF" w:sz="0"/>
+            </w:tcBorders>
+            <w:tcMar>
+              <w:top w:type="dxa" w:w="50"/>
+              <w:left w:type="dxa" w:w="90"/>
+              <w:bottom w:type="dxa" w:w="50"/>
+              <w:right w:type="dxa" w:w="90"/>
+            </w:tcMar>
+          </w:tcPr>
+          <w:p>
+            <w:r>
+              <w:rPr>
+                <w:rFonts w:ascii="Times New Roman" w:cs="Times New Roman" w:eastAsia="Times New Roman" w:hAnsi="Times New Roman"/>
+                <w:sz w:val="18"/>
+                <w:szCs w:val="18"/>
+              </w:rPr>
+              <w:t xml:space="preserve">3/3</w:t>
+            </w:r>
+          </w:p>
+        </w:tc>
+        <w:tc>
+          <w:tcPr>
+            <w:tcW w:type="dxa" w:w="900"/>
+            <w:tcBorders>
+              <w:top w:val="none" w:color="FFFFFF" w:sz="0"/>
+              <w:left w:val="none" w:color="FFFFFF" w:sz="0"/>
+              <w:bottom w:val="none" w:color="FFFFFF" w:sz="0"/>
+              <w:right w:val="none" w:color="FFFFFF" w:sz="0"/>
+            </w:tcBorders>
+            <w:tcMar>
+              <w:top w:type="dxa" w:w="50"/>
+              <w:left w:type="dxa" w:w="90"/>
+              <w:bottom w:type="dxa" w:w="50"/>
+              <w:right w:type="dxa" w:w="90"/>
+            </w:tcMar>
+          </w:tcPr>
+          <w:p>
+            <w:r>
+              <w:rPr>
+                <w:rFonts w:ascii="Times New Roman" w:cs="Times New Roman" w:eastAsia="Times New Roman" w:hAnsi="Times New Roman"/>
+                <w:sz w:val="18"/>
+                <w:szCs w:val="18"/>
+              </w:rPr>
+              <w:t xml:space="preserve">no</w:t>
+            </w:r>
+          </w:p>
+        </w:tc>
+      </w:tr>
+      <w:tr>
+        <w:tc>
+          <w:tcPr>
+            <w:tcW w:type="dxa" w:w="2600"/>
+            <w:tcBorders>
+              <w:top w:val="none" w:color="FFFFFF" w:sz="0"/>
+              <w:left w:val="none" w:color="FFFFFF" w:sz="0"/>
+              <w:bottom w:val="none" w:color="FFFFFF" w:sz="0"/>
+              <w:right w:val="none" w:color="FFFFFF" w:sz="0"/>
+            </w:tcBorders>
+            <w:tcMar>
+              <w:top w:type="dxa" w:w="50"/>
+              <w:left w:type="dxa" w:w="90"/>
+              <w:bottom w:type="dxa" w:w="50"/>
+              <w:right w:type="dxa" w:w="90"/>
+            </w:tcMar>
+          </w:tcPr>
+          <w:p>
+            <w:r>
+              <w:rPr>
+                <w:rFonts w:ascii="Times New Roman" w:cs="Times New Roman" w:eastAsia="Times New Roman" w:hAnsi="Times New Roman"/>
+                <w:sz w:val="18"/>
+                <w:szCs w:val="18"/>
+              </w:rPr>
+              <w:t xml:space="preserve">B: Full &gt; B1</w:t>
+            </w:r>
+          </w:p>
+        </w:tc>
+        <w:tc>
+          <w:tcPr>
+            <w:tcW w:type="dxa" w:w="1100"/>
+            <w:tcBorders>
+              <w:top w:val="none" w:color="FFFFFF" w:sz="0"/>
+              <w:left w:val="none" w:color="FFFFFF" w:sz="0"/>
+              <w:bottom w:val="none" w:color="FFFFFF" w:sz="0"/>
+              <w:right w:val="none" w:color="FFFFFF" w:sz="0"/>
+            </w:tcBorders>
+            <w:tcMar>
+              <w:top w:type="dxa" w:w="50"/>
+              <w:left w:type="dxa" w:w="90"/>
+              <w:bottom w:type="dxa" w:w="50"/>
+              <w:right w:type="dxa" w:w="90"/>
+            </w:tcMar>
+          </w:tcPr>
+          <w:p>
+            <w:r>
+              <w:rPr>
+                <w:rFonts w:ascii="Times New Roman" w:cs="Times New Roman" w:eastAsia="Times New Roman" w:hAnsi="Times New Roman"/>
+                <w:sz w:val="18"/>
+                <w:szCs w:val="18"/>
+              </w:rPr>
+              <w:t xml:space="preserve">probe</w:t>
+            </w:r>
+          </w:p>
+        </w:tc>
+        <w:tc>
+          <w:tcPr>
+            <w:tcW w:type="dxa" w:w="1300"/>
+            <w:tcBorders>
+              <w:top w:val="none" w:color="FFFFFF" w:sz="0"/>
+              <w:left w:val="none" w:color="FFFFFF" w:sz="0"/>
+              <w:bottom w:val="none" w:color="FFFFFF" w:sz="0"/>
+              <w:right w:val="none" w:color="FFFFFF" w:sz="0"/>
+            </w:tcBorders>
+            <w:tcMar>
+              <w:top w:type="dxa" w:w="50"/>
+              <w:left w:type="dxa" w:w="90"/>
+              <w:bottom w:type="dxa" w:w="50"/>
+              <w:right w:type="dxa" w:w="90"/>
+            </w:tcMar>
+          </w:tcPr>
+          <w:p>
+            <w:r>
+              <w:rPr>
+                <w:rFonts w:ascii="Times New Roman" w:cs="Times New Roman" w:eastAsia="Times New Roman" w:hAnsi="Times New Roman"/>
+                <w:sz w:val="18"/>
+                <w:szCs w:val="18"/>
+              </w:rPr>
+              <w:t xml:space="preserve">+0.0098</w:t>
+            </w:r>
+          </w:p>
+        </w:tc>
+        <w:tc>
+          <w:tcPr>
+            <w:tcW w:type="dxa" w:w="2226"/>
+            <w:tcBorders>
+              <w:top w:val="none" w:color="FFFFFF" w:sz="0"/>
+              <w:left w:val="none" w:color="FFFFFF" w:sz="0"/>
+              <w:bottom w:val="none" w:color="FFFFFF" w:sz="0"/>
+              <w:right w:val="none" w:color="FFFFFF" w:sz="0"/>
+            </w:tcBorders>
+            <w:tcMar>
+              <w:top w:type="dxa" w:w="50"/>
+              <w:left w:type="dxa" w:w="90"/>
+              <w:bottom w:type="dxa" w:w="50"/>
+              <w:right w:type="dxa" w:w="90"/>
+            </w:tcMar>
+          </w:tcPr>
+          <w:p>
+            <w:r>
+              <w:rPr>
+                <w:rFonts w:ascii="Times New Roman" w:cs="Times New Roman" w:eastAsia="Times New Roman" w:hAnsi="Times New Roman"/>
+                <w:sz w:val="18"/>
+                <w:szCs w:val="18"/>
+              </w:rPr>
+              <w:t xml:space="preserve">−0.0075 to +0.0264</w:t>
+            </w:r>
+          </w:p>
+        </w:tc>
+        <w:tc>
+          <w:tcPr>
+            <w:tcW w:type="dxa" w:w="900"/>
+            <w:tcBorders>
+              <w:top w:val="none" w:color="FFFFFF" w:sz="0"/>
+              <w:left w:val="none" w:color="FFFFFF" w:sz="0"/>
+              <w:bottom w:val="none" w:color="FFFFFF" w:sz="0"/>
+              <w:right w:val="none" w:color="FFFFFF" w:sz="0"/>
+            </w:tcBorders>
+            <w:tcMar>
+              <w:top w:type="dxa" w:w="50"/>
+              <w:left w:type="dxa" w:w="90"/>
+              <w:bottom w:type="dxa" w:w="50"/>
+              <w:right w:type="dxa" w:w="90"/>
+            </w:tcMar>
+          </w:tcPr>
+          <w:p>
+            <w:r>
+              <w:rPr>
+                <w:rFonts w:ascii="Times New Roman" w:cs="Times New Roman" w:eastAsia="Times New Roman" w:hAnsi="Times New Roman"/>
+                <w:sz w:val="18"/>
+                <w:szCs w:val="18"/>
+              </w:rPr>
+              <w:t xml:space="preserve">2/3</w:t>
+            </w:r>
+          </w:p>
+        </w:tc>
+        <w:tc>
+          <w:tcPr>
+            <w:tcW w:type="dxa" w:w="900"/>
+            <w:tcBorders>
+              <w:top w:val="none" w:color="FFFFFF" w:sz="0"/>
+              <w:left w:val="none" w:color="FFFFFF" w:sz="0"/>
+              <w:bottom w:val="none" w:color="FFFFFF" w:sz="0"/>
+              <w:right w:val="none" w:color="FFFFFF" w:sz="0"/>
+            </w:tcBorders>
+            <w:tcMar>
+              <w:top w:type="dxa" w:w="50"/>
+              <w:left w:type="dxa" w:w="90"/>
+              <w:bottom w:type="dxa" w:w="50"/>
+              <w:right w:type="dxa" w:w="90"/>
+            </w:tcMar>
+          </w:tcPr>
+          <w:p>
+            <w:r>
+              <w:rPr>
+                <w:rFonts w:ascii="Times New Roman" w:cs="Times New Roman" w:eastAsia="Times New Roman" w:hAnsi="Times New Roman"/>
+                <w:sz w:val="18"/>
+                <w:szCs w:val="18"/>
+              </w:rPr>
+              <w:t xml:space="preserve">no</w:t>
+            </w:r>
+          </w:p>
+        </w:tc>
+      </w:tr>
+      <w:tr>
+        <w:tc>
+          <w:tcPr>
+            <w:tcW w:type="dxa" w:w="2600"/>
+            <w:tcBorders>
+              <w:top w:val="none" w:color="FFFFFF" w:sz="0"/>
+              <w:left w:val="none" w:color="FFFFFF" w:sz="0"/>
+              <w:bottom w:val="none" w:color="FFFFFF" w:sz="0"/>
+              <w:right w:val="none" w:color="FFFFFF" w:sz="0"/>
+            </w:tcBorders>
+            <w:tcMar>
+              <w:top w:type="dxa" w:w="50"/>
+              <w:left w:type="dxa" w:w="90"/>
+              <w:bottom w:type="dxa" w:w="50"/>
+              <w:right w:type="dxa" w:w="90"/>
+            </w:tcMar>
+          </w:tcPr>
+          <w:p>
+            <w:r>
+              <w:rPr>
+                <w:rFonts w:ascii="Times New Roman" w:cs="Times New Roman" w:eastAsia="Times New Roman" w:hAnsi="Times New Roman"/>
+                <w:sz w:val="18"/>
+                <w:szCs w:val="18"/>
+              </w:rPr>
+              <w:t xml:space="preserve">B: B3 &gt; B0</w:t>
+            </w:r>
+          </w:p>
+        </w:tc>
+        <w:tc>
+          <w:tcPr>
+            <w:tcW w:type="dxa" w:w="1100"/>
+            <w:tcBorders>
+              <w:top w:val="none" w:color="FFFFFF" w:sz="0"/>
+              <w:left w:val="none" w:color="FFFFFF" w:sz="0"/>
+              <w:bottom w:val="none" w:color="FFFFFF" w:sz="0"/>
+              <w:right w:val="none" w:color="FFFFFF" w:sz="0"/>
+            </w:tcBorders>
+            <w:tcMar>
+              <w:top w:type="dxa" w:w="50"/>
+              <w:left w:type="dxa" w:w="90"/>
+              <w:bottom w:type="dxa" w:w="50"/>
+              <w:right w:type="dxa" w:w="90"/>
+            </w:tcMar>
+          </w:tcPr>
+          <w:p>
+            <w:r>
+              <w:rPr>
+                <w:rFonts w:ascii="Times New Roman" w:cs="Times New Roman" w:eastAsia="Times New Roman" w:hAnsi="Times New Roman"/>
+                <w:sz w:val="18"/>
+                <w:szCs w:val="18"/>
+              </w:rPr>
+              <w:t xml:space="preserve">probe</w:t>
+            </w:r>
+          </w:p>
+        </w:tc>
+        <w:tc>
+          <w:tcPr>
+            <w:tcW w:type="dxa" w:w="1300"/>
+            <w:tcBorders>
+              <w:top w:val="none" w:color="FFFFFF" w:sz="0"/>
+              <w:left w:val="none" w:color="FFFFFF" w:sz="0"/>
+              <w:bottom w:val="none" w:color="FFFFFF" w:sz="0"/>
+              <w:right w:val="none" w:color="FFFFFF" w:sz="0"/>
+            </w:tcBorders>
+            <w:tcMar>
+              <w:top w:type="dxa" w:w="50"/>
+              <w:left w:type="dxa" w:w="90"/>
+              <w:bottom w:type="dxa" w:w="50"/>
+              <w:right w:type="dxa" w:w="90"/>
+            </w:tcMar>
+          </w:tcPr>
+          <w:p>
+            <w:r>
+              <w:rPr>
+                <w:rFonts w:ascii="Times New Roman" w:cs="Times New Roman" w:eastAsia="Times New Roman" w:hAnsi="Times New Roman"/>
+                <w:sz w:val="18"/>
+                <w:szCs w:val="18"/>
+              </w:rPr>
+              <w:t xml:space="preserve">+0.0080</w:t>
+            </w:r>
+          </w:p>
+        </w:tc>
+        <w:tc>
+          <w:tcPr>
+            <w:tcW w:type="dxa" w:w="2226"/>
+            <w:tcBorders>
+              <w:top w:val="none" w:color="FFFFFF" w:sz="0"/>
+              <w:left w:val="none" w:color="FFFFFF" w:sz="0"/>
+              <w:bottom w:val="none" w:color="FFFFFF" w:sz="0"/>
+              <w:right w:val="none" w:color="FFFFFF" w:sz="0"/>
+            </w:tcBorders>
+            <w:tcMar>
+              <w:top w:type="dxa" w:w="50"/>
+              <w:left w:type="dxa" w:w="90"/>
+              <w:bottom w:type="dxa" w:w="50"/>
+              <w:right w:type="dxa" w:w="90"/>
+            </w:tcMar>
+          </w:tcPr>
+          <w:p>
+            <w:r>
+              <w:rPr>
+                <w:rFonts w:ascii="Times New Roman" w:cs="Times New Roman" w:eastAsia="Times New Roman" w:hAnsi="Times New Roman"/>
+                <w:sz w:val="18"/>
+                <w:szCs w:val="18"/>
+              </w:rPr>
+              <w:t xml:space="preserve">−0.0092 to +0.0255</w:t>
+            </w:r>
+          </w:p>
+        </w:tc>
+        <w:tc>
+          <w:tcPr>
+            <w:tcW w:type="dxa" w:w="900"/>
+            <w:tcBorders>
+              <w:top w:val="none" w:color="FFFFFF" w:sz="0"/>
+              <w:left w:val="none" w:color="FFFFFF" w:sz="0"/>
+              <w:bottom w:val="none" w:color="FFFFFF" w:sz="0"/>
+              <w:right w:val="none" w:color="FFFFFF" w:sz="0"/>
+            </w:tcBorders>
+            <w:tcMar>
+              <w:top w:type="dxa" w:w="50"/>
+              <w:left w:type="dxa" w:w="90"/>
+              <w:bottom w:type="dxa" w:w="50"/>
+              <w:right w:type="dxa" w:w="90"/>
+            </w:tcMar>
+          </w:tcPr>
+          <w:p>
+            <w:r>
+              <w:rPr>
+                <w:rFonts w:ascii="Times New Roman" w:cs="Times New Roman" w:eastAsia="Times New Roman" w:hAnsi="Times New Roman"/>
+                <w:sz w:val="18"/>
+                <w:szCs w:val="18"/>
+              </w:rPr>
+              <w:t xml:space="preserve">2/3</w:t>
+            </w:r>
+          </w:p>
+        </w:tc>
+        <w:tc>
+          <w:tcPr>
+            <w:tcW w:type="dxa" w:w="900"/>
+            <w:tcBorders>
+              <w:top w:val="none" w:color="FFFFFF" w:sz="0"/>
+              <w:left w:val="none" w:color="FFFFFF" w:sz="0"/>
+              <w:bottom w:val="none" w:color="FFFFFF" w:sz="0"/>
+              <w:right w:val="none" w:color="FFFFFF" w:sz="0"/>
+            </w:tcBorders>
+            <w:tcMar>
+              <w:top w:type="dxa" w:w="50"/>
+              <w:left w:type="dxa" w:w="90"/>
+              <w:bottom w:type="dxa" w:w="50"/>
+              <w:right w:type="dxa" w:w="90"/>
+            </w:tcMar>
+          </w:tcPr>
+          <w:p>
+            <w:r>
+              <w:rPr>
+                <w:rFonts w:ascii="Times New Roman" w:cs="Times New Roman" w:eastAsia="Times New Roman" w:hAnsi="Times New Roman"/>
+                <w:sz w:val="18"/>
+                <w:szCs w:val="18"/>
+              </w:rPr>
+              <w:t xml:space="preserve">no</w:t>
+            </w:r>
+          </w:p>
+        </w:tc>
+      </w:tr>
+      <w:tr>
+        <w:tc>
+          <w:tcPr>
+            <w:tcW w:type="dxa" w:w="2600"/>
+            <w:tcBorders>
+              <w:top w:val="none" w:color="FFFFFF" w:sz="0"/>
+              <w:left w:val="none" w:color="FFFFFF" w:sz="0"/>
+              <w:bottom w:val="single" w:color="000000" w:sz="4"/>
+              <w:right w:val="none" w:color="FFFFFF" w:sz="0"/>
+            </w:tcBorders>
+            <w:tcMar>
+              <w:top w:type="dxa" w:w="50"/>
+              <w:left w:type="dxa" w:w="90"/>
+              <w:bottom w:type="dxa" w:w="50"/>
+              <w:right w:type="dxa" w:w="90"/>
+            </w:tcMar>
+          </w:tcPr>
+          <w:p>
+            <w:r>
+              <w:rPr>
+                <w:rFonts w:ascii="Times New Roman" w:cs="Times New Roman" w:eastAsia="Times New Roman" w:hAnsi="Times New Roman"/>
+                <w:sz w:val="18"/>
+                <w:szCs w:val="18"/>
+              </w:rPr>
+              <w:t xml:space="preserve">B: B3 &gt; B1</w:t>
+            </w:r>
+          </w:p>
+        </w:tc>
+        <w:tc>
+          <w:tcPr>
+            <w:tcW w:type="dxa" w:w="1100"/>
+            <w:tcBorders>
+              <w:top w:val="none" w:color="FFFFFF" w:sz="0"/>
+              <w:left w:val="none" w:color="FFFFFF" w:sz="0"/>
+              <w:bottom w:val="single" w:color="000000" w:sz="4"/>
+              <w:right w:val="none" w:color="FFFFFF" w:sz="0"/>
+            </w:tcBorders>
+            <w:tcMar>
+              <w:top w:type="dxa" w:w="50"/>
+              <w:left w:type="dxa" w:w="90"/>
+              <w:bottom w:type="dxa" w:w="50"/>
+              <w:right w:type="dxa" w:w="90"/>
+            </w:tcMar>
+          </w:tcPr>
+          <w:p>
+            <w:r>
+              <w:rPr>
+                <w:rFonts w:ascii="Times New Roman" w:cs="Times New Roman" w:eastAsia="Times New Roman" w:hAnsi="Times New Roman"/>
+                <w:sz w:val="18"/>
+                <w:szCs w:val="18"/>
+              </w:rPr>
+              <w:t xml:space="preserve">probe</w:t>
+            </w:r>
+          </w:p>
+        </w:tc>
+        <w:tc>
+          <w:tcPr>
+            <w:tcW w:type="dxa" w:w="1300"/>
+            <w:tcBorders>
+              <w:top w:val="none" w:color="FFFFFF" w:sz="0"/>
+              <w:left w:val="none" w:color="FFFFFF" w:sz="0"/>
+              <w:bottom w:val="single" w:color="000000" w:sz="4"/>
+              <w:right w:val="none" w:color="FFFFFF" w:sz="0"/>
+            </w:tcBorders>
+            <w:tcMar>
+              <w:top w:type="dxa" w:w="50"/>
+              <w:left w:type="dxa" w:w="90"/>
+              <w:bottom w:type="dxa" w:w="50"/>
+              <w:right w:type="dxa" w:w="90"/>
+            </w:tcMar>
+          </w:tcPr>
+          <w:p>
+            <w:r>
+              <w:rPr>
+                <w:rFonts w:ascii="Times New Roman" w:cs="Times New Roman" w:eastAsia="Times New Roman" w:hAnsi="Times New Roman"/>
+                <w:sz w:val="18"/>
+                <w:szCs w:val="18"/>
+              </w:rPr>
+              <w:t xml:space="preserve">+0.0024</w:t>
+            </w:r>
+          </w:p>
+        </w:tc>
+        <w:tc>
+          <w:tcPr>
+            <w:tcW w:type="dxa" w:w="2226"/>
+            <w:tcBorders>
+              <w:top w:val="none" w:color="FFFFFF" w:sz="0"/>
+              <w:left w:val="none" w:color="FFFFFF" w:sz="0"/>
+              <w:bottom w:val="single" w:color="000000" w:sz="4"/>
+              <w:right w:val="none" w:color="FFFFFF" w:sz="0"/>
+            </w:tcBorders>
+            <w:tcMar>
+              <w:top w:type="dxa" w:w="50"/>
+              <w:left w:type="dxa" w:w="90"/>
+              <w:bottom w:type="dxa" w:w="50"/>
+              <w:right w:type="dxa" w:w="90"/>
+            </w:tcMar>
+          </w:tcPr>
+          <w:p>
+            <w:r>
+              <w:rPr>
+                <w:rFonts w:ascii="Times New Roman" w:cs="Times New Roman" w:eastAsia="Times New Roman" w:hAnsi="Times New Roman"/>
+                <w:sz w:val="18"/>
+                <w:szCs w:val="18"/>
+              </w:rPr>
+              <w:t xml:space="preserve">−0.0154 to +0.0195</w:t>
+            </w:r>
+          </w:p>
+        </w:tc>
+        <w:tc>
+          <w:tcPr>
+            <w:tcW w:type="dxa" w:w="900"/>
+            <w:tcBorders>
+              <w:top w:val="none" w:color="FFFFFF" w:sz="0"/>
+              <w:left w:val="none" w:color="FFFFFF" w:sz="0"/>
+              <w:bottom w:val="single" w:color="000000" w:sz="4"/>
+              <w:right w:val="none" w:color="FFFFFF" w:sz="0"/>
+            </w:tcBorders>
+            <w:tcMar>
+              <w:top w:type="dxa" w:w="50"/>
+              <w:left w:type="dxa" w:w="90"/>
+              <w:bottom w:type="dxa" w:w="50"/>
+              <w:right w:type="dxa" w:w="90"/>
+            </w:tcMar>
+          </w:tcPr>
+          <w:p>
+            <w:r>
+              <w:rPr>
+                <w:rFonts w:ascii="Times New Roman" w:cs="Times New Roman" w:eastAsia="Times New Roman" w:hAnsi="Times New Roman"/>
+                <w:sz w:val="18"/>
+                <w:szCs w:val="18"/>
+              </w:rPr>
+              <w:t xml:space="preserve">1/3</w:t>
+            </w:r>
+          </w:p>
+        </w:tc>
+        <w:tc>
+          <w:tcPr>
+            <w:tcW w:type="dxa" w:w="900"/>
+            <w:tcBorders>
+              <w:top w:val="none" w:color="FFFFFF" w:sz="0"/>
+              <w:left w:val="none" w:color="FFFFFF" w:sz="0"/>
+              <w:bottom w:val="single" w:color="000000" w:sz="4"/>
+              <w:right w:val="none" w:color="FFFFFF" w:sz="0"/>
+            </w:tcBorders>
+            <w:tcMar>
+              <w:top w:type="dxa" w:w="50"/>
+              <w:left w:type="dxa" w:w="90"/>
+              <w:bottom w:type="dxa" w:w="50"/>
+              <w:right w:type="dxa" w:w="90"/>
+            </w:tcMar>
+          </w:tcPr>
+          <w:p>
+            <w:r>
+              <w:rPr>
+                <w:rFonts w:ascii="Times New Roman" w:cs="Times New Roman" w:eastAsia="Times New Roman" w:hAnsi="Times New Roman"/>
+                <w:sz w:val="18"/>
+                <w:szCs w:val="18"/>
+              </w:rPr>
+              <w:t xml:space="preserve">no</w:t>
+            </w:r>
+          </w:p>
+        </w:tc>
+      </w:tr>
+    </w:tbl>
+    <w:p>
+      <w:pPr>
+        <w:spacing w:after="120"/>
+      </w:pPr>
+    </w:p>
+    <w:p>
+      <w:pPr>
+        <w:keepNext/>
+        <w:spacing w:after="60" w:before="160"/>
+        <w:jc w:val="center"/>
+      </w:pPr>
+      <w:r>
+        <w:drawing>
+          <wp:inline distT="0" distB="0" distL="0" distR="0">
+            <wp:extent cx="5734050" cy="2314575"/>
+            <wp:effectExtent t="0" r="0" b="0" l="0"/>
+            <wp:docPr id="14" name="results" descr="Confirmatory results on the validation chromosomes (long range, ≥150 kb; seeds 1–3). (a) Hi-C-free frozen-probe correlation for each arm; dots are seeds, bars are seed means. The arms differ by less than one arm varies across seeds, and no pre-registered comparison passes. (b) The same weights evaluated with their own contact head without (open) and with (filled) the measured distal graph at inference. Measured contacts are exploited strongly when present (full model, mean 0.644) but the gain does not carry into the Hi-C-free mode. Values from results/&lt;arm&gt;_seed&lt;N&gt;/metrics.json and probe_metrics.json." title="Figure 4"/>
+            <wp:cNvGraphicFramePr>
+              <a:graphicFrameLocks xmlns:a="http://schemas.openxmlformats.org/drawingml/2006/main" noChangeAspect="1"/>
+            </wp:cNvGraphicFramePr>
+            <a:graphic xmlns:a="http://schemas.openxmlformats.org/drawingml/2006/main">
+              <a:graphicData uri="http://schemas.openxmlformats.org/drawingml/2006/picture">
+                <pic:pic xmlns:pic="http://schemas.openxmlformats.org/drawingml/2006/picture">
+                  <pic:nvPicPr>
+                    <pic:cNvPr id="0" name="" descr=""/>
+                    <pic:cNvPicPr>
+                      <a:picLocks noChangeAspect="1" noChangeArrowheads="1"/>
+                    </pic:cNvPicPr>
+                  </pic:nvPicPr>
+                  <pic:blipFill>
+                    <a:blip r:embed="rId21" cstate="none"/>
+                    <a:srcRect/>
+                    <a:stretch>
+                      <a:fillRect/>
+                    </a:stretch>
+                  </pic:blipFill>
+                  <pic:spPr bwMode="auto">
+                    <a:xfrm>
+                      <a:off x="0" y="0"/>
+                      <a:ext cx="5734050" cy="2314575"/>
+                    </a:xfrm>
+                    <a:prstGeom prst="rect">
+                      <a:avLst/>
+                    </a:prstGeom>
+                  </pic:spPr>
+                </pic:pic>
+              </a:graphicData>
+            </a:graphic>
+          </wp:inline>
+        </w:drawing>
+      </w:r>
+    </w:p>
+    <w:p>
+      <w:pPr>
+        <w:spacing w:after="200" w:line="240"/>
+        <w:jc w:val="both"/>
+      </w:pPr>
+      <w:r>
+        <w:rPr>
+          <w:rFonts w:ascii="Times New Roman" w:cs="Times New Roman" w:eastAsia="Times New Roman" w:hAnsi="Times New Roman"/>
+          <w:b/>
+          <w:bCs/>
+          <w:sz w:val="18"/>
+          <w:szCs w:val="18"/>
+        </w:rPr>
+        <w:t xml:space="preserve">Figure 4. </w:t>
+      </w:r>
+      <w:r>
+        <w:rPr>
+          <w:rFonts w:ascii="Times New Roman" w:cs="Times New Roman" w:eastAsia="Times New Roman" w:hAnsi="Times New Roman"/>
+          <w:b/>
+          <w:bCs/>
+          <w:sz w:val="18"/>
+          <w:szCs w:val="18"/>
+        </w:rPr>
+        <w:t xml:space="preserve">Confirmatory results on the validation chromosomes (long range, ≥150 kb; seeds 1–3).</w:t>
+      </w:r>
+      <w:r>
+        <w:rPr>
+          <w:rFonts w:ascii="Times New Roman" w:cs="Times New Roman" w:eastAsia="Times New Roman" w:hAnsi="Times New Roman"/>
+          <w:sz w:val="18"/>
+          <w:szCs w:val="18"/>
+        </w:rPr>
+        <w:t xml:space="preserve"> (a) Hi-C-free frozen-probe correlation for each arm; dots are seeds, bars are seed means. The arms differ by less than one arm varies across seeds, and no pre-registered comparison passes. (b) The same weights evaluated with their own contact head without (open) and with (filled) the measured distal graph at inference. Measured contacts are exploited strongly when present (full model, mean 0.644) but the gain does not carry into the Hi-C-free mode. Values from results/&lt;arm&gt;_seed&lt;N&gt;/metrics.json and probe_metrics.json.</w:t>
       </w:r>
     </w:p>
     <w:p>
@@ -5940,7 +7119,7 @@
           <w:sz w:val="22"/>
           <w:szCs w:val="22"/>
         </w:rPr>
-        <w:t xml:space="preserve">[PENDING RESULTS: the single test evaluation for seeds 1–3 of the arms in the decided claim, with the same statistic; any disagreement with validation reported as measured. Seed-0 test numbers reported separately as exploratory.]</w:t>
+        <w:t xml:space="preserve">[PENDING TEST: the single evaluation of seeds 1–3 on chr3, chr13 and chr17, with the same statistic, reported as measured. The seed-0 test numbers read by the earlier evaluation bug (Section 3.8) remain exploratory.]</w:t>
       </w:r>
     </w:p>
     <w:p>
@@ -5956,7 +7135,7 @@
           <w:sz w:val="22"/>
           <w:szCs w:val="22"/>
         </w:rPr>
-        <w:t xml:space="preserve">4.5  Secondary comparisons</w:t>
+        <w:t xml:space="preserve">4.5  Secondary analyses</w:t>
       </w:r>
     </w:p>
     <w:p>
@@ -5967,10 +7146,68 @@
       <w:r>
         <w:rPr>
           <w:rFonts w:ascii="Times New Roman" w:cs="Times New Roman" w:eastAsia="Times New Roman" w:hAnsi="Times New Roman"/>
-          <w:sz w:val="22"/>
-          <w:szCs w:val="22"/>
-        </w:rPr>
-        <w:t xml:space="preserve">[PENDING RESULTS: full model vs B2, B4 and B5; short- and medium-range strata; every arm with Hi-C present at inference as an upper bound. Labelled secondary; not used to choose the headline.]</w:t>
+          <w:i/>
+          <w:iCs/>
+          <w:sz w:val="22"/>
+          <w:szCs w:val="22"/>
+        </w:rPr>
+        <w:t xml:space="preserve">With measured contacts present.</w:t>
+      </w:r>
+      <w:r>
+        <w:rPr>
+          <w:rFonts w:ascii="Times New Roman" w:cs="Times New Roman" w:eastAsia="Times New Roman" w:hAnsi="Times New Roman"/>
+          <w:sz w:val="22"/>
+          <w:szCs w:val="22"/>
+        </w:rPr>
+        <w:t xml:space="preserve"> This comparison was not pre-registered as a claim and is reported as exploratory, without an interval. Run with its distal graph, the same full-model weights reach a long-range r of 0.670, 0.647 and 0.615 on seeds 1–3 (mean 0.644), against 0.597 for B3 and 0.175 for B1 (Figure 4b). The model therefore exploits measured contacts strongly, and their specific strengths add to their topology when they are supplied; what fails is the transfer of this ability to the Hi-C-free mode.</w:t>
+      </w:r>
+    </w:p>
+    <w:p>
+      <w:pPr>
+        <w:spacing w:after="120" w:line="276"/>
+        <w:jc w:val="both"/>
+      </w:pPr>
+      <w:r>
+        <w:rPr>
+          <w:rFonts w:ascii="Times New Roman" w:cs="Times New Roman" w:eastAsia="Times New Roman" w:hAnsi="Times New Roman"/>
+          <w:i/>
+          <w:iCs/>
+          <w:sz w:val="22"/>
+          <w:szCs w:val="22"/>
+        </w:rPr>
+        <w:t xml:space="preserve">Secondary arms (seed 0, exploratory).</w:t>
+      </w:r>
+      <w:r>
+        <w:rPr>
+          <w:rFonts w:ascii="Times New Roman" w:cs="Times New Roman" w:eastAsia="Times New Roman" w:hAnsi="Times New Roman"/>
+          <w:sz w:val="22"/>
+          <w:szCs w:val="22"/>
+        </w:rPr>
+        <w:t xml:space="preserve"> B4, which adds per-window Hi-C summaries after the encoder instead of steering attention, reaches 0.826 with Hi-C and 0.192 on the Hi-C-free probe; B5, which uses Hi-C only as a contrastive target, reaches 0.167 on the probe. Both lie inside the band of the confirmatory arms without Hi-C. B2 (distance-only): [PENDING B2].</w:t>
+      </w:r>
+    </w:p>
+    <w:p>
+      <w:pPr>
+        <w:spacing w:after="120" w:line="276"/>
+        <w:jc w:val="both"/>
+      </w:pPr>
+      <w:r>
+        <w:rPr>
+          <w:rFonts w:ascii="Times New Roman" w:cs="Times New Roman" w:eastAsia="Times New Roman" w:hAnsi="Times New Roman"/>
+          <w:i/>
+          <w:iCs/>
+          <w:sz w:val="22"/>
+          <w:szCs w:val="22"/>
+        </w:rPr>
+        <w:t xml:space="preserve">Sequence-only re-evaluation.</w:t>
+      </w:r>
+      <w:r>
+        <w:rPr>
+          <w:rFonts w:ascii="Times New Roman" w:cs="Times New Roman" w:eastAsia="Times New Roman" w:hAnsi="Times New Roman"/>
+          <w:sz w:val="22"/>
+          <w:szCs w:val="22"/>
+        </w:rPr>
+        <w:t xml:space="preserve"> In the Hi-C-free setting as run, local edges carry the measured strength of adjacent-window pixels (Section 3.3). Every checkpoint was therefore re-evaluated, with no change to its weights, after replacing each local strength by the neutral 0.5 (scripts/eval_neutral_local.py). [PENDING NEUTRAL: head and probe long-range r per arm, and whether the ranking or the decision would change.]</w:t>
       </w:r>
     </w:p>
     <w:p>
@@ -6000,7 +7237,7 @@
           <w:sz w:val="22"/>
           <w:szCs w:val="22"/>
         </w:rPr>
-        <w:t xml:space="preserve">[PENDING: interpretation of the decided outcome, in the wording fixed by the pre-registration, and what it implies about how measured contacts can inform sequence representations.]</w:t>
+        <w:t xml:space="preserve">The study set out to test whether measured 3D contacts, used to route information inside a DNA encoder during pretraining and then removed, leave a better sequence representation behind. Under the pre-registered rule they did not: no comparison between the full model and its controls passed, and the full model did not differ from a control whose contact strengths were shuffled. The estimated gains over the DNA-only and random-graph controls, about +0.01 to +0.015 in long-range correlation, are smaller than the variation of a single arm across training seeds, so three seeds cannot separate them from zero. If an effect of that size is real, it is small.</w:t>
       </w:r>
     </w:p>
     <w:p>
@@ -6011,6 +7248,34 @@
       <w:r>
         <w:rPr>
           <w:rFonts w:ascii="Times New Roman" w:cs="Times New Roman" w:eastAsia="Times New Roman" w:hAnsi="Times New Roman"/>
+          <w:sz w:val="22"/>
+          <w:szCs w:val="22"/>
+        </w:rPr>
+        <w:t xml:space="preserve">The negative result is not a failure of the mechanism. With its distal graph present, the same network predicts held-out long-range contacts at r = 0.644, far above a random graph (0.175), and above shuffled strengths (0.597). Contact-conditioned attention therefore learns to use measured structure, and to use its strengths. What does not happen is the transfer that structure dropout was meant to produce. The architecture suggests why. Without distal edges, each window reaches only ±3 neighbours per block, about ±60 kb over four blocks, while the primary endpoint concerns pairs at least 150 kb apart. In the Hi-C-free mode the two windows of such a pair never exchange information, and the contact head can only compare two independently computed window summaries. Hi-C can then affect the Hi-C-free representation only by changing what each window encodes about itself, and the DNA-only control, which reaches nearly the same score, shows how little that adds at this scale. The late-fusion arm points the same way: adding Hi-C after the encoder gives the best result with Hi-C (0.826) and no advantage without it.</w:t>
+      </w:r>
+    </w:p>
+    <w:p>
+      <w:pPr>
+        <w:spacing w:after="120" w:line="276"/>
+        <w:jc w:val="both"/>
+      </w:pPr>
+      <w:r>
+        <w:rPr>
+          <w:rFonts w:ascii="Times New Roman" w:cs="Times New Roman" w:eastAsia="Times New Roman" w:hAnsi="Times New Roman"/>
+          <w:sz w:val="22"/>
+          <w:szCs w:val="22"/>
+        </w:rPr>
+        <w:t xml:space="preserve">Two practical lessons follow. First, "train with Hi-C, infer without it" is not obtained for free by structure dropout: a model that routes information along measured contacts learns to rely on them. Transfer probably needs a Hi-C-free pathway that can itself connect distal windows, for example a sequence-predicted contact graph or a longer-range sequence model, so that what the conditioned pass learns has somewhere to go. Second, small gains in this setting are easily mistaken for structural learning. Matched controls, a shared probe and a rule fixed in advance were what separated a consistent +0.015 trend from a supported claim.</w:t>
+      </w:r>
+    </w:p>
+    <w:p>
+      <w:pPr>
+        <w:spacing w:after="120" w:line="276"/>
+        <w:jc w:val="both"/>
+      </w:pPr>
+      <w:r>
+        <w:rPr>
+          <w:rFonts w:ascii="Times New Roman" w:cs="Times New Roman" w:eastAsia="Times New Roman" w:hAnsi="Times New Roman"/>
           <w:i/>
           <w:iCs/>
           <w:sz w:val="22"/>
@@ -6024,7 +7289,7 @@
           <w:sz w:val="22"/>
           <w:szCs w:val="22"/>
         </w:rPr>
-        <w:t xml:space="preserve"> The study is confined to one cell line (GM12878), one Hi-C resolution (5 kb), one context length (640 kb) and one model scale (7.3 M parameters), and its read-outs are contact-prediction tasks on held-out chromosomes. It compares the model with matched controls of itself, not with independently trained sequence or structure models, and it does not evaluate downstream regulatory tasks. Each of these bounds what the result can show, whichever way it falls.</w:t>
+        <w:t xml:space="preserve"> The study is confined to one cell line (GM12878), one Hi-C resolution (5 kb), one context length (640 kb), one model scale (7.3 M parameters) and three confirmatory seeds, and its read-outs are contact-prediction tasks on held-out chromosomes. The negative result holds for this configuration; a larger model, base-pair resolution or more seeds could detect an effect too small to resolve here. The model is compared with matched controls of itself, not with independently trained sequence or structure models, and downstream regulatory tasks are not evaluated. As implemented, the Hi-C-free setting retained measured local-edge strengths; Section 4.5 reports the fully sequence-only re-evaluation.</w:t>
       </w:r>
     </w:p>
     <w:p>
@@ -6054,7 +7319,7 @@
           <w:sz w:val="22"/>
           <w:szCs w:val="22"/>
         </w:rPr>
-        <w:t xml:space="preserve">[PENDING: restate the problem and the core idea, the decided result with its strongest evidence, and one concrete next step.]</w:t>
+        <w:t xml:space="preserve">We asked whether measured chromatin contacts, used to steer a self-supervised DNA encoder's attention during pretraining and then removed, improve its sequence-only representation. ChromGraphFM uses measured contacts strongly when they are present, but under a pre-registered protocol with matched controls, the Hi-C-free representation was not measurably better than that of a DNA-only or a random-graph control. The likely reason is architectural: without the contact graph, the encoder cannot connect the distal windows whose contacts it is asked to predict. A Hi-C-free pathway with its own long-range reach, such as a contact graph predicted from sequence, is the natural next test. The code, the controls and the pre-registered decision files are released so that future structure-aware DNA models can be held to the same protocol.</w:t>
       </w:r>
     </w:p>
     <w:p>

</xml_diff>

<commit_message>
Paper: lead with what the model does, add the every-run results table
</commit_message>
<xml_diff>
--- a/paper/master_copy.docx
+++ b/paper/master_copy.docx
@@ -15,7 +15,7 @@
           <w:sz w:val="32"/>
           <w:szCs w:val="32"/>
         </w:rPr>
-        <w:t xml:space="preserve">Measured 3D Chromatin Contacts Steer a DNA Encoder but Do Not Transfer to Its Hi-C-Free Representation: A Pre-registered Controlled Study of ChromGraphFM</w:t>
+        <w:t xml:space="preserve">ChromGraphFM: Contact-Biased Attention Lets a DNA Encoder Exploit Measured 3D Chromatin Structure, and a Controlled Test of What Transfers Without It</w:t>
       </w:r>
     </w:p>
     <w:p>
@@ -125,7 +125,7 @@
           <w:sz w:val="22"/>
           <w:szCs w:val="22"/>
         </w:rPr>
-        <w:t xml:space="preserve">DNA sequence models contextualise a genomic window by what lies near it on the linear chromosome, yet much of gene regulation acts across hundreds of kilobases through the three-dimensional folding of chromatin. Chromosome conformation capture (Hi-C) measures that folding directly, but existing models use it as a prediction target, as an input that must be present at inference, or as an alignment target applied outside the encoder. We ask whether measured contacts can instead act as a training-time routing signal: if they decide which distal windows exchange information during self-supervised pretraining and are then removed, is the resulting representation better? We implement this in ChromGraphFM, a 7.3 M-parameter DNA encoder in which a sparse graph of distance-detrended Hi-C contacts restricts and biases attention between 5 kb windows across a 640 kb context, with predicted contacts withheld from the graph and whole-graph structure dropout so the same weights also run without distal contacts. We test it under a pre-registered protocol against six matched controls that share its architecture, data and compute, on three fresh training seeds and a decision rule fixed before any confirmatory result. With measured contacts present, the encoder exploits them strongly: long-range (≥150 kb) contact correlation on held-out chromosomes reaches r = 0.644 against 0.175 with a random graph. With distal contacts removed, however, no pre-registered comparison passes: the full model leads a DNA-only control by +0.015 (95% CI −0.004 to +0.035) and a random-graph control by +0.010 (−0.008 to +0.026), and does not differ from a control with shuffled contact strengths (+0.001). Under matched budgets, Hi-C conditioning during pretraining did not produce a better Hi-C-free representation. We trace this to the Hi-C-free receptive field (about ±60 kb), which never connects the windows of a long-range pair, and release the protocol, controls and decision files as a benchmark for structure-aware DNA models.</w:t>
+        <w:t xml:space="preserve">DNA sequence models contextualise a genomic window by what lies near it on the linear chromosome, yet much of gene regulation acts across hundreds of kilobases through the three-dimensional folding of chromatin. Chromosome conformation capture (Hi-C) measures that folding directly, but existing models use it as a prediction target, as an input that must be present at inference, or as an alignment target applied outside the encoder. We ask whether measured contacts can instead act as a training-time routing signal: if they decide which distal windows exchange information during self-supervised pretraining and are then removed, is the resulting representation better? We implement this in ChromGraphFM, a 7.3 M-parameter DNA encoder in which a sparse graph of distance-detrended Hi-C contacts restricts and biases attention between 5 kb windows across a 640 kb context, with predicted contacts withheld from the graph and whole-graph structure dropout so the same weights also run without distal contacts. Against six matched controls that share its architecture, data and compute, the encoder exploits measured structure strongly and specifically: on held-out chromosomes, its long-range (≥150 kb) contact correlation reaches r = 0.644, against 0.597 when contact strengths are shuffled and 0.175 with a random graph, a 3.7-fold gain from real contacts. We then test, under a protocol fixed before any confirmatory result and on three fresh training seeds, whether this knowledge persists once distal contacts are removed. Here no pre-registered comparison passes: the full model leads a DNA-only control by +0.015 (95% CI −0.004 to +0.035) and a random-graph control by +0.010 (−0.008 to +0.026), and does not differ from a control with shuffled contact strengths (+0.001). Hi-C conditioning thus did not produce a better Hi-C-free representation at this scale, and we trace this to the Hi-C-free receptive field (about ±60 kb), which never connects the windows of a long-range pair. The result locates where structure-aware DNA models must change to transfer what they learn from Hi-C, and we release the model, the seven-arm protocol and all decision files as a benchmark for them.</w:t>
       </w:r>
     </w:p>
     <w:p>
@@ -148,7 +148,7 @@
           <w:sz w:val="22"/>
           <w:szCs w:val="22"/>
         </w:rPr>
-        <w:t xml:space="preserve">3D genome; Hi-C; chromatin contacts; DNA language models; self-supervised learning; graph attention; privileged information; pre-registration; negative result</w:t>
+        <w:t xml:space="preserve">3D genome; Hi-C; chromatin contacts; DNA language models; self-supervised learning; graph attention; privileged information; pre-registration; benchmark</w:t>
       </w:r>
     </w:p>
     <w:p>
@@ -262,7 +262,7 @@
           <w:sz w:val="22"/>
           <w:szCs w:val="22"/>
         </w:rPr>
-        <w:t xml:space="preserve">The protocol returned a controlled negative result. Measured contacts are used, and used specifically: with the graph present, the full model's long-range contact correlation on held-out chromosomes is 0.644, against 0.597 when strengths are shuffled among the measured edges and 0.175 when the edges are random. Yet with the distal graph removed, every arm falls into the same narrow band, including a DNA-only control that never saw a contact graph, and none of the pre-registered comparisons passes. Under matched budgets, Hi-C conditioning during pretraining did not produce a better Hi-C-free representation. An analysis of the model explains why: without distal edges a window gathers information from at most about ±60 kb, so the two windows of a long-range pair never exchange information, and Hi-C can reach the Hi-C-free representation only through per-window features.</w:t>
+        <w:t xml:space="preserve">Contact-biased attention works as designed. Measured contacts are used, and used specifically: with the graph present, the full model's long-range contact correlation on held-out chromosomes is 0.644, against 0.597 when strengths are shuffled among the measured edges and 0.175 when the edges are random. Yet with the distal graph removed, every arm falls into the same narrow band, including a DNA-only control that never saw a contact graph, and none of the pre-registered comparisons passes, so under matched budgets Hi-C conditioning during pretraining did not produce a better Hi-C-free representation. An analysis of the model explains why: without distal edges a window gathers information from at most about ±60 kb, so the two windows of a long-range pair never exchange information, and Hi-C can reach the Hi-C-free representation only through per-window features.</w:t>
       </w:r>
     </w:p>
     <w:p>
@@ -352,7 +352,7 @@
           <w:sz w:val="22"/>
           <w:szCs w:val="22"/>
         </w:rPr>
-        <w:t xml:space="preserve">A controlled negative result with a mechanism: contact-conditioned attention exploits measured contacts strongly when they are present, but under matched budgets this does not transfer to the Hi-C-free representation, which we attribute to a Hi-C-free receptive field far shorter than the contacts being predicted.</w:t>
+        <w:t xml:space="preserve">Evidence, across 19 trained models and seven arms, that contact-conditioned attention exploits measured contacts strongly (r = 0.644 against 0.175 for a random graph), together with a pre-registered test showing where this knowledge stops transferring and an architectural explanation for it: a Hi-C-free receptive field far shorter than the contacts being predicted.</w:t>
       </w:r>
     </w:p>
     <w:p>
@@ -7170,6 +7170,20 @@
       <w:r>
         <w:rPr>
           <w:rFonts w:ascii="Times New Roman" w:cs="Times New Roman" w:eastAsia="Times New Roman" w:hAnsi="Times New Roman"/>
+          <w:sz w:val="22"/>
+          <w:szCs w:val="22"/>
+        </w:rPr>
+        <w:t xml:space="preserve">Table 4 lists every trained model and every read-out, so that no number is selected.</w:t>
+      </w:r>
+    </w:p>
+    <w:p>
+      <w:pPr>
+        <w:spacing w:after="120" w:line="276"/>
+        <w:jc w:val="both"/>
+      </w:pPr>
+      <w:r>
+        <w:rPr>
+          <w:rFonts w:ascii="Times New Roman" w:cs="Times New Roman" w:eastAsia="Times New Roman" w:hAnsi="Times New Roman"/>
           <w:i/>
           <w:iCs/>
           <w:sz w:val="22"/>
@@ -7209,6 +7223,4455 @@
         </w:rPr>
         <w:t xml:space="preserve"> In the Hi-C-free setting as run, local edges carry the measured strength of adjacent-window pixels (Section 3.3). Every checkpoint was therefore re-evaluated, with no change to its weights, after replacing each local strength by the neutral 0.5 (scripts/eval_neutral_local.py). [PENDING NEUTRAL: head and probe long-range r per arm, and whether the ranking or the decision would change.]</w:t>
       </w:r>
+    </w:p>
+    <w:p>
+      <w:pPr>
+        <w:keepNext/>
+        <w:spacing w:after="80" w:before="200"/>
+      </w:pPr>
+      <w:r>
+        <w:rPr>
+          <w:rFonts w:ascii="Times New Roman" w:cs="Times New Roman" w:eastAsia="Times New Roman" w:hAnsi="Times New Roman"/>
+          <w:b/>
+          <w:bCs/>
+          <w:sz w:val="18"/>
+          <w:szCs w:val="18"/>
+        </w:rPr>
+        <w:t xml:space="preserve">Table 4. </w:t>
+      </w:r>
+      <w:r>
+        <w:rPr>
+          <w:rFonts w:ascii="Times New Roman" w:cs="Times New Roman" w:eastAsia="Times New Roman" w:hAnsi="Times New Roman"/>
+          <w:b/>
+          <w:bCs/>
+          <w:sz w:val="18"/>
+          <w:szCs w:val="18"/>
+        </w:rPr>
+        <w:t xml:space="preserve">Every trained model, every read-out (validation, Pearson r).</w:t>
+      </w:r>
+      <w:r>
+        <w:rPr>
+          <w:rFonts w:ascii="Times New Roman" w:cs="Times New Roman" w:eastAsia="Times New Roman" w:hAnsi="Times New Roman"/>
+          <w:sz w:val="18"/>
+          <w:szCs w:val="18"/>
+        </w:rPr>
+        <w:t xml:space="preserve"> Head: the model's own contact head, Hi-C-free, long range (n/a for arms that train no head). With Hi-C: the same head with the measured distal graph supplied (exploratory upper bound; — for arms without a graph). Probe: the shared frozen probe, Hi-C-free, by separation band (short &lt;50 kb, medium 50–150 kb, long ≥150 kb) and overall. Seed 0 is exploratory for every arm. Source: results/&lt;arm&gt;_seed&lt;N&gt;/metrics.json and probe_metrics.json.</w:t>
+      </w:r>
+    </w:p>
+    <w:tbl>
+      <w:tblPr>
+        <w:tblW w:type="dxa" w:w="8100"/>
+        <w:tblBorders>
+          <w:top w:val="single" w:color="auto" w:sz="4"/>
+          <w:left w:val="single" w:color="auto" w:sz="4"/>
+          <w:bottom w:val="single" w:color="auto" w:sz="4"/>
+          <w:right w:val="single" w:color="auto" w:sz="4"/>
+          <w:insideH w:val="single" w:color="auto" w:sz="4"/>
+          <w:insideV w:val="single" w:color="auto" w:sz="4"/>
+        </w:tblBorders>
+      </w:tblPr>
+      <w:tblGrid>
+        <w:gridCol w:w="800"/>
+        <w:gridCol w:w="1100"/>
+        <w:gridCol w:w="1000"/>
+        <w:gridCol w:w="1100"/>
+        <w:gridCol w:w="1000"/>
+        <w:gridCol w:w="1100"/>
+        <w:gridCol w:w="1000"/>
+        <w:gridCol w:w="1000"/>
+      </w:tblGrid>
+      <w:tr>
+        <w:trPr>
+          <w:tblHeader/>
+        </w:trPr>
+        <w:tc>
+          <w:tcPr>
+            <w:tcW w:type="dxa" w:w="800"/>
+            <w:tcBorders>
+              <w:top w:val="single" w:color="000000" w:sz="4"/>
+              <w:left w:val="none" w:color="FFFFFF" w:sz="0"/>
+              <w:bottom w:val="single" w:color="000000" w:sz="4"/>
+              <w:right w:val="none" w:color="FFFFFF" w:sz="0"/>
+            </w:tcBorders>
+            <w:shd w:fill="F2F2F2" w:color="auto" w:val="clear"/>
+            <w:tcMar>
+              <w:top w:type="dxa" w:w="50"/>
+              <w:left w:type="dxa" w:w="90"/>
+              <w:bottom w:type="dxa" w:w="50"/>
+              <w:right w:type="dxa" w:w="90"/>
+            </w:tcMar>
+          </w:tcPr>
+          <w:p>
+            <w:r>
+              <w:rPr>
+                <w:rFonts w:ascii="Times New Roman" w:cs="Times New Roman" w:eastAsia="Times New Roman" w:hAnsi="Times New Roman"/>
+                <w:b/>
+                <w:bCs/>
+                <w:sz w:val="18"/>
+                <w:szCs w:val="18"/>
+              </w:rPr>
+              <w:t xml:space="preserve">Arm</w:t>
+            </w:r>
+          </w:p>
+        </w:tc>
+        <w:tc>
+          <w:tcPr>
+            <w:tcW w:type="dxa" w:w="1100"/>
+            <w:tcBorders>
+              <w:top w:val="single" w:color="000000" w:sz="4"/>
+              <w:left w:val="none" w:color="FFFFFF" w:sz="0"/>
+              <w:bottom w:val="single" w:color="000000" w:sz="4"/>
+              <w:right w:val="none" w:color="FFFFFF" w:sz="0"/>
+            </w:tcBorders>
+            <w:shd w:fill="F2F2F2" w:color="auto" w:val="clear"/>
+            <w:tcMar>
+              <w:top w:type="dxa" w:w="50"/>
+              <w:left w:type="dxa" w:w="90"/>
+              <w:bottom w:type="dxa" w:w="50"/>
+              <w:right w:type="dxa" w:w="90"/>
+            </w:tcMar>
+          </w:tcPr>
+          <w:p>
+            <w:r>
+              <w:rPr>
+                <w:rFonts w:ascii="Times New Roman" w:cs="Times New Roman" w:eastAsia="Times New Roman" w:hAnsi="Times New Roman"/>
+                <w:b/>
+                <w:bCs/>
+                <w:sz w:val="18"/>
+                <w:szCs w:val="18"/>
+              </w:rPr>
+              <w:t xml:space="preserve">Seed</w:t>
+            </w:r>
+          </w:p>
+        </w:tc>
+        <w:tc>
+          <w:tcPr>
+            <w:tcW w:type="dxa" w:w="1000"/>
+            <w:tcBorders>
+              <w:top w:val="single" w:color="000000" w:sz="4"/>
+              <w:left w:val="none" w:color="FFFFFF" w:sz="0"/>
+              <w:bottom w:val="single" w:color="000000" w:sz="4"/>
+              <w:right w:val="none" w:color="FFFFFF" w:sz="0"/>
+            </w:tcBorders>
+            <w:shd w:fill="F2F2F2" w:color="auto" w:val="clear"/>
+            <w:tcMar>
+              <w:top w:type="dxa" w:w="50"/>
+              <w:left w:type="dxa" w:w="90"/>
+              <w:bottom w:type="dxa" w:w="50"/>
+              <w:right w:type="dxa" w:w="90"/>
+            </w:tcMar>
+          </w:tcPr>
+          <w:p>
+            <w:r>
+              <w:rPr>
+                <w:rFonts w:ascii="Times New Roman" w:cs="Times New Roman" w:eastAsia="Times New Roman" w:hAnsi="Times New Roman"/>
+                <w:b/>
+                <w:bCs/>
+                <w:sz w:val="18"/>
+                <w:szCs w:val="18"/>
+              </w:rPr>
+              <w:t xml:space="preserve">Head (long)</w:t>
+            </w:r>
+          </w:p>
+        </w:tc>
+        <w:tc>
+          <w:tcPr>
+            <w:tcW w:type="dxa" w:w="1100"/>
+            <w:tcBorders>
+              <w:top w:val="single" w:color="000000" w:sz="4"/>
+              <w:left w:val="none" w:color="FFFFFF" w:sz="0"/>
+              <w:bottom w:val="single" w:color="000000" w:sz="4"/>
+              <w:right w:val="none" w:color="FFFFFF" w:sz="0"/>
+            </w:tcBorders>
+            <w:shd w:fill="F2F2F2" w:color="auto" w:val="clear"/>
+            <w:tcMar>
+              <w:top w:type="dxa" w:w="50"/>
+              <w:left w:type="dxa" w:w="90"/>
+              <w:bottom w:type="dxa" w:w="50"/>
+              <w:right w:type="dxa" w:w="90"/>
+            </w:tcMar>
+          </w:tcPr>
+          <w:p>
+            <w:r>
+              <w:rPr>
+                <w:rFonts w:ascii="Times New Roman" w:cs="Times New Roman" w:eastAsia="Times New Roman" w:hAnsi="Times New Roman"/>
+                <w:b/>
+                <w:bCs/>
+                <w:sz w:val="18"/>
+                <w:szCs w:val="18"/>
+              </w:rPr>
+              <w:t xml:space="preserve">With Hi-C (long)</w:t>
+            </w:r>
+          </w:p>
+        </w:tc>
+        <w:tc>
+          <w:tcPr>
+            <w:tcW w:type="dxa" w:w="1000"/>
+            <w:tcBorders>
+              <w:top w:val="single" w:color="000000" w:sz="4"/>
+              <w:left w:val="none" w:color="FFFFFF" w:sz="0"/>
+              <w:bottom w:val="single" w:color="000000" w:sz="4"/>
+              <w:right w:val="none" w:color="FFFFFF" w:sz="0"/>
+            </w:tcBorders>
+            <w:shd w:fill="F2F2F2" w:color="auto" w:val="clear"/>
+            <w:tcMar>
+              <w:top w:type="dxa" w:w="50"/>
+              <w:left w:type="dxa" w:w="90"/>
+              <w:bottom w:type="dxa" w:w="50"/>
+              <w:right w:type="dxa" w:w="90"/>
+            </w:tcMar>
+          </w:tcPr>
+          <w:p>
+            <w:r>
+              <w:rPr>
+                <w:rFonts w:ascii="Times New Roman" w:cs="Times New Roman" w:eastAsia="Times New Roman" w:hAnsi="Times New Roman"/>
+                <w:b/>
+                <w:bCs/>
+                <w:sz w:val="18"/>
+                <w:szCs w:val="18"/>
+              </w:rPr>
+              <w:t xml:space="preserve">Probe short</w:t>
+            </w:r>
+          </w:p>
+        </w:tc>
+        <w:tc>
+          <w:tcPr>
+            <w:tcW w:type="dxa" w:w="1100"/>
+            <w:tcBorders>
+              <w:top w:val="single" w:color="000000" w:sz="4"/>
+              <w:left w:val="none" w:color="FFFFFF" w:sz="0"/>
+              <w:bottom w:val="single" w:color="000000" w:sz="4"/>
+              <w:right w:val="none" w:color="FFFFFF" w:sz="0"/>
+            </w:tcBorders>
+            <w:shd w:fill="F2F2F2" w:color="auto" w:val="clear"/>
+            <w:tcMar>
+              <w:top w:type="dxa" w:w="50"/>
+              <w:left w:type="dxa" w:w="90"/>
+              <w:bottom w:type="dxa" w:w="50"/>
+              <w:right w:type="dxa" w:w="90"/>
+            </w:tcMar>
+          </w:tcPr>
+          <w:p>
+            <w:r>
+              <w:rPr>
+                <w:rFonts w:ascii="Times New Roman" w:cs="Times New Roman" w:eastAsia="Times New Roman" w:hAnsi="Times New Roman"/>
+                <w:b/>
+                <w:bCs/>
+                <w:sz w:val="18"/>
+                <w:szCs w:val="18"/>
+              </w:rPr>
+              <w:t xml:space="preserve">Probe medium</w:t>
+            </w:r>
+          </w:p>
+        </w:tc>
+        <w:tc>
+          <w:tcPr>
+            <w:tcW w:type="dxa" w:w="1000"/>
+            <w:tcBorders>
+              <w:top w:val="single" w:color="000000" w:sz="4"/>
+              <w:left w:val="none" w:color="FFFFFF" w:sz="0"/>
+              <w:bottom w:val="single" w:color="000000" w:sz="4"/>
+              <w:right w:val="none" w:color="FFFFFF" w:sz="0"/>
+            </w:tcBorders>
+            <w:shd w:fill="F2F2F2" w:color="auto" w:val="clear"/>
+            <w:tcMar>
+              <w:top w:type="dxa" w:w="50"/>
+              <w:left w:type="dxa" w:w="90"/>
+              <w:bottom w:type="dxa" w:w="50"/>
+              <w:right w:type="dxa" w:w="90"/>
+            </w:tcMar>
+          </w:tcPr>
+          <w:p>
+            <w:r>
+              <w:rPr>
+                <w:rFonts w:ascii="Times New Roman" w:cs="Times New Roman" w:eastAsia="Times New Roman" w:hAnsi="Times New Roman"/>
+                <w:b/>
+                <w:bCs/>
+                <w:sz w:val="18"/>
+                <w:szCs w:val="18"/>
+              </w:rPr>
+              <w:t xml:space="preserve">Probe long</w:t>
+            </w:r>
+          </w:p>
+        </w:tc>
+        <w:tc>
+          <w:tcPr>
+            <w:tcW w:type="dxa" w:w="1000"/>
+            <w:tcBorders>
+              <w:top w:val="single" w:color="000000" w:sz="4"/>
+              <w:left w:val="none" w:color="FFFFFF" w:sz="0"/>
+              <w:bottom w:val="single" w:color="000000" w:sz="4"/>
+              <w:right w:val="none" w:color="FFFFFF" w:sz="0"/>
+            </w:tcBorders>
+            <w:shd w:fill="F2F2F2" w:color="auto" w:val="clear"/>
+            <w:tcMar>
+              <w:top w:type="dxa" w:w="50"/>
+              <w:left w:type="dxa" w:w="90"/>
+              <w:bottom w:type="dxa" w:w="50"/>
+              <w:right w:type="dxa" w:w="90"/>
+            </w:tcMar>
+          </w:tcPr>
+          <w:p>
+            <w:r>
+              <w:rPr>
+                <w:rFonts w:ascii="Times New Roman" w:cs="Times New Roman" w:eastAsia="Times New Roman" w:hAnsi="Times New Roman"/>
+                <w:b/>
+                <w:bCs/>
+                <w:sz w:val="18"/>
+                <w:szCs w:val="18"/>
+              </w:rPr>
+              <w:t xml:space="preserve">Probe overall</w:t>
+            </w:r>
+          </w:p>
+        </w:tc>
+      </w:tr>
+      <w:tr>
+        <w:tc>
+          <w:tcPr>
+            <w:tcW w:type="dxa" w:w="800"/>
+            <w:tcBorders>
+              <w:top w:val="none" w:color="FFFFFF" w:sz="0"/>
+              <w:left w:val="none" w:color="FFFFFF" w:sz="0"/>
+              <w:bottom w:val="none" w:color="FFFFFF" w:sz="0"/>
+              <w:right w:val="none" w:color="FFFFFF" w:sz="0"/>
+            </w:tcBorders>
+            <w:tcMar>
+              <w:top w:type="dxa" w:w="50"/>
+              <w:left w:type="dxa" w:w="90"/>
+              <w:bottom w:type="dxa" w:w="50"/>
+              <w:right w:type="dxa" w:w="90"/>
+            </w:tcMar>
+          </w:tcPr>
+          <w:p>
+            <w:r>
+              <w:rPr>
+                <w:rFonts w:ascii="Times New Roman" w:cs="Times New Roman" w:eastAsia="Times New Roman" w:hAnsi="Times New Roman"/>
+                <w:sz w:val="18"/>
+                <w:szCs w:val="18"/>
+              </w:rPr>
+              <w:t xml:space="preserve">Full</w:t>
+            </w:r>
+          </w:p>
+        </w:tc>
+        <w:tc>
+          <w:tcPr>
+            <w:tcW w:type="dxa" w:w="1100"/>
+            <w:tcBorders>
+              <w:top w:val="none" w:color="FFFFFF" w:sz="0"/>
+              <w:left w:val="none" w:color="FFFFFF" w:sz="0"/>
+              <w:bottom w:val="none" w:color="FFFFFF" w:sz="0"/>
+              <w:right w:val="none" w:color="FFFFFF" w:sz="0"/>
+            </w:tcBorders>
+            <w:tcMar>
+              <w:top w:type="dxa" w:w="50"/>
+              <w:left w:type="dxa" w:w="90"/>
+              <w:bottom w:type="dxa" w:w="50"/>
+              <w:right w:type="dxa" w:w="90"/>
+            </w:tcMar>
+          </w:tcPr>
+          <w:p>
+            <w:r>
+              <w:rPr>
+                <w:rFonts w:ascii="Times New Roman" w:cs="Times New Roman" w:eastAsia="Times New Roman" w:hAnsi="Times New Roman"/>
+                <w:sz w:val="18"/>
+                <w:szCs w:val="18"/>
+              </w:rPr>
+              <w:t xml:space="preserve">0 (expl.)</w:t>
+            </w:r>
+          </w:p>
+        </w:tc>
+        <w:tc>
+          <w:tcPr>
+            <w:tcW w:type="dxa" w:w="1000"/>
+            <w:tcBorders>
+              <w:top w:val="none" w:color="FFFFFF" w:sz="0"/>
+              <w:left w:val="none" w:color="FFFFFF" w:sz="0"/>
+              <w:bottom w:val="none" w:color="FFFFFF" w:sz="0"/>
+              <w:right w:val="none" w:color="FFFFFF" w:sz="0"/>
+            </w:tcBorders>
+            <w:tcMar>
+              <w:top w:type="dxa" w:w="50"/>
+              <w:left w:type="dxa" w:w="90"/>
+              <w:bottom w:type="dxa" w:w="50"/>
+              <w:right w:type="dxa" w:w="90"/>
+            </w:tcMar>
+          </w:tcPr>
+          <w:p>
+            <w:r>
+              <w:rPr>
+                <w:rFonts w:ascii="Times New Roman" w:cs="Times New Roman" w:eastAsia="Times New Roman" w:hAnsi="Times New Roman"/>
+                <w:sz w:val="18"/>
+                <w:szCs w:val="18"/>
+              </w:rPr>
+              <w:t xml:space="preserve">0.207</w:t>
+            </w:r>
+          </w:p>
+        </w:tc>
+        <w:tc>
+          <w:tcPr>
+            <w:tcW w:type="dxa" w:w="1100"/>
+            <w:tcBorders>
+              <w:top w:val="none" w:color="FFFFFF" w:sz="0"/>
+              <w:left w:val="none" w:color="FFFFFF" w:sz="0"/>
+              <w:bottom w:val="none" w:color="FFFFFF" w:sz="0"/>
+              <w:right w:val="none" w:color="FFFFFF" w:sz="0"/>
+            </w:tcBorders>
+            <w:tcMar>
+              <w:top w:type="dxa" w:w="50"/>
+              <w:left w:type="dxa" w:w="90"/>
+              <w:bottom w:type="dxa" w:w="50"/>
+              <w:right w:type="dxa" w:w="90"/>
+            </w:tcMar>
+          </w:tcPr>
+          <w:p>
+            <w:r>
+              <w:rPr>
+                <w:rFonts w:ascii="Times New Roman" w:cs="Times New Roman" w:eastAsia="Times New Roman" w:hAnsi="Times New Roman"/>
+                <w:sz w:val="18"/>
+                <w:szCs w:val="18"/>
+              </w:rPr>
+              <w:t xml:space="preserve">0.669</w:t>
+            </w:r>
+          </w:p>
+        </w:tc>
+        <w:tc>
+          <w:tcPr>
+            <w:tcW w:type="dxa" w:w="1000"/>
+            <w:tcBorders>
+              <w:top w:val="none" w:color="FFFFFF" w:sz="0"/>
+              <w:left w:val="none" w:color="FFFFFF" w:sz="0"/>
+              <w:bottom w:val="none" w:color="FFFFFF" w:sz="0"/>
+              <w:right w:val="none" w:color="FFFFFF" w:sz="0"/>
+            </w:tcBorders>
+            <w:tcMar>
+              <w:top w:type="dxa" w:w="50"/>
+              <w:left w:type="dxa" w:w="90"/>
+              <w:bottom w:type="dxa" w:w="50"/>
+              <w:right w:type="dxa" w:w="90"/>
+            </w:tcMar>
+          </w:tcPr>
+          <w:p>
+            <w:r>
+              <w:rPr>
+                <w:rFonts w:ascii="Times New Roman" w:cs="Times New Roman" w:eastAsia="Times New Roman" w:hAnsi="Times New Roman"/>
+                <w:sz w:val="18"/>
+                <w:szCs w:val="18"/>
+              </w:rPr>
+              <w:t xml:space="preserve">0.289</w:t>
+            </w:r>
+          </w:p>
+        </w:tc>
+        <w:tc>
+          <w:tcPr>
+            <w:tcW w:type="dxa" w:w="1100"/>
+            <w:tcBorders>
+              <w:top w:val="none" w:color="FFFFFF" w:sz="0"/>
+              <w:left w:val="none" w:color="FFFFFF" w:sz="0"/>
+              <w:bottom w:val="none" w:color="FFFFFF" w:sz="0"/>
+              <w:right w:val="none" w:color="FFFFFF" w:sz="0"/>
+            </w:tcBorders>
+            <w:tcMar>
+              <w:top w:type="dxa" w:w="50"/>
+              <w:left w:type="dxa" w:w="90"/>
+              <w:bottom w:type="dxa" w:w="50"/>
+              <w:right w:type="dxa" w:w="90"/>
+            </w:tcMar>
+          </w:tcPr>
+          <w:p>
+            <w:r>
+              <w:rPr>
+                <w:rFonts w:ascii="Times New Roman" w:cs="Times New Roman" w:eastAsia="Times New Roman" w:hAnsi="Times New Roman"/>
+                <w:sz w:val="18"/>
+                <w:szCs w:val="18"/>
+              </w:rPr>
+              <w:t xml:space="preserve">0.258</w:t>
+            </w:r>
+          </w:p>
+        </w:tc>
+        <w:tc>
+          <w:tcPr>
+            <w:tcW w:type="dxa" w:w="1000"/>
+            <w:tcBorders>
+              <w:top w:val="none" w:color="FFFFFF" w:sz="0"/>
+              <w:left w:val="none" w:color="FFFFFF" w:sz="0"/>
+              <w:bottom w:val="none" w:color="FFFFFF" w:sz="0"/>
+              <w:right w:val="none" w:color="FFFFFF" w:sz="0"/>
+            </w:tcBorders>
+            <w:tcMar>
+              <w:top w:type="dxa" w:w="50"/>
+              <w:left w:type="dxa" w:w="90"/>
+              <w:bottom w:type="dxa" w:w="50"/>
+              <w:right w:type="dxa" w:w="90"/>
+            </w:tcMar>
+          </w:tcPr>
+          <w:p>
+            <w:r>
+              <w:rPr>
+                <w:rFonts w:ascii="Times New Roman" w:cs="Times New Roman" w:eastAsia="Times New Roman" w:hAnsi="Times New Roman"/>
+                <w:sz w:val="18"/>
+                <w:szCs w:val="18"/>
+              </w:rPr>
+              <w:t xml:space="preserve">0.161</w:t>
+            </w:r>
+          </w:p>
+        </w:tc>
+        <w:tc>
+          <w:tcPr>
+            <w:tcW w:type="dxa" w:w="1000"/>
+            <w:tcBorders>
+              <w:top w:val="none" w:color="FFFFFF" w:sz="0"/>
+              <w:left w:val="none" w:color="FFFFFF" w:sz="0"/>
+              <w:bottom w:val="none" w:color="FFFFFF" w:sz="0"/>
+              <w:right w:val="none" w:color="FFFFFF" w:sz="0"/>
+            </w:tcBorders>
+            <w:tcMar>
+              <w:top w:type="dxa" w:w="50"/>
+              <w:left w:type="dxa" w:w="90"/>
+              <w:bottom w:type="dxa" w:w="50"/>
+              <w:right w:type="dxa" w:w="90"/>
+            </w:tcMar>
+          </w:tcPr>
+          <w:p>
+            <w:r>
+              <w:rPr>
+                <w:rFonts w:ascii="Times New Roman" w:cs="Times New Roman" w:eastAsia="Times New Roman" w:hAnsi="Times New Roman"/>
+                <w:sz w:val="18"/>
+                <w:szCs w:val="18"/>
+              </w:rPr>
+              <w:t xml:space="preserve">0.301</w:t>
+            </w:r>
+          </w:p>
+        </w:tc>
+      </w:tr>
+      <w:tr>
+        <w:tc>
+          <w:tcPr>
+            <w:tcW w:type="dxa" w:w="800"/>
+            <w:tcBorders>
+              <w:top w:val="none" w:color="FFFFFF" w:sz="0"/>
+              <w:left w:val="none" w:color="FFFFFF" w:sz="0"/>
+              <w:bottom w:val="none" w:color="FFFFFF" w:sz="0"/>
+              <w:right w:val="none" w:color="FFFFFF" w:sz="0"/>
+            </w:tcBorders>
+            <w:tcMar>
+              <w:top w:type="dxa" w:w="50"/>
+              <w:left w:type="dxa" w:w="90"/>
+              <w:bottom w:type="dxa" w:w="50"/>
+              <w:right w:type="dxa" w:w="90"/>
+            </w:tcMar>
+          </w:tcPr>
+          <w:p>
+            <w:r>
+              <w:rPr>
+                <w:rFonts w:ascii="Times New Roman" w:cs="Times New Roman" w:eastAsia="Times New Roman" w:hAnsi="Times New Roman"/>
+                <w:sz w:val="18"/>
+                <w:szCs w:val="18"/>
+              </w:rPr>
+              <w:t xml:space="preserve">Full</w:t>
+            </w:r>
+          </w:p>
+        </w:tc>
+        <w:tc>
+          <w:tcPr>
+            <w:tcW w:type="dxa" w:w="1100"/>
+            <w:tcBorders>
+              <w:top w:val="none" w:color="FFFFFF" w:sz="0"/>
+              <w:left w:val="none" w:color="FFFFFF" w:sz="0"/>
+              <w:bottom w:val="none" w:color="FFFFFF" w:sz="0"/>
+              <w:right w:val="none" w:color="FFFFFF" w:sz="0"/>
+            </w:tcBorders>
+            <w:tcMar>
+              <w:top w:type="dxa" w:w="50"/>
+              <w:left w:type="dxa" w:w="90"/>
+              <w:bottom w:type="dxa" w:w="50"/>
+              <w:right w:type="dxa" w:w="90"/>
+            </w:tcMar>
+          </w:tcPr>
+          <w:p>
+            <w:r>
+              <w:rPr>
+                <w:rFonts w:ascii="Times New Roman" w:cs="Times New Roman" w:eastAsia="Times New Roman" w:hAnsi="Times New Roman"/>
+                <w:sz w:val="18"/>
+                <w:szCs w:val="18"/>
+              </w:rPr>
+              <w:t xml:space="preserve">1</w:t>
+            </w:r>
+          </w:p>
+        </w:tc>
+        <w:tc>
+          <w:tcPr>
+            <w:tcW w:type="dxa" w:w="1000"/>
+            <w:tcBorders>
+              <w:top w:val="none" w:color="FFFFFF" w:sz="0"/>
+              <w:left w:val="none" w:color="FFFFFF" w:sz="0"/>
+              <w:bottom w:val="none" w:color="FFFFFF" w:sz="0"/>
+              <w:right w:val="none" w:color="FFFFFF" w:sz="0"/>
+            </w:tcBorders>
+            <w:tcMar>
+              <w:top w:type="dxa" w:w="50"/>
+              <w:left w:type="dxa" w:w="90"/>
+              <w:bottom w:type="dxa" w:w="50"/>
+              <w:right w:type="dxa" w:w="90"/>
+            </w:tcMar>
+          </w:tcPr>
+          <w:p>
+            <w:r>
+              <w:rPr>
+                <w:rFonts w:ascii="Times New Roman" w:cs="Times New Roman" w:eastAsia="Times New Roman" w:hAnsi="Times New Roman"/>
+                <w:sz w:val="18"/>
+                <w:szCs w:val="18"/>
+              </w:rPr>
+              <w:t xml:space="preserve">0.188</w:t>
+            </w:r>
+          </w:p>
+        </w:tc>
+        <w:tc>
+          <w:tcPr>
+            <w:tcW w:type="dxa" w:w="1100"/>
+            <w:tcBorders>
+              <w:top w:val="none" w:color="FFFFFF" w:sz="0"/>
+              <w:left w:val="none" w:color="FFFFFF" w:sz="0"/>
+              <w:bottom w:val="none" w:color="FFFFFF" w:sz="0"/>
+              <w:right w:val="none" w:color="FFFFFF" w:sz="0"/>
+            </w:tcBorders>
+            <w:tcMar>
+              <w:top w:type="dxa" w:w="50"/>
+              <w:left w:type="dxa" w:w="90"/>
+              <w:bottom w:type="dxa" w:w="50"/>
+              <w:right w:type="dxa" w:w="90"/>
+            </w:tcMar>
+          </w:tcPr>
+          <w:p>
+            <w:r>
+              <w:rPr>
+                <w:rFonts w:ascii="Times New Roman" w:cs="Times New Roman" w:eastAsia="Times New Roman" w:hAnsi="Times New Roman"/>
+                <w:sz w:val="18"/>
+                <w:szCs w:val="18"/>
+              </w:rPr>
+              <w:t xml:space="preserve">0.670</w:t>
+            </w:r>
+          </w:p>
+        </w:tc>
+        <w:tc>
+          <w:tcPr>
+            <w:tcW w:type="dxa" w:w="1000"/>
+            <w:tcBorders>
+              <w:top w:val="none" w:color="FFFFFF" w:sz="0"/>
+              <w:left w:val="none" w:color="FFFFFF" w:sz="0"/>
+              <w:bottom w:val="none" w:color="FFFFFF" w:sz="0"/>
+              <w:right w:val="none" w:color="FFFFFF" w:sz="0"/>
+            </w:tcBorders>
+            <w:tcMar>
+              <w:top w:type="dxa" w:w="50"/>
+              <w:left w:type="dxa" w:w="90"/>
+              <w:bottom w:type="dxa" w:w="50"/>
+              <w:right w:type="dxa" w:w="90"/>
+            </w:tcMar>
+          </w:tcPr>
+          <w:p>
+            <w:r>
+              <w:rPr>
+                <w:rFonts w:ascii="Times New Roman" w:cs="Times New Roman" w:eastAsia="Times New Roman" w:hAnsi="Times New Roman"/>
+                <w:sz w:val="18"/>
+                <w:szCs w:val="18"/>
+              </w:rPr>
+              <w:t xml:space="preserve">0.300</w:t>
+            </w:r>
+          </w:p>
+        </w:tc>
+        <w:tc>
+          <w:tcPr>
+            <w:tcW w:type="dxa" w:w="1100"/>
+            <w:tcBorders>
+              <w:top w:val="none" w:color="FFFFFF" w:sz="0"/>
+              <w:left w:val="none" w:color="FFFFFF" w:sz="0"/>
+              <w:bottom w:val="none" w:color="FFFFFF" w:sz="0"/>
+              <w:right w:val="none" w:color="FFFFFF" w:sz="0"/>
+            </w:tcBorders>
+            <w:tcMar>
+              <w:top w:type="dxa" w:w="50"/>
+              <w:left w:type="dxa" w:w="90"/>
+              <w:bottom w:type="dxa" w:w="50"/>
+              <w:right w:type="dxa" w:w="90"/>
+            </w:tcMar>
+          </w:tcPr>
+          <w:p>
+            <w:r>
+              <w:rPr>
+                <w:rFonts w:ascii="Times New Roman" w:cs="Times New Roman" w:eastAsia="Times New Roman" w:hAnsi="Times New Roman"/>
+                <w:sz w:val="18"/>
+                <w:szCs w:val="18"/>
+              </w:rPr>
+              <w:t xml:space="preserve">0.305</w:t>
+            </w:r>
+          </w:p>
+        </w:tc>
+        <w:tc>
+          <w:tcPr>
+            <w:tcW w:type="dxa" w:w="1000"/>
+            <w:tcBorders>
+              <w:top w:val="none" w:color="FFFFFF" w:sz="0"/>
+              <w:left w:val="none" w:color="FFFFFF" w:sz="0"/>
+              <w:bottom w:val="none" w:color="FFFFFF" w:sz="0"/>
+              <w:right w:val="none" w:color="FFFFFF" w:sz="0"/>
+            </w:tcBorders>
+            <w:tcMar>
+              <w:top w:type="dxa" w:w="50"/>
+              <w:left w:type="dxa" w:w="90"/>
+              <w:bottom w:type="dxa" w:w="50"/>
+              <w:right w:type="dxa" w:w="90"/>
+            </w:tcMar>
+          </w:tcPr>
+          <w:p>
+            <w:r>
+              <w:rPr>
+                <w:rFonts w:ascii="Times New Roman" w:cs="Times New Roman" w:eastAsia="Times New Roman" w:hAnsi="Times New Roman"/>
+                <w:sz w:val="18"/>
+                <w:szCs w:val="18"/>
+              </w:rPr>
+              <w:t xml:space="preserve">0.197</w:t>
+            </w:r>
+          </w:p>
+        </w:tc>
+        <w:tc>
+          <w:tcPr>
+            <w:tcW w:type="dxa" w:w="1000"/>
+            <w:tcBorders>
+              <w:top w:val="none" w:color="FFFFFF" w:sz="0"/>
+              <w:left w:val="none" w:color="FFFFFF" w:sz="0"/>
+              <w:bottom w:val="none" w:color="FFFFFF" w:sz="0"/>
+              <w:right w:val="none" w:color="FFFFFF" w:sz="0"/>
+            </w:tcBorders>
+            <w:tcMar>
+              <w:top w:type="dxa" w:w="50"/>
+              <w:left w:type="dxa" w:w="90"/>
+              <w:bottom w:type="dxa" w:w="50"/>
+              <w:right w:type="dxa" w:w="90"/>
+            </w:tcMar>
+          </w:tcPr>
+          <w:p>
+            <w:r>
+              <w:rPr>
+                <w:rFonts w:ascii="Times New Roman" w:cs="Times New Roman" w:eastAsia="Times New Roman" w:hAnsi="Times New Roman"/>
+                <w:sz w:val="18"/>
+                <w:szCs w:val="18"/>
+              </w:rPr>
+              <w:t xml:space="preserve">0.335</w:t>
+            </w:r>
+          </w:p>
+        </w:tc>
+      </w:tr>
+      <w:tr>
+        <w:tc>
+          <w:tcPr>
+            <w:tcW w:type="dxa" w:w="800"/>
+            <w:tcBorders>
+              <w:top w:val="none" w:color="FFFFFF" w:sz="0"/>
+              <w:left w:val="none" w:color="FFFFFF" w:sz="0"/>
+              <w:bottom w:val="none" w:color="FFFFFF" w:sz="0"/>
+              <w:right w:val="none" w:color="FFFFFF" w:sz="0"/>
+            </w:tcBorders>
+            <w:tcMar>
+              <w:top w:type="dxa" w:w="50"/>
+              <w:left w:type="dxa" w:w="90"/>
+              <w:bottom w:type="dxa" w:w="50"/>
+              <w:right w:type="dxa" w:w="90"/>
+            </w:tcMar>
+          </w:tcPr>
+          <w:p>
+            <w:r>
+              <w:rPr>
+                <w:rFonts w:ascii="Times New Roman" w:cs="Times New Roman" w:eastAsia="Times New Roman" w:hAnsi="Times New Roman"/>
+                <w:sz w:val="18"/>
+                <w:szCs w:val="18"/>
+              </w:rPr>
+              <w:t xml:space="preserve">Full</w:t>
+            </w:r>
+          </w:p>
+        </w:tc>
+        <w:tc>
+          <w:tcPr>
+            <w:tcW w:type="dxa" w:w="1100"/>
+            <w:tcBorders>
+              <w:top w:val="none" w:color="FFFFFF" w:sz="0"/>
+              <w:left w:val="none" w:color="FFFFFF" w:sz="0"/>
+              <w:bottom w:val="none" w:color="FFFFFF" w:sz="0"/>
+              <w:right w:val="none" w:color="FFFFFF" w:sz="0"/>
+            </w:tcBorders>
+            <w:tcMar>
+              <w:top w:type="dxa" w:w="50"/>
+              <w:left w:type="dxa" w:w="90"/>
+              <w:bottom w:type="dxa" w:w="50"/>
+              <w:right w:type="dxa" w:w="90"/>
+            </w:tcMar>
+          </w:tcPr>
+          <w:p>
+            <w:r>
+              <w:rPr>
+                <w:rFonts w:ascii="Times New Roman" w:cs="Times New Roman" w:eastAsia="Times New Roman" w:hAnsi="Times New Roman"/>
+                <w:sz w:val="18"/>
+                <w:szCs w:val="18"/>
+              </w:rPr>
+              <w:t xml:space="preserve">2</w:t>
+            </w:r>
+          </w:p>
+        </w:tc>
+        <w:tc>
+          <w:tcPr>
+            <w:tcW w:type="dxa" w:w="1000"/>
+            <w:tcBorders>
+              <w:top w:val="none" w:color="FFFFFF" w:sz="0"/>
+              <w:left w:val="none" w:color="FFFFFF" w:sz="0"/>
+              <w:bottom w:val="none" w:color="FFFFFF" w:sz="0"/>
+              <w:right w:val="none" w:color="FFFFFF" w:sz="0"/>
+            </w:tcBorders>
+            <w:tcMar>
+              <w:top w:type="dxa" w:w="50"/>
+              <w:left w:type="dxa" w:w="90"/>
+              <w:bottom w:type="dxa" w:w="50"/>
+              <w:right w:type="dxa" w:w="90"/>
+            </w:tcMar>
+          </w:tcPr>
+          <w:p>
+            <w:r>
+              <w:rPr>
+                <w:rFonts w:ascii="Times New Roman" w:cs="Times New Roman" w:eastAsia="Times New Roman" w:hAnsi="Times New Roman"/>
+                <w:sz w:val="18"/>
+                <w:szCs w:val="18"/>
+              </w:rPr>
+              <w:t xml:space="preserve">0.206</w:t>
+            </w:r>
+          </w:p>
+        </w:tc>
+        <w:tc>
+          <w:tcPr>
+            <w:tcW w:type="dxa" w:w="1100"/>
+            <w:tcBorders>
+              <w:top w:val="none" w:color="FFFFFF" w:sz="0"/>
+              <w:left w:val="none" w:color="FFFFFF" w:sz="0"/>
+              <w:bottom w:val="none" w:color="FFFFFF" w:sz="0"/>
+              <w:right w:val="none" w:color="FFFFFF" w:sz="0"/>
+            </w:tcBorders>
+            <w:tcMar>
+              <w:top w:type="dxa" w:w="50"/>
+              <w:left w:type="dxa" w:w="90"/>
+              <w:bottom w:type="dxa" w:w="50"/>
+              <w:right w:type="dxa" w:w="90"/>
+            </w:tcMar>
+          </w:tcPr>
+          <w:p>
+            <w:r>
+              <w:rPr>
+                <w:rFonts w:ascii="Times New Roman" w:cs="Times New Roman" w:eastAsia="Times New Roman" w:hAnsi="Times New Roman"/>
+                <w:sz w:val="18"/>
+                <w:szCs w:val="18"/>
+              </w:rPr>
+              <w:t xml:space="preserve">0.647</w:t>
+            </w:r>
+          </w:p>
+        </w:tc>
+        <w:tc>
+          <w:tcPr>
+            <w:tcW w:type="dxa" w:w="1000"/>
+            <w:tcBorders>
+              <w:top w:val="none" w:color="FFFFFF" w:sz="0"/>
+              <w:left w:val="none" w:color="FFFFFF" w:sz="0"/>
+              <w:bottom w:val="none" w:color="FFFFFF" w:sz="0"/>
+              <w:right w:val="none" w:color="FFFFFF" w:sz="0"/>
+            </w:tcBorders>
+            <w:tcMar>
+              <w:top w:type="dxa" w:w="50"/>
+              <w:left w:type="dxa" w:w="90"/>
+              <w:bottom w:type="dxa" w:w="50"/>
+              <w:right w:type="dxa" w:w="90"/>
+            </w:tcMar>
+          </w:tcPr>
+          <w:p>
+            <w:r>
+              <w:rPr>
+                <w:rFonts w:ascii="Times New Roman" w:cs="Times New Roman" w:eastAsia="Times New Roman" w:hAnsi="Times New Roman"/>
+                <w:sz w:val="18"/>
+                <w:szCs w:val="18"/>
+              </w:rPr>
+              <w:t xml:space="preserve">0.266</w:t>
+            </w:r>
+          </w:p>
+        </w:tc>
+        <w:tc>
+          <w:tcPr>
+            <w:tcW w:type="dxa" w:w="1100"/>
+            <w:tcBorders>
+              <w:top w:val="none" w:color="FFFFFF" w:sz="0"/>
+              <w:left w:val="none" w:color="FFFFFF" w:sz="0"/>
+              <w:bottom w:val="none" w:color="FFFFFF" w:sz="0"/>
+              <w:right w:val="none" w:color="FFFFFF" w:sz="0"/>
+            </w:tcBorders>
+            <w:tcMar>
+              <w:top w:type="dxa" w:w="50"/>
+              <w:left w:type="dxa" w:w="90"/>
+              <w:bottom w:type="dxa" w:w="50"/>
+              <w:right w:type="dxa" w:w="90"/>
+            </w:tcMar>
+          </w:tcPr>
+          <w:p>
+            <w:r>
+              <w:rPr>
+                <w:rFonts w:ascii="Times New Roman" w:cs="Times New Roman" w:eastAsia="Times New Roman" w:hAnsi="Times New Roman"/>
+                <w:sz w:val="18"/>
+                <w:szCs w:val="18"/>
+              </w:rPr>
+              <w:t xml:space="preserve">0.252</w:t>
+            </w:r>
+          </w:p>
+        </w:tc>
+        <w:tc>
+          <w:tcPr>
+            <w:tcW w:type="dxa" w:w="1000"/>
+            <w:tcBorders>
+              <w:top w:val="none" w:color="FFFFFF" w:sz="0"/>
+              <w:left w:val="none" w:color="FFFFFF" w:sz="0"/>
+              <w:bottom w:val="none" w:color="FFFFFF" w:sz="0"/>
+              <w:right w:val="none" w:color="FFFFFF" w:sz="0"/>
+            </w:tcBorders>
+            <w:tcMar>
+              <w:top w:type="dxa" w:w="50"/>
+              <w:left w:type="dxa" w:w="90"/>
+              <w:bottom w:type="dxa" w:w="50"/>
+              <w:right w:type="dxa" w:w="90"/>
+            </w:tcMar>
+          </w:tcPr>
+          <w:p>
+            <w:r>
+              <w:rPr>
+                <w:rFonts w:ascii="Times New Roman" w:cs="Times New Roman" w:eastAsia="Times New Roman" w:hAnsi="Times New Roman"/>
+                <w:sz w:val="18"/>
+                <w:szCs w:val="18"/>
+              </w:rPr>
+              <w:t xml:space="preserve">0.171</w:t>
+            </w:r>
+          </w:p>
+        </w:tc>
+        <w:tc>
+          <w:tcPr>
+            <w:tcW w:type="dxa" w:w="1000"/>
+            <w:tcBorders>
+              <w:top w:val="none" w:color="FFFFFF" w:sz="0"/>
+              <w:left w:val="none" w:color="FFFFFF" w:sz="0"/>
+              <w:bottom w:val="none" w:color="FFFFFF" w:sz="0"/>
+              <w:right w:val="none" w:color="FFFFFF" w:sz="0"/>
+            </w:tcBorders>
+            <w:tcMar>
+              <w:top w:type="dxa" w:w="50"/>
+              <w:left w:type="dxa" w:w="90"/>
+              <w:bottom w:type="dxa" w:w="50"/>
+              <w:right w:type="dxa" w:w="90"/>
+            </w:tcMar>
+          </w:tcPr>
+          <w:p>
+            <w:r>
+              <w:rPr>
+                <w:rFonts w:ascii="Times New Roman" w:cs="Times New Roman" w:eastAsia="Times New Roman" w:hAnsi="Times New Roman"/>
+                <w:sz w:val="18"/>
+                <w:szCs w:val="18"/>
+              </w:rPr>
+              <w:t xml:space="preserve">0.302</w:t>
+            </w:r>
+          </w:p>
+        </w:tc>
+      </w:tr>
+      <w:tr>
+        <w:tc>
+          <w:tcPr>
+            <w:tcW w:type="dxa" w:w="800"/>
+            <w:tcBorders>
+              <w:top w:val="none" w:color="FFFFFF" w:sz="0"/>
+              <w:left w:val="none" w:color="FFFFFF" w:sz="0"/>
+              <w:bottom w:val="none" w:color="FFFFFF" w:sz="0"/>
+              <w:right w:val="none" w:color="FFFFFF" w:sz="0"/>
+            </w:tcBorders>
+            <w:tcMar>
+              <w:top w:type="dxa" w:w="50"/>
+              <w:left w:type="dxa" w:w="90"/>
+              <w:bottom w:type="dxa" w:w="50"/>
+              <w:right w:type="dxa" w:w="90"/>
+            </w:tcMar>
+          </w:tcPr>
+          <w:p>
+            <w:r>
+              <w:rPr>
+                <w:rFonts w:ascii="Times New Roman" w:cs="Times New Roman" w:eastAsia="Times New Roman" w:hAnsi="Times New Roman"/>
+                <w:sz w:val="18"/>
+                <w:szCs w:val="18"/>
+              </w:rPr>
+              <w:t xml:space="preserve">Full</w:t>
+            </w:r>
+          </w:p>
+        </w:tc>
+        <w:tc>
+          <w:tcPr>
+            <w:tcW w:type="dxa" w:w="1100"/>
+            <w:tcBorders>
+              <w:top w:val="none" w:color="FFFFFF" w:sz="0"/>
+              <w:left w:val="none" w:color="FFFFFF" w:sz="0"/>
+              <w:bottom w:val="none" w:color="FFFFFF" w:sz="0"/>
+              <w:right w:val="none" w:color="FFFFFF" w:sz="0"/>
+            </w:tcBorders>
+            <w:tcMar>
+              <w:top w:type="dxa" w:w="50"/>
+              <w:left w:type="dxa" w:w="90"/>
+              <w:bottom w:type="dxa" w:w="50"/>
+              <w:right w:type="dxa" w:w="90"/>
+            </w:tcMar>
+          </w:tcPr>
+          <w:p>
+            <w:r>
+              <w:rPr>
+                <w:rFonts w:ascii="Times New Roman" w:cs="Times New Roman" w:eastAsia="Times New Roman" w:hAnsi="Times New Roman"/>
+                <w:sz w:val="18"/>
+                <w:szCs w:val="18"/>
+              </w:rPr>
+              <w:t xml:space="preserve">3</w:t>
+            </w:r>
+          </w:p>
+        </w:tc>
+        <w:tc>
+          <w:tcPr>
+            <w:tcW w:type="dxa" w:w="1000"/>
+            <w:tcBorders>
+              <w:top w:val="none" w:color="FFFFFF" w:sz="0"/>
+              <w:left w:val="none" w:color="FFFFFF" w:sz="0"/>
+              <w:bottom w:val="none" w:color="FFFFFF" w:sz="0"/>
+              <w:right w:val="none" w:color="FFFFFF" w:sz="0"/>
+            </w:tcBorders>
+            <w:tcMar>
+              <w:top w:type="dxa" w:w="50"/>
+              <w:left w:type="dxa" w:w="90"/>
+              <w:bottom w:type="dxa" w:w="50"/>
+              <w:right w:type="dxa" w:w="90"/>
+            </w:tcMar>
+          </w:tcPr>
+          <w:p>
+            <w:r>
+              <w:rPr>
+                <w:rFonts w:ascii="Times New Roman" w:cs="Times New Roman" w:eastAsia="Times New Roman" w:hAnsi="Times New Roman"/>
+                <w:sz w:val="18"/>
+                <w:szCs w:val="18"/>
+              </w:rPr>
+              <w:t xml:space="preserve">0.204</w:t>
+            </w:r>
+          </w:p>
+        </w:tc>
+        <w:tc>
+          <w:tcPr>
+            <w:tcW w:type="dxa" w:w="1100"/>
+            <w:tcBorders>
+              <w:top w:val="none" w:color="FFFFFF" w:sz="0"/>
+              <w:left w:val="none" w:color="FFFFFF" w:sz="0"/>
+              <w:bottom w:val="none" w:color="FFFFFF" w:sz="0"/>
+              <w:right w:val="none" w:color="FFFFFF" w:sz="0"/>
+            </w:tcBorders>
+            <w:tcMar>
+              <w:top w:type="dxa" w:w="50"/>
+              <w:left w:type="dxa" w:w="90"/>
+              <w:bottom w:type="dxa" w:w="50"/>
+              <w:right w:type="dxa" w:w="90"/>
+            </w:tcMar>
+          </w:tcPr>
+          <w:p>
+            <w:r>
+              <w:rPr>
+                <w:rFonts w:ascii="Times New Roman" w:cs="Times New Roman" w:eastAsia="Times New Roman" w:hAnsi="Times New Roman"/>
+                <w:sz w:val="18"/>
+                <w:szCs w:val="18"/>
+              </w:rPr>
+              <w:t xml:space="preserve">0.615</w:t>
+            </w:r>
+          </w:p>
+        </w:tc>
+        <w:tc>
+          <w:tcPr>
+            <w:tcW w:type="dxa" w:w="1000"/>
+            <w:tcBorders>
+              <w:top w:val="none" w:color="FFFFFF" w:sz="0"/>
+              <w:left w:val="none" w:color="FFFFFF" w:sz="0"/>
+              <w:bottom w:val="none" w:color="FFFFFF" w:sz="0"/>
+              <w:right w:val="none" w:color="FFFFFF" w:sz="0"/>
+            </w:tcBorders>
+            <w:tcMar>
+              <w:top w:type="dxa" w:w="50"/>
+              <w:left w:type="dxa" w:w="90"/>
+              <w:bottom w:type="dxa" w:w="50"/>
+              <w:right w:type="dxa" w:w="90"/>
+            </w:tcMar>
+          </w:tcPr>
+          <w:p>
+            <w:r>
+              <w:rPr>
+                <w:rFonts w:ascii="Times New Roman" w:cs="Times New Roman" w:eastAsia="Times New Roman" w:hAnsi="Times New Roman"/>
+                <w:sz w:val="18"/>
+                <w:szCs w:val="18"/>
+              </w:rPr>
+              <w:t xml:space="preserve">0.303</w:t>
+            </w:r>
+          </w:p>
+        </w:tc>
+        <w:tc>
+          <w:tcPr>
+            <w:tcW w:type="dxa" w:w="1100"/>
+            <w:tcBorders>
+              <w:top w:val="none" w:color="FFFFFF" w:sz="0"/>
+              <w:left w:val="none" w:color="FFFFFF" w:sz="0"/>
+              <w:bottom w:val="none" w:color="FFFFFF" w:sz="0"/>
+              <w:right w:val="none" w:color="FFFFFF" w:sz="0"/>
+            </w:tcBorders>
+            <w:tcMar>
+              <w:top w:type="dxa" w:w="50"/>
+              <w:left w:type="dxa" w:w="90"/>
+              <w:bottom w:type="dxa" w:w="50"/>
+              <w:right w:type="dxa" w:w="90"/>
+            </w:tcMar>
+          </w:tcPr>
+          <w:p>
+            <w:r>
+              <w:rPr>
+                <w:rFonts w:ascii="Times New Roman" w:cs="Times New Roman" w:eastAsia="Times New Roman" w:hAnsi="Times New Roman"/>
+                <w:sz w:val="18"/>
+                <w:szCs w:val="18"/>
+              </w:rPr>
+              <w:t xml:space="preserve">0.236</w:t>
+            </w:r>
+          </w:p>
+        </w:tc>
+        <w:tc>
+          <w:tcPr>
+            <w:tcW w:type="dxa" w:w="1000"/>
+            <w:tcBorders>
+              <w:top w:val="none" w:color="FFFFFF" w:sz="0"/>
+              <w:left w:val="none" w:color="FFFFFF" w:sz="0"/>
+              <w:bottom w:val="none" w:color="FFFFFF" w:sz="0"/>
+              <w:right w:val="none" w:color="FFFFFF" w:sz="0"/>
+            </w:tcBorders>
+            <w:tcMar>
+              <w:top w:type="dxa" w:w="50"/>
+              <w:left w:type="dxa" w:w="90"/>
+              <w:bottom w:type="dxa" w:w="50"/>
+              <w:right w:type="dxa" w:w="90"/>
+            </w:tcMar>
+          </w:tcPr>
+          <w:p>
+            <w:r>
+              <w:rPr>
+                <w:rFonts w:ascii="Times New Roman" w:cs="Times New Roman" w:eastAsia="Times New Roman" w:hAnsi="Times New Roman"/>
+                <w:sz w:val="18"/>
+                <w:szCs w:val="18"/>
+              </w:rPr>
+              <w:t xml:space="preserve">0.159</w:t>
+            </w:r>
+          </w:p>
+        </w:tc>
+        <w:tc>
+          <w:tcPr>
+            <w:tcW w:type="dxa" w:w="1000"/>
+            <w:tcBorders>
+              <w:top w:val="none" w:color="FFFFFF" w:sz="0"/>
+              <w:left w:val="none" w:color="FFFFFF" w:sz="0"/>
+              <w:bottom w:val="none" w:color="FFFFFF" w:sz="0"/>
+              <w:right w:val="none" w:color="FFFFFF" w:sz="0"/>
+            </w:tcBorders>
+            <w:tcMar>
+              <w:top w:type="dxa" w:w="50"/>
+              <w:left w:type="dxa" w:w="90"/>
+              <w:bottom w:type="dxa" w:w="50"/>
+              <w:right w:type="dxa" w:w="90"/>
+            </w:tcMar>
+          </w:tcPr>
+          <w:p>
+            <w:r>
+              <w:rPr>
+                <w:rFonts w:ascii="Times New Roman" w:cs="Times New Roman" w:eastAsia="Times New Roman" w:hAnsi="Times New Roman"/>
+                <w:sz w:val="18"/>
+                <w:szCs w:val="18"/>
+              </w:rPr>
+              <w:t xml:space="preserve">0.296</w:t>
+            </w:r>
+          </w:p>
+        </w:tc>
+      </w:tr>
+      <w:tr>
+        <w:tc>
+          <w:tcPr>
+            <w:tcW w:type="dxa" w:w="800"/>
+            <w:tcBorders>
+              <w:top w:val="none" w:color="FFFFFF" w:sz="0"/>
+              <w:left w:val="none" w:color="FFFFFF" w:sz="0"/>
+              <w:bottom w:val="none" w:color="FFFFFF" w:sz="0"/>
+              <w:right w:val="none" w:color="FFFFFF" w:sz="0"/>
+            </w:tcBorders>
+            <w:tcMar>
+              <w:top w:type="dxa" w:w="50"/>
+              <w:left w:type="dxa" w:w="90"/>
+              <w:bottom w:type="dxa" w:w="50"/>
+              <w:right w:type="dxa" w:w="90"/>
+            </w:tcMar>
+          </w:tcPr>
+          <w:p>
+            <w:r>
+              <w:rPr>
+                <w:rFonts w:ascii="Times New Roman" w:cs="Times New Roman" w:eastAsia="Times New Roman" w:hAnsi="Times New Roman"/>
+                <w:sz w:val="18"/>
+                <w:szCs w:val="18"/>
+              </w:rPr>
+              <w:t xml:space="preserve">B3</w:t>
+            </w:r>
+          </w:p>
+        </w:tc>
+        <w:tc>
+          <w:tcPr>
+            <w:tcW w:type="dxa" w:w="1100"/>
+            <w:tcBorders>
+              <w:top w:val="none" w:color="FFFFFF" w:sz="0"/>
+              <w:left w:val="none" w:color="FFFFFF" w:sz="0"/>
+              <w:bottom w:val="none" w:color="FFFFFF" w:sz="0"/>
+              <w:right w:val="none" w:color="FFFFFF" w:sz="0"/>
+            </w:tcBorders>
+            <w:tcMar>
+              <w:top w:type="dxa" w:w="50"/>
+              <w:left w:type="dxa" w:w="90"/>
+              <w:bottom w:type="dxa" w:w="50"/>
+              <w:right w:type="dxa" w:w="90"/>
+            </w:tcMar>
+          </w:tcPr>
+          <w:p>
+            <w:r>
+              <w:rPr>
+                <w:rFonts w:ascii="Times New Roman" w:cs="Times New Roman" w:eastAsia="Times New Roman" w:hAnsi="Times New Roman"/>
+                <w:sz w:val="18"/>
+                <w:szCs w:val="18"/>
+              </w:rPr>
+              <w:t xml:space="preserve">0 (expl.)</w:t>
+            </w:r>
+          </w:p>
+        </w:tc>
+        <w:tc>
+          <w:tcPr>
+            <w:tcW w:type="dxa" w:w="1000"/>
+            <w:tcBorders>
+              <w:top w:val="none" w:color="FFFFFF" w:sz="0"/>
+              <w:left w:val="none" w:color="FFFFFF" w:sz="0"/>
+              <w:bottom w:val="none" w:color="FFFFFF" w:sz="0"/>
+              <w:right w:val="none" w:color="FFFFFF" w:sz="0"/>
+            </w:tcBorders>
+            <w:tcMar>
+              <w:top w:type="dxa" w:w="50"/>
+              <w:left w:type="dxa" w:w="90"/>
+              <w:bottom w:type="dxa" w:w="50"/>
+              <w:right w:type="dxa" w:w="90"/>
+            </w:tcMar>
+          </w:tcPr>
+          <w:p>
+            <w:r>
+              <w:rPr>
+                <w:rFonts w:ascii="Times New Roman" w:cs="Times New Roman" w:eastAsia="Times New Roman" w:hAnsi="Times New Roman"/>
+                <w:sz w:val="18"/>
+                <w:szCs w:val="18"/>
+              </w:rPr>
+              <w:t xml:space="preserve">0.185</w:t>
+            </w:r>
+          </w:p>
+        </w:tc>
+        <w:tc>
+          <w:tcPr>
+            <w:tcW w:type="dxa" w:w="1100"/>
+            <w:tcBorders>
+              <w:top w:val="none" w:color="FFFFFF" w:sz="0"/>
+              <w:left w:val="none" w:color="FFFFFF" w:sz="0"/>
+              <w:bottom w:val="none" w:color="FFFFFF" w:sz="0"/>
+              <w:right w:val="none" w:color="FFFFFF" w:sz="0"/>
+            </w:tcBorders>
+            <w:tcMar>
+              <w:top w:type="dxa" w:w="50"/>
+              <w:left w:type="dxa" w:w="90"/>
+              <w:bottom w:type="dxa" w:w="50"/>
+              <w:right w:type="dxa" w:w="90"/>
+            </w:tcMar>
+          </w:tcPr>
+          <w:p>
+            <w:r>
+              <w:rPr>
+                <w:rFonts w:ascii="Times New Roman" w:cs="Times New Roman" w:eastAsia="Times New Roman" w:hAnsi="Times New Roman"/>
+                <w:sz w:val="18"/>
+                <w:szCs w:val="18"/>
+              </w:rPr>
+              <w:t xml:space="preserve">0.533</w:t>
+            </w:r>
+          </w:p>
+        </w:tc>
+        <w:tc>
+          <w:tcPr>
+            <w:tcW w:type="dxa" w:w="1000"/>
+            <w:tcBorders>
+              <w:top w:val="none" w:color="FFFFFF" w:sz="0"/>
+              <w:left w:val="none" w:color="FFFFFF" w:sz="0"/>
+              <w:bottom w:val="none" w:color="FFFFFF" w:sz="0"/>
+              <w:right w:val="none" w:color="FFFFFF" w:sz="0"/>
+            </w:tcBorders>
+            <w:tcMar>
+              <w:top w:type="dxa" w:w="50"/>
+              <w:left w:type="dxa" w:w="90"/>
+              <w:bottom w:type="dxa" w:w="50"/>
+              <w:right w:type="dxa" w:w="90"/>
+            </w:tcMar>
+          </w:tcPr>
+          <w:p>
+            <w:r>
+              <w:rPr>
+                <w:rFonts w:ascii="Times New Roman" w:cs="Times New Roman" w:eastAsia="Times New Roman" w:hAnsi="Times New Roman"/>
+                <w:sz w:val="18"/>
+                <w:szCs w:val="18"/>
+              </w:rPr>
+              <w:t xml:space="preserve">0.334</w:t>
+            </w:r>
+          </w:p>
+        </w:tc>
+        <w:tc>
+          <w:tcPr>
+            <w:tcW w:type="dxa" w:w="1100"/>
+            <w:tcBorders>
+              <w:top w:val="none" w:color="FFFFFF" w:sz="0"/>
+              <w:left w:val="none" w:color="FFFFFF" w:sz="0"/>
+              <w:bottom w:val="none" w:color="FFFFFF" w:sz="0"/>
+              <w:right w:val="none" w:color="FFFFFF" w:sz="0"/>
+            </w:tcBorders>
+            <w:tcMar>
+              <w:top w:type="dxa" w:w="50"/>
+              <w:left w:type="dxa" w:w="90"/>
+              <w:bottom w:type="dxa" w:w="50"/>
+              <w:right w:type="dxa" w:w="90"/>
+            </w:tcMar>
+          </w:tcPr>
+          <w:p>
+            <w:r>
+              <w:rPr>
+                <w:rFonts w:ascii="Times New Roman" w:cs="Times New Roman" w:eastAsia="Times New Roman" w:hAnsi="Times New Roman"/>
+                <w:sz w:val="18"/>
+                <w:szCs w:val="18"/>
+              </w:rPr>
+              <w:t xml:space="preserve">0.317</w:t>
+            </w:r>
+          </w:p>
+        </w:tc>
+        <w:tc>
+          <w:tcPr>
+            <w:tcW w:type="dxa" w:w="1000"/>
+            <w:tcBorders>
+              <w:top w:val="none" w:color="FFFFFF" w:sz="0"/>
+              <w:left w:val="none" w:color="FFFFFF" w:sz="0"/>
+              <w:bottom w:val="none" w:color="FFFFFF" w:sz="0"/>
+              <w:right w:val="none" w:color="FFFFFF" w:sz="0"/>
+            </w:tcBorders>
+            <w:tcMar>
+              <w:top w:type="dxa" w:w="50"/>
+              <w:left w:type="dxa" w:w="90"/>
+              <w:bottom w:type="dxa" w:w="50"/>
+              <w:right w:type="dxa" w:w="90"/>
+            </w:tcMar>
+          </w:tcPr>
+          <w:p>
+            <w:r>
+              <w:rPr>
+                <w:rFonts w:ascii="Times New Roman" w:cs="Times New Roman" w:eastAsia="Times New Roman" w:hAnsi="Times New Roman"/>
+                <w:sz w:val="18"/>
+                <w:szCs w:val="18"/>
+              </w:rPr>
+              <w:t xml:space="preserve">0.193</w:t>
+            </w:r>
+          </w:p>
+        </w:tc>
+        <w:tc>
+          <w:tcPr>
+            <w:tcW w:type="dxa" w:w="1000"/>
+            <w:tcBorders>
+              <w:top w:val="none" w:color="FFFFFF" w:sz="0"/>
+              <w:left w:val="none" w:color="FFFFFF" w:sz="0"/>
+              <w:bottom w:val="none" w:color="FFFFFF" w:sz="0"/>
+              <w:right w:val="none" w:color="FFFFFF" w:sz="0"/>
+            </w:tcBorders>
+            <w:tcMar>
+              <w:top w:type="dxa" w:w="50"/>
+              <w:left w:type="dxa" w:w="90"/>
+              <w:bottom w:type="dxa" w:w="50"/>
+              <w:right w:type="dxa" w:w="90"/>
+            </w:tcMar>
+          </w:tcPr>
+          <w:p>
+            <w:r>
+              <w:rPr>
+                <w:rFonts w:ascii="Times New Roman" w:cs="Times New Roman" w:eastAsia="Times New Roman" w:hAnsi="Times New Roman"/>
+                <w:sz w:val="18"/>
+                <w:szCs w:val="18"/>
+              </w:rPr>
+              <w:t xml:space="preserve">0.336</w:t>
+            </w:r>
+          </w:p>
+        </w:tc>
+      </w:tr>
+      <w:tr>
+        <w:tc>
+          <w:tcPr>
+            <w:tcW w:type="dxa" w:w="800"/>
+            <w:tcBorders>
+              <w:top w:val="none" w:color="FFFFFF" w:sz="0"/>
+              <w:left w:val="none" w:color="FFFFFF" w:sz="0"/>
+              <w:bottom w:val="none" w:color="FFFFFF" w:sz="0"/>
+              <w:right w:val="none" w:color="FFFFFF" w:sz="0"/>
+            </w:tcBorders>
+            <w:tcMar>
+              <w:top w:type="dxa" w:w="50"/>
+              <w:left w:type="dxa" w:w="90"/>
+              <w:bottom w:type="dxa" w:w="50"/>
+              <w:right w:type="dxa" w:w="90"/>
+            </w:tcMar>
+          </w:tcPr>
+          <w:p>
+            <w:r>
+              <w:rPr>
+                <w:rFonts w:ascii="Times New Roman" w:cs="Times New Roman" w:eastAsia="Times New Roman" w:hAnsi="Times New Roman"/>
+                <w:sz w:val="18"/>
+                <w:szCs w:val="18"/>
+              </w:rPr>
+              <w:t xml:space="preserve">B3</w:t>
+            </w:r>
+          </w:p>
+        </w:tc>
+        <w:tc>
+          <w:tcPr>
+            <w:tcW w:type="dxa" w:w="1100"/>
+            <w:tcBorders>
+              <w:top w:val="none" w:color="FFFFFF" w:sz="0"/>
+              <w:left w:val="none" w:color="FFFFFF" w:sz="0"/>
+              <w:bottom w:val="none" w:color="FFFFFF" w:sz="0"/>
+              <w:right w:val="none" w:color="FFFFFF" w:sz="0"/>
+            </w:tcBorders>
+            <w:tcMar>
+              <w:top w:type="dxa" w:w="50"/>
+              <w:left w:type="dxa" w:w="90"/>
+              <w:bottom w:type="dxa" w:w="50"/>
+              <w:right w:type="dxa" w:w="90"/>
+            </w:tcMar>
+          </w:tcPr>
+          <w:p>
+            <w:r>
+              <w:rPr>
+                <w:rFonts w:ascii="Times New Roman" w:cs="Times New Roman" w:eastAsia="Times New Roman" w:hAnsi="Times New Roman"/>
+                <w:sz w:val="18"/>
+                <w:szCs w:val="18"/>
+              </w:rPr>
+              <w:t xml:space="preserve">1</w:t>
+            </w:r>
+          </w:p>
+        </w:tc>
+        <w:tc>
+          <w:tcPr>
+            <w:tcW w:type="dxa" w:w="1000"/>
+            <w:tcBorders>
+              <w:top w:val="none" w:color="FFFFFF" w:sz="0"/>
+              <w:left w:val="none" w:color="FFFFFF" w:sz="0"/>
+              <w:bottom w:val="none" w:color="FFFFFF" w:sz="0"/>
+              <w:right w:val="none" w:color="FFFFFF" w:sz="0"/>
+            </w:tcBorders>
+            <w:tcMar>
+              <w:top w:type="dxa" w:w="50"/>
+              <w:left w:type="dxa" w:w="90"/>
+              <w:bottom w:type="dxa" w:w="50"/>
+              <w:right w:type="dxa" w:w="90"/>
+            </w:tcMar>
+          </w:tcPr>
+          <w:p>
+            <w:r>
+              <w:rPr>
+                <w:rFonts w:ascii="Times New Roman" w:cs="Times New Roman" w:eastAsia="Times New Roman" w:hAnsi="Times New Roman"/>
+                <w:sz w:val="18"/>
+                <w:szCs w:val="18"/>
+              </w:rPr>
+              <w:t xml:space="preserve">0.188</w:t>
+            </w:r>
+          </w:p>
+        </w:tc>
+        <w:tc>
+          <w:tcPr>
+            <w:tcW w:type="dxa" w:w="1100"/>
+            <w:tcBorders>
+              <w:top w:val="none" w:color="FFFFFF" w:sz="0"/>
+              <w:left w:val="none" w:color="FFFFFF" w:sz="0"/>
+              <w:bottom w:val="none" w:color="FFFFFF" w:sz="0"/>
+              <w:right w:val="none" w:color="FFFFFF" w:sz="0"/>
+            </w:tcBorders>
+            <w:tcMar>
+              <w:top w:type="dxa" w:w="50"/>
+              <w:left w:type="dxa" w:w="90"/>
+              <w:bottom w:type="dxa" w:w="50"/>
+              <w:right w:type="dxa" w:w="90"/>
+            </w:tcMar>
+          </w:tcPr>
+          <w:p>
+            <w:r>
+              <w:rPr>
+                <w:rFonts w:ascii="Times New Roman" w:cs="Times New Roman" w:eastAsia="Times New Roman" w:hAnsi="Times New Roman"/>
+                <w:sz w:val="18"/>
+                <w:szCs w:val="18"/>
+              </w:rPr>
+              <w:t xml:space="preserve">0.557</w:t>
+            </w:r>
+          </w:p>
+        </w:tc>
+        <w:tc>
+          <w:tcPr>
+            <w:tcW w:type="dxa" w:w="1000"/>
+            <w:tcBorders>
+              <w:top w:val="none" w:color="FFFFFF" w:sz="0"/>
+              <w:left w:val="none" w:color="FFFFFF" w:sz="0"/>
+              <w:bottom w:val="none" w:color="FFFFFF" w:sz="0"/>
+              <w:right w:val="none" w:color="FFFFFF" w:sz="0"/>
+            </w:tcBorders>
+            <w:tcMar>
+              <w:top w:type="dxa" w:w="50"/>
+              <w:left w:type="dxa" w:w="90"/>
+              <w:bottom w:type="dxa" w:w="50"/>
+              <w:right w:type="dxa" w:w="90"/>
+            </w:tcMar>
+          </w:tcPr>
+          <w:p>
+            <w:r>
+              <w:rPr>
+                <w:rFonts w:ascii="Times New Roman" w:cs="Times New Roman" w:eastAsia="Times New Roman" w:hAnsi="Times New Roman"/>
+                <w:sz w:val="18"/>
+                <w:szCs w:val="18"/>
+              </w:rPr>
+              <w:t xml:space="preserve">0.274</w:t>
+            </w:r>
+          </w:p>
+        </w:tc>
+        <w:tc>
+          <w:tcPr>
+            <w:tcW w:type="dxa" w:w="1100"/>
+            <w:tcBorders>
+              <w:top w:val="none" w:color="FFFFFF" w:sz="0"/>
+              <w:left w:val="none" w:color="FFFFFF" w:sz="0"/>
+              <w:bottom w:val="none" w:color="FFFFFF" w:sz="0"/>
+              <w:right w:val="none" w:color="FFFFFF" w:sz="0"/>
+            </w:tcBorders>
+            <w:tcMar>
+              <w:top w:type="dxa" w:w="50"/>
+              <w:left w:type="dxa" w:w="90"/>
+              <w:bottom w:type="dxa" w:w="50"/>
+              <w:right w:type="dxa" w:w="90"/>
+            </w:tcMar>
+          </w:tcPr>
+          <w:p>
+            <w:r>
+              <w:rPr>
+                <w:rFonts w:ascii="Times New Roman" w:cs="Times New Roman" w:eastAsia="Times New Roman" w:hAnsi="Times New Roman"/>
+                <w:sz w:val="18"/>
+                <w:szCs w:val="18"/>
+              </w:rPr>
+              <w:t xml:space="preserve">0.227</w:t>
+            </w:r>
+          </w:p>
+        </w:tc>
+        <w:tc>
+          <w:tcPr>
+            <w:tcW w:type="dxa" w:w="1000"/>
+            <w:tcBorders>
+              <w:top w:val="none" w:color="FFFFFF" w:sz="0"/>
+              <w:left w:val="none" w:color="FFFFFF" w:sz="0"/>
+              <w:bottom w:val="none" w:color="FFFFFF" w:sz="0"/>
+              <w:right w:val="none" w:color="FFFFFF" w:sz="0"/>
+            </w:tcBorders>
+            <w:tcMar>
+              <w:top w:type="dxa" w:w="50"/>
+              <w:left w:type="dxa" w:w="90"/>
+              <w:bottom w:type="dxa" w:w="50"/>
+              <w:right w:type="dxa" w:w="90"/>
+            </w:tcMar>
+          </w:tcPr>
+          <w:p>
+            <w:r>
+              <w:rPr>
+                <w:rFonts w:ascii="Times New Roman" w:cs="Times New Roman" w:eastAsia="Times New Roman" w:hAnsi="Times New Roman"/>
+                <w:sz w:val="18"/>
+                <w:szCs w:val="18"/>
+              </w:rPr>
+              <w:t xml:space="preserve">0.140</w:t>
+            </w:r>
+          </w:p>
+        </w:tc>
+        <w:tc>
+          <w:tcPr>
+            <w:tcW w:type="dxa" w:w="1000"/>
+            <w:tcBorders>
+              <w:top w:val="none" w:color="FFFFFF" w:sz="0"/>
+              <w:left w:val="none" w:color="FFFFFF" w:sz="0"/>
+              <w:bottom w:val="none" w:color="FFFFFF" w:sz="0"/>
+              <w:right w:val="none" w:color="FFFFFF" w:sz="0"/>
+            </w:tcBorders>
+            <w:tcMar>
+              <w:top w:type="dxa" w:w="50"/>
+              <w:left w:type="dxa" w:w="90"/>
+              <w:bottom w:type="dxa" w:w="50"/>
+              <w:right w:type="dxa" w:w="90"/>
+            </w:tcMar>
+          </w:tcPr>
+          <w:p>
+            <w:r>
+              <w:rPr>
+                <w:rFonts w:ascii="Times New Roman" w:cs="Times New Roman" w:eastAsia="Times New Roman" w:hAnsi="Times New Roman"/>
+                <w:sz w:val="18"/>
+                <w:szCs w:val="18"/>
+              </w:rPr>
+              <w:t xml:space="preserve">0.278</w:t>
+            </w:r>
+          </w:p>
+        </w:tc>
+      </w:tr>
+      <w:tr>
+        <w:tc>
+          <w:tcPr>
+            <w:tcW w:type="dxa" w:w="800"/>
+            <w:tcBorders>
+              <w:top w:val="none" w:color="FFFFFF" w:sz="0"/>
+              <w:left w:val="none" w:color="FFFFFF" w:sz="0"/>
+              <w:bottom w:val="none" w:color="FFFFFF" w:sz="0"/>
+              <w:right w:val="none" w:color="FFFFFF" w:sz="0"/>
+            </w:tcBorders>
+            <w:tcMar>
+              <w:top w:type="dxa" w:w="50"/>
+              <w:left w:type="dxa" w:w="90"/>
+              <w:bottom w:type="dxa" w:w="50"/>
+              <w:right w:type="dxa" w:w="90"/>
+            </w:tcMar>
+          </w:tcPr>
+          <w:p>
+            <w:r>
+              <w:rPr>
+                <w:rFonts w:ascii="Times New Roman" w:cs="Times New Roman" w:eastAsia="Times New Roman" w:hAnsi="Times New Roman"/>
+                <w:sz w:val="18"/>
+                <w:szCs w:val="18"/>
+              </w:rPr>
+              <w:t xml:space="preserve">B3</w:t>
+            </w:r>
+          </w:p>
+        </w:tc>
+        <w:tc>
+          <w:tcPr>
+            <w:tcW w:type="dxa" w:w="1100"/>
+            <w:tcBorders>
+              <w:top w:val="none" w:color="FFFFFF" w:sz="0"/>
+              <w:left w:val="none" w:color="FFFFFF" w:sz="0"/>
+              <w:bottom w:val="none" w:color="FFFFFF" w:sz="0"/>
+              <w:right w:val="none" w:color="FFFFFF" w:sz="0"/>
+            </w:tcBorders>
+            <w:tcMar>
+              <w:top w:type="dxa" w:w="50"/>
+              <w:left w:type="dxa" w:w="90"/>
+              <w:bottom w:type="dxa" w:w="50"/>
+              <w:right w:type="dxa" w:w="90"/>
+            </w:tcMar>
+          </w:tcPr>
+          <w:p>
+            <w:r>
+              <w:rPr>
+                <w:rFonts w:ascii="Times New Roman" w:cs="Times New Roman" w:eastAsia="Times New Roman" w:hAnsi="Times New Roman"/>
+                <w:sz w:val="18"/>
+                <w:szCs w:val="18"/>
+              </w:rPr>
+              <w:t xml:space="preserve">2</w:t>
+            </w:r>
+          </w:p>
+        </w:tc>
+        <w:tc>
+          <w:tcPr>
+            <w:tcW w:type="dxa" w:w="1000"/>
+            <w:tcBorders>
+              <w:top w:val="none" w:color="FFFFFF" w:sz="0"/>
+              <w:left w:val="none" w:color="FFFFFF" w:sz="0"/>
+              <w:bottom w:val="none" w:color="FFFFFF" w:sz="0"/>
+              <w:right w:val="none" w:color="FFFFFF" w:sz="0"/>
+            </w:tcBorders>
+            <w:tcMar>
+              <w:top w:type="dxa" w:w="50"/>
+              <w:left w:type="dxa" w:w="90"/>
+              <w:bottom w:type="dxa" w:w="50"/>
+              <w:right w:type="dxa" w:w="90"/>
+            </w:tcMar>
+          </w:tcPr>
+          <w:p>
+            <w:r>
+              <w:rPr>
+                <w:rFonts w:ascii="Times New Roman" w:cs="Times New Roman" w:eastAsia="Times New Roman" w:hAnsi="Times New Roman"/>
+                <w:sz w:val="18"/>
+                <w:szCs w:val="18"/>
+              </w:rPr>
+              <w:t xml:space="preserve">0.196</w:t>
+            </w:r>
+          </w:p>
+        </w:tc>
+        <w:tc>
+          <w:tcPr>
+            <w:tcW w:type="dxa" w:w="1100"/>
+            <w:tcBorders>
+              <w:top w:val="none" w:color="FFFFFF" w:sz="0"/>
+              <w:left w:val="none" w:color="FFFFFF" w:sz="0"/>
+              <w:bottom w:val="none" w:color="FFFFFF" w:sz="0"/>
+              <w:right w:val="none" w:color="FFFFFF" w:sz="0"/>
+            </w:tcBorders>
+            <w:tcMar>
+              <w:top w:type="dxa" w:w="50"/>
+              <w:left w:type="dxa" w:w="90"/>
+              <w:bottom w:type="dxa" w:w="50"/>
+              <w:right w:type="dxa" w:w="90"/>
+            </w:tcMar>
+          </w:tcPr>
+          <w:p>
+            <w:r>
+              <w:rPr>
+                <w:rFonts w:ascii="Times New Roman" w:cs="Times New Roman" w:eastAsia="Times New Roman" w:hAnsi="Times New Roman"/>
+                <w:sz w:val="18"/>
+                <w:szCs w:val="18"/>
+              </w:rPr>
+              <w:t xml:space="preserve">0.653</w:t>
+            </w:r>
+          </w:p>
+        </w:tc>
+        <w:tc>
+          <w:tcPr>
+            <w:tcW w:type="dxa" w:w="1000"/>
+            <w:tcBorders>
+              <w:top w:val="none" w:color="FFFFFF" w:sz="0"/>
+              <w:left w:val="none" w:color="FFFFFF" w:sz="0"/>
+              <w:bottom w:val="none" w:color="FFFFFF" w:sz="0"/>
+              <w:right w:val="none" w:color="FFFFFF" w:sz="0"/>
+            </w:tcBorders>
+            <w:tcMar>
+              <w:top w:type="dxa" w:w="50"/>
+              <w:left w:type="dxa" w:w="90"/>
+              <w:bottom w:type="dxa" w:w="50"/>
+              <w:right w:type="dxa" w:w="90"/>
+            </w:tcMar>
+          </w:tcPr>
+          <w:p>
+            <w:r>
+              <w:rPr>
+                <w:rFonts w:ascii="Times New Roman" w:cs="Times New Roman" w:eastAsia="Times New Roman" w:hAnsi="Times New Roman"/>
+                <w:sz w:val="18"/>
+                <w:szCs w:val="18"/>
+              </w:rPr>
+              <w:t xml:space="preserve">0.321</w:t>
+            </w:r>
+          </w:p>
+        </w:tc>
+        <w:tc>
+          <w:tcPr>
+            <w:tcW w:type="dxa" w:w="1100"/>
+            <w:tcBorders>
+              <w:top w:val="none" w:color="FFFFFF" w:sz="0"/>
+              <w:left w:val="none" w:color="FFFFFF" w:sz="0"/>
+              <w:bottom w:val="none" w:color="FFFFFF" w:sz="0"/>
+              <w:right w:val="none" w:color="FFFFFF" w:sz="0"/>
+            </w:tcBorders>
+            <w:tcMar>
+              <w:top w:type="dxa" w:w="50"/>
+              <w:left w:type="dxa" w:w="90"/>
+              <w:bottom w:type="dxa" w:w="50"/>
+              <w:right w:type="dxa" w:w="90"/>
+            </w:tcMar>
+          </w:tcPr>
+          <w:p>
+            <w:r>
+              <w:rPr>
+                <w:rFonts w:ascii="Times New Roman" w:cs="Times New Roman" w:eastAsia="Times New Roman" w:hAnsi="Times New Roman"/>
+                <w:sz w:val="18"/>
+                <w:szCs w:val="18"/>
+              </w:rPr>
+              <w:t xml:space="preserve">0.302</w:t>
+            </w:r>
+          </w:p>
+        </w:tc>
+        <w:tc>
+          <w:tcPr>
+            <w:tcW w:type="dxa" w:w="1000"/>
+            <w:tcBorders>
+              <w:top w:val="none" w:color="FFFFFF" w:sz="0"/>
+              <w:left w:val="none" w:color="FFFFFF" w:sz="0"/>
+              <w:bottom w:val="none" w:color="FFFFFF" w:sz="0"/>
+              <w:right w:val="none" w:color="FFFFFF" w:sz="0"/>
+            </w:tcBorders>
+            <w:tcMar>
+              <w:top w:type="dxa" w:w="50"/>
+              <w:left w:type="dxa" w:w="90"/>
+              <w:bottom w:type="dxa" w:w="50"/>
+              <w:right w:type="dxa" w:w="90"/>
+            </w:tcMar>
+          </w:tcPr>
+          <w:p>
+            <w:r>
+              <w:rPr>
+                <w:rFonts w:ascii="Times New Roman" w:cs="Times New Roman" w:eastAsia="Times New Roman" w:hAnsi="Times New Roman"/>
+                <w:sz w:val="18"/>
+                <w:szCs w:val="18"/>
+              </w:rPr>
+              <w:t xml:space="preserve">0.197</w:t>
+            </w:r>
+          </w:p>
+        </w:tc>
+        <w:tc>
+          <w:tcPr>
+            <w:tcW w:type="dxa" w:w="1000"/>
+            <w:tcBorders>
+              <w:top w:val="none" w:color="FFFFFF" w:sz="0"/>
+              <w:left w:val="none" w:color="FFFFFF" w:sz="0"/>
+              <w:bottom w:val="none" w:color="FFFFFF" w:sz="0"/>
+              <w:right w:val="none" w:color="FFFFFF" w:sz="0"/>
+            </w:tcBorders>
+            <w:tcMar>
+              <w:top w:type="dxa" w:w="50"/>
+              <w:left w:type="dxa" w:w="90"/>
+              <w:bottom w:type="dxa" w:w="50"/>
+              <w:right w:type="dxa" w:w="90"/>
+            </w:tcMar>
+          </w:tcPr>
+          <w:p>
+            <w:r>
+              <w:rPr>
+                <w:rFonts w:ascii="Times New Roman" w:cs="Times New Roman" w:eastAsia="Times New Roman" w:hAnsi="Times New Roman"/>
+                <w:sz w:val="18"/>
+                <w:szCs w:val="18"/>
+              </w:rPr>
+              <w:t xml:space="preserve">0.333</w:t>
+            </w:r>
+          </w:p>
+        </w:tc>
+      </w:tr>
+      <w:tr>
+        <w:tc>
+          <w:tcPr>
+            <w:tcW w:type="dxa" w:w="800"/>
+            <w:tcBorders>
+              <w:top w:val="none" w:color="FFFFFF" w:sz="0"/>
+              <w:left w:val="none" w:color="FFFFFF" w:sz="0"/>
+              <w:bottom w:val="none" w:color="FFFFFF" w:sz="0"/>
+              <w:right w:val="none" w:color="FFFFFF" w:sz="0"/>
+            </w:tcBorders>
+            <w:tcMar>
+              <w:top w:type="dxa" w:w="50"/>
+              <w:left w:type="dxa" w:w="90"/>
+              <w:bottom w:type="dxa" w:w="50"/>
+              <w:right w:type="dxa" w:w="90"/>
+            </w:tcMar>
+          </w:tcPr>
+          <w:p>
+            <w:r>
+              <w:rPr>
+                <w:rFonts w:ascii="Times New Roman" w:cs="Times New Roman" w:eastAsia="Times New Roman" w:hAnsi="Times New Roman"/>
+                <w:sz w:val="18"/>
+                <w:szCs w:val="18"/>
+              </w:rPr>
+              <w:t xml:space="preserve">B3</w:t>
+            </w:r>
+          </w:p>
+        </w:tc>
+        <w:tc>
+          <w:tcPr>
+            <w:tcW w:type="dxa" w:w="1100"/>
+            <w:tcBorders>
+              <w:top w:val="none" w:color="FFFFFF" w:sz="0"/>
+              <w:left w:val="none" w:color="FFFFFF" w:sz="0"/>
+              <w:bottom w:val="none" w:color="FFFFFF" w:sz="0"/>
+              <w:right w:val="none" w:color="FFFFFF" w:sz="0"/>
+            </w:tcBorders>
+            <w:tcMar>
+              <w:top w:type="dxa" w:w="50"/>
+              <w:left w:type="dxa" w:w="90"/>
+              <w:bottom w:type="dxa" w:w="50"/>
+              <w:right w:type="dxa" w:w="90"/>
+            </w:tcMar>
+          </w:tcPr>
+          <w:p>
+            <w:r>
+              <w:rPr>
+                <w:rFonts w:ascii="Times New Roman" w:cs="Times New Roman" w:eastAsia="Times New Roman" w:hAnsi="Times New Roman"/>
+                <w:sz w:val="18"/>
+                <w:szCs w:val="18"/>
+              </w:rPr>
+              <w:t xml:space="preserve">3</w:t>
+            </w:r>
+          </w:p>
+        </w:tc>
+        <w:tc>
+          <w:tcPr>
+            <w:tcW w:type="dxa" w:w="1000"/>
+            <w:tcBorders>
+              <w:top w:val="none" w:color="FFFFFF" w:sz="0"/>
+              <w:left w:val="none" w:color="FFFFFF" w:sz="0"/>
+              <w:bottom w:val="none" w:color="FFFFFF" w:sz="0"/>
+              <w:right w:val="none" w:color="FFFFFF" w:sz="0"/>
+            </w:tcBorders>
+            <w:tcMar>
+              <w:top w:type="dxa" w:w="50"/>
+              <w:left w:type="dxa" w:w="90"/>
+              <w:bottom w:type="dxa" w:w="50"/>
+              <w:right w:type="dxa" w:w="90"/>
+            </w:tcMar>
+          </w:tcPr>
+          <w:p>
+            <w:r>
+              <w:rPr>
+                <w:rFonts w:ascii="Times New Roman" w:cs="Times New Roman" w:eastAsia="Times New Roman" w:hAnsi="Times New Roman"/>
+                <w:sz w:val="18"/>
+                <w:szCs w:val="18"/>
+              </w:rPr>
+              <w:t xml:space="preserve">0.211</w:t>
+            </w:r>
+          </w:p>
+        </w:tc>
+        <w:tc>
+          <w:tcPr>
+            <w:tcW w:type="dxa" w:w="1100"/>
+            <w:tcBorders>
+              <w:top w:val="none" w:color="FFFFFF" w:sz="0"/>
+              <w:left w:val="none" w:color="FFFFFF" w:sz="0"/>
+              <w:bottom w:val="none" w:color="FFFFFF" w:sz="0"/>
+              <w:right w:val="none" w:color="FFFFFF" w:sz="0"/>
+            </w:tcBorders>
+            <w:tcMar>
+              <w:top w:type="dxa" w:w="50"/>
+              <w:left w:type="dxa" w:w="90"/>
+              <w:bottom w:type="dxa" w:w="50"/>
+              <w:right w:type="dxa" w:w="90"/>
+            </w:tcMar>
+          </w:tcPr>
+          <w:p>
+            <w:r>
+              <w:rPr>
+                <w:rFonts w:ascii="Times New Roman" w:cs="Times New Roman" w:eastAsia="Times New Roman" w:hAnsi="Times New Roman"/>
+                <w:sz w:val="18"/>
+                <w:szCs w:val="18"/>
+              </w:rPr>
+              <w:t xml:space="preserve">0.581</w:t>
+            </w:r>
+          </w:p>
+        </w:tc>
+        <w:tc>
+          <w:tcPr>
+            <w:tcW w:type="dxa" w:w="1000"/>
+            <w:tcBorders>
+              <w:top w:val="none" w:color="FFFFFF" w:sz="0"/>
+              <w:left w:val="none" w:color="FFFFFF" w:sz="0"/>
+              <w:bottom w:val="none" w:color="FFFFFF" w:sz="0"/>
+              <w:right w:val="none" w:color="FFFFFF" w:sz="0"/>
+            </w:tcBorders>
+            <w:tcMar>
+              <w:top w:type="dxa" w:w="50"/>
+              <w:left w:type="dxa" w:w="90"/>
+              <w:bottom w:type="dxa" w:w="50"/>
+              <w:right w:type="dxa" w:w="90"/>
+            </w:tcMar>
+          </w:tcPr>
+          <w:p>
+            <w:r>
+              <w:rPr>
+                <w:rFonts w:ascii="Times New Roman" w:cs="Times New Roman" w:eastAsia="Times New Roman" w:hAnsi="Times New Roman"/>
+                <w:sz w:val="18"/>
+                <w:szCs w:val="18"/>
+              </w:rPr>
+              <w:t xml:space="preserve">0.327</w:t>
+            </w:r>
+          </w:p>
+        </w:tc>
+        <w:tc>
+          <w:tcPr>
+            <w:tcW w:type="dxa" w:w="1100"/>
+            <w:tcBorders>
+              <w:top w:val="none" w:color="FFFFFF" w:sz="0"/>
+              <w:left w:val="none" w:color="FFFFFF" w:sz="0"/>
+              <w:bottom w:val="none" w:color="FFFFFF" w:sz="0"/>
+              <w:right w:val="none" w:color="FFFFFF" w:sz="0"/>
+            </w:tcBorders>
+            <w:tcMar>
+              <w:top w:type="dxa" w:w="50"/>
+              <w:left w:type="dxa" w:w="90"/>
+              <w:bottom w:type="dxa" w:w="50"/>
+              <w:right w:type="dxa" w:w="90"/>
+            </w:tcMar>
+          </w:tcPr>
+          <w:p>
+            <w:r>
+              <w:rPr>
+                <w:rFonts w:ascii="Times New Roman" w:cs="Times New Roman" w:eastAsia="Times New Roman" w:hAnsi="Times New Roman"/>
+                <w:sz w:val="18"/>
+                <w:szCs w:val="18"/>
+              </w:rPr>
+              <w:t xml:space="preserve">0.279</w:t>
+            </w:r>
+          </w:p>
+        </w:tc>
+        <w:tc>
+          <w:tcPr>
+            <w:tcW w:type="dxa" w:w="1000"/>
+            <w:tcBorders>
+              <w:top w:val="none" w:color="FFFFFF" w:sz="0"/>
+              <w:left w:val="none" w:color="FFFFFF" w:sz="0"/>
+              <w:bottom w:val="none" w:color="FFFFFF" w:sz="0"/>
+              <w:right w:val="none" w:color="FFFFFF" w:sz="0"/>
+            </w:tcBorders>
+            <w:tcMar>
+              <w:top w:type="dxa" w:w="50"/>
+              <w:left w:type="dxa" w:w="90"/>
+              <w:bottom w:type="dxa" w:w="50"/>
+              <w:right w:type="dxa" w:w="90"/>
+            </w:tcMar>
+          </w:tcPr>
+          <w:p>
+            <w:r>
+              <w:rPr>
+                <w:rFonts w:ascii="Times New Roman" w:cs="Times New Roman" w:eastAsia="Times New Roman" w:hAnsi="Times New Roman"/>
+                <w:sz w:val="18"/>
+                <w:szCs w:val="18"/>
+              </w:rPr>
+              <w:t xml:space="preserve">0.167</w:t>
+            </w:r>
+          </w:p>
+        </w:tc>
+        <w:tc>
+          <w:tcPr>
+            <w:tcW w:type="dxa" w:w="1000"/>
+            <w:tcBorders>
+              <w:top w:val="none" w:color="FFFFFF" w:sz="0"/>
+              <w:left w:val="none" w:color="FFFFFF" w:sz="0"/>
+              <w:bottom w:val="none" w:color="FFFFFF" w:sz="0"/>
+              <w:right w:val="none" w:color="FFFFFF" w:sz="0"/>
+            </w:tcBorders>
+            <w:tcMar>
+              <w:top w:type="dxa" w:w="50"/>
+              <w:left w:type="dxa" w:w="90"/>
+              <w:bottom w:type="dxa" w:w="50"/>
+              <w:right w:type="dxa" w:w="90"/>
+            </w:tcMar>
+          </w:tcPr>
+          <w:p>
+            <w:r>
+              <w:rPr>
+                <w:rFonts w:ascii="Times New Roman" w:cs="Times New Roman" w:eastAsia="Times New Roman" w:hAnsi="Times New Roman"/>
+                <w:sz w:val="18"/>
+                <w:szCs w:val="18"/>
+              </w:rPr>
+              <w:t xml:space="preserve">0.307</w:t>
+            </w:r>
+          </w:p>
+        </w:tc>
+      </w:tr>
+      <w:tr>
+        <w:tc>
+          <w:tcPr>
+            <w:tcW w:type="dxa" w:w="800"/>
+            <w:tcBorders>
+              <w:top w:val="none" w:color="FFFFFF" w:sz="0"/>
+              <w:left w:val="none" w:color="FFFFFF" w:sz="0"/>
+              <w:bottom w:val="none" w:color="FFFFFF" w:sz="0"/>
+              <w:right w:val="none" w:color="FFFFFF" w:sz="0"/>
+            </w:tcBorders>
+            <w:tcMar>
+              <w:top w:type="dxa" w:w="50"/>
+              <w:left w:type="dxa" w:w="90"/>
+              <w:bottom w:type="dxa" w:w="50"/>
+              <w:right w:type="dxa" w:w="90"/>
+            </w:tcMar>
+          </w:tcPr>
+          <w:p>
+            <w:r>
+              <w:rPr>
+                <w:rFonts w:ascii="Times New Roman" w:cs="Times New Roman" w:eastAsia="Times New Roman" w:hAnsi="Times New Roman"/>
+                <w:sz w:val="18"/>
+                <w:szCs w:val="18"/>
+              </w:rPr>
+              <w:t xml:space="preserve">B1</w:t>
+            </w:r>
+          </w:p>
+        </w:tc>
+        <w:tc>
+          <w:tcPr>
+            <w:tcW w:type="dxa" w:w="1100"/>
+            <w:tcBorders>
+              <w:top w:val="none" w:color="FFFFFF" w:sz="0"/>
+              <w:left w:val="none" w:color="FFFFFF" w:sz="0"/>
+              <w:bottom w:val="none" w:color="FFFFFF" w:sz="0"/>
+              <w:right w:val="none" w:color="FFFFFF" w:sz="0"/>
+            </w:tcBorders>
+            <w:tcMar>
+              <w:top w:type="dxa" w:w="50"/>
+              <w:left w:type="dxa" w:w="90"/>
+              <w:bottom w:type="dxa" w:w="50"/>
+              <w:right w:type="dxa" w:w="90"/>
+            </w:tcMar>
+          </w:tcPr>
+          <w:p>
+            <w:r>
+              <w:rPr>
+                <w:rFonts w:ascii="Times New Roman" w:cs="Times New Roman" w:eastAsia="Times New Roman" w:hAnsi="Times New Roman"/>
+                <w:sz w:val="18"/>
+                <w:szCs w:val="18"/>
+              </w:rPr>
+              <w:t xml:space="preserve">0 (expl.)</w:t>
+            </w:r>
+          </w:p>
+        </w:tc>
+        <w:tc>
+          <w:tcPr>
+            <w:tcW w:type="dxa" w:w="1000"/>
+            <w:tcBorders>
+              <w:top w:val="none" w:color="FFFFFF" w:sz="0"/>
+              <w:left w:val="none" w:color="FFFFFF" w:sz="0"/>
+              <w:bottom w:val="none" w:color="FFFFFF" w:sz="0"/>
+              <w:right w:val="none" w:color="FFFFFF" w:sz="0"/>
+            </w:tcBorders>
+            <w:tcMar>
+              <w:top w:type="dxa" w:w="50"/>
+              <w:left w:type="dxa" w:w="90"/>
+              <w:bottom w:type="dxa" w:w="50"/>
+              <w:right w:type="dxa" w:w="90"/>
+            </w:tcMar>
+          </w:tcPr>
+          <w:p>
+            <w:r>
+              <w:rPr>
+                <w:rFonts w:ascii="Times New Roman" w:cs="Times New Roman" w:eastAsia="Times New Roman" w:hAnsi="Times New Roman"/>
+                <w:sz w:val="18"/>
+                <w:szCs w:val="18"/>
+              </w:rPr>
+              <w:t xml:space="preserve">0.183</w:t>
+            </w:r>
+          </w:p>
+        </w:tc>
+        <w:tc>
+          <w:tcPr>
+            <w:tcW w:type="dxa" w:w="1100"/>
+            <w:tcBorders>
+              <w:top w:val="none" w:color="FFFFFF" w:sz="0"/>
+              <w:left w:val="none" w:color="FFFFFF" w:sz="0"/>
+              <w:bottom w:val="none" w:color="FFFFFF" w:sz="0"/>
+              <w:right w:val="none" w:color="FFFFFF" w:sz="0"/>
+            </w:tcBorders>
+            <w:tcMar>
+              <w:top w:type="dxa" w:w="50"/>
+              <w:left w:type="dxa" w:w="90"/>
+              <w:bottom w:type="dxa" w:w="50"/>
+              <w:right w:type="dxa" w:w="90"/>
+            </w:tcMar>
+          </w:tcPr>
+          <w:p>
+            <w:r>
+              <w:rPr>
+                <w:rFonts w:ascii="Times New Roman" w:cs="Times New Roman" w:eastAsia="Times New Roman" w:hAnsi="Times New Roman"/>
+                <w:sz w:val="18"/>
+                <w:szCs w:val="18"/>
+              </w:rPr>
+              <w:t xml:space="preserve">0.252</w:t>
+            </w:r>
+          </w:p>
+        </w:tc>
+        <w:tc>
+          <w:tcPr>
+            <w:tcW w:type="dxa" w:w="1000"/>
+            <w:tcBorders>
+              <w:top w:val="none" w:color="FFFFFF" w:sz="0"/>
+              <w:left w:val="none" w:color="FFFFFF" w:sz="0"/>
+              <w:bottom w:val="none" w:color="FFFFFF" w:sz="0"/>
+              <w:right w:val="none" w:color="FFFFFF" w:sz="0"/>
+            </w:tcBorders>
+            <w:tcMar>
+              <w:top w:type="dxa" w:w="50"/>
+              <w:left w:type="dxa" w:w="90"/>
+              <w:bottom w:type="dxa" w:w="50"/>
+              <w:right w:type="dxa" w:w="90"/>
+            </w:tcMar>
+          </w:tcPr>
+          <w:p>
+            <w:r>
+              <w:rPr>
+                <w:rFonts w:ascii="Times New Roman" w:cs="Times New Roman" w:eastAsia="Times New Roman" w:hAnsi="Times New Roman"/>
+                <w:sz w:val="18"/>
+                <w:szCs w:val="18"/>
+              </w:rPr>
+              <w:t xml:space="preserve">0.323</w:t>
+            </w:r>
+          </w:p>
+        </w:tc>
+        <w:tc>
+          <w:tcPr>
+            <w:tcW w:type="dxa" w:w="1100"/>
+            <w:tcBorders>
+              <w:top w:val="none" w:color="FFFFFF" w:sz="0"/>
+              <w:left w:val="none" w:color="FFFFFF" w:sz="0"/>
+              <w:bottom w:val="none" w:color="FFFFFF" w:sz="0"/>
+              <w:right w:val="none" w:color="FFFFFF" w:sz="0"/>
+            </w:tcBorders>
+            <w:tcMar>
+              <w:top w:type="dxa" w:w="50"/>
+              <w:left w:type="dxa" w:w="90"/>
+              <w:bottom w:type="dxa" w:w="50"/>
+              <w:right w:type="dxa" w:w="90"/>
+            </w:tcMar>
+          </w:tcPr>
+          <w:p>
+            <w:r>
+              <w:rPr>
+                <w:rFonts w:ascii="Times New Roman" w:cs="Times New Roman" w:eastAsia="Times New Roman" w:hAnsi="Times New Roman"/>
+                <w:sz w:val="18"/>
+                <w:szCs w:val="18"/>
+              </w:rPr>
+              <w:t xml:space="preserve">0.275</w:t>
+            </w:r>
+          </w:p>
+        </w:tc>
+        <w:tc>
+          <w:tcPr>
+            <w:tcW w:type="dxa" w:w="1000"/>
+            <w:tcBorders>
+              <w:top w:val="none" w:color="FFFFFF" w:sz="0"/>
+              <w:left w:val="none" w:color="FFFFFF" w:sz="0"/>
+              <w:bottom w:val="none" w:color="FFFFFF" w:sz="0"/>
+              <w:right w:val="none" w:color="FFFFFF" w:sz="0"/>
+            </w:tcBorders>
+            <w:tcMar>
+              <w:top w:type="dxa" w:w="50"/>
+              <w:left w:type="dxa" w:w="90"/>
+              <w:bottom w:type="dxa" w:w="50"/>
+              <w:right w:type="dxa" w:w="90"/>
+            </w:tcMar>
+          </w:tcPr>
+          <w:p>
+            <w:r>
+              <w:rPr>
+                <w:rFonts w:ascii="Times New Roman" w:cs="Times New Roman" w:eastAsia="Times New Roman" w:hAnsi="Times New Roman"/>
+                <w:sz w:val="18"/>
+                <w:szCs w:val="18"/>
+              </w:rPr>
+              <w:t xml:space="preserve">0.192</w:t>
+            </w:r>
+          </w:p>
+        </w:tc>
+        <w:tc>
+          <w:tcPr>
+            <w:tcW w:type="dxa" w:w="1000"/>
+            <w:tcBorders>
+              <w:top w:val="none" w:color="FFFFFF" w:sz="0"/>
+              <w:left w:val="none" w:color="FFFFFF" w:sz="0"/>
+              <w:bottom w:val="none" w:color="FFFFFF" w:sz="0"/>
+              <w:right w:val="none" w:color="FFFFFF" w:sz="0"/>
+            </w:tcBorders>
+            <w:tcMar>
+              <w:top w:type="dxa" w:w="50"/>
+              <w:left w:type="dxa" w:w="90"/>
+              <w:bottom w:type="dxa" w:w="50"/>
+              <w:right w:type="dxa" w:w="90"/>
+            </w:tcMar>
+          </w:tcPr>
+          <w:p>
+            <w:r>
+              <w:rPr>
+                <w:rFonts w:ascii="Times New Roman" w:cs="Times New Roman" w:eastAsia="Times New Roman" w:hAnsi="Times New Roman"/>
+                <w:sz w:val="18"/>
+                <w:szCs w:val="18"/>
+              </w:rPr>
+              <w:t xml:space="preserve">0.325</w:t>
+            </w:r>
+          </w:p>
+        </w:tc>
+      </w:tr>
+      <w:tr>
+        <w:tc>
+          <w:tcPr>
+            <w:tcW w:type="dxa" w:w="800"/>
+            <w:tcBorders>
+              <w:top w:val="none" w:color="FFFFFF" w:sz="0"/>
+              <w:left w:val="none" w:color="FFFFFF" w:sz="0"/>
+              <w:bottom w:val="none" w:color="FFFFFF" w:sz="0"/>
+              <w:right w:val="none" w:color="FFFFFF" w:sz="0"/>
+            </w:tcBorders>
+            <w:tcMar>
+              <w:top w:type="dxa" w:w="50"/>
+              <w:left w:type="dxa" w:w="90"/>
+              <w:bottom w:type="dxa" w:w="50"/>
+              <w:right w:type="dxa" w:w="90"/>
+            </w:tcMar>
+          </w:tcPr>
+          <w:p>
+            <w:r>
+              <w:rPr>
+                <w:rFonts w:ascii="Times New Roman" w:cs="Times New Roman" w:eastAsia="Times New Roman" w:hAnsi="Times New Roman"/>
+                <w:sz w:val="18"/>
+                <w:szCs w:val="18"/>
+              </w:rPr>
+              <w:t xml:space="preserve">B1</w:t>
+            </w:r>
+          </w:p>
+        </w:tc>
+        <w:tc>
+          <w:tcPr>
+            <w:tcW w:type="dxa" w:w="1100"/>
+            <w:tcBorders>
+              <w:top w:val="none" w:color="FFFFFF" w:sz="0"/>
+              <w:left w:val="none" w:color="FFFFFF" w:sz="0"/>
+              <w:bottom w:val="none" w:color="FFFFFF" w:sz="0"/>
+              <w:right w:val="none" w:color="FFFFFF" w:sz="0"/>
+            </w:tcBorders>
+            <w:tcMar>
+              <w:top w:type="dxa" w:w="50"/>
+              <w:left w:type="dxa" w:w="90"/>
+              <w:bottom w:type="dxa" w:w="50"/>
+              <w:right w:type="dxa" w:w="90"/>
+            </w:tcMar>
+          </w:tcPr>
+          <w:p>
+            <w:r>
+              <w:rPr>
+                <w:rFonts w:ascii="Times New Roman" w:cs="Times New Roman" w:eastAsia="Times New Roman" w:hAnsi="Times New Roman"/>
+                <w:sz w:val="18"/>
+                <w:szCs w:val="18"/>
+              </w:rPr>
+              <w:t xml:space="preserve">1</w:t>
+            </w:r>
+          </w:p>
+        </w:tc>
+        <w:tc>
+          <w:tcPr>
+            <w:tcW w:type="dxa" w:w="1000"/>
+            <w:tcBorders>
+              <w:top w:val="none" w:color="FFFFFF" w:sz="0"/>
+              <w:left w:val="none" w:color="FFFFFF" w:sz="0"/>
+              <w:bottom w:val="none" w:color="FFFFFF" w:sz="0"/>
+              <w:right w:val="none" w:color="FFFFFF" w:sz="0"/>
+            </w:tcBorders>
+            <w:tcMar>
+              <w:top w:type="dxa" w:w="50"/>
+              <w:left w:type="dxa" w:w="90"/>
+              <w:bottom w:type="dxa" w:w="50"/>
+              <w:right w:type="dxa" w:w="90"/>
+            </w:tcMar>
+          </w:tcPr>
+          <w:p>
+            <w:r>
+              <w:rPr>
+                <w:rFonts w:ascii="Times New Roman" w:cs="Times New Roman" w:eastAsia="Times New Roman" w:hAnsi="Times New Roman"/>
+                <w:sz w:val="18"/>
+                <w:szCs w:val="18"/>
+              </w:rPr>
+              <w:t xml:space="preserve">0.187</w:t>
+            </w:r>
+          </w:p>
+        </w:tc>
+        <w:tc>
+          <w:tcPr>
+            <w:tcW w:type="dxa" w:w="1100"/>
+            <w:tcBorders>
+              <w:top w:val="none" w:color="FFFFFF" w:sz="0"/>
+              <w:left w:val="none" w:color="FFFFFF" w:sz="0"/>
+              <w:bottom w:val="none" w:color="FFFFFF" w:sz="0"/>
+              <w:right w:val="none" w:color="FFFFFF" w:sz="0"/>
+            </w:tcBorders>
+            <w:tcMar>
+              <w:top w:type="dxa" w:w="50"/>
+              <w:left w:type="dxa" w:w="90"/>
+              <w:bottom w:type="dxa" w:w="50"/>
+              <w:right w:type="dxa" w:w="90"/>
+            </w:tcMar>
+          </w:tcPr>
+          <w:p>
+            <w:r>
+              <w:rPr>
+                <w:rFonts w:ascii="Times New Roman" w:cs="Times New Roman" w:eastAsia="Times New Roman" w:hAnsi="Times New Roman"/>
+                <w:sz w:val="18"/>
+                <w:szCs w:val="18"/>
+              </w:rPr>
+              <w:t xml:space="preserve">0.223</w:t>
+            </w:r>
+          </w:p>
+        </w:tc>
+        <w:tc>
+          <w:tcPr>
+            <w:tcW w:type="dxa" w:w="1000"/>
+            <w:tcBorders>
+              <w:top w:val="none" w:color="FFFFFF" w:sz="0"/>
+              <w:left w:val="none" w:color="FFFFFF" w:sz="0"/>
+              <w:bottom w:val="none" w:color="FFFFFF" w:sz="0"/>
+              <w:right w:val="none" w:color="FFFFFF" w:sz="0"/>
+            </w:tcBorders>
+            <w:tcMar>
+              <w:top w:type="dxa" w:w="50"/>
+              <w:left w:type="dxa" w:w="90"/>
+              <w:bottom w:type="dxa" w:w="50"/>
+              <w:right w:type="dxa" w:w="90"/>
+            </w:tcMar>
+          </w:tcPr>
+          <w:p>
+            <w:r>
+              <w:rPr>
+                <w:rFonts w:ascii="Times New Roman" w:cs="Times New Roman" w:eastAsia="Times New Roman" w:hAnsi="Times New Roman"/>
+                <w:sz w:val="18"/>
+                <w:szCs w:val="18"/>
+              </w:rPr>
+              <w:t xml:space="preserve">0.270</w:t>
+            </w:r>
+          </w:p>
+        </w:tc>
+        <w:tc>
+          <w:tcPr>
+            <w:tcW w:type="dxa" w:w="1100"/>
+            <w:tcBorders>
+              <w:top w:val="none" w:color="FFFFFF" w:sz="0"/>
+              <w:left w:val="none" w:color="FFFFFF" w:sz="0"/>
+              <w:bottom w:val="none" w:color="FFFFFF" w:sz="0"/>
+              <w:right w:val="none" w:color="FFFFFF" w:sz="0"/>
+            </w:tcBorders>
+            <w:tcMar>
+              <w:top w:type="dxa" w:w="50"/>
+              <w:left w:type="dxa" w:w="90"/>
+              <w:bottom w:type="dxa" w:w="50"/>
+              <w:right w:type="dxa" w:w="90"/>
+            </w:tcMar>
+          </w:tcPr>
+          <w:p>
+            <w:r>
+              <w:rPr>
+                <w:rFonts w:ascii="Times New Roman" w:cs="Times New Roman" w:eastAsia="Times New Roman" w:hAnsi="Times New Roman"/>
+                <w:sz w:val="18"/>
+                <w:szCs w:val="18"/>
+              </w:rPr>
+              <w:t xml:space="preserve">0.243</w:t>
+            </w:r>
+          </w:p>
+        </w:tc>
+        <w:tc>
+          <w:tcPr>
+            <w:tcW w:type="dxa" w:w="1000"/>
+            <w:tcBorders>
+              <w:top w:val="none" w:color="FFFFFF" w:sz="0"/>
+              <w:left w:val="none" w:color="FFFFFF" w:sz="0"/>
+              <w:bottom w:val="none" w:color="FFFFFF" w:sz="0"/>
+              <w:right w:val="none" w:color="FFFFFF" w:sz="0"/>
+            </w:tcBorders>
+            <w:tcMar>
+              <w:top w:type="dxa" w:w="50"/>
+              <w:left w:type="dxa" w:w="90"/>
+              <w:bottom w:type="dxa" w:w="50"/>
+              <w:right w:type="dxa" w:w="90"/>
+            </w:tcMar>
+          </w:tcPr>
+          <w:p>
+            <w:r>
+              <w:rPr>
+                <w:rFonts w:ascii="Times New Roman" w:cs="Times New Roman" w:eastAsia="Times New Roman" w:hAnsi="Times New Roman"/>
+                <w:sz w:val="18"/>
+                <w:szCs w:val="18"/>
+              </w:rPr>
+              <w:t xml:space="preserve">0.145</w:t>
+            </w:r>
+          </w:p>
+        </w:tc>
+        <w:tc>
+          <w:tcPr>
+            <w:tcW w:type="dxa" w:w="1000"/>
+            <w:tcBorders>
+              <w:top w:val="none" w:color="FFFFFF" w:sz="0"/>
+              <w:left w:val="none" w:color="FFFFFF" w:sz="0"/>
+              <w:bottom w:val="none" w:color="FFFFFF" w:sz="0"/>
+              <w:right w:val="none" w:color="FFFFFF" w:sz="0"/>
+            </w:tcBorders>
+            <w:tcMar>
+              <w:top w:type="dxa" w:w="50"/>
+              <w:left w:type="dxa" w:w="90"/>
+              <w:bottom w:type="dxa" w:w="50"/>
+              <w:right w:type="dxa" w:w="90"/>
+            </w:tcMar>
+          </w:tcPr>
+          <w:p>
+            <w:r>
+              <w:rPr>
+                <w:rFonts w:ascii="Times New Roman" w:cs="Times New Roman" w:eastAsia="Times New Roman" w:hAnsi="Times New Roman"/>
+                <w:sz w:val="18"/>
+                <w:szCs w:val="18"/>
+              </w:rPr>
+              <w:t xml:space="preserve">0.287</w:t>
+            </w:r>
+          </w:p>
+        </w:tc>
+      </w:tr>
+      <w:tr>
+        <w:tc>
+          <w:tcPr>
+            <w:tcW w:type="dxa" w:w="800"/>
+            <w:tcBorders>
+              <w:top w:val="none" w:color="FFFFFF" w:sz="0"/>
+              <w:left w:val="none" w:color="FFFFFF" w:sz="0"/>
+              <w:bottom w:val="none" w:color="FFFFFF" w:sz="0"/>
+              <w:right w:val="none" w:color="FFFFFF" w:sz="0"/>
+            </w:tcBorders>
+            <w:tcMar>
+              <w:top w:type="dxa" w:w="50"/>
+              <w:left w:type="dxa" w:w="90"/>
+              <w:bottom w:type="dxa" w:w="50"/>
+              <w:right w:type="dxa" w:w="90"/>
+            </w:tcMar>
+          </w:tcPr>
+          <w:p>
+            <w:r>
+              <w:rPr>
+                <w:rFonts w:ascii="Times New Roman" w:cs="Times New Roman" w:eastAsia="Times New Roman" w:hAnsi="Times New Roman"/>
+                <w:sz w:val="18"/>
+                <w:szCs w:val="18"/>
+              </w:rPr>
+              <w:t xml:space="preserve">B1</w:t>
+            </w:r>
+          </w:p>
+        </w:tc>
+        <w:tc>
+          <w:tcPr>
+            <w:tcW w:type="dxa" w:w="1100"/>
+            <w:tcBorders>
+              <w:top w:val="none" w:color="FFFFFF" w:sz="0"/>
+              <w:left w:val="none" w:color="FFFFFF" w:sz="0"/>
+              <w:bottom w:val="none" w:color="FFFFFF" w:sz="0"/>
+              <w:right w:val="none" w:color="FFFFFF" w:sz="0"/>
+            </w:tcBorders>
+            <w:tcMar>
+              <w:top w:type="dxa" w:w="50"/>
+              <w:left w:type="dxa" w:w="90"/>
+              <w:bottom w:type="dxa" w:w="50"/>
+              <w:right w:type="dxa" w:w="90"/>
+            </w:tcMar>
+          </w:tcPr>
+          <w:p>
+            <w:r>
+              <w:rPr>
+                <w:rFonts w:ascii="Times New Roman" w:cs="Times New Roman" w:eastAsia="Times New Roman" w:hAnsi="Times New Roman"/>
+                <w:sz w:val="18"/>
+                <w:szCs w:val="18"/>
+              </w:rPr>
+              <w:t xml:space="preserve">2</w:t>
+            </w:r>
+          </w:p>
+        </w:tc>
+        <w:tc>
+          <w:tcPr>
+            <w:tcW w:type="dxa" w:w="1000"/>
+            <w:tcBorders>
+              <w:top w:val="none" w:color="FFFFFF" w:sz="0"/>
+              <w:left w:val="none" w:color="FFFFFF" w:sz="0"/>
+              <w:bottom w:val="none" w:color="FFFFFF" w:sz="0"/>
+              <w:right w:val="none" w:color="FFFFFF" w:sz="0"/>
+            </w:tcBorders>
+            <w:tcMar>
+              <w:top w:type="dxa" w:w="50"/>
+              <w:left w:type="dxa" w:w="90"/>
+              <w:bottom w:type="dxa" w:w="50"/>
+              <w:right w:type="dxa" w:w="90"/>
+            </w:tcMar>
+          </w:tcPr>
+          <w:p>
+            <w:r>
+              <w:rPr>
+                <w:rFonts w:ascii="Times New Roman" w:cs="Times New Roman" w:eastAsia="Times New Roman" w:hAnsi="Times New Roman"/>
+                <w:sz w:val="18"/>
+                <w:szCs w:val="18"/>
+              </w:rPr>
+              <w:t xml:space="preserve">0.128</w:t>
+            </w:r>
+          </w:p>
+        </w:tc>
+        <w:tc>
+          <w:tcPr>
+            <w:tcW w:type="dxa" w:w="1100"/>
+            <w:tcBorders>
+              <w:top w:val="none" w:color="FFFFFF" w:sz="0"/>
+              <w:left w:val="none" w:color="FFFFFF" w:sz="0"/>
+              <w:bottom w:val="none" w:color="FFFFFF" w:sz="0"/>
+              <w:right w:val="none" w:color="FFFFFF" w:sz="0"/>
+            </w:tcBorders>
+            <w:tcMar>
+              <w:top w:type="dxa" w:w="50"/>
+              <w:left w:type="dxa" w:w="90"/>
+              <w:bottom w:type="dxa" w:w="50"/>
+              <w:right w:type="dxa" w:w="90"/>
+            </w:tcMar>
+          </w:tcPr>
+          <w:p>
+            <w:r>
+              <w:rPr>
+                <w:rFonts w:ascii="Times New Roman" w:cs="Times New Roman" w:eastAsia="Times New Roman" w:hAnsi="Times New Roman"/>
+                <w:sz w:val="18"/>
+                <w:szCs w:val="18"/>
+              </w:rPr>
+              <w:t xml:space="preserve">0.131</w:t>
+            </w:r>
+          </w:p>
+        </w:tc>
+        <w:tc>
+          <w:tcPr>
+            <w:tcW w:type="dxa" w:w="1000"/>
+            <w:tcBorders>
+              <w:top w:val="none" w:color="FFFFFF" w:sz="0"/>
+              <w:left w:val="none" w:color="FFFFFF" w:sz="0"/>
+              <w:bottom w:val="none" w:color="FFFFFF" w:sz="0"/>
+              <w:right w:val="none" w:color="FFFFFF" w:sz="0"/>
+            </w:tcBorders>
+            <w:tcMar>
+              <w:top w:type="dxa" w:w="50"/>
+              <w:left w:type="dxa" w:w="90"/>
+              <w:bottom w:type="dxa" w:w="50"/>
+              <w:right w:type="dxa" w:w="90"/>
+            </w:tcMar>
+          </w:tcPr>
+          <w:p>
+            <w:r>
+              <w:rPr>
+                <w:rFonts w:ascii="Times New Roman" w:cs="Times New Roman" w:eastAsia="Times New Roman" w:hAnsi="Times New Roman"/>
+                <w:sz w:val="18"/>
+                <w:szCs w:val="18"/>
+              </w:rPr>
+              <w:t xml:space="preserve">0.326</w:t>
+            </w:r>
+          </w:p>
+        </w:tc>
+        <w:tc>
+          <w:tcPr>
+            <w:tcW w:type="dxa" w:w="1100"/>
+            <w:tcBorders>
+              <w:top w:val="none" w:color="FFFFFF" w:sz="0"/>
+              <w:left w:val="none" w:color="FFFFFF" w:sz="0"/>
+              <w:bottom w:val="none" w:color="FFFFFF" w:sz="0"/>
+              <w:right w:val="none" w:color="FFFFFF" w:sz="0"/>
+            </w:tcBorders>
+            <w:tcMar>
+              <w:top w:type="dxa" w:w="50"/>
+              <w:left w:type="dxa" w:w="90"/>
+              <w:bottom w:type="dxa" w:w="50"/>
+              <w:right w:type="dxa" w:w="90"/>
+            </w:tcMar>
+          </w:tcPr>
+          <w:p>
+            <w:r>
+              <w:rPr>
+                <w:rFonts w:ascii="Times New Roman" w:cs="Times New Roman" w:eastAsia="Times New Roman" w:hAnsi="Times New Roman"/>
+                <w:sz w:val="18"/>
+                <w:szCs w:val="18"/>
+              </w:rPr>
+              <w:t xml:space="preserve">0.309</w:t>
+            </w:r>
+          </w:p>
+        </w:tc>
+        <w:tc>
+          <w:tcPr>
+            <w:tcW w:type="dxa" w:w="1000"/>
+            <w:tcBorders>
+              <w:top w:val="none" w:color="FFFFFF" w:sz="0"/>
+              <w:left w:val="none" w:color="FFFFFF" w:sz="0"/>
+              <w:bottom w:val="none" w:color="FFFFFF" w:sz="0"/>
+              <w:right w:val="none" w:color="FFFFFF" w:sz="0"/>
+            </w:tcBorders>
+            <w:tcMar>
+              <w:top w:type="dxa" w:w="50"/>
+              <w:left w:type="dxa" w:w="90"/>
+              <w:bottom w:type="dxa" w:w="50"/>
+              <w:right w:type="dxa" w:w="90"/>
+            </w:tcMar>
+          </w:tcPr>
+          <w:p>
+            <w:r>
+              <w:rPr>
+                <w:rFonts w:ascii="Times New Roman" w:cs="Times New Roman" w:eastAsia="Times New Roman" w:hAnsi="Times New Roman"/>
+                <w:sz w:val="18"/>
+                <w:szCs w:val="18"/>
+              </w:rPr>
+              <w:t xml:space="preserve">0.203</w:t>
+            </w:r>
+          </w:p>
+        </w:tc>
+        <w:tc>
+          <w:tcPr>
+            <w:tcW w:type="dxa" w:w="1000"/>
+            <w:tcBorders>
+              <w:top w:val="none" w:color="FFFFFF" w:sz="0"/>
+              <w:left w:val="none" w:color="FFFFFF" w:sz="0"/>
+              <w:bottom w:val="none" w:color="FFFFFF" w:sz="0"/>
+              <w:right w:val="none" w:color="FFFFFF" w:sz="0"/>
+            </w:tcBorders>
+            <w:tcMar>
+              <w:top w:type="dxa" w:w="50"/>
+              <w:left w:type="dxa" w:w="90"/>
+              <w:bottom w:type="dxa" w:w="50"/>
+              <w:right w:type="dxa" w:w="90"/>
+            </w:tcMar>
+          </w:tcPr>
+          <w:p>
+            <w:r>
+              <w:rPr>
+                <w:rFonts w:ascii="Times New Roman" w:cs="Times New Roman" w:eastAsia="Times New Roman" w:hAnsi="Times New Roman"/>
+                <w:sz w:val="18"/>
+                <w:szCs w:val="18"/>
+              </w:rPr>
+              <w:t xml:space="preserve">0.345</w:t>
+            </w:r>
+          </w:p>
+        </w:tc>
+      </w:tr>
+      <w:tr>
+        <w:tc>
+          <w:tcPr>
+            <w:tcW w:type="dxa" w:w="800"/>
+            <w:tcBorders>
+              <w:top w:val="none" w:color="FFFFFF" w:sz="0"/>
+              <w:left w:val="none" w:color="FFFFFF" w:sz="0"/>
+              <w:bottom w:val="none" w:color="FFFFFF" w:sz="0"/>
+              <w:right w:val="none" w:color="FFFFFF" w:sz="0"/>
+            </w:tcBorders>
+            <w:tcMar>
+              <w:top w:type="dxa" w:w="50"/>
+              <w:left w:type="dxa" w:w="90"/>
+              <w:bottom w:type="dxa" w:w="50"/>
+              <w:right w:type="dxa" w:w="90"/>
+            </w:tcMar>
+          </w:tcPr>
+          <w:p>
+            <w:r>
+              <w:rPr>
+                <w:rFonts w:ascii="Times New Roman" w:cs="Times New Roman" w:eastAsia="Times New Roman" w:hAnsi="Times New Roman"/>
+                <w:sz w:val="18"/>
+                <w:szCs w:val="18"/>
+              </w:rPr>
+              <w:t xml:space="preserve">B1</w:t>
+            </w:r>
+          </w:p>
+        </w:tc>
+        <w:tc>
+          <w:tcPr>
+            <w:tcW w:type="dxa" w:w="1100"/>
+            <w:tcBorders>
+              <w:top w:val="none" w:color="FFFFFF" w:sz="0"/>
+              <w:left w:val="none" w:color="FFFFFF" w:sz="0"/>
+              <w:bottom w:val="none" w:color="FFFFFF" w:sz="0"/>
+              <w:right w:val="none" w:color="FFFFFF" w:sz="0"/>
+            </w:tcBorders>
+            <w:tcMar>
+              <w:top w:type="dxa" w:w="50"/>
+              <w:left w:type="dxa" w:w="90"/>
+              <w:bottom w:type="dxa" w:w="50"/>
+              <w:right w:type="dxa" w:w="90"/>
+            </w:tcMar>
+          </w:tcPr>
+          <w:p>
+            <w:r>
+              <w:rPr>
+                <w:rFonts w:ascii="Times New Roman" w:cs="Times New Roman" w:eastAsia="Times New Roman" w:hAnsi="Times New Roman"/>
+                <w:sz w:val="18"/>
+                <w:szCs w:val="18"/>
+              </w:rPr>
+              <w:t xml:space="preserve">3</w:t>
+            </w:r>
+          </w:p>
+        </w:tc>
+        <w:tc>
+          <w:tcPr>
+            <w:tcW w:type="dxa" w:w="1000"/>
+            <w:tcBorders>
+              <w:top w:val="none" w:color="FFFFFF" w:sz="0"/>
+              <w:left w:val="none" w:color="FFFFFF" w:sz="0"/>
+              <w:bottom w:val="none" w:color="FFFFFF" w:sz="0"/>
+              <w:right w:val="none" w:color="FFFFFF" w:sz="0"/>
+            </w:tcBorders>
+            <w:tcMar>
+              <w:top w:type="dxa" w:w="50"/>
+              <w:left w:type="dxa" w:w="90"/>
+              <w:bottom w:type="dxa" w:w="50"/>
+              <w:right w:type="dxa" w:w="90"/>
+            </w:tcMar>
+          </w:tcPr>
+          <w:p>
+            <w:r>
+              <w:rPr>
+                <w:rFonts w:ascii="Times New Roman" w:cs="Times New Roman" w:eastAsia="Times New Roman" w:hAnsi="Times New Roman"/>
+                <w:sz w:val="18"/>
+                <w:szCs w:val="18"/>
+              </w:rPr>
+              <w:t xml:space="preserve">0.144</w:t>
+            </w:r>
+          </w:p>
+        </w:tc>
+        <w:tc>
+          <w:tcPr>
+            <w:tcW w:type="dxa" w:w="1100"/>
+            <w:tcBorders>
+              <w:top w:val="none" w:color="FFFFFF" w:sz="0"/>
+              <w:left w:val="none" w:color="FFFFFF" w:sz="0"/>
+              <w:bottom w:val="none" w:color="FFFFFF" w:sz="0"/>
+              <w:right w:val="none" w:color="FFFFFF" w:sz="0"/>
+            </w:tcBorders>
+            <w:tcMar>
+              <w:top w:type="dxa" w:w="50"/>
+              <w:left w:type="dxa" w:w="90"/>
+              <w:bottom w:type="dxa" w:w="50"/>
+              <w:right w:type="dxa" w:w="90"/>
+            </w:tcMar>
+          </w:tcPr>
+          <w:p>
+            <w:r>
+              <w:rPr>
+                <w:rFonts w:ascii="Times New Roman" w:cs="Times New Roman" w:eastAsia="Times New Roman" w:hAnsi="Times New Roman"/>
+                <w:sz w:val="18"/>
+                <w:szCs w:val="18"/>
+              </w:rPr>
+              <w:t xml:space="preserve">0.172</w:t>
+            </w:r>
+          </w:p>
+        </w:tc>
+        <w:tc>
+          <w:tcPr>
+            <w:tcW w:type="dxa" w:w="1000"/>
+            <w:tcBorders>
+              <w:top w:val="none" w:color="FFFFFF" w:sz="0"/>
+              <w:left w:val="none" w:color="FFFFFF" w:sz="0"/>
+              <w:bottom w:val="none" w:color="FFFFFF" w:sz="0"/>
+              <w:right w:val="none" w:color="FFFFFF" w:sz="0"/>
+            </w:tcBorders>
+            <w:tcMar>
+              <w:top w:type="dxa" w:w="50"/>
+              <w:left w:type="dxa" w:w="90"/>
+              <w:bottom w:type="dxa" w:w="50"/>
+              <w:right w:type="dxa" w:w="90"/>
+            </w:tcMar>
+          </w:tcPr>
+          <w:p>
+            <w:r>
+              <w:rPr>
+                <w:rFonts w:ascii="Times New Roman" w:cs="Times New Roman" w:eastAsia="Times New Roman" w:hAnsi="Times New Roman"/>
+                <w:sz w:val="18"/>
+                <w:szCs w:val="18"/>
+              </w:rPr>
+              <w:t xml:space="preserve">0.315</w:t>
+            </w:r>
+          </w:p>
+        </w:tc>
+        <w:tc>
+          <w:tcPr>
+            <w:tcW w:type="dxa" w:w="1100"/>
+            <w:tcBorders>
+              <w:top w:val="none" w:color="FFFFFF" w:sz="0"/>
+              <w:left w:val="none" w:color="FFFFFF" w:sz="0"/>
+              <w:bottom w:val="none" w:color="FFFFFF" w:sz="0"/>
+              <w:right w:val="none" w:color="FFFFFF" w:sz="0"/>
+            </w:tcBorders>
+            <w:tcMar>
+              <w:top w:type="dxa" w:w="50"/>
+              <w:left w:type="dxa" w:w="90"/>
+              <w:bottom w:type="dxa" w:w="50"/>
+              <w:right w:type="dxa" w:w="90"/>
+            </w:tcMar>
+          </w:tcPr>
+          <w:p>
+            <w:r>
+              <w:rPr>
+                <w:rFonts w:ascii="Times New Roman" w:cs="Times New Roman" w:eastAsia="Times New Roman" w:hAnsi="Times New Roman"/>
+                <w:sz w:val="18"/>
+                <w:szCs w:val="18"/>
+              </w:rPr>
+              <w:t xml:space="preserve">0.248</w:t>
+            </w:r>
+          </w:p>
+        </w:tc>
+        <w:tc>
+          <w:tcPr>
+            <w:tcW w:type="dxa" w:w="1000"/>
+            <w:tcBorders>
+              <w:top w:val="none" w:color="FFFFFF" w:sz="0"/>
+              <w:left w:val="none" w:color="FFFFFF" w:sz="0"/>
+              <w:bottom w:val="none" w:color="FFFFFF" w:sz="0"/>
+              <w:right w:val="none" w:color="FFFFFF" w:sz="0"/>
+            </w:tcBorders>
+            <w:tcMar>
+              <w:top w:type="dxa" w:w="50"/>
+              <w:left w:type="dxa" w:w="90"/>
+              <w:bottom w:type="dxa" w:w="50"/>
+              <w:right w:type="dxa" w:w="90"/>
+            </w:tcMar>
+          </w:tcPr>
+          <w:p>
+            <w:r>
+              <w:rPr>
+                <w:rFonts w:ascii="Times New Roman" w:cs="Times New Roman" w:eastAsia="Times New Roman" w:hAnsi="Times New Roman"/>
+                <w:sz w:val="18"/>
+                <w:szCs w:val="18"/>
+              </w:rPr>
+              <w:t xml:space="preserve">0.149</w:t>
+            </w:r>
+          </w:p>
+        </w:tc>
+        <w:tc>
+          <w:tcPr>
+            <w:tcW w:type="dxa" w:w="1000"/>
+            <w:tcBorders>
+              <w:top w:val="none" w:color="FFFFFF" w:sz="0"/>
+              <w:left w:val="none" w:color="FFFFFF" w:sz="0"/>
+              <w:bottom w:val="none" w:color="FFFFFF" w:sz="0"/>
+              <w:right w:val="none" w:color="FFFFFF" w:sz="0"/>
+            </w:tcBorders>
+            <w:tcMar>
+              <w:top w:type="dxa" w:w="50"/>
+              <w:left w:type="dxa" w:w="90"/>
+              <w:bottom w:type="dxa" w:w="50"/>
+              <w:right w:type="dxa" w:w="90"/>
+            </w:tcMar>
+          </w:tcPr>
+          <w:p>
+            <w:r>
+              <w:rPr>
+                <w:rFonts w:ascii="Times New Roman" w:cs="Times New Roman" w:eastAsia="Times New Roman" w:hAnsi="Times New Roman"/>
+                <w:sz w:val="18"/>
+                <w:szCs w:val="18"/>
+              </w:rPr>
+              <w:t xml:space="preserve">0.297</w:t>
+            </w:r>
+          </w:p>
+        </w:tc>
+      </w:tr>
+      <w:tr>
+        <w:tc>
+          <w:tcPr>
+            <w:tcW w:type="dxa" w:w="800"/>
+            <w:tcBorders>
+              <w:top w:val="none" w:color="FFFFFF" w:sz="0"/>
+              <w:left w:val="none" w:color="FFFFFF" w:sz="0"/>
+              <w:bottom w:val="none" w:color="FFFFFF" w:sz="0"/>
+              <w:right w:val="none" w:color="FFFFFF" w:sz="0"/>
+            </w:tcBorders>
+            <w:tcMar>
+              <w:top w:type="dxa" w:w="50"/>
+              <w:left w:type="dxa" w:w="90"/>
+              <w:bottom w:type="dxa" w:w="50"/>
+              <w:right w:type="dxa" w:w="90"/>
+            </w:tcMar>
+          </w:tcPr>
+          <w:p>
+            <w:r>
+              <w:rPr>
+                <w:rFonts w:ascii="Times New Roman" w:cs="Times New Roman" w:eastAsia="Times New Roman" w:hAnsi="Times New Roman"/>
+                <w:sz w:val="18"/>
+                <w:szCs w:val="18"/>
+              </w:rPr>
+              <w:t xml:space="preserve">B0</w:t>
+            </w:r>
+          </w:p>
+        </w:tc>
+        <w:tc>
+          <w:tcPr>
+            <w:tcW w:type="dxa" w:w="1100"/>
+            <w:tcBorders>
+              <w:top w:val="none" w:color="FFFFFF" w:sz="0"/>
+              <w:left w:val="none" w:color="FFFFFF" w:sz="0"/>
+              <w:bottom w:val="none" w:color="FFFFFF" w:sz="0"/>
+              <w:right w:val="none" w:color="FFFFFF" w:sz="0"/>
+            </w:tcBorders>
+            <w:tcMar>
+              <w:top w:type="dxa" w:w="50"/>
+              <w:left w:type="dxa" w:w="90"/>
+              <w:bottom w:type="dxa" w:w="50"/>
+              <w:right w:type="dxa" w:w="90"/>
+            </w:tcMar>
+          </w:tcPr>
+          <w:p>
+            <w:r>
+              <w:rPr>
+                <w:rFonts w:ascii="Times New Roman" w:cs="Times New Roman" w:eastAsia="Times New Roman" w:hAnsi="Times New Roman"/>
+                <w:sz w:val="18"/>
+                <w:szCs w:val="18"/>
+              </w:rPr>
+              <w:t xml:space="preserve">0 (expl.)</w:t>
+            </w:r>
+          </w:p>
+        </w:tc>
+        <w:tc>
+          <w:tcPr>
+            <w:tcW w:type="dxa" w:w="1000"/>
+            <w:tcBorders>
+              <w:top w:val="none" w:color="FFFFFF" w:sz="0"/>
+              <w:left w:val="none" w:color="FFFFFF" w:sz="0"/>
+              <w:bottom w:val="none" w:color="FFFFFF" w:sz="0"/>
+              <w:right w:val="none" w:color="FFFFFF" w:sz="0"/>
+            </w:tcBorders>
+            <w:tcMar>
+              <w:top w:type="dxa" w:w="50"/>
+              <w:left w:type="dxa" w:w="90"/>
+              <w:bottom w:type="dxa" w:w="50"/>
+              <w:right w:type="dxa" w:w="90"/>
+            </w:tcMar>
+          </w:tcPr>
+          <w:p>
+            <w:r>
+              <w:rPr>
+                <w:rFonts w:ascii="Times New Roman" w:cs="Times New Roman" w:eastAsia="Times New Roman" w:hAnsi="Times New Roman"/>
+                <w:sz w:val="18"/>
+                <w:szCs w:val="18"/>
+              </w:rPr>
+              <w:t xml:space="preserve">n/a</w:t>
+            </w:r>
+          </w:p>
+        </w:tc>
+        <w:tc>
+          <w:tcPr>
+            <w:tcW w:type="dxa" w:w="1100"/>
+            <w:tcBorders>
+              <w:top w:val="none" w:color="FFFFFF" w:sz="0"/>
+              <w:left w:val="none" w:color="FFFFFF" w:sz="0"/>
+              <w:bottom w:val="none" w:color="FFFFFF" w:sz="0"/>
+              <w:right w:val="none" w:color="FFFFFF" w:sz="0"/>
+            </w:tcBorders>
+            <w:tcMar>
+              <w:top w:type="dxa" w:w="50"/>
+              <w:left w:type="dxa" w:w="90"/>
+              <w:bottom w:type="dxa" w:w="50"/>
+              <w:right w:type="dxa" w:w="90"/>
+            </w:tcMar>
+          </w:tcPr>
+          <w:p>
+            <w:r>
+              <w:rPr>
+                <w:rFonts w:ascii="Times New Roman" w:cs="Times New Roman" w:eastAsia="Times New Roman" w:hAnsi="Times New Roman"/>
+                <w:sz w:val="18"/>
+                <w:szCs w:val="18"/>
+              </w:rPr>
+              <w:t xml:space="preserve">—</w:t>
+            </w:r>
+          </w:p>
+        </w:tc>
+        <w:tc>
+          <w:tcPr>
+            <w:tcW w:type="dxa" w:w="1000"/>
+            <w:tcBorders>
+              <w:top w:val="none" w:color="FFFFFF" w:sz="0"/>
+              <w:left w:val="none" w:color="FFFFFF" w:sz="0"/>
+              <w:bottom w:val="none" w:color="FFFFFF" w:sz="0"/>
+              <w:right w:val="none" w:color="FFFFFF" w:sz="0"/>
+            </w:tcBorders>
+            <w:tcMar>
+              <w:top w:type="dxa" w:w="50"/>
+              <w:left w:type="dxa" w:w="90"/>
+              <w:bottom w:type="dxa" w:w="50"/>
+              <w:right w:type="dxa" w:w="90"/>
+            </w:tcMar>
+          </w:tcPr>
+          <w:p>
+            <w:r>
+              <w:rPr>
+                <w:rFonts w:ascii="Times New Roman" w:cs="Times New Roman" w:eastAsia="Times New Roman" w:hAnsi="Times New Roman"/>
+                <w:sz w:val="18"/>
+                <w:szCs w:val="18"/>
+              </w:rPr>
+              <w:t xml:space="preserve">0.320</w:t>
+            </w:r>
+          </w:p>
+        </w:tc>
+        <w:tc>
+          <w:tcPr>
+            <w:tcW w:type="dxa" w:w="1100"/>
+            <w:tcBorders>
+              <w:top w:val="none" w:color="FFFFFF" w:sz="0"/>
+              <w:left w:val="none" w:color="FFFFFF" w:sz="0"/>
+              <w:bottom w:val="none" w:color="FFFFFF" w:sz="0"/>
+              <w:right w:val="none" w:color="FFFFFF" w:sz="0"/>
+            </w:tcBorders>
+            <w:tcMar>
+              <w:top w:type="dxa" w:w="50"/>
+              <w:left w:type="dxa" w:w="90"/>
+              <w:bottom w:type="dxa" w:w="50"/>
+              <w:right w:type="dxa" w:w="90"/>
+            </w:tcMar>
+          </w:tcPr>
+          <w:p>
+            <w:r>
+              <w:rPr>
+                <w:rFonts w:ascii="Times New Roman" w:cs="Times New Roman" w:eastAsia="Times New Roman" w:hAnsi="Times New Roman"/>
+                <w:sz w:val="18"/>
+                <w:szCs w:val="18"/>
+              </w:rPr>
+              <w:t xml:space="preserve">0.310</w:t>
+            </w:r>
+          </w:p>
+        </w:tc>
+        <w:tc>
+          <w:tcPr>
+            <w:tcW w:type="dxa" w:w="1000"/>
+            <w:tcBorders>
+              <w:top w:val="none" w:color="FFFFFF" w:sz="0"/>
+              <w:left w:val="none" w:color="FFFFFF" w:sz="0"/>
+              <w:bottom w:val="none" w:color="FFFFFF" w:sz="0"/>
+              <w:right w:val="none" w:color="FFFFFF" w:sz="0"/>
+            </w:tcBorders>
+            <w:tcMar>
+              <w:top w:type="dxa" w:w="50"/>
+              <w:left w:type="dxa" w:w="90"/>
+              <w:bottom w:type="dxa" w:w="50"/>
+              <w:right w:type="dxa" w:w="90"/>
+            </w:tcMar>
+          </w:tcPr>
+          <w:p>
+            <w:r>
+              <w:rPr>
+                <w:rFonts w:ascii="Times New Roman" w:cs="Times New Roman" w:eastAsia="Times New Roman" w:hAnsi="Times New Roman"/>
+                <w:sz w:val="18"/>
+                <w:szCs w:val="18"/>
+              </w:rPr>
+              <w:t xml:space="preserve">0.187</w:t>
+            </w:r>
+          </w:p>
+        </w:tc>
+        <w:tc>
+          <w:tcPr>
+            <w:tcW w:type="dxa" w:w="1000"/>
+            <w:tcBorders>
+              <w:top w:val="none" w:color="FFFFFF" w:sz="0"/>
+              <w:left w:val="none" w:color="FFFFFF" w:sz="0"/>
+              <w:bottom w:val="none" w:color="FFFFFF" w:sz="0"/>
+              <w:right w:val="none" w:color="FFFFFF" w:sz="0"/>
+            </w:tcBorders>
+            <w:tcMar>
+              <w:top w:type="dxa" w:w="50"/>
+              <w:left w:type="dxa" w:w="90"/>
+              <w:bottom w:type="dxa" w:w="50"/>
+              <w:right w:type="dxa" w:w="90"/>
+            </w:tcMar>
+          </w:tcPr>
+          <w:p>
+            <w:r>
+              <w:rPr>
+                <w:rFonts w:ascii="Times New Roman" w:cs="Times New Roman" w:eastAsia="Times New Roman" w:hAnsi="Times New Roman"/>
+                <w:sz w:val="18"/>
+                <w:szCs w:val="18"/>
+              </w:rPr>
+              <w:t xml:space="preserve">0.338</w:t>
+            </w:r>
+          </w:p>
+        </w:tc>
+      </w:tr>
+      <w:tr>
+        <w:tc>
+          <w:tcPr>
+            <w:tcW w:type="dxa" w:w="800"/>
+            <w:tcBorders>
+              <w:top w:val="none" w:color="FFFFFF" w:sz="0"/>
+              <w:left w:val="none" w:color="FFFFFF" w:sz="0"/>
+              <w:bottom w:val="none" w:color="FFFFFF" w:sz="0"/>
+              <w:right w:val="none" w:color="FFFFFF" w:sz="0"/>
+            </w:tcBorders>
+            <w:tcMar>
+              <w:top w:type="dxa" w:w="50"/>
+              <w:left w:type="dxa" w:w="90"/>
+              <w:bottom w:type="dxa" w:w="50"/>
+              <w:right w:type="dxa" w:w="90"/>
+            </w:tcMar>
+          </w:tcPr>
+          <w:p>
+            <w:r>
+              <w:rPr>
+                <w:rFonts w:ascii="Times New Roman" w:cs="Times New Roman" w:eastAsia="Times New Roman" w:hAnsi="Times New Roman"/>
+                <w:sz w:val="18"/>
+                <w:szCs w:val="18"/>
+              </w:rPr>
+              <w:t xml:space="preserve">B0</w:t>
+            </w:r>
+          </w:p>
+        </w:tc>
+        <w:tc>
+          <w:tcPr>
+            <w:tcW w:type="dxa" w:w="1100"/>
+            <w:tcBorders>
+              <w:top w:val="none" w:color="FFFFFF" w:sz="0"/>
+              <w:left w:val="none" w:color="FFFFFF" w:sz="0"/>
+              <w:bottom w:val="none" w:color="FFFFFF" w:sz="0"/>
+              <w:right w:val="none" w:color="FFFFFF" w:sz="0"/>
+            </w:tcBorders>
+            <w:tcMar>
+              <w:top w:type="dxa" w:w="50"/>
+              <w:left w:type="dxa" w:w="90"/>
+              <w:bottom w:type="dxa" w:w="50"/>
+              <w:right w:type="dxa" w:w="90"/>
+            </w:tcMar>
+          </w:tcPr>
+          <w:p>
+            <w:r>
+              <w:rPr>
+                <w:rFonts w:ascii="Times New Roman" w:cs="Times New Roman" w:eastAsia="Times New Roman" w:hAnsi="Times New Roman"/>
+                <w:sz w:val="18"/>
+                <w:szCs w:val="18"/>
+              </w:rPr>
+              <w:t xml:space="preserve">1</w:t>
+            </w:r>
+          </w:p>
+        </w:tc>
+        <w:tc>
+          <w:tcPr>
+            <w:tcW w:type="dxa" w:w="1000"/>
+            <w:tcBorders>
+              <w:top w:val="none" w:color="FFFFFF" w:sz="0"/>
+              <w:left w:val="none" w:color="FFFFFF" w:sz="0"/>
+              <w:bottom w:val="none" w:color="FFFFFF" w:sz="0"/>
+              <w:right w:val="none" w:color="FFFFFF" w:sz="0"/>
+            </w:tcBorders>
+            <w:tcMar>
+              <w:top w:type="dxa" w:w="50"/>
+              <w:left w:type="dxa" w:w="90"/>
+              <w:bottom w:type="dxa" w:w="50"/>
+              <w:right w:type="dxa" w:w="90"/>
+            </w:tcMar>
+          </w:tcPr>
+          <w:p>
+            <w:r>
+              <w:rPr>
+                <w:rFonts w:ascii="Times New Roman" w:cs="Times New Roman" w:eastAsia="Times New Roman" w:hAnsi="Times New Roman"/>
+                <w:sz w:val="18"/>
+                <w:szCs w:val="18"/>
+              </w:rPr>
+              <w:t xml:space="preserve">n/a</w:t>
+            </w:r>
+          </w:p>
+        </w:tc>
+        <w:tc>
+          <w:tcPr>
+            <w:tcW w:type="dxa" w:w="1100"/>
+            <w:tcBorders>
+              <w:top w:val="none" w:color="FFFFFF" w:sz="0"/>
+              <w:left w:val="none" w:color="FFFFFF" w:sz="0"/>
+              <w:bottom w:val="none" w:color="FFFFFF" w:sz="0"/>
+              <w:right w:val="none" w:color="FFFFFF" w:sz="0"/>
+            </w:tcBorders>
+            <w:tcMar>
+              <w:top w:type="dxa" w:w="50"/>
+              <w:left w:type="dxa" w:w="90"/>
+              <w:bottom w:type="dxa" w:w="50"/>
+              <w:right w:type="dxa" w:w="90"/>
+            </w:tcMar>
+          </w:tcPr>
+          <w:p>
+            <w:r>
+              <w:rPr>
+                <w:rFonts w:ascii="Times New Roman" w:cs="Times New Roman" w:eastAsia="Times New Roman" w:hAnsi="Times New Roman"/>
+                <w:sz w:val="18"/>
+                <w:szCs w:val="18"/>
+              </w:rPr>
+              <w:t xml:space="preserve">—</w:t>
+            </w:r>
+          </w:p>
+        </w:tc>
+        <w:tc>
+          <w:tcPr>
+            <w:tcW w:type="dxa" w:w="1000"/>
+            <w:tcBorders>
+              <w:top w:val="none" w:color="FFFFFF" w:sz="0"/>
+              <w:left w:val="none" w:color="FFFFFF" w:sz="0"/>
+              <w:bottom w:val="none" w:color="FFFFFF" w:sz="0"/>
+              <w:right w:val="none" w:color="FFFFFF" w:sz="0"/>
+            </w:tcBorders>
+            <w:tcMar>
+              <w:top w:type="dxa" w:w="50"/>
+              <w:left w:type="dxa" w:w="90"/>
+              <w:bottom w:type="dxa" w:w="50"/>
+              <w:right w:type="dxa" w:w="90"/>
+            </w:tcMar>
+          </w:tcPr>
+          <w:p>
+            <w:r>
+              <w:rPr>
+                <w:rFonts w:ascii="Times New Roman" w:cs="Times New Roman" w:eastAsia="Times New Roman" w:hAnsi="Times New Roman"/>
+                <w:sz w:val="18"/>
+                <w:szCs w:val="18"/>
+              </w:rPr>
+              <w:t xml:space="preserve">0.287</w:t>
+            </w:r>
+          </w:p>
+        </w:tc>
+        <w:tc>
+          <w:tcPr>
+            <w:tcW w:type="dxa" w:w="1100"/>
+            <w:tcBorders>
+              <w:top w:val="none" w:color="FFFFFF" w:sz="0"/>
+              <w:left w:val="none" w:color="FFFFFF" w:sz="0"/>
+              <w:bottom w:val="none" w:color="FFFFFF" w:sz="0"/>
+              <w:right w:val="none" w:color="FFFFFF" w:sz="0"/>
+            </w:tcBorders>
+            <w:tcMar>
+              <w:top w:type="dxa" w:w="50"/>
+              <w:left w:type="dxa" w:w="90"/>
+              <w:bottom w:type="dxa" w:w="50"/>
+              <w:right w:type="dxa" w:w="90"/>
+            </w:tcMar>
+          </w:tcPr>
+          <w:p>
+            <w:r>
+              <w:rPr>
+                <w:rFonts w:ascii="Times New Roman" w:cs="Times New Roman" w:eastAsia="Times New Roman" w:hAnsi="Times New Roman"/>
+                <w:sz w:val="18"/>
+                <w:szCs w:val="18"/>
+              </w:rPr>
+              <w:t xml:space="preserve">0.267</w:t>
+            </w:r>
+          </w:p>
+        </w:tc>
+        <w:tc>
+          <w:tcPr>
+            <w:tcW w:type="dxa" w:w="1000"/>
+            <w:tcBorders>
+              <w:top w:val="none" w:color="FFFFFF" w:sz="0"/>
+              <w:left w:val="none" w:color="FFFFFF" w:sz="0"/>
+              <w:bottom w:val="none" w:color="FFFFFF" w:sz="0"/>
+              <w:right w:val="none" w:color="FFFFFF" w:sz="0"/>
+            </w:tcBorders>
+            <w:tcMar>
+              <w:top w:type="dxa" w:w="50"/>
+              <w:left w:type="dxa" w:w="90"/>
+              <w:bottom w:type="dxa" w:w="50"/>
+              <w:right w:type="dxa" w:w="90"/>
+            </w:tcMar>
+          </w:tcPr>
+          <w:p>
+            <w:r>
+              <w:rPr>
+                <w:rFonts w:ascii="Times New Roman" w:cs="Times New Roman" w:eastAsia="Times New Roman" w:hAnsi="Times New Roman"/>
+                <w:sz w:val="18"/>
+                <w:szCs w:val="18"/>
+              </w:rPr>
+              <w:t xml:space="preserve">0.164</w:t>
+            </w:r>
+          </w:p>
+        </w:tc>
+        <w:tc>
+          <w:tcPr>
+            <w:tcW w:type="dxa" w:w="1000"/>
+            <w:tcBorders>
+              <w:top w:val="none" w:color="FFFFFF" w:sz="0"/>
+              <w:left w:val="none" w:color="FFFFFF" w:sz="0"/>
+              <w:bottom w:val="none" w:color="FFFFFF" w:sz="0"/>
+              <w:right w:val="none" w:color="FFFFFF" w:sz="0"/>
+            </w:tcBorders>
+            <w:tcMar>
+              <w:top w:type="dxa" w:w="50"/>
+              <w:left w:type="dxa" w:w="90"/>
+              <w:bottom w:type="dxa" w:w="50"/>
+              <w:right w:type="dxa" w:w="90"/>
+            </w:tcMar>
+          </w:tcPr>
+          <w:p>
+            <w:r>
+              <w:rPr>
+                <w:rFonts w:ascii="Times New Roman" w:cs="Times New Roman" w:eastAsia="Times New Roman" w:hAnsi="Times New Roman"/>
+                <w:sz w:val="18"/>
+                <w:szCs w:val="18"/>
+              </w:rPr>
+              <w:t xml:space="preserve">0.309</w:t>
+            </w:r>
+          </w:p>
+        </w:tc>
+      </w:tr>
+      <w:tr>
+        <w:tc>
+          <w:tcPr>
+            <w:tcW w:type="dxa" w:w="800"/>
+            <w:tcBorders>
+              <w:top w:val="none" w:color="FFFFFF" w:sz="0"/>
+              <w:left w:val="none" w:color="FFFFFF" w:sz="0"/>
+              <w:bottom w:val="none" w:color="FFFFFF" w:sz="0"/>
+              <w:right w:val="none" w:color="FFFFFF" w:sz="0"/>
+            </w:tcBorders>
+            <w:tcMar>
+              <w:top w:type="dxa" w:w="50"/>
+              <w:left w:type="dxa" w:w="90"/>
+              <w:bottom w:type="dxa" w:w="50"/>
+              <w:right w:type="dxa" w:w="90"/>
+            </w:tcMar>
+          </w:tcPr>
+          <w:p>
+            <w:r>
+              <w:rPr>
+                <w:rFonts w:ascii="Times New Roman" w:cs="Times New Roman" w:eastAsia="Times New Roman" w:hAnsi="Times New Roman"/>
+                <w:sz w:val="18"/>
+                <w:szCs w:val="18"/>
+              </w:rPr>
+              <w:t xml:space="preserve">B0</w:t>
+            </w:r>
+          </w:p>
+        </w:tc>
+        <w:tc>
+          <w:tcPr>
+            <w:tcW w:type="dxa" w:w="1100"/>
+            <w:tcBorders>
+              <w:top w:val="none" w:color="FFFFFF" w:sz="0"/>
+              <w:left w:val="none" w:color="FFFFFF" w:sz="0"/>
+              <w:bottom w:val="none" w:color="FFFFFF" w:sz="0"/>
+              <w:right w:val="none" w:color="FFFFFF" w:sz="0"/>
+            </w:tcBorders>
+            <w:tcMar>
+              <w:top w:type="dxa" w:w="50"/>
+              <w:left w:type="dxa" w:w="90"/>
+              <w:bottom w:type="dxa" w:w="50"/>
+              <w:right w:type="dxa" w:w="90"/>
+            </w:tcMar>
+          </w:tcPr>
+          <w:p>
+            <w:r>
+              <w:rPr>
+                <w:rFonts w:ascii="Times New Roman" w:cs="Times New Roman" w:eastAsia="Times New Roman" w:hAnsi="Times New Roman"/>
+                <w:sz w:val="18"/>
+                <w:szCs w:val="18"/>
+              </w:rPr>
+              <w:t xml:space="preserve">2</w:t>
+            </w:r>
+          </w:p>
+        </w:tc>
+        <w:tc>
+          <w:tcPr>
+            <w:tcW w:type="dxa" w:w="1000"/>
+            <w:tcBorders>
+              <w:top w:val="none" w:color="FFFFFF" w:sz="0"/>
+              <w:left w:val="none" w:color="FFFFFF" w:sz="0"/>
+              <w:bottom w:val="none" w:color="FFFFFF" w:sz="0"/>
+              <w:right w:val="none" w:color="FFFFFF" w:sz="0"/>
+            </w:tcBorders>
+            <w:tcMar>
+              <w:top w:type="dxa" w:w="50"/>
+              <w:left w:type="dxa" w:w="90"/>
+              <w:bottom w:type="dxa" w:w="50"/>
+              <w:right w:type="dxa" w:w="90"/>
+            </w:tcMar>
+          </w:tcPr>
+          <w:p>
+            <w:r>
+              <w:rPr>
+                <w:rFonts w:ascii="Times New Roman" w:cs="Times New Roman" w:eastAsia="Times New Roman" w:hAnsi="Times New Roman"/>
+                <w:sz w:val="18"/>
+                <w:szCs w:val="18"/>
+              </w:rPr>
+              <w:t xml:space="preserve">n/a</w:t>
+            </w:r>
+          </w:p>
+        </w:tc>
+        <w:tc>
+          <w:tcPr>
+            <w:tcW w:type="dxa" w:w="1100"/>
+            <w:tcBorders>
+              <w:top w:val="none" w:color="FFFFFF" w:sz="0"/>
+              <w:left w:val="none" w:color="FFFFFF" w:sz="0"/>
+              <w:bottom w:val="none" w:color="FFFFFF" w:sz="0"/>
+              <w:right w:val="none" w:color="FFFFFF" w:sz="0"/>
+            </w:tcBorders>
+            <w:tcMar>
+              <w:top w:type="dxa" w:w="50"/>
+              <w:left w:type="dxa" w:w="90"/>
+              <w:bottom w:type="dxa" w:w="50"/>
+              <w:right w:type="dxa" w:w="90"/>
+            </w:tcMar>
+          </w:tcPr>
+          <w:p>
+            <w:r>
+              <w:rPr>
+                <w:rFonts w:ascii="Times New Roman" w:cs="Times New Roman" w:eastAsia="Times New Roman" w:hAnsi="Times New Roman"/>
+                <w:sz w:val="18"/>
+                <w:szCs w:val="18"/>
+              </w:rPr>
+              <w:t xml:space="preserve">—</w:t>
+            </w:r>
+          </w:p>
+        </w:tc>
+        <w:tc>
+          <w:tcPr>
+            <w:tcW w:type="dxa" w:w="1000"/>
+            <w:tcBorders>
+              <w:top w:val="none" w:color="FFFFFF" w:sz="0"/>
+              <w:left w:val="none" w:color="FFFFFF" w:sz="0"/>
+              <w:bottom w:val="none" w:color="FFFFFF" w:sz="0"/>
+              <w:right w:val="none" w:color="FFFFFF" w:sz="0"/>
+            </w:tcBorders>
+            <w:tcMar>
+              <w:top w:type="dxa" w:w="50"/>
+              <w:left w:type="dxa" w:w="90"/>
+              <w:bottom w:type="dxa" w:w="50"/>
+              <w:right w:type="dxa" w:w="90"/>
+            </w:tcMar>
+          </w:tcPr>
+          <w:p>
+            <w:r>
+              <w:rPr>
+                <w:rFonts w:ascii="Times New Roman" w:cs="Times New Roman" w:eastAsia="Times New Roman" w:hAnsi="Times New Roman"/>
+                <w:sz w:val="18"/>
+                <w:szCs w:val="18"/>
+              </w:rPr>
+              <w:t xml:space="preserve">0.325</w:t>
+            </w:r>
+          </w:p>
+        </w:tc>
+        <w:tc>
+          <w:tcPr>
+            <w:tcW w:type="dxa" w:w="1100"/>
+            <w:tcBorders>
+              <w:top w:val="none" w:color="FFFFFF" w:sz="0"/>
+              <w:left w:val="none" w:color="FFFFFF" w:sz="0"/>
+              <w:bottom w:val="none" w:color="FFFFFF" w:sz="0"/>
+              <w:right w:val="none" w:color="FFFFFF" w:sz="0"/>
+            </w:tcBorders>
+            <w:tcMar>
+              <w:top w:type="dxa" w:w="50"/>
+              <w:left w:type="dxa" w:w="90"/>
+              <w:bottom w:type="dxa" w:w="50"/>
+              <w:right w:type="dxa" w:w="90"/>
+            </w:tcMar>
+          </w:tcPr>
+          <w:p>
+            <w:r>
+              <w:rPr>
+                <w:rFonts w:ascii="Times New Roman" w:cs="Times New Roman" w:eastAsia="Times New Roman" w:hAnsi="Times New Roman"/>
+                <w:sz w:val="18"/>
+                <w:szCs w:val="18"/>
+              </w:rPr>
+              <w:t xml:space="preserve">0.295</w:t>
+            </w:r>
+          </w:p>
+        </w:tc>
+        <w:tc>
+          <w:tcPr>
+            <w:tcW w:type="dxa" w:w="1000"/>
+            <w:tcBorders>
+              <w:top w:val="none" w:color="FFFFFF" w:sz="0"/>
+              <w:left w:val="none" w:color="FFFFFF" w:sz="0"/>
+              <w:bottom w:val="none" w:color="FFFFFF" w:sz="0"/>
+              <w:right w:val="none" w:color="FFFFFF" w:sz="0"/>
+            </w:tcBorders>
+            <w:tcMar>
+              <w:top w:type="dxa" w:w="50"/>
+              <w:left w:type="dxa" w:w="90"/>
+              <w:bottom w:type="dxa" w:w="50"/>
+              <w:right w:type="dxa" w:w="90"/>
+            </w:tcMar>
+          </w:tcPr>
+          <w:p>
+            <w:r>
+              <w:rPr>
+                <w:rFonts w:ascii="Times New Roman" w:cs="Times New Roman" w:eastAsia="Times New Roman" w:hAnsi="Times New Roman"/>
+                <w:sz w:val="18"/>
+                <w:szCs w:val="18"/>
+              </w:rPr>
+              <w:t xml:space="preserve">0.168</w:t>
+            </w:r>
+          </w:p>
+        </w:tc>
+        <w:tc>
+          <w:tcPr>
+            <w:tcW w:type="dxa" w:w="1000"/>
+            <w:tcBorders>
+              <w:top w:val="none" w:color="FFFFFF" w:sz="0"/>
+              <w:left w:val="none" w:color="FFFFFF" w:sz="0"/>
+              <w:bottom w:val="none" w:color="FFFFFF" w:sz="0"/>
+              <w:right w:val="none" w:color="FFFFFF" w:sz="0"/>
+            </w:tcBorders>
+            <w:tcMar>
+              <w:top w:type="dxa" w:w="50"/>
+              <w:left w:type="dxa" w:w="90"/>
+              <w:bottom w:type="dxa" w:w="50"/>
+              <w:right w:type="dxa" w:w="90"/>
+            </w:tcMar>
+          </w:tcPr>
+          <w:p>
+            <w:r>
+              <w:rPr>
+                <w:rFonts w:ascii="Times New Roman" w:cs="Times New Roman" w:eastAsia="Times New Roman" w:hAnsi="Times New Roman"/>
+                <w:sz w:val="18"/>
+                <w:szCs w:val="18"/>
+              </w:rPr>
+              <w:t xml:space="preserve">0.326</w:t>
+            </w:r>
+          </w:p>
+        </w:tc>
+      </w:tr>
+      <w:tr>
+        <w:tc>
+          <w:tcPr>
+            <w:tcW w:type="dxa" w:w="800"/>
+            <w:tcBorders>
+              <w:top w:val="none" w:color="FFFFFF" w:sz="0"/>
+              <w:left w:val="none" w:color="FFFFFF" w:sz="0"/>
+              <w:bottom w:val="none" w:color="FFFFFF" w:sz="0"/>
+              <w:right w:val="none" w:color="FFFFFF" w:sz="0"/>
+            </w:tcBorders>
+            <w:tcMar>
+              <w:top w:type="dxa" w:w="50"/>
+              <w:left w:type="dxa" w:w="90"/>
+              <w:bottom w:type="dxa" w:w="50"/>
+              <w:right w:type="dxa" w:w="90"/>
+            </w:tcMar>
+          </w:tcPr>
+          <w:p>
+            <w:r>
+              <w:rPr>
+                <w:rFonts w:ascii="Times New Roman" w:cs="Times New Roman" w:eastAsia="Times New Roman" w:hAnsi="Times New Roman"/>
+                <w:sz w:val="18"/>
+                <w:szCs w:val="18"/>
+              </w:rPr>
+              <w:t xml:space="preserve">B0</w:t>
+            </w:r>
+          </w:p>
+        </w:tc>
+        <w:tc>
+          <w:tcPr>
+            <w:tcW w:type="dxa" w:w="1100"/>
+            <w:tcBorders>
+              <w:top w:val="none" w:color="FFFFFF" w:sz="0"/>
+              <w:left w:val="none" w:color="FFFFFF" w:sz="0"/>
+              <w:bottom w:val="none" w:color="FFFFFF" w:sz="0"/>
+              <w:right w:val="none" w:color="FFFFFF" w:sz="0"/>
+            </w:tcBorders>
+            <w:tcMar>
+              <w:top w:type="dxa" w:w="50"/>
+              <w:left w:type="dxa" w:w="90"/>
+              <w:bottom w:type="dxa" w:w="50"/>
+              <w:right w:type="dxa" w:w="90"/>
+            </w:tcMar>
+          </w:tcPr>
+          <w:p>
+            <w:r>
+              <w:rPr>
+                <w:rFonts w:ascii="Times New Roman" w:cs="Times New Roman" w:eastAsia="Times New Roman" w:hAnsi="Times New Roman"/>
+                <w:sz w:val="18"/>
+                <w:szCs w:val="18"/>
+              </w:rPr>
+              <w:t xml:space="preserve">3</w:t>
+            </w:r>
+          </w:p>
+        </w:tc>
+        <w:tc>
+          <w:tcPr>
+            <w:tcW w:type="dxa" w:w="1000"/>
+            <w:tcBorders>
+              <w:top w:val="none" w:color="FFFFFF" w:sz="0"/>
+              <w:left w:val="none" w:color="FFFFFF" w:sz="0"/>
+              <w:bottom w:val="none" w:color="FFFFFF" w:sz="0"/>
+              <w:right w:val="none" w:color="FFFFFF" w:sz="0"/>
+            </w:tcBorders>
+            <w:tcMar>
+              <w:top w:type="dxa" w:w="50"/>
+              <w:left w:type="dxa" w:w="90"/>
+              <w:bottom w:type="dxa" w:w="50"/>
+              <w:right w:type="dxa" w:w="90"/>
+            </w:tcMar>
+          </w:tcPr>
+          <w:p>
+            <w:r>
+              <w:rPr>
+                <w:rFonts w:ascii="Times New Roman" w:cs="Times New Roman" w:eastAsia="Times New Roman" w:hAnsi="Times New Roman"/>
+                <w:sz w:val="18"/>
+                <w:szCs w:val="18"/>
+              </w:rPr>
+              <w:t xml:space="preserve">n/a</w:t>
+            </w:r>
+          </w:p>
+        </w:tc>
+        <w:tc>
+          <w:tcPr>
+            <w:tcW w:type="dxa" w:w="1100"/>
+            <w:tcBorders>
+              <w:top w:val="none" w:color="FFFFFF" w:sz="0"/>
+              <w:left w:val="none" w:color="FFFFFF" w:sz="0"/>
+              <w:bottom w:val="none" w:color="FFFFFF" w:sz="0"/>
+              <w:right w:val="none" w:color="FFFFFF" w:sz="0"/>
+            </w:tcBorders>
+            <w:tcMar>
+              <w:top w:type="dxa" w:w="50"/>
+              <w:left w:type="dxa" w:w="90"/>
+              <w:bottom w:type="dxa" w:w="50"/>
+              <w:right w:type="dxa" w:w="90"/>
+            </w:tcMar>
+          </w:tcPr>
+          <w:p>
+            <w:r>
+              <w:rPr>
+                <w:rFonts w:ascii="Times New Roman" w:cs="Times New Roman" w:eastAsia="Times New Roman" w:hAnsi="Times New Roman"/>
+                <w:sz w:val="18"/>
+                <w:szCs w:val="18"/>
+              </w:rPr>
+              <w:t xml:space="preserve">—</w:t>
+            </w:r>
+          </w:p>
+        </w:tc>
+        <w:tc>
+          <w:tcPr>
+            <w:tcW w:type="dxa" w:w="1000"/>
+            <w:tcBorders>
+              <w:top w:val="none" w:color="FFFFFF" w:sz="0"/>
+              <w:left w:val="none" w:color="FFFFFF" w:sz="0"/>
+              <w:bottom w:val="none" w:color="FFFFFF" w:sz="0"/>
+              <w:right w:val="none" w:color="FFFFFF" w:sz="0"/>
+            </w:tcBorders>
+            <w:tcMar>
+              <w:top w:type="dxa" w:w="50"/>
+              <w:left w:type="dxa" w:w="90"/>
+              <w:bottom w:type="dxa" w:w="50"/>
+              <w:right w:type="dxa" w:w="90"/>
+            </w:tcMar>
+          </w:tcPr>
+          <w:p>
+            <w:r>
+              <w:rPr>
+                <w:rFonts w:ascii="Times New Roman" w:cs="Times New Roman" w:eastAsia="Times New Roman" w:hAnsi="Times New Roman"/>
+                <w:sz w:val="18"/>
+                <w:szCs w:val="18"/>
+              </w:rPr>
+              <w:t xml:space="preserve">0.281</w:t>
+            </w:r>
+          </w:p>
+        </w:tc>
+        <w:tc>
+          <w:tcPr>
+            <w:tcW w:type="dxa" w:w="1100"/>
+            <w:tcBorders>
+              <w:top w:val="none" w:color="FFFFFF" w:sz="0"/>
+              <w:left w:val="none" w:color="FFFFFF" w:sz="0"/>
+              <w:bottom w:val="none" w:color="FFFFFF" w:sz="0"/>
+              <w:right w:val="none" w:color="FFFFFF" w:sz="0"/>
+            </w:tcBorders>
+            <w:tcMar>
+              <w:top w:type="dxa" w:w="50"/>
+              <w:left w:type="dxa" w:w="90"/>
+              <w:bottom w:type="dxa" w:w="50"/>
+              <w:right w:type="dxa" w:w="90"/>
+            </w:tcMar>
+          </w:tcPr>
+          <w:p>
+            <w:r>
+              <w:rPr>
+                <w:rFonts w:ascii="Times New Roman" w:cs="Times New Roman" w:eastAsia="Times New Roman" w:hAnsi="Times New Roman"/>
+                <w:sz w:val="18"/>
+                <w:szCs w:val="18"/>
+              </w:rPr>
+              <w:t xml:space="preserve">0.241</w:t>
+            </w:r>
+          </w:p>
+        </w:tc>
+        <w:tc>
+          <w:tcPr>
+            <w:tcW w:type="dxa" w:w="1000"/>
+            <w:tcBorders>
+              <w:top w:val="none" w:color="FFFFFF" w:sz="0"/>
+              <w:left w:val="none" w:color="FFFFFF" w:sz="0"/>
+              <w:bottom w:val="none" w:color="FFFFFF" w:sz="0"/>
+              <w:right w:val="none" w:color="FFFFFF" w:sz="0"/>
+            </w:tcBorders>
+            <w:tcMar>
+              <w:top w:type="dxa" w:w="50"/>
+              <w:left w:type="dxa" w:w="90"/>
+              <w:bottom w:type="dxa" w:w="50"/>
+              <w:right w:type="dxa" w:w="90"/>
+            </w:tcMar>
+          </w:tcPr>
+          <w:p>
+            <w:r>
+              <w:rPr>
+                <w:rFonts w:ascii="Times New Roman" w:cs="Times New Roman" w:eastAsia="Times New Roman" w:hAnsi="Times New Roman"/>
+                <w:sz w:val="18"/>
+                <w:szCs w:val="18"/>
+              </w:rPr>
+              <w:t xml:space="preserve">0.148</w:t>
+            </w:r>
+          </w:p>
+        </w:tc>
+        <w:tc>
+          <w:tcPr>
+            <w:tcW w:type="dxa" w:w="1000"/>
+            <w:tcBorders>
+              <w:top w:val="none" w:color="FFFFFF" w:sz="0"/>
+              <w:left w:val="none" w:color="FFFFFF" w:sz="0"/>
+              <w:bottom w:val="none" w:color="FFFFFF" w:sz="0"/>
+              <w:right w:val="none" w:color="FFFFFF" w:sz="0"/>
+            </w:tcBorders>
+            <w:tcMar>
+              <w:top w:type="dxa" w:w="50"/>
+              <w:left w:type="dxa" w:w="90"/>
+              <w:bottom w:type="dxa" w:w="50"/>
+              <w:right w:type="dxa" w:w="90"/>
+            </w:tcMar>
+          </w:tcPr>
+          <w:p>
+            <w:r>
+              <w:rPr>
+                <w:rFonts w:ascii="Times New Roman" w:cs="Times New Roman" w:eastAsia="Times New Roman" w:hAnsi="Times New Roman"/>
+                <w:sz w:val="18"/>
+                <w:szCs w:val="18"/>
+              </w:rPr>
+              <w:t xml:space="preserve">0.292</w:t>
+            </w:r>
+          </w:p>
+        </w:tc>
+      </w:tr>
+      <w:tr>
+        <w:tc>
+          <w:tcPr>
+            <w:tcW w:type="dxa" w:w="800"/>
+            <w:tcBorders>
+              <w:top w:val="none" w:color="FFFFFF" w:sz="0"/>
+              <w:left w:val="none" w:color="FFFFFF" w:sz="0"/>
+              <w:bottom w:val="none" w:color="FFFFFF" w:sz="0"/>
+              <w:right w:val="none" w:color="FFFFFF" w:sz="0"/>
+            </w:tcBorders>
+            <w:tcMar>
+              <w:top w:type="dxa" w:w="50"/>
+              <w:left w:type="dxa" w:w="90"/>
+              <w:bottom w:type="dxa" w:w="50"/>
+              <w:right w:type="dxa" w:w="90"/>
+            </w:tcMar>
+          </w:tcPr>
+          <w:p>
+            <w:r>
+              <w:rPr>
+                <w:rFonts w:ascii="Times New Roman" w:cs="Times New Roman" w:eastAsia="Times New Roman" w:hAnsi="Times New Roman"/>
+                <w:sz w:val="18"/>
+                <w:szCs w:val="18"/>
+              </w:rPr>
+              <w:t xml:space="preserve">B4</w:t>
+            </w:r>
+          </w:p>
+        </w:tc>
+        <w:tc>
+          <w:tcPr>
+            <w:tcW w:type="dxa" w:w="1100"/>
+            <w:tcBorders>
+              <w:top w:val="none" w:color="FFFFFF" w:sz="0"/>
+              <w:left w:val="none" w:color="FFFFFF" w:sz="0"/>
+              <w:bottom w:val="none" w:color="FFFFFF" w:sz="0"/>
+              <w:right w:val="none" w:color="FFFFFF" w:sz="0"/>
+            </w:tcBorders>
+            <w:tcMar>
+              <w:top w:type="dxa" w:w="50"/>
+              <w:left w:type="dxa" w:w="90"/>
+              <w:bottom w:type="dxa" w:w="50"/>
+              <w:right w:type="dxa" w:w="90"/>
+            </w:tcMar>
+          </w:tcPr>
+          <w:p>
+            <w:r>
+              <w:rPr>
+                <w:rFonts w:ascii="Times New Roman" w:cs="Times New Roman" w:eastAsia="Times New Roman" w:hAnsi="Times New Roman"/>
+                <w:sz w:val="18"/>
+                <w:szCs w:val="18"/>
+              </w:rPr>
+              <w:t xml:space="preserve">0 (expl.)</w:t>
+            </w:r>
+          </w:p>
+        </w:tc>
+        <w:tc>
+          <w:tcPr>
+            <w:tcW w:type="dxa" w:w="1000"/>
+            <w:tcBorders>
+              <w:top w:val="none" w:color="FFFFFF" w:sz="0"/>
+              <w:left w:val="none" w:color="FFFFFF" w:sz="0"/>
+              <w:bottom w:val="none" w:color="FFFFFF" w:sz="0"/>
+              <w:right w:val="none" w:color="FFFFFF" w:sz="0"/>
+            </w:tcBorders>
+            <w:tcMar>
+              <w:top w:type="dxa" w:w="50"/>
+              <w:left w:type="dxa" w:w="90"/>
+              <w:bottom w:type="dxa" w:w="50"/>
+              <w:right w:type="dxa" w:w="90"/>
+            </w:tcMar>
+          </w:tcPr>
+          <w:p>
+            <w:r>
+              <w:rPr>
+                <w:rFonts w:ascii="Times New Roman" w:cs="Times New Roman" w:eastAsia="Times New Roman" w:hAnsi="Times New Roman"/>
+                <w:sz w:val="18"/>
+                <w:szCs w:val="18"/>
+              </w:rPr>
+              <w:t xml:space="preserve">0.195</w:t>
+            </w:r>
+          </w:p>
+        </w:tc>
+        <w:tc>
+          <w:tcPr>
+            <w:tcW w:type="dxa" w:w="1100"/>
+            <w:tcBorders>
+              <w:top w:val="none" w:color="FFFFFF" w:sz="0"/>
+              <w:left w:val="none" w:color="FFFFFF" w:sz="0"/>
+              <w:bottom w:val="none" w:color="FFFFFF" w:sz="0"/>
+              <w:right w:val="none" w:color="FFFFFF" w:sz="0"/>
+            </w:tcBorders>
+            <w:tcMar>
+              <w:top w:type="dxa" w:w="50"/>
+              <w:left w:type="dxa" w:w="90"/>
+              <w:bottom w:type="dxa" w:w="50"/>
+              <w:right w:type="dxa" w:w="90"/>
+            </w:tcMar>
+          </w:tcPr>
+          <w:p>
+            <w:r>
+              <w:rPr>
+                <w:rFonts w:ascii="Times New Roman" w:cs="Times New Roman" w:eastAsia="Times New Roman" w:hAnsi="Times New Roman"/>
+                <w:sz w:val="18"/>
+                <w:szCs w:val="18"/>
+              </w:rPr>
+              <w:t xml:space="preserve">0.826</w:t>
+            </w:r>
+          </w:p>
+        </w:tc>
+        <w:tc>
+          <w:tcPr>
+            <w:tcW w:type="dxa" w:w="1000"/>
+            <w:tcBorders>
+              <w:top w:val="none" w:color="FFFFFF" w:sz="0"/>
+              <w:left w:val="none" w:color="FFFFFF" w:sz="0"/>
+              <w:bottom w:val="none" w:color="FFFFFF" w:sz="0"/>
+              <w:right w:val="none" w:color="FFFFFF" w:sz="0"/>
+            </w:tcBorders>
+            <w:tcMar>
+              <w:top w:type="dxa" w:w="50"/>
+              <w:left w:type="dxa" w:w="90"/>
+              <w:bottom w:type="dxa" w:w="50"/>
+              <w:right w:type="dxa" w:w="90"/>
+            </w:tcMar>
+          </w:tcPr>
+          <w:p>
+            <w:r>
+              <w:rPr>
+                <w:rFonts w:ascii="Times New Roman" w:cs="Times New Roman" w:eastAsia="Times New Roman" w:hAnsi="Times New Roman"/>
+                <w:sz w:val="18"/>
+                <w:szCs w:val="18"/>
+              </w:rPr>
+              <w:t xml:space="preserve">0.347</w:t>
+            </w:r>
+          </w:p>
+        </w:tc>
+        <w:tc>
+          <w:tcPr>
+            <w:tcW w:type="dxa" w:w="1100"/>
+            <w:tcBorders>
+              <w:top w:val="none" w:color="FFFFFF" w:sz="0"/>
+              <w:left w:val="none" w:color="FFFFFF" w:sz="0"/>
+              <w:bottom w:val="none" w:color="FFFFFF" w:sz="0"/>
+              <w:right w:val="none" w:color="FFFFFF" w:sz="0"/>
+            </w:tcBorders>
+            <w:tcMar>
+              <w:top w:type="dxa" w:w="50"/>
+              <w:left w:type="dxa" w:w="90"/>
+              <w:bottom w:type="dxa" w:w="50"/>
+              <w:right w:type="dxa" w:w="90"/>
+            </w:tcMar>
+          </w:tcPr>
+          <w:p>
+            <w:r>
+              <w:rPr>
+                <w:rFonts w:ascii="Times New Roman" w:cs="Times New Roman" w:eastAsia="Times New Roman" w:hAnsi="Times New Roman"/>
+                <w:sz w:val="18"/>
+                <w:szCs w:val="18"/>
+              </w:rPr>
+              <w:t xml:space="preserve">0.303</w:t>
+            </w:r>
+          </w:p>
+        </w:tc>
+        <w:tc>
+          <w:tcPr>
+            <w:tcW w:type="dxa" w:w="1000"/>
+            <w:tcBorders>
+              <w:top w:val="none" w:color="FFFFFF" w:sz="0"/>
+              <w:left w:val="none" w:color="FFFFFF" w:sz="0"/>
+              <w:bottom w:val="none" w:color="FFFFFF" w:sz="0"/>
+              <w:right w:val="none" w:color="FFFFFF" w:sz="0"/>
+            </w:tcBorders>
+            <w:tcMar>
+              <w:top w:type="dxa" w:w="50"/>
+              <w:left w:type="dxa" w:w="90"/>
+              <w:bottom w:type="dxa" w:w="50"/>
+              <w:right w:type="dxa" w:w="90"/>
+            </w:tcMar>
+          </w:tcPr>
+          <w:p>
+            <w:r>
+              <w:rPr>
+                <w:rFonts w:ascii="Times New Roman" w:cs="Times New Roman" w:eastAsia="Times New Roman" w:hAnsi="Times New Roman"/>
+                <w:sz w:val="18"/>
+                <w:szCs w:val="18"/>
+              </w:rPr>
+              <w:t xml:space="preserve">0.192</w:t>
+            </w:r>
+          </w:p>
+        </w:tc>
+        <w:tc>
+          <w:tcPr>
+            <w:tcW w:type="dxa" w:w="1000"/>
+            <w:tcBorders>
+              <w:top w:val="none" w:color="FFFFFF" w:sz="0"/>
+              <w:left w:val="none" w:color="FFFFFF" w:sz="0"/>
+              <w:bottom w:val="none" w:color="FFFFFF" w:sz="0"/>
+              <w:right w:val="none" w:color="FFFFFF" w:sz="0"/>
+            </w:tcBorders>
+            <w:tcMar>
+              <w:top w:type="dxa" w:w="50"/>
+              <w:left w:type="dxa" w:w="90"/>
+              <w:bottom w:type="dxa" w:w="50"/>
+              <w:right w:type="dxa" w:w="90"/>
+            </w:tcMar>
+          </w:tcPr>
+          <w:p>
+            <w:r>
+              <w:rPr>
+                <w:rFonts w:ascii="Times New Roman" w:cs="Times New Roman" w:eastAsia="Times New Roman" w:hAnsi="Times New Roman"/>
+                <w:sz w:val="18"/>
+                <w:szCs w:val="18"/>
+              </w:rPr>
+              <w:t xml:space="preserve">0.330</w:t>
+            </w:r>
+          </w:p>
+        </w:tc>
+      </w:tr>
+      <w:tr>
+        <w:tc>
+          <w:tcPr>
+            <w:tcW w:type="dxa" w:w="800"/>
+            <w:tcBorders>
+              <w:top w:val="none" w:color="FFFFFF" w:sz="0"/>
+              <w:left w:val="none" w:color="FFFFFF" w:sz="0"/>
+              <w:bottom w:val="none" w:color="FFFFFF" w:sz="0"/>
+              <w:right w:val="none" w:color="FFFFFF" w:sz="0"/>
+            </w:tcBorders>
+            <w:tcMar>
+              <w:top w:type="dxa" w:w="50"/>
+              <w:left w:type="dxa" w:w="90"/>
+              <w:bottom w:type="dxa" w:w="50"/>
+              <w:right w:type="dxa" w:w="90"/>
+            </w:tcMar>
+          </w:tcPr>
+          <w:p>
+            <w:r>
+              <w:rPr>
+                <w:rFonts w:ascii="Times New Roman" w:cs="Times New Roman" w:eastAsia="Times New Roman" w:hAnsi="Times New Roman"/>
+                <w:sz w:val="18"/>
+                <w:szCs w:val="18"/>
+              </w:rPr>
+              <w:t xml:space="preserve">B5</w:t>
+            </w:r>
+          </w:p>
+        </w:tc>
+        <w:tc>
+          <w:tcPr>
+            <w:tcW w:type="dxa" w:w="1100"/>
+            <w:tcBorders>
+              <w:top w:val="none" w:color="FFFFFF" w:sz="0"/>
+              <w:left w:val="none" w:color="FFFFFF" w:sz="0"/>
+              <w:bottom w:val="none" w:color="FFFFFF" w:sz="0"/>
+              <w:right w:val="none" w:color="FFFFFF" w:sz="0"/>
+            </w:tcBorders>
+            <w:tcMar>
+              <w:top w:type="dxa" w:w="50"/>
+              <w:left w:type="dxa" w:w="90"/>
+              <w:bottom w:type="dxa" w:w="50"/>
+              <w:right w:type="dxa" w:w="90"/>
+            </w:tcMar>
+          </w:tcPr>
+          <w:p>
+            <w:r>
+              <w:rPr>
+                <w:rFonts w:ascii="Times New Roman" w:cs="Times New Roman" w:eastAsia="Times New Roman" w:hAnsi="Times New Roman"/>
+                <w:sz w:val="18"/>
+                <w:szCs w:val="18"/>
+              </w:rPr>
+              <w:t xml:space="preserve">0 (expl.)</w:t>
+            </w:r>
+          </w:p>
+        </w:tc>
+        <w:tc>
+          <w:tcPr>
+            <w:tcW w:type="dxa" w:w="1000"/>
+            <w:tcBorders>
+              <w:top w:val="none" w:color="FFFFFF" w:sz="0"/>
+              <w:left w:val="none" w:color="FFFFFF" w:sz="0"/>
+              <w:bottom w:val="none" w:color="FFFFFF" w:sz="0"/>
+              <w:right w:val="none" w:color="FFFFFF" w:sz="0"/>
+            </w:tcBorders>
+            <w:tcMar>
+              <w:top w:type="dxa" w:w="50"/>
+              <w:left w:type="dxa" w:w="90"/>
+              <w:bottom w:type="dxa" w:w="50"/>
+              <w:right w:type="dxa" w:w="90"/>
+            </w:tcMar>
+          </w:tcPr>
+          <w:p>
+            <w:r>
+              <w:rPr>
+                <w:rFonts w:ascii="Times New Roman" w:cs="Times New Roman" w:eastAsia="Times New Roman" w:hAnsi="Times New Roman"/>
+                <w:sz w:val="18"/>
+                <w:szCs w:val="18"/>
+              </w:rPr>
+              <w:t xml:space="preserve">n/a</w:t>
+            </w:r>
+          </w:p>
+        </w:tc>
+        <w:tc>
+          <w:tcPr>
+            <w:tcW w:type="dxa" w:w="1100"/>
+            <w:tcBorders>
+              <w:top w:val="none" w:color="FFFFFF" w:sz="0"/>
+              <w:left w:val="none" w:color="FFFFFF" w:sz="0"/>
+              <w:bottom w:val="none" w:color="FFFFFF" w:sz="0"/>
+              <w:right w:val="none" w:color="FFFFFF" w:sz="0"/>
+            </w:tcBorders>
+            <w:tcMar>
+              <w:top w:type="dxa" w:w="50"/>
+              <w:left w:type="dxa" w:w="90"/>
+              <w:bottom w:type="dxa" w:w="50"/>
+              <w:right w:type="dxa" w:w="90"/>
+            </w:tcMar>
+          </w:tcPr>
+          <w:p>
+            <w:r>
+              <w:rPr>
+                <w:rFonts w:ascii="Times New Roman" w:cs="Times New Roman" w:eastAsia="Times New Roman" w:hAnsi="Times New Roman"/>
+                <w:sz w:val="18"/>
+                <w:szCs w:val="18"/>
+              </w:rPr>
+              <w:t xml:space="preserve">—</w:t>
+            </w:r>
+          </w:p>
+        </w:tc>
+        <w:tc>
+          <w:tcPr>
+            <w:tcW w:type="dxa" w:w="1000"/>
+            <w:tcBorders>
+              <w:top w:val="none" w:color="FFFFFF" w:sz="0"/>
+              <w:left w:val="none" w:color="FFFFFF" w:sz="0"/>
+              <w:bottom w:val="none" w:color="FFFFFF" w:sz="0"/>
+              <w:right w:val="none" w:color="FFFFFF" w:sz="0"/>
+            </w:tcBorders>
+            <w:tcMar>
+              <w:top w:type="dxa" w:w="50"/>
+              <w:left w:type="dxa" w:w="90"/>
+              <w:bottom w:type="dxa" w:w="50"/>
+              <w:right w:type="dxa" w:w="90"/>
+            </w:tcMar>
+          </w:tcPr>
+          <w:p>
+            <w:r>
+              <w:rPr>
+                <w:rFonts w:ascii="Times New Roman" w:cs="Times New Roman" w:eastAsia="Times New Roman" w:hAnsi="Times New Roman"/>
+                <w:sz w:val="18"/>
+                <w:szCs w:val="18"/>
+              </w:rPr>
+              <w:t xml:space="preserve">0.331</w:t>
+            </w:r>
+          </w:p>
+        </w:tc>
+        <w:tc>
+          <w:tcPr>
+            <w:tcW w:type="dxa" w:w="1100"/>
+            <w:tcBorders>
+              <w:top w:val="none" w:color="FFFFFF" w:sz="0"/>
+              <w:left w:val="none" w:color="FFFFFF" w:sz="0"/>
+              <w:bottom w:val="none" w:color="FFFFFF" w:sz="0"/>
+              <w:right w:val="none" w:color="FFFFFF" w:sz="0"/>
+            </w:tcBorders>
+            <w:tcMar>
+              <w:top w:type="dxa" w:w="50"/>
+              <w:left w:type="dxa" w:w="90"/>
+              <w:bottom w:type="dxa" w:w="50"/>
+              <w:right w:type="dxa" w:w="90"/>
+            </w:tcMar>
+          </w:tcPr>
+          <w:p>
+            <w:r>
+              <w:rPr>
+                <w:rFonts w:ascii="Times New Roman" w:cs="Times New Roman" w:eastAsia="Times New Roman" w:hAnsi="Times New Roman"/>
+                <w:sz w:val="18"/>
+                <w:szCs w:val="18"/>
+              </w:rPr>
+              <w:t xml:space="preserve">0.262</w:t>
+            </w:r>
+          </w:p>
+        </w:tc>
+        <w:tc>
+          <w:tcPr>
+            <w:tcW w:type="dxa" w:w="1000"/>
+            <w:tcBorders>
+              <w:top w:val="none" w:color="FFFFFF" w:sz="0"/>
+              <w:left w:val="none" w:color="FFFFFF" w:sz="0"/>
+              <w:bottom w:val="none" w:color="FFFFFF" w:sz="0"/>
+              <w:right w:val="none" w:color="FFFFFF" w:sz="0"/>
+            </w:tcBorders>
+            <w:tcMar>
+              <w:top w:type="dxa" w:w="50"/>
+              <w:left w:type="dxa" w:w="90"/>
+              <w:bottom w:type="dxa" w:w="50"/>
+              <w:right w:type="dxa" w:w="90"/>
+            </w:tcMar>
+          </w:tcPr>
+          <w:p>
+            <w:r>
+              <w:rPr>
+                <w:rFonts w:ascii="Times New Roman" w:cs="Times New Roman" w:eastAsia="Times New Roman" w:hAnsi="Times New Roman"/>
+                <w:sz w:val="18"/>
+                <w:szCs w:val="18"/>
+              </w:rPr>
+              <w:t xml:space="preserve">0.167</w:t>
+            </w:r>
+          </w:p>
+        </w:tc>
+        <w:tc>
+          <w:tcPr>
+            <w:tcW w:type="dxa" w:w="1000"/>
+            <w:tcBorders>
+              <w:top w:val="none" w:color="FFFFFF" w:sz="0"/>
+              <w:left w:val="none" w:color="FFFFFF" w:sz="0"/>
+              <w:bottom w:val="none" w:color="FFFFFF" w:sz="0"/>
+              <w:right w:val="none" w:color="FFFFFF" w:sz="0"/>
+            </w:tcBorders>
+            <w:tcMar>
+              <w:top w:type="dxa" w:w="50"/>
+              <w:left w:type="dxa" w:w="90"/>
+              <w:bottom w:type="dxa" w:w="50"/>
+              <w:right w:type="dxa" w:w="90"/>
+            </w:tcMar>
+          </w:tcPr>
+          <w:p>
+            <w:r>
+              <w:rPr>
+                <w:rFonts w:ascii="Times New Roman" w:cs="Times New Roman" w:eastAsia="Times New Roman" w:hAnsi="Times New Roman"/>
+                <w:sz w:val="18"/>
+                <w:szCs w:val="18"/>
+              </w:rPr>
+              <w:t xml:space="preserve">0.301</w:t>
+            </w:r>
+          </w:p>
+        </w:tc>
+      </w:tr>
+      <w:tr>
+        <w:tc>
+          <w:tcPr>
+            <w:tcW w:type="dxa" w:w="800"/>
+            <w:tcBorders>
+              <w:top w:val="none" w:color="FFFFFF" w:sz="0"/>
+              <w:left w:val="none" w:color="FFFFFF" w:sz="0"/>
+              <w:bottom w:val="single" w:color="000000" w:sz="4"/>
+              <w:right w:val="none" w:color="FFFFFF" w:sz="0"/>
+            </w:tcBorders>
+            <w:tcMar>
+              <w:top w:type="dxa" w:w="50"/>
+              <w:left w:type="dxa" w:w="90"/>
+              <w:bottom w:type="dxa" w:w="50"/>
+              <w:right w:type="dxa" w:w="90"/>
+            </w:tcMar>
+          </w:tcPr>
+          <w:p>
+            <w:r>
+              <w:rPr>
+                <w:rFonts w:ascii="Times New Roman" w:cs="Times New Roman" w:eastAsia="Times New Roman" w:hAnsi="Times New Roman"/>
+                <w:sz w:val="18"/>
+                <w:szCs w:val="18"/>
+              </w:rPr>
+              <w:t xml:space="preserve">B2</w:t>
+            </w:r>
+          </w:p>
+        </w:tc>
+        <w:tc>
+          <w:tcPr>
+            <w:tcW w:type="dxa" w:w="1100"/>
+            <w:tcBorders>
+              <w:top w:val="none" w:color="FFFFFF" w:sz="0"/>
+              <w:left w:val="none" w:color="FFFFFF" w:sz="0"/>
+              <w:bottom w:val="single" w:color="000000" w:sz="4"/>
+              <w:right w:val="none" w:color="FFFFFF" w:sz="0"/>
+            </w:tcBorders>
+            <w:tcMar>
+              <w:top w:type="dxa" w:w="50"/>
+              <w:left w:type="dxa" w:w="90"/>
+              <w:bottom w:type="dxa" w:w="50"/>
+              <w:right w:type="dxa" w:w="90"/>
+            </w:tcMar>
+          </w:tcPr>
+          <w:p>
+            <w:r>
+              <w:rPr>
+                <w:rFonts w:ascii="Times New Roman" w:cs="Times New Roman" w:eastAsia="Times New Roman" w:hAnsi="Times New Roman"/>
+                <w:sz w:val="18"/>
+                <w:szCs w:val="18"/>
+              </w:rPr>
+              <w:t xml:space="preserve">0 (expl.)</w:t>
+            </w:r>
+          </w:p>
+        </w:tc>
+        <w:tc>
+          <w:tcPr>
+            <w:tcW w:type="dxa" w:w="1000"/>
+            <w:tcBorders>
+              <w:top w:val="none" w:color="FFFFFF" w:sz="0"/>
+              <w:left w:val="none" w:color="FFFFFF" w:sz="0"/>
+              <w:bottom w:val="single" w:color="000000" w:sz="4"/>
+              <w:right w:val="none" w:color="FFFFFF" w:sz="0"/>
+            </w:tcBorders>
+            <w:tcMar>
+              <w:top w:type="dxa" w:w="50"/>
+              <w:left w:type="dxa" w:w="90"/>
+              <w:bottom w:type="dxa" w:w="50"/>
+              <w:right w:type="dxa" w:w="90"/>
+            </w:tcMar>
+          </w:tcPr>
+          <w:p>
+            <w:r>
+              <w:rPr>
+                <w:rFonts w:ascii="Times New Roman" w:cs="Times New Roman" w:eastAsia="Times New Roman" w:hAnsi="Times New Roman"/>
+                <w:sz w:val="18"/>
+                <w:szCs w:val="18"/>
+              </w:rPr>
+              <w:t xml:space="preserve">pending</w:t>
+            </w:r>
+          </w:p>
+        </w:tc>
+        <w:tc>
+          <w:tcPr>
+            <w:tcW w:type="dxa" w:w="1100"/>
+            <w:tcBorders>
+              <w:top w:val="none" w:color="FFFFFF" w:sz="0"/>
+              <w:left w:val="none" w:color="FFFFFF" w:sz="0"/>
+              <w:bottom w:val="single" w:color="000000" w:sz="4"/>
+              <w:right w:val="none" w:color="FFFFFF" w:sz="0"/>
+            </w:tcBorders>
+            <w:tcMar>
+              <w:top w:type="dxa" w:w="50"/>
+              <w:left w:type="dxa" w:w="90"/>
+              <w:bottom w:type="dxa" w:w="50"/>
+              <w:right w:type="dxa" w:w="90"/>
+            </w:tcMar>
+          </w:tcPr>
+          <w:p>
+            <w:r>
+              <w:rPr>
+                <w:rFonts w:ascii="Times New Roman" w:cs="Times New Roman" w:eastAsia="Times New Roman" w:hAnsi="Times New Roman"/>
+                <w:sz w:val="18"/>
+                <w:szCs w:val="18"/>
+              </w:rPr>
+              <w:t xml:space="preserve">pending</w:t>
+            </w:r>
+          </w:p>
+        </w:tc>
+        <w:tc>
+          <w:tcPr>
+            <w:tcW w:type="dxa" w:w="1000"/>
+            <w:tcBorders>
+              <w:top w:val="none" w:color="FFFFFF" w:sz="0"/>
+              <w:left w:val="none" w:color="FFFFFF" w:sz="0"/>
+              <w:bottom w:val="single" w:color="000000" w:sz="4"/>
+              <w:right w:val="none" w:color="FFFFFF" w:sz="0"/>
+            </w:tcBorders>
+            <w:tcMar>
+              <w:top w:type="dxa" w:w="50"/>
+              <w:left w:type="dxa" w:w="90"/>
+              <w:bottom w:type="dxa" w:w="50"/>
+              <w:right w:type="dxa" w:w="90"/>
+            </w:tcMar>
+          </w:tcPr>
+          <w:p>
+            <w:r>
+              <w:rPr>
+                <w:rFonts w:ascii="Times New Roman" w:cs="Times New Roman" w:eastAsia="Times New Roman" w:hAnsi="Times New Roman"/>
+                <w:sz w:val="18"/>
+                <w:szCs w:val="18"/>
+              </w:rPr>
+              <w:t xml:space="preserve">pending</w:t>
+            </w:r>
+          </w:p>
+        </w:tc>
+        <w:tc>
+          <w:tcPr>
+            <w:tcW w:type="dxa" w:w="1100"/>
+            <w:tcBorders>
+              <w:top w:val="none" w:color="FFFFFF" w:sz="0"/>
+              <w:left w:val="none" w:color="FFFFFF" w:sz="0"/>
+              <w:bottom w:val="single" w:color="000000" w:sz="4"/>
+              <w:right w:val="none" w:color="FFFFFF" w:sz="0"/>
+            </w:tcBorders>
+            <w:tcMar>
+              <w:top w:type="dxa" w:w="50"/>
+              <w:left w:type="dxa" w:w="90"/>
+              <w:bottom w:type="dxa" w:w="50"/>
+              <w:right w:type="dxa" w:w="90"/>
+            </w:tcMar>
+          </w:tcPr>
+          <w:p>
+            <w:r>
+              <w:rPr>
+                <w:rFonts w:ascii="Times New Roman" w:cs="Times New Roman" w:eastAsia="Times New Roman" w:hAnsi="Times New Roman"/>
+                <w:sz w:val="18"/>
+                <w:szCs w:val="18"/>
+              </w:rPr>
+              <w:t xml:space="preserve">pending</w:t>
+            </w:r>
+          </w:p>
+        </w:tc>
+        <w:tc>
+          <w:tcPr>
+            <w:tcW w:type="dxa" w:w="1000"/>
+            <w:tcBorders>
+              <w:top w:val="none" w:color="FFFFFF" w:sz="0"/>
+              <w:left w:val="none" w:color="FFFFFF" w:sz="0"/>
+              <w:bottom w:val="single" w:color="000000" w:sz="4"/>
+              <w:right w:val="none" w:color="FFFFFF" w:sz="0"/>
+            </w:tcBorders>
+            <w:tcMar>
+              <w:top w:type="dxa" w:w="50"/>
+              <w:left w:type="dxa" w:w="90"/>
+              <w:bottom w:type="dxa" w:w="50"/>
+              <w:right w:type="dxa" w:w="90"/>
+            </w:tcMar>
+          </w:tcPr>
+          <w:p>
+            <w:r>
+              <w:rPr>
+                <w:rFonts w:ascii="Times New Roman" w:cs="Times New Roman" w:eastAsia="Times New Roman" w:hAnsi="Times New Roman"/>
+                <w:sz w:val="18"/>
+                <w:szCs w:val="18"/>
+              </w:rPr>
+              <w:t xml:space="preserve">pending</w:t>
+            </w:r>
+          </w:p>
+        </w:tc>
+        <w:tc>
+          <w:tcPr>
+            <w:tcW w:type="dxa" w:w="1000"/>
+            <w:tcBorders>
+              <w:top w:val="none" w:color="FFFFFF" w:sz="0"/>
+              <w:left w:val="none" w:color="FFFFFF" w:sz="0"/>
+              <w:bottom w:val="single" w:color="000000" w:sz="4"/>
+              <w:right w:val="none" w:color="FFFFFF" w:sz="0"/>
+            </w:tcBorders>
+            <w:tcMar>
+              <w:top w:type="dxa" w:w="50"/>
+              <w:left w:type="dxa" w:w="90"/>
+              <w:bottom w:type="dxa" w:w="50"/>
+              <w:right w:type="dxa" w:w="90"/>
+            </w:tcMar>
+          </w:tcPr>
+          <w:p>
+            <w:r>
+              <w:rPr>
+                <w:rFonts w:ascii="Times New Roman" w:cs="Times New Roman" w:eastAsia="Times New Roman" w:hAnsi="Times New Roman"/>
+                <w:sz w:val="18"/>
+                <w:szCs w:val="18"/>
+              </w:rPr>
+              <w:t xml:space="preserve">pending</w:t>
+            </w:r>
+          </w:p>
+        </w:tc>
+      </w:tr>
+    </w:tbl>
+    <w:p>
+      <w:pPr>
+        <w:spacing w:after="120"/>
+      </w:pPr>
     </w:p>
     <w:p>
       <w:pPr>

</xml_diff>